<commit_message>
Update report: APK builds, verification and panel questions
Adds the APK build record (second build byte-identical to the first),
two panel questions, and the latest commit to the commit history.
</commit_message>
<xml_diff>
--- a/scope doument/Femora - Project Progress and Technical Report.docx
+++ b/scope doument/Femora - Project Progress and Technical Report.docx
@@ -6,8 +6,8 @@
       <w:pPr>
         <w:spacing w:after="200"/>
       </w:pPr>
-      <w:bookmarkStart w:id="65" w:name="_GoBack"/>
-      <w:bookmarkEnd w:id="65"/>
+      <w:bookmarkStart w:id="66" w:name="_GoBack"/>
+      <w:bookmarkEnd w:id="66"/>
     </w:p>
     <w:p>
       <w:pPr>
@@ -341,7 +341,7 @@
                 <w:b w:val="0"/>
                 <w:i w:val="0"/>
               </w:rPr>
-              <w:t>github.com/ammad-sajjad/Femora (branch main, state as of commit 8ca482f)</w:t>
+              <w:t>github.com/ammad-sajjad/Femora (branch main, state as of commit 8b0caf7)</w:t>
             </w:r>
           </w:p>
         </w:tc>
@@ -402,7 +402,7 @@
         <w:fldChar w:fldCharType="begin"/>
       </w:r>
       <w:r>
-        <w:instrText xml:space="preserve"> HYPERLINK \l _Toc18442 </w:instrText>
+        <w:instrText xml:space="preserve"> HYPERLINK \l _Toc9710 </w:instrText>
       </w:r>
       <w:r>
         <w:fldChar w:fldCharType="separate"/>
@@ -417,7 +417,7 @@
         <w:fldChar w:fldCharType="begin"/>
       </w:r>
       <w:r>
-        <w:instrText xml:space="preserve"> PAGEREF _Toc18442 \h </w:instrText>
+        <w:instrText xml:space="preserve"> PAGEREF _Toc9710 \h </w:instrText>
       </w:r>
       <w:r>
         <w:fldChar w:fldCharType="separate"/>
@@ -443,7 +443,7 @@
         <w:fldChar w:fldCharType="begin"/>
       </w:r>
       <w:r>
-        <w:instrText xml:space="preserve"> HYPERLINK \l _Toc7585 </w:instrText>
+        <w:instrText xml:space="preserve"> HYPERLINK \l _Toc18566 </w:instrText>
       </w:r>
       <w:r>
         <w:fldChar w:fldCharType="separate"/>
@@ -458,7 +458,7 @@
         <w:fldChar w:fldCharType="begin"/>
       </w:r>
       <w:r>
-        <w:instrText xml:space="preserve"> PAGEREF _Toc7585 \h </w:instrText>
+        <w:instrText xml:space="preserve"> PAGEREF _Toc18566 \h </w:instrText>
       </w:r>
       <w:r>
         <w:fldChar w:fldCharType="separate"/>
@@ -484,7 +484,7 @@
         <w:fldChar w:fldCharType="begin"/>
       </w:r>
       <w:r>
-        <w:instrText xml:space="preserve"> HYPERLINK \l _Toc30418 </w:instrText>
+        <w:instrText xml:space="preserve"> HYPERLINK \l _Toc11336 </w:instrText>
       </w:r>
       <w:r>
         <w:fldChar w:fldCharType="separate"/>
@@ -499,7 +499,7 @@
         <w:fldChar w:fldCharType="begin"/>
       </w:r>
       <w:r>
-        <w:instrText xml:space="preserve"> PAGEREF _Toc30418 \h </w:instrText>
+        <w:instrText xml:space="preserve"> PAGEREF _Toc11336 \h </w:instrText>
       </w:r>
       <w:r>
         <w:fldChar w:fldCharType="separate"/>
@@ -525,7 +525,7 @@
         <w:fldChar w:fldCharType="begin"/>
       </w:r>
       <w:r>
-        <w:instrText xml:space="preserve"> HYPERLINK \l _Toc16334 </w:instrText>
+        <w:instrText xml:space="preserve"> HYPERLINK \l _Toc12689 </w:instrText>
       </w:r>
       <w:r>
         <w:fldChar w:fldCharType="separate"/>
@@ -540,7 +540,7 @@
         <w:fldChar w:fldCharType="begin"/>
       </w:r>
       <w:r>
-        <w:instrText xml:space="preserve"> PAGEREF _Toc16334 \h </w:instrText>
+        <w:instrText xml:space="preserve"> PAGEREF _Toc12689 \h </w:instrText>
       </w:r>
       <w:r>
         <w:fldChar w:fldCharType="separate"/>
@@ -566,7 +566,7 @@
         <w:fldChar w:fldCharType="begin"/>
       </w:r>
       <w:r>
-        <w:instrText xml:space="preserve"> HYPERLINK \l _Toc32737 </w:instrText>
+        <w:instrText xml:space="preserve"> HYPERLINK \l _Toc5752 </w:instrText>
       </w:r>
       <w:r>
         <w:fldChar w:fldCharType="separate"/>
@@ -581,7 +581,7 @@
         <w:fldChar w:fldCharType="begin"/>
       </w:r>
       <w:r>
-        <w:instrText xml:space="preserve"> PAGEREF _Toc32737 \h </w:instrText>
+        <w:instrText xml:space="preserve"> PAGEREF _Toc5752 \h </w:instrText>
       </w:r>
       <w:r>
         <w:fldChar w:fldCharType="separate"/>
@@ -607,7 +607,7 @@
         <w:fldChar w:fldCharType="begin"/>
       </w:r>
       <w:r>
-        <w:instrText xml:space="preserve"> HYPERLINK \l _Toc25737 </w:instrText>
+        <w:instrText xml:space="preserve"> HYPERLINK \l _Toc13866 </w:instrText>
       </w:r>
       <w:r>
         <w:fldChar w:fldCharType="separate"/>
@@ -622,7 +622,7 @@
         <w:fldChar w:fldCharType="begin"/>
       </w:r>
       <w:r>
-        <w:instrText xml:space="preserve"> PAGEREF _Toc25737 \h </w:instrText>
+        <w:instrText xml:space="preserve"> PAGEREF _Toc13866 \h </w:instrText>
       </w:r>
       <w:r>
         <w:fldChar w:fldCharType="separate"/>
@@ -648,7 +648,7 @@
         <w:fldChar w:fldCharType="begin"/>
       </w:r>
       <w:r>
-        <w:instrText xml:space="preserve"> HYPERLINK \l _Toc9756 </w:instrText>
+        <w:instrText xml:space="preserve"> HYPERLINK \l _Toc9682 </w:instrText>
       </w:r>
       <w:r>
         <w:fldChar w:fldCharType="separate"/>
@@ -663,7 +663,7 @@
         <w:fldChar w:fldCharType="begin"/>
       </w:r>
       <w:r>
-        <w:instrText xml:space="preserve"> PAGEREF _Toc9756 \h </w:instrText>
+        <w:instrText xml:space="preserve"> PAGEREF _Toc9682 \h </w:instrText>
       </w:r>
       <w:r>
         <w:fldChar w:fldCharType="separate"/>
@@ -689,7 +689,7 @@
         <w:fldChar w:fldCharType="begin"/>
       </w:r>
       <w:r>
-        <w:instrText xml:space="preserve"> HYPERLINK \l _Toc14386 </w:instrText>
+        <w:instrText xml:space="preserve"> HYPERLINK \l _Toc31949 </w:instrText>
       </w:r>
       <w:r>
         <w:fldChar w:fldCharType="separate"/>
@@ -704,7 +704,7 @@
         <w:fldChar w:fldCharType="begin"/>
       </w:r>
       <w:r>
-        <w:instrText xml:space="preserve"> PAGEREF _Toc14386 \h </w:instrText>
+        <w:instrText xml:space="preserve"> PAGEREF _Toc31949 \h </w:instrText>
       </w:r>
       <w:r>
         <w:fldChar w:fldCharType="separate"/>
@@ -730,7 +730,7 @@
         <w:fldChar w:fldCharType="begin"/>
       </w:r>
       <w:r>
-        <w:instrText xml:space="preserve"> HYPERLINK \l _Toc19758 </w:instrText>
+        <w:instrText xml:space="preserve"> HYPERLINK \l _Toc3954 </w:instrText>
       </w:r>
       <w:r>
         <w:fldChar w:fldCharType="separate"/>
@@ -745,7 +745,7 @@
         <w:fldChar w:fldCharType="begin"/>
       </w:r>
       <w:r>
-        <w:instrText xml:space="preserve"> PAGEREF _Toc19758 \h </w:instrText>
+        <w:instrText xml:space="preserve"> PAGEREF _Toc3954 \h </w:instrText>
       </w:r>
       <w:r>
         <w:fldChar w:fldCharType="separate"/>
@@ -771,7 +771,7 @@
         <w:fldChar w:fldCharType="begin"/>
       </w:r>
       <w:r>
-        <w:instrText xml:space="preserve"> HYPERLINK \l _Toc32108 </w:instrText>
+        <w:instrText xml:space="preserve"> HYPERLINK \l _Toc13427 </w:instrText>
       </w:r>
       <w:r>
         <w:fldChar w:fldCharType="separate"/>
@@ -786,7 +786,7 @@
         <w:fldChar w:fldCharType="begin"/>
       </w:r>
       <w:r>
-        <w:instrText xml:space="preserve"> PAGEREF _Toc32108 \h </w:instrText>
+        <w:instrText xml:space="preserve"> PAGEREF _Toc13427 \h </w:instrText>
       </w:r>
       <w:r>
         <w:fldChar w:fldCharType="separate"/>
@@ -812,7 +812,7 @@
         <w:fldChar w:fldCharType="begin"/>
       </w:r>
       <w:r>
-        <w:instrText xml:space="preserve"> HYPERLINK \l _Toc27728 </w:instrText>
+        <w:instrText xml:space="preserve"> HYPERLINK \l _Toc911 </w:instrText>
       </w:r>
       <w:r>
         <w:fldChar w:fldCharType="separate"/>
@@ -827,7 +827,7 @@
         <w:fldChar w:fldCharType="begin"/>
       </w:r>
       <w:r>
-        <w:instrText xml:space="preserve"> PAGEREF _Toc27728 \h </w:instrText>
+        <w:instrText xml:space="preserve"> PAGEREF _Toc911 \h </w:instrText>
       </w:r>
       <w:r>
         <w:fldChar w:fldCharType="separate"/>
@@ -853,7 +853,7 @@
         <w:fldChar w:fldCharType="begin"/>
       </w:r>
       <w:r>
-        <w:instrText xml:space="preserve"> HYPERLINK \l _Toc31041 </w:instrText>
+        <w:instrText xml:space="preserve"> HYPERLINK \l _Toc7441 </w:instrText>
       </w:r>
       <w:r>
         <w:fldChar w:fldCharType="separate"/>
@@ -868,7 +868,7 @@
         <w:fldChar w:fldCharType="begin"/>
       </w:r>
       <w:r>
-        <w:instrText xml:space="preserve"> PAGEREF _Toc31041 \h </w:instrText>
+        <w:instrText xml:space="preserve"> PAGEREF _Toc7441 \h </w:instrText>
       </w:r>
       <w:r>
         <w:fldChar w:fldCharType="separate"/>
@@ -894,7 +894,7 @@
         <w:fldChar w:fldCharType="begin"/>
       </w:r>
       <w:r>
-        <w:instrText xml:space="preserve"> HYPERLINK \l _Toc31811 </w:instrText>
+        <w:instrText xml:space="preserve"> HYPERLINK \l _Toc14462 </w:instrText>
       </w:r>
       <w:r>
         <w:fldChar w:fldCharType="separate"/>
@@ -909,7 +909,7 @@
         <w:fldChar w:fldCharType="begin"/>
       </w:r>
       <w:r>
-        <w:instrText xml:space="preserve"> PAGEREF _Toc31811 \h </w:instrText>
+        <w:instrText xml:space="preserve"> PAGEREF _Toc14462 \h </w:instrText>
       </w:r>
       <w:r>
         <w:fldChar w:fldCharType="separate"/>
@@ -935,7 +935,7 @@
         <w:fldChar w:fldCharType="begin"/>
       </w:r>
       <w:r>
-        <w:instrText xml:space="preserve"> HYPERLINK \l _Toc4524 </w:instrText>
+        <w:instrText xml:space="preserve"> HYPERLINK \l _Toc30988 </w:instrText>
       </w:r>
       <w:r>
         <w:fldChar w:fldCharType="separate"/>
@@ -950,7 +950,7 @@
         <w:fldChar w:fldCharType="begin"/>
       </w:r>
       <w:r>
-        <w:instrText xml:space="preserve"> PAGEREF _Toc4524 \h </w:instrText>
+        <w:instrText xml:space="preserve"> PAGEREF _Toc30988 \h </w:instrText>
       </w:r>
       <w:r>
         <w:fldChar w:fldCharType="separate"/>
@@ -976,7 +976,7 @@
         <w:fldChar w:fldCharType="begin"/>
       </w:r>
       <w:r>
-        <w:instrText xml:space="preserve"> HYPERLINK \l _Toc25176 </w:instrText>
+        <w:instrText xml:space="preserve"> HYPERLINK \l _Toc24270 </w:instrText>
       </w:r>
       <w:r>
         <w:fldChar w:fldCharType="separate"/>
@@ -991,7 +991,7 @@
         <w:fldChar w:fldCharType="begin"/>
       </w:r>
       <w:r>
-        <w:instrText xml:space="preserve"> PAGEREF _Toc25176 \h </w:instrText>
+        <w:instrText xml:space="preserve"> PAGEREF _Toc24270 \h </w:instrText>
       </w:r>
       <w:r>
         <w:fldChar w:fldCharType="separate"/>
@@ -1017,7 +1017,7 @@
         <w:fldChar w:fldCharType="begin"/>
       </w:r>
       <w:r>
-        <w:instrText xml:space="preserve"> HYPERLINK \l _Toc14605 </w:instrText>
+        <w:instrText xml:space="preserve"> HYPERLINK \l _Toc22393 </w:instrText>
       </w:r>
       <w:r>
         <w:fldChar w:fldCharType="separate"/>
@@ -1032,7 +1032,7 @@
         <w:fldChar w:fldCharType="begin"/>
       </w:r>
       <w:r>
-        <w:instrText xml:space="preserve"> PAGEREF _Toc14605 \h </w:instrText>
+        <w:instrText xml:space="preserve"> PAGEREF _Toc22393 \h </w:instrText>
       </w:r>
       <w:r>
         <w:fldChar w:fldCharType="separate"/>
@@ -1058,7 +1058,7 @@
         <w:fldChar w:fldCharType="begin"/>
       </w:r>
       <w:r>
-        <w:instrText xml:space="preserve"> HYPERLINK \l _Toc10359 </w:instrText>
+        <w:instrText xml:space="preserve"> HYPERLINK \l _Toc20246 </w:instrText>
       </w:r>
       <w:r>
         <w:fldChar w:fldCharType="separate"/>
@@ -1073,7 +1073,7 @@
         <w:fldChar w:fldCharType="begin"/>
       </w:r>
       <w:r>
-        <w:instrText xml:space="preserve"> PAGEREF _Toc10359 \h </w:instrText>
+        <w:instrText xml:space="preserve"> PAGEREF _Toc20246 \h </w:instrText>
       </w:r>
       <w:r>
         <w:fldChar w:fldCharType="separate"/>
@@ -1099,7 +1099,7 @@
         <w:fldChar w:fldCharType="begin"/>
       </w:r>
       <w:r>
-        <w:instrText xml:space="preserve"> HYPERLINK \l _Toc22157 </w:instrText>
+        <w:instrText xml:space="preserve"> HYPERLINK \l _Toc25880 </w:instrText>
       </w:r>
       <w:r>
         <w:fldChar w:fldCharType="separate"/>
@@ -1114,7 +1114,7 @@
         <w:fldChar w:fldCharType="begin"/>
       </w:r>
       <w:r>
-        <w:instrText xml:space="preserve"> PAGEREF _Toc22157 \h </w:instrText>
+        <w:instrText xml:space="preserve"> PAGEREF _Toc25880 \h </w:instrText>
       </w:r>
       <w:r>
         <w:fldChar w:fldCharType="separate"/>
@@ -1140,7 +1140,7 @@
         <w:fldChar w:fldCharType="begin"/>
       </w:r>
       <w:r>
-        <w:instrText xml:space="preserve"> HYPERLINK \l _Toc4730 </w:instrText>
+        <w:instrText xml:space="preserve"> HYPERLINK \l _Toc1906 </w:instrText>
       </w:r>
       <w:r>
         <w:fldChar w:fldCharType="separate"/>
@@ -1155,7 +1155,7 @@
         <w:fldChar w:fldCharType="begin"/>
       </w:r>
       <w:r>
-        <w:instrText xml:space="preserve"> PAGEREF _Toc4730 \h </w:instrText>
+        <w:instrText xml:space="preserve"> PAGEREF _Toc1906 \h </w:instrText>
       </w:r>
       <w:r>
         <w:fldChar w:fldCharType="separate"/>
@@ -1181,7 +1181,7 @@
         <w:fldChar w:fldCharType="begin"/>
       </w:r>
       <w:r>
-        <w:instrText xml:space="preserve"> HYPERLINK \l _Toc6802 </w:instrText>
+        <w:instrText xml:space="preserve"> HYPERLINK \l _Toc8814 </w:instrText>
       </w:r>
       <w:r>
         <w:fldChar w:fldCharType="separate"/>
@@ -1196,7 +1196,7 @@
         <w:fldChar w:fldCharType="begin"/>
       </w:r>
       <w:r>
-        <w:instrText xml:space="preserve"> PAGEREF _Toc6802 \h </w:instrText>
+        <w:instrText xml:space="preserve"> PAGEREF _Toc8814 \h </w:instrText>
       </w:r>
       <w:r>
         <w:fldChar w:fldCharType="separate"/>
@@ -1222,7 +1222,7 @@
         <w:fldChar w:fldCharType="begin"/>
       </w:r>
       <w:r>
-        <w:instrText xml:space="preserve"> HYPERLINK \l _Toc25443 </w:instrText>
+        <w:instrText xml:space="preserve"> HYPERLINK \l _Toc32204 </w:instrText>
       </w:r>
       <w:r>
         <w:fldChar w:fldCharType="separate"/>
@@ -1237,7 +1237,7 @@
         <w:fldChar w:fldCharType="begin"/>
       </w:r>
       <w:r>
-        <w:instrText xml:space="preserve"> PAGEREF _Toc25443 \h </w:instrText>
+        <w:instrText xml:space="preserve"> PAGEREF _Toc32204 \h </w:instrText>
       </w:r>
       <w:r>
         <w:fldChar w:fldCharType="separate"/>
@@ -1263,7 +1263,7 @@
         <w:fldChar w:fldCharType="begin"/>
       </w:r>
       <w:r>
-        <w:instrText xml:space="preserve"> HYPERLINK \l _Toc26520 </w:instrText>
+        <w:instrText xml:space="preserve"> HYPERLINK \l _Toc3948 </w:instrText>
       </w:r>
       <w:r>
         <w:fldChar w:fldCharType="separate"/>
@@ -1278,7 +1278,7 @@
         <w:fldChar w:fldCharType="begin"/>
       </w:r>
       <w:r>
-        <w:instrText xml:space="preserve"> PAGEREF _Toc26520 \h </w:instrText>
+        <w:instrText xml:space="preserve"> PAGEREF _Toc3948 \h </w:instrText>
       </w:r>
       <w:r>
         <w:fldChar w:fldCharType="separate"/>
@@ -1304,7 +1304,7 @@
         <w:fldChar w:fldCharType="begin"/>
       </w:r>
       <w:r>
-        <w:instrText xml:space="preserve"> HYPERLINK \l _Toc31021 </w:instrText>
+        <w:instrText xml:space="preserve"> HYPERLINK \l _Toc13651 </w:instrText>
       </w:r>
       <w:r>
         <w:fldChar w:fldCharType="separate"/>
@@ -1319,7 +1319,7 @@
         <w:fldChar w:fldCharType="begin"/>
       </w:r>
       <w:r>
-        <w:instrText xml:space="preserve"> PAGEREF _Toc31021 \h </w:instrText>
+        <w:instrText xml:space="preserve"> PAGEREF _Toc13651 \h </w:instrText>
       </w:r>
       <w:r>
         <w:fldChar w:fldCharType="separate"/>
@@ -1345,7 +1345,7 @@
         <w:fldChar w:fldCharType="begin"/>
       </w:r>
       <w:r>
-        <w:instrText xml:space="preserve"> HYPERLINK \l _Toc31549 </w:instrText>
+        <w:instrText xml:space="preserve"> HYPERLINK \l _Toc8572 </w:instrText>
       </w:r>
       <w:r>
         <w:fldChar w:fldCharType="separate"/>
@@ -1360,7 +1360,7 @@
         <w:fldChar w:fldCharType="begin"/>
       </w:r>
       <w:r>
-        <w:instrText xml:space="preserve"> PAGEREF _Toc31549 \h </w:instrText>
+        <w:instrText xml:space="preserve"> PAGEREF _Toc8572 \h </w:instrText>
       </w:r>
       <w:r>
         <w:fldChar w:fldCharType="separate"/>
@@ -1386,7 +1386,7 @@
         <w:fldChar w:fldCharType="begin"/>
       </w:r>
       <w:r>
-        <w:instrText xml:space="preserve"> HYPERLINK \l _Toc23633 </w:instrText>
+        <w:instrText xml:space="preserve"> HYPERLINK \l _Toc14550 </w:instrText>
       </w:r>
       <w:r>
         <w:fldChar w:fldCharType="separate"/>
@@ -1401,7 +1401,7 @@
         <w:fldChar w:fldCharType="begin"/>
       </w:r>
       <w:r>
-        <w:instrText xml:space="preserve"> PAGEREF _Toc23633 \h </w:instrText>
+        <w:instrText xml:space="preserve"> PAGEREF _Toc14550 \h </w:instrText>
       </w:r>
       <w:r>
         <w:fldChar w:fldCharType="separate"/>
@@ -1427,7 +1427,7 @@
         <w:fldChar w:fldCharType="begin"/>
       </w:r>
       <w:r>
-        <w:instrText xml:space="preserve"> HYPERLINK \l _Toc8254 </w:instrText>
+        <w:instrText xml:space="preserve"> HYPERLINK \l _Toc16123 </w:instrText>
       </w:r>
       <w:r>
         <w:fldChar w:fldCharType="separate"/>
@@ -1442,7 +1442,7 @@
         <w:fldChar w:fldCharType="begin"/>
       </w:r>
       <w:r>
-        <w:instrText xml:space="preserve"> PAGEREF _Toc8254 \h </w:instrText>
+        <w:instrText xml:space="preserve"> PAGEREF _Toc16123 \h </w:instrText>
       </w:r>
       <w:r>
         <w:fldChar w:fldCharType="separate"/>
@@ -1468,7 +1468,7 @@
         <w:fldChar w:fldCharType="begin"/>
       </w:r>
       <w:r>
-        <w:instrText xml:space="preserve"> HYPERLINK \l _Toc2092 </w:instrText>
+        <w:instrText xml:space="preserve"> HYPERLINK \l _Toc26849 </w:instrText>
       </w:r>
       <w:r>
         <w:fldChar w:fldCharType="separate"/>
@@ -1483,7 +1483,7 @@
         <w:fldChar w:fldCharType="begin"/>
       </w:r>
       <w:r>
-        <w:instrText xml:space="preserve"> PAGEREF _Toc2092 \h </w:instrText>
+        <w:instrText xml:space="preserve"> PAGEREF _Toc26849 \h </w:instrText>
       </w:r>
       <w:r>
         <w:fldChar w:fldCharType="separate"/>
@@ -1509,7 +1509,7 @@
         <w:fldChar w:fldCharType="begin"/>
       </w:r>
       <w:r>
-        <w:instrText xml:space="preserve"> HYPERLINK \l _Toc14767 </w:instrText>
+        <w:instrText xml:space="preserve"> HYPERLINK \l _Toc4958 </w:instrText>
       </w:r>
       <w:r>
         <w:fldChar w:fldCharType="separate"/>
@@ -1524,7 +1524,7 @@
         <w:fldChar w:fldCharType="begin"/>
       </w:r>
       <w:r>
-        <w:instrText xml:space="preserve"> PAGEREF _Toc14767 \h </w:instrText>
+        <w:instrText xml:space="preserve"> PAGEREF _Toc4958 \h </w:instrText>
       </w:r>
       <w:r>
         <w:fldChar w:fldCharType="separate"/>
@@ -1550,7 +1550,7 @@
         <w:fldChar w:fldCharType="begin"/>
       </w:r>
       <w:r>
-        <w:instrText xml:space="preserve"> HYPERLINK \l _Toc7153 </w:instrText>
+        <w:instrText xml:space="preserve"> HYPERLINK \l _Toc17353 </w:instrText>
       </w:r>
       <w:r>
         <w:fldChar w:fldCharType="separate"/>
@@ -1565,7 +1565,7 @@
         <w:fldChar w:fldCharType="begin"/>
       </w:r>
       <w:r>
-        <w:instrText xml:space="preserve"> PAGEREF _Toc7153 \h </w:instrText>
+        <w:instrText xml:space="preserve"> PAGEREF _Toc17353 \h </w:instrText>
       </w:r>
       <w:r>
         <w:fldChar w:fldCharType="separate"/>
@@ -1591,7 +1591,7 @@
         <w:fldChar w:fldCharType="begin"/>
       </w:r>
       <w:r>
-        <w:instrText xml:space="preserve"> HYPERLINK \l _Toc14526 </w:instrText>
+        <w:instrText xml:space="preserve"> HYPERLINK \l _Toc27025 </w:instrText>
       </w:r>
       <w:r>
         <w:fldChar w:fldCharType="separate"/>
@@ -1606,7 +1606,7 @@
         <w:fldChar w:fldCharType="begin"/>
       </w:r>
       <w:r>
-        <w:instrText xml:space="preserve"> PAGEREF _Toc14526 \h </w:instrText>
+        <w:instrText xml:space="preserve"> PAGEREF _Toc27025 \h </w:instrText>
       </w:r>
       <w:r>
         <w:fldChar w:fldCharType="separate"/>
@@ -1632,7 +1632,7 @@
         <w:fldChar w:fldCharType="begin"/>
       </w:r>
       <w:r>
-        <w:instrText xml:space="preserve"> HYPERLINK \l _Toc24522 </w:instrText>
+        <w:instrText xml:space="preserve"> HYPERLINK \l _Toc16139 </w:instrText>
       </w:r>
       <w:r>
         <w:fldChar w:fldCharType="separate"/>
@@ -1647,7 +1647,7 @@
         <w:fldChar w:fldCharType="begin"/>
       </w:r>
       <w:r>
-        <w:instrText xml:space="preserve"> PAGEREF _Toc24522 \h </w:instrText>
+        <w:instrText xml:space="preserve"> PAGEREF _Toc16139 \h </w:instrText>
       </w:r>
       <w:r>
         <w:fldChar w:fldCharType="separate"/>
@@ -1673,7 +1673,7 @@
         <w:fldChar w:fldCharType="begin"/>
       </w:r>
       <w:r>
-        <w:instrText xml:space="preserve"> HYPERLINK \l _Toc22974 </w:instrText>
+        <w:instrText xml:space="preserve"> HYPERLINK \l _Toc26203 </w:instrText>
       </w:r>
       <w:r>
         <w:fldChar w:fldCharType="separate"/>
@@ -1688,7 +1688,7 @@
         <w:fldChar w:fldCharType="begin"/>
       </w:r>
       <w:r>
-        <w:instrText xml:space="preserve"> PAGEREF _Toc22974 \h </w:instrText>
+        <w:instrText xml:space="preserve"> PAGEREF _Toc26203 \h </w:instrText>
       </w:r>
       <w:r>
         <w:fldChar w:fldCharType="separate"/>
@@ -1714,7 +1714,7 @@
         <w:fldChar w:fldCharType="begin"/>
       </w:r>
       <w:r>
-        <w:instrText xml:space="preserve"> HYPERLINK \l _Toc10318 </w:instrText>
+        <w:instrText xml:space="preserve"> HYPERLINK \l _Toc17573 </w:instrText>
       </w:r>
       <w:r>
         <w:fldChar w:fldCharType="separate"/>
@@ -1729,7 +1729,7 @@
         <w:fldChar w:fldCharType="begin"/>
       </w:r>
       <w:r>
-        <w:instrText xml:space="preserve"> PAGEREF _Toc10318 \h </w:instrText>
+        <w:instrText xml:space="preserve"> PAGEREF _Toc17573 \h </w:instrText>
       </w:r>
       <w:r>
         <w:fldChar w:fldCharType="separate"/>
@@ -1755,7 +1755,7 @@
         <w:fldChar w:fldCharType="begin"/>
       </w:r>
       <w:r>
-        <w:instrText xml:space="preserve"> HYPERLINK \l _Toc10825 </w:instrText>
+        <w:instrText xml:space="preserve"> HYPERLINK \l _Toc2757 </w:instrText>
       </w:r>
       <w:r>
         <w:fldChar w:fldCharType="separate"/>
@@ -1770,7 +1770,7 @@
         <w:fldChar w:fldCharType="begin"/>
       </w:r>
       <w:r>
-        <w:instrText xml:space="preserve"> PAGEREF _Toc10825 \h </w:instrText>
+        <w:instrText xml:space="preserve"> PAGEREF _Toc2757 \h </w:instrText>
       </w:r>
       <w:r>
         <w:fldChar w:fldCharType="separate"/>
@@ -1796,7 +1796,7 @@
         <w:fldChar w:fldCharType="begin"/>
       </w:r>
       <w:r>
-        <w:instrText xml:space="preserve"> HYPERLINK \l _Toc12933 </w:instrText>
+        <w:instrText xml:space="preserve"> HYPERLINK \l _Toc15455 </w:instrText>
       </w:r>
       <w:r>
         <w:fldChar w:fldCharType="separate"/>
@@ -1811,7 +1811,7 @@
         <w:fldChar w:fldCharType="begin"/>
       </w:r>
       <w:r>
-        <w:instrText xml:space="preserve"> PAGEREF _Toc12933 \h </w:instrText>
+        <w:instrText xml:space="preserve"> PAGEREF _Toc15455 \h </w:instrText>
       </w:r>
       <w:r>
         <w:fldChar w:fldCharType="separate"/>
@@ -1837,7 +1837,7 @@
         <w:fldChar w:fldCharType="begin"/>
       </w:r>
       <w:r>
-        <w:instrText xml:space="preserve"> HYPERLINK \l _Toc10684 </w:instrText>
+        <w:instrText xml:space="preserve"> HYPERLINK \l _Toc26326 </w:instrText>
       </w:r>
       <w:r>
         <w:fldChar w:fldCharType="separate"/>
@@ -1852,7 +1852,7 @@
         <w:fldChar w:fldCharType="begin"/>
       </w:r>
       <w:r>
-        <w:instrText xml:space="preserve"> PAGEREF _Toc10684 \h </w:instrText>
+        <w:instrText xml:space="preserve"> PAGEREF _Toc26326 \h </w:instrText>
       </w:r>
       <w:r>
         <w:fldChar w:fldCharType="separate"/>
@@ -1878,7 +1878,7 @@
         <w:fldChar w:fldCharType="begin"/>
       </w:r>
       <w:r>
-        <w:instrText xml:space="preserve"> HYPERLINK \l _Toc9473 </w:instrText>
+        <w:instrText xml:space="preserve"> HYPERLINK \l _Toc2066 </w:instrText>
       </w:r>
       <w:r>
         <w:fldChar w:fldCharType="separate"/>
@@ -1893,7 +1893,7 @@
         <w:fldChar w:fldCharType="begin"/>
       </w:r>
       <w:r>
-        <w:instrText xml:space="preserve"> PAGEREF _Toc9473 \h </w:instrText>
+        <w:instrText xml:space="preserve"> PAGEREF _Toc2066 \h </w:instrText>
       </w:r>
       <w:r>
         <w:fldChar w:fldCharType="separate"/>
@@ -1919,7 +1919,7 @@
         <w:fldChar w:fldCharType="begin"/>
       </w:r>
       <w:r>
-        <w:instrText xml:space="preserve"> HYPERLINK \l _Toc7779 </w:instrText>
+        <w:instrText xml:space="preserve"> HYPERLINK \l _Toc26409 </w:instrText>
       </w:r>
       <w:r>
         <w:fldChar w:fldCharType="separate"/>
@@ -1934,7 +1934,7 @@
         <w:fldChar w:fldCharType="begin"/>
       </w:r>
       <w:r>
-        <w:instrText xml:space="preserve"> PAGEREF _Toc7779 \h </w:instrText>
+        <w:instrText xml:space="preserve"> PAGEREF _Toc26409 \h </w:instrText>
       </w:r>
       <w:r>
         <w:fldChar w:fldCharType="separate"/>
@@ -1960,7 +1960,7 @@
         <w:fldChar w:fldCharType="begin"/>
       </w:r>
       <w:r>
-        <w:instrText xml:space="preserve"> HYPERLINK \l _Toc1757 </w:instrText>
+        <w:instrText xml:space="preserve"> HYPERLINK \l _Toc21362 </w:instrText>
       </w:r>
       <w:r>
         <w:fldChar w:fldCharType="separate"/>
@@ -1975,7 +1975,7 @@
         <w:fldChar w:fldCharType="begin"/>
       </w:r>
       <w:r>
-        <w:instrText xml:space="preserve"> PAGEREF _Toc1757 \h </w:instrText>
+        <w:instrText xml:space="preserve"> PAGEREF _Toc21362 \h </w:instrText>
       </w:r>
       <w:r>
         <w:fldChar w:fldCharType="separate"/>
@@ -2001,7 +2001,7 @@
         <w:fldChar w:fldCharType="begin"/>
       </w:r>
       <w:r>
-        <w:instrText xml:space="preserve"> HYPERLINK \l _Toc19708 </w:instrText>
+        <w:instrText xml:space="preserve"> HYPERLINK \l _Toc15392 </w:instrText>
       </w:r>
       <w:r>
         <w:fldChar w:fldCharType="separate"/>
@@ -2016,7 +2016,7 @@
         <w:fldChar w:fldCharType="begin"/>
       </w:r>
       <w:r>
-        <w:instrText xml:space="preserve"> PAGEREF _Toc19708 \h </w:instrText>
+        <w:instrText xml:space="preserve"> PAGEREF _Toc15392 \h </w:instrText>
       </w:r>
       <w:r>
         <w:fldChar w:fldCharType="separate"/>
@@ -2042,7 +2042,7 @@
         <w:fldChar w:fldCharType="begin"/>
       </w:r>
       <w:r>
-        <w:instrText xml:space="preserve"> HYPERLINK \l _Toc17316 </w:instrText>
+        <w:instrText xml:space="preserve"> HYPERLINK \l _Toc23273 </w:instrText>
       </w:r>
       <w:r>
         <w:fldChar w:fldCharType="separate"/>
@@ -2057,7 +2057,7 @@
         <w:fldChar w:fldCharType="begin"/>
       </w:r>
       <w:r>
-        <w:instrText xml:space="preserve"> PAGEREF _Toc17316 \h </w:instrText>
+        <w:instrText xml:space="preserve"> PAGEREF _Toc23273 \h </w:instrText>
       </w:r>
       <w:r>
         <w:fldChar w:fldCharType="separate"/>
@@ -2083,7 +2083,7 @@
         <w:fldChar w:fldCharType="begin"/>
       </w:r>
       <w:r>
-        <w:instrText xml:space="preserve"> HYPERLINK \l _Toc28044 </w:instrText>
+        <w:instrText xml:space="preserve"> HYPERLINK \l _Toc4035 </w:instrText>
       </w:r>
       <w:r>
         <w:fldChar w:fldCharType="separate"/>
@@ -2098,7 +2098,7 @@
         <w:fldChar w:fldCharType="begin"/>
       </w:r>
       <w:r>
-        <w:instrText xml:space="preserve"> PAGEREF _Toc28044 \h </w:instrText>
+        <w:instrText xml:space="preserve"> PAGEREF _Toc4035 \h </w:instrText>
       </w:r>
       <w:r>
         <w:fldChar w:fldCharType="separate"/>
@@ -2124,7 +2124,7 @@
         <w:fldChar w:fldCharType="begin"/>
       </w:r>
       <w:r>
-        <w:instrText xml:space="preserve"> HYPERLINK \l _Toc19303 </w:instrText>
+        <w:instrText xml:space="preserve"> HYPERLINK \l _Toc10882 </w:instrText>
       </w:r>
       <w:r>
         <w:fldChar w:fldCharType="separate"/>
@@ -2139,7 +2139,7 @@
         <w:fldChar w:fldCharType="begin"/>
       </w:r>
       <w:r>
-        <w:instrText xml:space="preserve"> PAGEREF _Toc19303 \h </w:instrText>
+        <w:instrText xml:space="preserve"> PAGEREF _Toc10882 \h </w:instrText>
       </w:r>
       <w:r>
         <w:fldChar w:fldCharType="separate"/>
@@ -2165,7 +2165,7 @@
         <w:fldChar w:fldCharType="begin"/>
       </w:r>
       <w:r>
-        <w:instrText xml:space="preserve"> HYPERLINK \l _Toc20371 </w:instrText>
+        <w:instrText xml:space="preserve"> HYPERLINK \l _Toc10128 </w:instrText>
       </w:r>
       <w:r>
         <w:fldChar w:fldCharType="separate"/>
@@ -2180,7 +2180,7 @@
         <w:fldChar w:fldCharType="begin"/>
       </w:r>
       <w:r>
-        <w:instrText xml:space="preserve"> PAGEREF _Toc20371 \h </w:instrText>
+        <w:instrText xml:space="preserve"> PAGEREF _Toc10128 \h </w:instrText>
       </w:r>
       <w:r>
         <w:fldChar w:fldCharType="separate"/>
@@ -2206,7 +2206,7 @@
         <w:fldChar w:fldCharType="begin"/>
       </w:r>
       <w:r>
-        <w:instrText xml:space="preserve"> HYPERLINK \l _Toc6282 </w:instrText>
+        <w:instrText xml:space="preserve"> HYPERLINK \l _Toc7414 </w:instrText>
       </w:r>
       <w:r>
         <w:fldChar w:fldCharType="separate"/>
@@ -2221,7 +2221,7 @@
         <w:fldChar w:fldCharType="begin"/>
       </w:r>
       <w:r>
-        <w:instrText xml:space="preserve"> PAGEREF _Toc6282 \h </w:instrText>
+        <w:instrText xml:space="preserve"> PAGEREF _Toc7414 \h </w:instrText>
       </w:r>
       <w:r>
         <w:fldChar w:fldCharType="separate"/>
@@ -2247,7 +2247,7 @@
         <w:fldChar w:fldCharType="begin"/>
       </w:r>
       <w:r>
-        <w:instrText xml:space="preserve"> HYPERLINK \l _Toc28960 </w:instrText>
+        <w:instrText xml:space="preserve"> HYPERLINK \l _Toc14785 </w:instrText>
       </w:r>
       <w:r>
         <w:fldChar w:fldCharType="separate"/>
@@ -2262,7 +2262,7 @@
         <w:fldChar w:fldCharType="begin"/>
       </w:r>
       <w:r>
-        <w:instrText xml:space="preserve"> PAGEREF _Toc28960 \h </w:instrText>
+        <w:instrText xml:space="preserve"> PAGEREF _Toc14785 \h </w:instrText>
       </w:r>
       <w:r>
         <w:fldChar w:fldCharType="separate"/>
@@ -2288,7 +2288,7 @@
         <w:fldChar w:fldCharType="begin"/>
       </w:r>
       <w:r>
-        <w:instrText xml:space="preserve"> HYPERLINK \l _Toc28957 </w:instrText>
+        <w:instrText xml:space="preserve"> HYPERLINK \l _Toc25690 </w:instrText>
       </w:r>
       <w:r>
         <w:fldChar w:fldCharType="separate"/>
@@ -2303,7 +2303,7 @@
         <w:fldChar w:fldCharType="begin"/>
       </w:r>
       <w:r>
-        <w:instrText xml:space="preserve"> PAGEREF _Toc28957 \h </w:instrText>
+        <w:instrText xml:space="preserve"> PAGEREF _Toc25690 \h </w:instrText>
       </w:r>
       <w:r>
         <w:fldChar w:fldCharType="separate"/>
@@ -2329,7 +2329,7 @@
         <w:fldChar w:fldCharType="begin"/>
       </w:r>
       <w:r>
-        <w:instrText xml:space="preserve"> HYPERLINK \l _Toc10076 </w:instrText>
+        <w:instrText xml:space="preserve"> HYPERLINK \l _Toc14806 </w:instrText>
       </w:r>
       <w:r>
         <w:fldChar w:fldCharType="separate"/>
@@ -2344,7 +2344,7 @@
         <w:fldChar w:fldCharType="begin"/>
       </w:r>
       <w:r>
-        <w:instrText xml:space="preserve"> PAGEREF _Toc10076 \h </w:instrText>
+        <w:instrText xml:space="preserve"> PAGEREF _Toc14806 \h </w:instrText>
       </w:r>
       <w:r>
         <w:fldChar w:fldCharType="separate"/>
@@ -2370,7 +2370,7 @@
         <w:fldChar w:fldCharType="begin"/>
       </w:r>
       <w:r>
-        <w:instrText xml:space="preserve"> HYPERLINK \l _Toc10157 </w:instrText>
+        <w:instrText xml:space="preserve"> HYPERLINK \l _Toc28925 </w:instrText>
       </w:r>
       <w:r>
         <w:fldChar w:fldCharType="separate"/>
@@ -2385,7 +2385,7 @@
         <w:fldChar w:fldCharType="begin"/>
       </w:r>
       <w:r>
-        <w:instrText xml:space="preserve"> PAGEREF _Toc10157 \h </w:instrText>
+        <w:instrText xml:space="preserve"> PAGEREF _Toc28925 \h </w:instrText>
       </w:r>
       <w:r>
         <w:fldChar w:fldCharType="separate"/>
@@ -2411,7 +2411,7 @@
         <w:fldChar w:fldCharType="begin"/>
       </w:r>
       <w:r>
-        <w:instrText xml:space="preserve"> HYPERLINK \l _Toc11388 </w:instrText>
+        <w:instrText xml:space="preserve"> HYPERLINK \l _Toc15976 </w:instrText>
       </w:r>
       <w:r>
         <w:fldChar w:fldCharType="separate"/>
@@ -2426,7 +2426,7 @@
         <w:fldChar w:fldCharType="begin"/>
       </w:r>
       <w:r>
-        <w:instrText xml:space="preserve"> PAGEREF _Toc11388 \h </w:instrText>
+        <w:instrText xml:space="preserve"> PAGEREF _Toc15976 \h </w:instrText>
       </w:r>
       <w:r>
         <w:fldChar w:fldCharType="separate"/>
@@ -2452,7 +2452,7 @@
         <w:fldChar w:fldCharType="begin"/>
       </w:r>
       <w:r>
-        <w:instrText xml:space="preserve"> HYPERLINK \l _Toc32760 </w:instrText>
+        <w:instrText xml:space="preserve"> HYPERLINK \l _Toc28790 </w:instrText>
       </w:r>
       <w:r>
         <w:fldChar w:fldCharType="separate"/>
@@ -2467,7 +2467,7 @@
         <w:fldChar w:fldCharType="begin"/>
       </w:r>
       <w:r>
-        <w:instrText xml:space="preserve"> PAGEREF _Toc32760 \h </w:instrText>
+        <w:instrText xml:space="preserve"> PAGEREF _Toc28790 \h </w:instrText>
       </w:r>
       <w:r>
         <w:fldChar w:fldCharType="separate"/>
@@ -2493,7 +2493,7 @@
         <w:fldChar w:fldCharType="begin"/>
       </w:r>
       <w:r>
-        <w:instrText xml:space="preserve"> HYPERLINK \l _Toc17983 </w:instrText>
+        <w:instrText xml:space="preserve"> HYPERLINK \l _Toc29324 </w:instrText>
       </w:r>
       <w:r>
         <w:fldChar w:fldCharType="separate"/>
@@ -2508,13 +2508,54 @@
         <w:fldChar w:fldCharType="begin"/>
       </w:r>
       <w:r>
-        <w:instrText xml:space="preserve"> PAGEREF _Toc17983 \h </w:instrText>
+        <w:instrText xml:space="preserve"> PAGEREF _Toc29324 \h </w:instrText>
       </w:r>
       <w:r>
         <w:fldChar w:fldCharType="separate"/>
       </w:r>
       <w:r>
         <w:t>26</w:t>
+      </w:r>
+      <w:r>
+        <w:fldChar w:fldCharType="end"/>
+      </w:r>
+      <w:r>
+        <w:fldChar w:fldCharType="end"/>
+      </w:r>
+    </w:p>
+    <w:p>
+      <w:pPr>
+        <w:pStyle w:val="38"/>
+        <w:tabs>
+          <w:tab w:val="right" w:leader="dot" w:pos="9412"/>
+        </w:tabs>
+      </w:pPr>
+      <w:r>
+        <w:fldChar w:fldCharType="begin"/>
+      </w:r>
+      <w:r>
+        <w:instrText xml:space="preserve"> HYPERLINK \l _Toc11770 </w:instrText>
+      </w:r>
+      <w:r>
+        <w:fldChar w:fldCharType="separate"/>
+      </w:r>
+      <w:r>
+        <w:t>9.4 APK builds</w:t>
+      </w:r>
+      <w:r>
+        <w:tab/>
+      </w:r>
+      <w:r>
+        <w:fldChar w:fldCharType="begin"/>
+      </w:r>
+      <w:r>
+        <w:instrText xml:space="preserve"> PAGEREF _Toc11770 \h </w:instrText>
+      </w:r>
+      <w:r>
+        <w:fldChar w:fldCharType="separate"/>
+      </w:r>
+      <w:r>
+        <w:t>27</w:t>
       </w:r>
       <w:r>
         <w:fldChar w:fldCharType="end"/>
@@ -2534,7 +2575,7 @@
         <w:fldChar w:fldCharType="begin"/>
       </w:r>
       <w:r>
-        <w:instrText xml:space="preserve"> HYPERLINK \l _Toc15848 </w:instrText>
+        <w:instrText xml:space="preserve"> HYPERLINK \l _Toc22350 </w:instrText>
       </w:r>
       <w:r>
         <w:fldChar w:fldCharType="separate"/>
@@ -2549,7 +2590,7 @@
         <w:fldChar w:fldCharType="begin"/>
       </w:r>
       <w:r>
-        <w:instrText xml:space="preserve"> PAGEREF _Toc15848 \h </w:instrText>
+        <w:instrText xml:space="preserve"> PAGEREF _Toc22350 \h </w:instrText>
       </w:r>
       <w:r>
         <w:fldChar w:fldCharType="separate"/>
@@ -2575,7 +2616,7 @@
         <w:fldChar w:fldCharType="begin"/>
       </w:r>
       <w:r>
-        <w:instrText xml:space="preserve"> HYPERLINK \l _Toc4450 </w:instrText>
+        <w:instrText xml:space="preserve"> HYPERLINK \l _Toc9832 </w:instrText>
       </w:r>
       <w:r>
         <w:fldChar w:fldCharType="separate"/>
@@ -2590,13 +2631,13 @@
         <w:fldChar w:fldCharType="begin"/>
       </w:r>
       <w:r>
-        <w:instrText xml:space="preserve"> PAGEREF _Toc4450 \h </w:instrText>
+        <w:instrText xml:space="preserve"> PAGEREF _Toc9832 \h </w:instrText>
       </w:r>
       <w:r>
         <w:fldChar w:fldCharType="separate"/>
       </w:r>
       <w:r>
-        <w:t>27</w:t>
+        <w:t>28</w:t>
       </w:r>
       <w:r>
         <w:fldChar w:fldCharType="end"/>
@@ -2616,7 +2657,7 @@
         <w:fldChar w:fldCharType="begin"/>
       </w:r>
       <w:r>
-        <w:instrText xml:space="preserve"> HYPERLINK \l _Toc22977 </w:instrText>
+        <w:instrText xml:space="preserve"> HYPERLINK \l _Toc32270 </w:instrText>
       </w:r>
       <w:r>
         <w:fldChar w:fldCharType="separate"/>
@@ -2631,13 +2672,13 @@
         <w:fldChar w:fldCharType="begin"/>
       </w:r>
       <w:r>
-        <w:instrText xml:space="preserve"> PAGEREF _Toc22977 \h </w:instrText>
+        <w:instrText xml:space="preserve"> PAGEREF _Toc32270 \h </w:instrText>
       </w:r>
       <w:r>
         <w:fldChar w:fldCharType="separate"/>
       </w:r>
       <w:r>
-        <w:t>27</w:t>
+        <w:t>28</w:t>
       </w:r>
       <w:r>
         <w:fldChar w:fldCharType="end"/>
@@ -2657,7 +2698,7 @@
         <w:fldChar w:fldCharType="begin"/>
       </w:r>
       <w:r>
-        <w:instrText xml:space="preserve"> HYPERLINK \l _Toc8626 </w:instrText>
+        <w:instrText xml:space="preserve"> HYPERLINK \l _Toc30125 </w:instrText>
       </w:r>
       <w:r>
         <w:fldChar w:fldCharType="separate"/>
@@ -2672,7 +2713,7 @@
         <w:fldChar w:fldCharType="begin"/>
       </w:r>
       <w:r>
-        <w:instrText xml:space="preserve"> PAGEREF _Toc8626 \h </w:instrText>
+        <w:instrText xml:space="preserve"> PAGEREF _Toc30125 \h </w:instrText>
       </w:r>
       <w:r>
         <w:fldChar w:fldCharType="separate"/>
@@ -2698,7 +2739,7 @@
         <w:fldChar w:fldCharType="begin"/>
       </w:r>
       <w:r>
-        <w:instrText xml:space="preserve"> HYPERLINK \l _Toc27239 </w:instrText>
+        <w:instrText xml:space="preserve"> HYPERLINK \l _Toc27337 </w:instrText>
       </w:r>
       <w:r>
         <w:fldChar w:fldCharType="separate"/>
@@ -2713,7 +2754,7 @@
         <w:fldChar w:fldCharType="begin"/>
       </w:r>
       <w:r>
-        <w:instrText xml:space="preserve"> PAGEREF _Toc27239 \h </w:instrText>
+        <w:instrText xml:space="preserve"> PAGEREF _Toc27337 \h </w:instrText>
       </w:r>
       <w:r>
         <w:fldChar w:fldCharType="separate"/>
@@ -2739,7 +2780,7 @@
         <w:fldChar w:fldCharType="begin"/>
       </w:r>
       <w:r>
-        <w:instrText xml:space="preserve"> HYPERLINK \l _Toc25503 </w:instrText>
+        <w:instrText xml:space="preserve"> HYPERLINK \l _Toc12410 </w:instrText>
       </w:r>
       <w:r>
         <w:fldChar w:fldCharType="separate"/>
@@ -2754,13 +2795,13 @@
         <w:fldChar w:fldCharType="begin"/>
       </w:r>
       <w:r>
-        <w:instrText xml:space="preserve"> PAGEREF _Toc25503 \h </w:instrText>
+        <w:instrText xml:space="preserve"> PAGEREF _Toc12410 \h </w:instrText>
       </w:r>
       <w:r>
         <w:fldChar w:fldCharType="separate"/>
       </w:r>
       <w:r>
-        <w:t>28</w:t>
+        <w:t>29</w:t>
       </w:r>
       <w:r>
         <w:fldChar w:fldCharType="end"/>
@@ -2780,7 +2821,7 @@
         <w:fldChar w:fldCharType="begin"/>
       </w:r>
       <w:r>
-        <w:instrText xml:space="preserve"> HYPERLINK \l _Toc7972 </w:instrText>
+        <w:instrText xml:space="preserve"> HYPERLINK \l _Toc1420 </w:instrText>
       </w:r>
       <w:r>
         <w:fldChar w:fldCharType="separate"/>
@@ -2795,13 +2836,13 @@
         <w:fldChar w:fldCharType="begin"/>
       </w:r>
       <w:r>
-        <w:instrText xml:space="preserve"> PAGEREF _Toc7972 \h </w:instrText>
+        <w:instrText xml:space="preserve"> PAGEREF _Toc1420 \h </w:instrText>
       </w:r>
       <w:r>
         <w:fldChar w:fldCharType="separate"/>
       </w:r>
       <w:r>
-        <w:t>28</w:t>
+        <w:t>29</w:t>
       </w:r>
       <w:r>
         <w:fldChar w:fldCharType="end"/>
@@ -2821,7 +2862,7 @@
         <w:fldChar w:fldCharType="begin"/>
       </w:r>
       <w:r>
-        <w:instrText xml:space="preserve"> HYPERLINK \l _Toc21375 </w:instrText>
+        <w:instrText xml:space="preserve"> HYPERLINK \l _Toc5206 </w:instrText>
       </w:r>
       <w:r>
         <w:fldChar w:fldCharType="separate"/>
@@ -2836,7 +2877,7 @@
         <w:fldChar w:fldCharType="begin"/>
       </w:r>
       <w:r>
-        <w:instrText xml:space="preserve"> PAGEREF _Toc21375 \h </w:instrText>
+        <w:instrText xml:space="preserve"> PAGEREF _Toc5206 \h </w:instrText>
       </w:r>
       <w:r>
         <w:fldChar w:fldCharType="separate"/>
@@ -2862,7 +2903,7 @@
         <w:fldChar w:fldCharType="begin"/>
       </w:r>
       <w:r>
-        <w:instrText xml:space="preserve"> HYPERLINK \l _Toc11355 </w:instrText>
+        <w:instrText xml:space="preserve"> HYPERLINK \l _Toc31911 </w:instrText>
       </w:r>
       <w:r>
         <w:fldChar w:fldCharType="separate"/>
@@ -2877,7 +2918,7 @@
         <w:fldChar w:fldCharType="begin"/>
       </w:r>
       <w:r>
-        <w:instrText xml:space="preserve"> PAGEREF _Toc11355 \h </w:instrText>
+        <w:instrText xml:space="preserve"> PAGEREF _Toc31911 \h </w:instrText>
       </w:r>
       <w:r>
         <w:fldChar w:fldCharType="separate"/>
@@ -2903,7 +2944,7 @@
         <w:fldChar w:fldCharType="begin"/>
       </w:r>
       <w:r>
-        <w:instrText xml:space="preserve"> HYPERLINK \l _Toc32746 </w:instrText>
+        <w:instrText xml:space="preserve"> HYPERLINK \l _Toc2453 </w:instrText>
       </w:r>
       <w:r>
         <w:fldChar w:fldCharType="separate"/>
@@ -2918,7 +2959,7 @@
         <w:fldChar w:fldCharType="begin"/>
       </w:r>
       <w:r>
-        <w:instrText xml:space="preserve"> PAGEREF _Toc32746 \h </w:instrText>
+        <w:instrText xml:space="preserve"> PAGEREF _Toc2453 \h </w:instrText>
       </w:r>
       <w:r>
         <w:fldChar w:fldCharType="separate"/>
@@ -2944,7 +2985,7 @@
         <w:fldChar w:fldCharType="begin"/>
       </w:r>
       <w:r>
-        <w:instrText xml:space="preserve"> HYPERLINK \l _Toc27398 </w:instrText>
+        <w:instrText xml:space="preserve"> HYPERLINK \l _Toc17757 </w:instrText>
       </w:r>
       <w:r>
         <w:fldChar w:fldCharType="separate"/>
@@ -2959,7 +3000,7 @@
         <w:fldChar w:fldCharType="begin"/>
       </w:r>
       <w:r>
-        <w:instrText xml:space="preserve"> PAGEREF _Toc27398 \h </w:instrText>
+        <w:instrText xml:space="preserve"> PAGEREF _Toc17757 \h </w:instrText>
       </w:r>
       <w:r>
         <w:fldChar w:fldCharType="separate"/>
@@ -2985,7 +3026,7 @@
         <w:fldChar w:fldCharType="begin"/>
       </w:r>
       <w:r>
-        <w:instrText xml:space="preserve"> HYPERLINK \l _Toc14280 </w:instrText>
+        <w:instrText xml:space="preserve"> HYPERLINK \l _Toc3518 </w:instrText>
       </w:r>
       <w:r>
         <w:fldChar w:fldCharType="separate"/>
@@ -3000,7 +3041,7 @@
         <w:fldChar w:fldCharType="begin"/>
       </w:r>
       <w:r>
-        <w:instrText xml:space="preserve"> PAGEREF _Toc14280 \h </w:instrText>
+        <w:instrText xml:space="preserve"> PAGEREF _Toc3518 \h </w:instrText>
       </w:r>
       <w:r>
         <w:fldChar w:fldCharType="separate"/>
@@ -3026,7 +3067,7 @@
         <w:fldChar w:fldCharType="begin"/>
       </w:r>
       <w:r>
-        <w:instrText xml:space="preserve"> HYPERLINK \l _Toc10482 </w:instrText>
+        <w:instrText xml:space="preserve"> HYPERLINK \l _Toc5919 </w:instrText>
       </w:r>
       <w:r>
         <w:fldChar w:fldCharType="separate"/>
@@ -3041,7 +3082,7 @@
         <w:fldChar w:fldCharType="begin"/>
       </w:r>
       <w:r>
-        <w:instrText xml:space="preserve"> PAGEREF _Toc10482 \h </w:instrText>
+        <w:instrText xml:space="preserve"> PAGEREF _Toc5919 \h </w:instrText>
       </w:r>
       <w:r>
         <w:fldChar w:fldCharType="separate"/>
@@ -3066,7 +3107,7 @@
         <w:pStyle w:val="2"/>
         <w:pageBreakBefore/>
       </w:pPr>
-      <w:bookmarkStart w:id="0" w:name="_Toc18442"/>
+      <w:bookmarkStart w:id="0" w:name="_Toc9710"/>
       <w:r>
         <w:t>1. Executive summary</w:t>
       </w:r>
@@ -4051,7 +4092,7 @@
         <w:pStyle w:val="2"/>
         <w:pageBreakBefore w:val="0"/>
       </w:pPr>
-      <w:bookmarkStart w:id="1" w:name="_Toc7585"/>
+      <w:bookmarkStart w:id="1" w:name="_Toc18566"/>
       <w:r>
         <w:t>2. Project background and scope</w:t>
       </w:r>
@@ -4137,7 +4178,7 @@
         <w:pStyle w:val="2"/>
         <w:pageBreakBefore w:val="0"/>
       </w:pPr>
-      <w:bookmarkStart w:id="2" w:name="_Toc30418"/>
+      <w:bookmarkStart w:id="2" w:name="_Toc11336"/>
       <w:r>
         <w:t>3. System architecture</w:t>
       </w:r>
@@ -4147,7 +4188,7 @@
       <w:pPr>
         <w:pStyle w:val="3"/>
       </w:pPr>
-      <w:bookmarkStart w:id="3" w:name="_Toc16334"/>
+      <w:bookmarkStart w:id="3" w:name="_Toc12689"/>
       <w:r>
         <w:t>3.1 Overview</w:t>
       </w:r>
@@ -4695,7 +4736,7 @@
       <w:pPr>
         <w:pStyle w:val="3"/>
       </w:pPr>
-      <w:bookmarkStart w:id="4" w:name="_Toc32737"/>
+      <w:bookmarkStart w:id="4" w:name="_Toc5752"/>
       <w:r>
         <w:t>3.2 What happens when a user taps a button</w:t>
       </w:r>
@@ -4857,7 +4898,7 @@
       <w:pPr>
         <w:pStyle w:val="3"/>
       </w:pPr>
-      <w:bookmarkStart w:id="5" w:name="_Toc25737"/>
+      <w:bookmarkStart w:id="5" w:name="_Toc13866"/>
       <w:r>
         <w:t>3.3 API reference</w:t>
       </w:r>
@@ -8548,7 +8589,7 @@
       <w:pPr>
         <w:pStyle w:val="3"/>
       </w:pPr>
-      <w:bookmarkStart w:id="6" w:name="_Toc9756"/>
+      <w:bookmarkStart w:id="6" w:name="_Toc9682"/>
       <w:r>
         <w:t>3.4 Privacy, safety and security design</w:t>
       </w:r>
@@ -8613,7 +8654,7 @@
       <w:pPr>
         <w:pStyle w:val="3"/>
       </w:pPr>
-      <w:bookmarkStart w:id="7" w:name="_Toc14386"/>
+      <w:bookmarkStart w:id="7" w:name="_Toc31949"/>
       <w:r>
         <w:t>3.5 Repository layout</w:t>
       </w:r>
@@ -9157,7 +9198,7 @@
         <w:pStyle w:val="2"/>
         <w:pageBreakBefore w:val="0"/>
       </w:pPr>
-      <w:bookmarkStart w:id="8" w:name="_Toc19758"/>
+      <w:bookmarkStart w:id="8" w:name="_Toc3954"/>
       <w:r>
         <w:t>4. Mobile application in detail</w:t>
       </w:r>
@@ -9167,7 +9208,7 @@
       <w:pPr>
         <w:pStyle w:val="3"/>
       </w:pPr>
-      <w:bookmarkStart w:id="9" w:name="_Toc32108"/>
+      <w:bookmarkStart w:id="9" w:name="_Toc13427"/>
       <w:r>
         <w:t>4.1 Technology</w:t>
       </w:r>
@@ -9756,7 +9797,7 @@
       <w:pPr>
         <w:pStyle w:val="3"/>
       </w:pPr>
-      <w:bookmarkStart w:id="10" w:name="_Toc27728"/>
+      <w:bookmarkStart w:id="10" w:name="_Toc911"/>
       <w:r>
         <w:t>4.2 Screens</w:t>
       </w:r>
@@ -10295,7 +10336,7 @@
       <w:pPr>
         <w:pStyle w:val="3"/>
       </w:pPr>
-      <w:bookmarkStart w:id="11" w:name="_Toc31041"/>
+      <w:bookmarkStart w:id="11" w:name="_Toc7441"/>
       <w:r>
         <w:t>4.3 State and data flow</w:t>
       </w:r>
@@ -10716,7 +10757,7 @@
       <w:pPr>
         <w:pStyle w:val="3"/>
       </w:pPr>
-      <w:bookmarkStart w:id="12" w:name="_Toc31811"/>
+      <w:bookmarkStart w:id="12" w:name="_Toc14462"/>
       <w:r>
         <w:t>4.4 PCOS assessment flow</w:t>
       </w:r>
@@ -10769,7 +10810,7 @@
       <w:pPr>
         <w:pStyle w:val="3"/>
       </w:pPr>
-      <w:bookmarkStart w:id="13" w:name="_Toc4524"/>
+      <w:bookmarkStart w:id="13" w:name="_Toc30988"/>
       <w:r>
         <w:t>4.5 Breast health flow</w:t>
       </w:r>
@@ -10874,7 +10915,7 @@
       <w:pPr>
         <w:pStyle w:val="3"/>
       </w:pPr>
-      <w:bookmarkStart w:id="14" w:name="_Toc25176"/>
+      <w:bookmarkStart w:id="14" w:name="_Toc24270"/>
       <w:r>
         <w:t>4.6 Breast self-exam and the monthly reminder</w:t>
       </w:r>
@@ -10948,7 +10989,7 @@
       <w:pPr>
         <w:pStyle w:val="3"/>
       </w:pPr>
-      <w:bookmarkStart w:id="15" w:name="_Toc14605"/>
+      <w:bookmarkStart w:id="15" w:name="_Toc22393"/>
       <w:r>
         <w:t>4.7 Server address setting</w:t>
       </w:r>
@@ -10967,7 +11008,7 @@
       <w:pPr>
         <w:pStyle w:val="3"/>
       </w:pPr>
-      <w:bookmarkStart w:id="16" w:name="_Toc10359"/>
+      <w:bookmarkStart w:id="16" w:name="_Toc20246"/>
       <w:r>
         <w:t>4.8 Android configuration</w:t>
       </w:r>
@@ -11013,7 +11054,7 @@
       <w:pPr>
         <w:pStyle w:val="3"/>
       </w:pPr>
-      <w:bookmarkStart w:id="17" w:name="_Toc22157"/>
+      <w:bookmarkStart w:id="17" w:name="_Toc25880"/>
       <w:r>
         <w:t>4.9 Automated tests</w:t>
       </w:r>
@@ -12003,7 +12044,7 @@
         <w:pStyle w:val="2"/>
         <w:pageBreakBefore w:val="0"/>
       </w:pPr>
-      <w:bookmarkStart w:id="18" w:name="_Toc4730"/>
+      <w:bookmarkStart w:id="18" w:name="_Toc1906"/>
       <w:r>
         <w:t>5. PCOS risk model</w:t>
       </w:r>
@@ -12022,7 +12063,7 @@
       <w:pPr>
         <w:pStyle w:val="3"/>
       </w:pPr>
-      <w:bookmarkStart w:id="19" w:name="_Toc6802"/>
+      <w:bookmarkStart w:id="19" w:name="_Toc8814"/>
       <w:r>
         <w:t>5.1 Data and preparation</w:t>
       </w:r>
@@ -12089,7 +12130,7 @@
       <w:pPr>
         <w:pStyle w:val="3"/>
       </w:pPr>
-      <w:bookmarkStart w:id="20" w:name="_Toc25443"/>
+      <w:bookmarkStart w:id="20" w:name="_Toc32204"/>
       <w:r>
         <w:t>5.2 Features and constraints</w:t>
       </w:r>
@@ -13361,7 +13402,7 @@
       <w:pPr>
         <w:pStyle w:val="3"/>
       </w:pPr>
-      <w:bookmarkStart w:id="21" w:name="_Toc26520"/>
+      <w:bookmarkStart w:id="21" w:name="_Toc3948"/>
       <w:r>
         <w:t>5.3 Model and training</w:t>
       </w:r>
@@ -13904,7 +13945,7 @@
       <w:pPr>
         <w:pStyle w:val="3"/>
       </w:pPr>
-      <w:bookmarkStart w:id="22" w:name="_Toc31021"/>
+      <w:bookmarkStart w:id="22" w:name="_Toc13651"/>
       <w:r>
         <w:t>5.4 Results</w:t>
       </w:r>
@@ -15822,7 +15863,7 @@
       <w:pPr>
         <w:pStyle w:val="3"/>
       </w:pPr>
-      <w:bookmarkStart w:id="23" w:name="_Toc31549"/>
+      <w:bookmarkStart w:id="23" w:name="_Toc8572"/>
       <w:r>
         <w:t>5.5 How the app uses it</w:t>
       </w:r>
@@ -15882,7 +15923,7 @@
       <w:pPr>
         <w:pStyle w:val="3"/>
       </w:pPr>
-      <w:bookmarkStart w:id="24" w:name="_Toc23633"/>
+      <w:bookmarkStart w:id="24" w:name="_Toc14550"/>
       <w:r>
         <w:t>5.6 Limitations</w:t>
       </w:r>
@@ -15929,7 +15970,7 @@
         <w:pStyle w:val="2"/>
         <w:pageBreakBefore w:val="0"/>
       </w:pPr>
-      <w:bookmarkStart w:id="25" w:name="_Toc8254"/>
+      <w:bookmarkStart w:id="25" w:name="_Toc16123"/>
       <w:r>
         <w:t>6. Breast ultrasound classifier (component A)</w:t>
       </w:r>
@@ -15939,7 +15980,7 @@
       <w:pPr>
         <w:pStyle w:val="3"/>
       </w:pPr>
-      <w:bookmarkStart w:id="26" w:name="_Toc2092"/>
+      <w:bookmarkStart w:id="26" w:name="_Toc26849"/>
       <w:r>
         <w:t>6.1 What it does</w:t>
       </w:r>
@@ -15958,7 +15999,7 @@
       <w:pPr>
         <w:pStyle w:val="3"/>
       </w:pPr>
-      <w:bookmarkStart w:id="27" w:name="_Toc14767"/>
+      <w:bookmarkStart w:id="27" w:name="_Toc4958"/>
       <w:r>
         <w:t>6.2 Datasets</w:t>
       </w:r>
@@ -16656,14 +16697,6 @@
       </w:tblGrid>
       <w:tr>
         <w:tblPrEx>
-          <w:tblBorders>
-            <w:top w:val="single" w:color="D9C3CC" w:sz="4" w:space="0"/>
-            <w:left w:val="single" w:color="D9C3CC" w:sz="4" w:space="0"/>
-            <w:bottom w:val="single" w:color="D9C3CC" w:sz="4" w:space="0"/>
-            <w:right w:val="single" w:color="D9C3CC" w:sz="4" w:space="0"/>
-            <w:insideH w:val="single" w:color="D9C3CC" w:sz="4" w:space="0"/>
-            <w:insideV w:val="single" w:color="D9C3CC" w:sz="4" w:space="0"/>
-          </w:tblBorders>
           <w:tblCellMar>
             <w:top w:w="50" w:type="dxa"/>
             <w:left w:w="90" w:type="dxa"/>
@@ -18323,7 +18356,7 @@
       <w:pPr>
         <w:pStyle w:val="3"/>
       </w:pPr>
-      <w:bookmarkStart w:id="28" w:name="_Toc7153"/>
+      <w:bookmarkStart w:id="28" w:name="_Toc17353"/>
       <w:r>
         <w:t>6.3 Data-quality decisions</w:t>
       </w:r>
@@ -18447,7 +18480,7 @@
       <w:pPr>
         <w:pStyle w:val="3"/>
       </w:pPr>
-      <w:bookmarkStart w:id="29" w:name="_Toc14526"/>
+      <w:bookmarkStart w:id="29" w:name="_Toc27025"/>
       <w:r>
         <w:t>6.4 Method and settings</w:t>
       </w:r>
@@ -19436,6 +19469,12 @@
             <w:insideH w:val="single" w:color="D9C3CC" w:sz="4" w:space="0"/>
             <w:insideV w:val="single" w:color="D9C3CC" w:sz="4" w:space="0"/>
           </w:tblBorders>
+          <w:tblCellMar>
+            <w:top w:w="50" w:type="dxa"/>
+            <w:left w:w="90" w:type="dxa"/>
+            <w:bottom w:w="50" w:type="dxa"/>
+            <w:right w:w="90" w:type="dxa"/>
+          </w:tblCellMar>
         </w:tblPrEx>
         <w:trPr>
           <w:tblHeader/>
@@ -20083,7 +20122,7 @@
       <w:pPr>
         <w:pStyle w:val="3"/>
       </w:pPr>
-      <w:bookmarkStart w:id="30" w:name="_Toc24522"/>
+      <w:bookmarkStart w:id="30" w:name="_Toc16139"/>
       <w:r>
         <w:t>6.5 Selecting the recipe by cross-validation</w:t>
       </w:r>
@@ -22234,7 +22273,7 @@
       <w:pPr>
         <w:pStyle w:val="3"/>
       </w:pPr>
-      <w:bookmarkStart w:id="31" w:name="_Toc22974"/>
+      <w:bookmarkStart w:id="31" w:name="_Toc26203"/>
       <w:r>
         <w:t>6.6 Calibration, threshold and export</w:t>
       </w:r>
@@ -22320,7 +22359,7 @@
       <w:pPr>
         <w:pStyle w:val="3"/>
       </w:pPr>
-      <w:bookmarkStart w:id="32" w:name="_Toc10318"/>
+      <w:bookmarkStart w:id="32" w:name="_Toc17573"/>
       <w:r>
         <w:t>6.7 Model versions</w:t>
       </w:r>
@@ -22780,7 +22819,7 @@
       <w:pPr>
         <w:pStyle w:val="3"/>
       </w:pPr>
-      <w:bookmarkStart w:id="33" w:name="_Toc10825"/>
+      <w:bookmarkStart w:id="33" w:name="_Toc2757"/>
       <w:r>
         <w:t>6.8 Results</w:t>
       </w:r>
@@ -23530,14 +23569,6 @@
       </w:tblGrid>
       <w:tr>
         <w:tblPrEx>
-          <w:tblBorders>
-            <w:top w:val="single" w:color="D9C3CC" w:sz="4" w:space="0"/>
-            <w:left w:val="single" w:color="D9C3CC" w:sz="4" w:space="0"/>
-            <w:bottom w:val="single" w:color="D9C3CC" w:sz="4" w:space="0"/>
-            <w:right w:val="single" w:color="D9C3CC" w:sz="4" w:space="0"/>
-            <w:insideH w:val="single" w:color="D9C3CC" w:sz="4" w:space="0"/>
-            <w:insideV w:val="single" w:color="D9C3CC" w:sz="4" w:space="0"/>
-          </w:tblBorders>
           <w:tblCellMar>
             <w:top w:w="50" w:type="dxa"/>
             <w:left w:w="90" w:type="dxa"/>
@@ -26917,14 +26948,6 @@
       </w:tblGrid>
       <w:tr>
         <w:tblPrEx>
-          <w:tblBorders>
-            <w:top w:val="single" w:color="D9C3CC" w:sz="4" w:space="0"/>
-            <w:left w:val="single" w:color="D9C3CC" w:sz="4" w:space="0"/>
-            <w:bottom w:val="single" w:color="D9C3CC" w:sz="4" w:space="0"/>
-            <w:right w:val="single" w:color="D9C3CC" w:sz="4" w:space="0"/>
-            <w:insideH w:val="single" w:color="D9C3CC" w:sz="4" w:space="0"/>
-            <w:insideV w:val="single" w:color="D9C3CC" w:sz="4" w:space="0"/>
-          </w:tblBorders>
           <w:tblCellMar>
             <w:top w:w="50" w:type="dxa"/>
             <w:left w:w="90" w:type="dxa"/>
@@ -28752,7 +28775,7 @@
       <w:pPr>
         <w:pStyle w:val="3"/>
       </w:pPr>
-      <w:bookmarkStart w:id="34" w:name="_Toc12933"/>
+      <w:bookmarkStart w:id="34" w:name="_Toc15455"/>
       <w:r>
         <w:t>6.9 Rejecting uploads that are not breast ultrasounds</w:t>
       </w:r>
@@ -29686,7 +29709,7 @@
       <w:pPr>
         <w:pStyle w:val="3"/>
       </w:pPr>
-      <w:bookmarkStart w:id="35" w:name="_Toc10684"/>
+      <w:bookmarkStart w:id="35" w:name="_Toc26326"/>
       <w:r>
         <w:t>6.10 The screening threshold decision</w:t>
       </w:r>
@@ -30318,7 +30341,7 @@
       <w:pPr>
         <w:pStyle w:val="3"/>
       </w:pPr>
-      <w:bookmarkStart w:id="36" w:name="_Toc9473"/>
+      <w:bookmarkStart w:id="36" w:name="_Toc2066"/>
       <w:r>
         <w:t>6.11 Explainability</w:t>
       </w:r>
@@ -30397,7 +30420,7 @@
       <w:pPr>
         <w:pStyle w:val="3"/>
       </w:pPr>
-      <w:bookmarkStart w:id="37" w:name="_Toc7779"/>
+      <w:bookmarkStart w:id="37" w:name="_Toc26409"/>
       <w:r>
         <w:t>6.12 Limitations</w:t>
       </w:r>
@@ -30480,7 +30503,7 @@
         <w:pStyle w:val="2"/>
         <w:pageBreakBefore w:val="0"/>
       </w:pPr>
-      <w:bookmarkStart w:id="38" w:name="_Toc1757"/>
+      <w:bookmarkStart w:id="38" w:name="_Toc21362"/>
       <w:r>
         <w:t>7. Breast cancer risk questionnaire (component B)</w:t>
       </w:r>
@@ -30490,7 +30513,7 @@
       <w:pPr>
         <w:pStyle w:val="3"/>
       </w:pPr>
-      <w:bookmarkStart w:id="39" w:name="_Toc19708"/>
+      <w:bookmarkStart w:id="39" w:name="_Toc15392"/>
       <w:r>
         <w:t>7.1 Data and design</w:t>
       </w:r>
@@ -30604,7 +30627,7 @@
       <w:pPr>
         <w:pStyle w:val="3"/>
       </w:pPr>
-      <w:bookmarkStart w:id="40" w:name="_Toc17316"/>
+      <w:bookmarkStart w:id="40" w:name="_Toc23273"/>
       <w:r>
         <w:t>7.2 How answers become model inputs</w:t>
       </w:r>
@@ -31251,7 +31274,7 @@
       <w:pPr>
         <w:pStyle w:val="3"/>
       </w:pPr>
-      <w:bookmarkStart w:id="41" w:name="_Toc28044"/>
+      <w:bookmarkStart w:id="41" w:name="_Toc4035"/>
       <w:r>
         <w:t>7.3 Model settings</w:t>
       </w:r>
@@ -31840,7 +31863,7 @@
       <w:pPr>
         <w:pStyle w:val="3"/>
       </w:pPr>
-      <w:bookmarkStart w:id="42" w:name="_Toc19303"/>
+      <w:bookmarkStart w:id="42" w:name="_Toc10882"/>
       <w:r>
         <w:t>7.4 Results</w:t>
       </w:r>
@@ -33630,7 +33653,7 @@
       <w:pPr>
         <w:pStyle w:val="3"/>
       </w:pPr>
-      <w:bookmarkStart w:id="43" w:name="_Toc20371"/>
+      <w:bookmarkStart w:id="43" w:name="_Toc10128"/>
       <w:r>
         <w:t>7.5 What the user sees and why</w:t>
       </w:r>
@@ -34406,7 +34429,7 @@
       <w:pPr>
         <w:pStyle w:val="3"/>
       </w:pPr>
-      <w:bookmarkStart w:id="44" w:name="_Toc6282"/>
+      <w:bookmarkStart w:id="44" w:name="_Toc7414"/>
       <w:r>
         <w:t>7.6 Behaviour check through the API</w:t>
       </w:r>
@@ -35360,7 +35383,7 @@
       <w:pPr>
         <w:pStyle w:val="3"/>
       </w:pPr>
-      <w:bookmarkStart w:id="45" w:name="_Toc28960"/>
+      <w:bookmarkStart w:id="45" w:name="_Toc14785"/>
       <w:r>
         <w:t>7.7 Deviation from the scope document</w:t>
       </w:r>
@@ -35379,7 +35402,7 @@
       <w:pPr>
         <w:pStyle w:val="3"/>
       </w:pPr>
-      <w:bookmarkStart w:id="46" w:name="_Toc28957"/>
+      <w:bookmarkStart w:id="46" w:name="_Toc25690"/>
       <w:r>
         <w:t>7.8 Limitations</w:t>
       </w:r>
@@ -35426,7 +35449,7 @@
         <w:pStyle w:val="2"/>
         <w:pageBreakBefore w:val="0"/>
       </w:pPr>
-      <w:bookmarkStart w:id="47" w:name="_Toc10076"/>
+      <w:bookmarkStart w:id="47" w:name="_Toc14806"/>
       <w:r>
         <w:t>8. Other parts of the breast module</w:t>
       </w:r>
@@ -35494,7 +35517,7 @@
         <w:pStyle w:val="2"/>
         <w:pageBreakBefore w:val="0"/>
       </w:pPr>
-      <w:bookmarkStart w:id="48" w:name="_Toc10157"/>
+      <w:bookmarkStart w:id="48" w:name="_Toc28925"/>
       <w:r>
         <w:t>9. Deployment and demo build</w:t>
       </w:r>
@@ -35504,7 +35527,7 @@
       <w:pPr>
         <w:pStyle w:val="3"/>
       </w:pPr>
-      <w:bookmarkStart w:id="49" w:name="_Toc11388"/>
+      <w:bookmarkStart w:id="49" w:name="_Toc15976"/>
       <w:r>
         <w:t>9.1 Hosting options considered</w:t>
       </w:r>
@@ -35865,7 +35888,7 @@
       <w:pPr>
         <w:pStyle w:val="3"/>
       </w:pPr>
-      <w:bookmarkStart w:id="50" w:name="_Toc32760"/>
+      <w:bookmarkStart w:id="50" w:name="_Toc28790"/>
       <w:r>
         <w:t>9.2 Demo procedure</w:t>
       </w:r>
@@ -35911,7 +35934,7 @@
       <w:pPr>
         <w:pStyle w:val="3"/>
       </w:pPr>
-      <w:bookmarkStart w:id="51" w:name="_Toc17983"/>
+      <w:bookmarkStart w:id="51" w:name="_Toc29324"/>
       <w:r>
         <w:t>9.3 Build environment and workarounds</w:t>
       </w:r>
@@ -36330,12 +36353,11 @@
     </w:p>
     <w:p>
       <w:pPr>
-        <w:pStyle w:val="2"/>
-        <w:pageBreakBefore w:val="0"/>
+        <w:pStyle w:val="3"/>
       </w:pPr>
-      <w:bookmarkStart w:id="52" w:name="_Toc15848"/>
-      <w:r>
-        <w:t>10. Verification and testing</w:t>
+      <w:bookmarkStart w:id="52" w:name="_Toc11770"/>
+      <w:r>
+        <w:t>9.4 APK builds</w:t>
       </w:r>
       <w:bookmarkEnd w:id="52"/>
     </w:p>
@@ -36350,7 +36372,316 @@
           <w:b w:val="0"/>
           <w:i w:val="0"/>
         </w:rPr>
-        <w:t>Table 46. Verification performed</w:t>
+        <w:t>Table 46. Release APK builds</w:t>
+      </w:r>
+    </w:p>
+    <w:tbl>
+      <w:tblPr>
+        <w:tblStyle w:val="12"/>
+        <w:tblW w:w="0" w:type="auto"/>
+        <w:jc w:val="center"/>
+        <w:tblBorders>
+          <w:top w:val="single" w:color="D9C3CC" w:sz="4" w:space="0"/>
+          <w:left w:val="single" w:color="D9C3CC" w:sz="4" w:space="0"/>
+          <w:bottom w:val="single" w:color="D9C3CC" w:sz="4" w:space="0"/>
+          <w:right w:val="single" w:color="D9C3CC" w:sz="4" w:space="0"/>
+          <w:insideH w:val="single" w:color="D9C3CC" w:sz="4" w:space="0"/>
+          <w:insideV w:val="single" w:color="D9C3CC" w:sz="4" w:space="0"/>
+        </w:tblBorders>
+        <w:tblLayout w:type="fixed"/>
+        <w:tblCellMar>
+          <w:top w:w="50" w:type="dxa"/>
+          <w:left w:w="90" w:type="dxa"/>
+          <w:bottom w:w="50" w:type="dxa"/>
+          <w:right w:w="90" w:type="dxa"/>
+        </w:tblCellMar>
+      </w:tblPr>
+      <w:tblGrid>
+        <w:gridCol w:w="1701"/>
+        <w:gridCol w:w="3175"/>
+        <w:gridCol w:w="4535"/>
+      </w:tblGrid>
+      <w:tr>
+        <w:tblPrEx>
+          <w:tblBorders>
+            <w:top w:val="single" w:color="D9C3CC" w:sz="4" w:space="0"/>
+            <w:left w:val="single" w:color="D9C3CC" w:sz="4" w:space="0"/>
+            <w:bottom w:val="single" w:color="D9C3CC" w:sz="4" w:space="0"/>
+            <w:right w:val="single" w:color="D9C3CC" w:sz="4" w:space="0"/>
+            <w:insideH w:val="single" w:color="D9C3CC" w:sz="4" w:space="0"/>
+            <w:insideV w:val="single" w:color="D9C3CC" w:sz="4" w:space="0"/>
+          </w:tblBorders>
+          <w:tblCellMar>
+            <w:top w:w="50" w:type="dxa"/>
+            <w:left w:w="90" w:type="dxa"/>
+            <w:bottom w:w="50" w:type="dxa"/>
+            <w:right w:w="90" w:type="dxa"/>
+          </w:tblCellMar>
+        </w:tblPrEx>
+        <w:trPr>
+          <w:tblHeader/>
+          <w:jc w:val="center"/>
+        </w:trPr>
+        <w:tc>
+          <w:tcPr>
+            <w:tcW w:w="1701" w:type="dxa"/>
+            <w:shd w:val="clear" w:color="auto" w:fill="9E1B46"/>
+          </w:tcPr>
+          <w:p>
+            <w:pPr>
+              <w:keepNext/>
+              <w:spacing w:after="0" w:line="240" w:lineRule="auto"/>
+            </w:pPr>
+            <w:r>
+              <w:rPr>
+                <w:b/>
+                <w:i w:val="0"/>
+                <w:color w:val="FFFFFF"/>
+                <w:sz w:val="17"/>
+              </w:rPr>
+              <w:t>Build</w:t>
+            </w:r>
+          </w:p>
+        </w:tc>
+        <w:tc>
+          <w:tcPr>
+            <w:tcW w:w="3175" w:type="dxa"/>
+            <w:shd w:val="clear" w:color="auto" w:fill="9E1B46"/>
+          </w:tcPr>
+          <w:p>
+            <w:pPr>
+              <w:keepNext/>
+              <w:spacing w:after="0" w:line="240" w:lineRule="auto"/>
+            </w:pPr>
+            <w:r>
+              <w:rPr>
+                <w:b/>
+                <w:i w:val="0"/>
+                <w:color w:val="FFFFFF"/>
+                <w:sz w:val="17"/>
+              </w:rPr>
+              <w:t>Source state</w:t>
+            </w:r>
+          </w:p>
+        </w:tc>
+        <w:tc>
+          <w:tcPr>
+            <w:tcW w:w="4535" w:type="dxa"/>
+            <w:shd w:val="clear" w:color="auto" w:fill="9E1B46"/>
+          </w:tcPr>
+          <w:p>
+            <w:pPr>
+              <w:keepNext/>
+              <w:spacing w:after="0" w:line="240" w:lineRule="auto"/>
+            </w:pPr>
+            <w:r>
+              <w:rPr>
+                <w:b/>
+                <w:i w:val="0"/>
+                <w:color w:val="FFFFFF"/>
+                <w:sz w:val="17"/>
+              </w:rPr>
+              <w:t>Result</w:t>
+            </w:r>
+          </w:p>
+        </w:tc>
+      </w:tr>
+      <w:tr>
+        <w:tblPrEx>
+          <w:tblBorders>
+            <w:top w:val="single" w:color="D9C3CC" w:sz="4" w:space="0"/>
+            <w:left w:val="single" w:color="D9C3CC" w:sz="4" w:space="0"/>
+            <w:bottom w:val="single" w:color="D9C3CC" w:sz="4" w:space="0"/>
+            <w:right w:val="single" w:color="D9C3CC" w:sz="4" w:space="0"/>
+            <w:insideH w:val="single" w:color="D9C3CC" w:sz="4" w:space="0"/>
+            <w:insideV w:val="single" w:color="D9C3CC" w:sz="4" w:space="0"/>
+          </w:tblBorders>
+          <w:tblCellMar>
+            <w:top w:w="50" w:type="dxa"/>
+            <w:left w:w="90" w:type="dxa"/>
+            <w:bottom w:w="50" w:type="dxa"/>
+            <w:right w:w="90" w:type="dxa"/>
+          </w:tblCellMar>
+        </w:tblPrEx>
+        <w:trPr>
+          <w:cantSplit/>
+          <w:jc w:val="center"/>
+        </w:trPr>
+        <w:tc>
+          <w:tcPr>
+            <w:tcW w:w="1701" w:type="dxa"/>
+          </w:tcPr>
+          <w:p>
+            <w:pPr>
+              <w:keepNext/>
+              <w:spacing w:after="0" w:line="240" w:lineRule="auto"/>
+            </w:pPr>
+            <w:r>
+              <w:rPr>
+                <w:b w:val="0"/>
+                <w:i w:val="0"/>
+                <w:sz w:val="17"/>
+              </w:rPr>
+              <w:t>1 (20 Sep 2026)</w:t>
+            </w:r>
+          </w:p>
+        </w:tc>
+        <w:tc>
+          <w:tcPr>
+            <w:tcW w:w="3175" w:type="dxa"/>
+          </w:tcPr>
+          <w:p>
+            <w:pPr>
+              <w:keepNext/>
+              <w:spacing w:after="0" w:line="240" w:lineRule="auto"/>
+            </w:pPr>
+            <w:r>
+              <w:rPr>
+                <w:b w:val="0"/>
+                <w:i w:val="0"/>
+                <w:sz w:val="17"/>
+              </w:rPr>
+              <w:t>Commit 6479090 (in-app server address setting added)</w:t>
+            </w:r>
+          </w:p>
+        </w:tc>
+        <w:tc>
+          <w:tcPr>
+            <w:tcW w:w="4535" w:type="dxa"/>
+          </w:tcPr>
+          <w:p>
+            <w:pPr>
+              <w:keepNext/>
+              <w:spacing w:after="0" w:line="240" w:lineRule="auto"/>
+            </w:pPr>
+            <w:r>
+              <w:rPr>
+                <w:b w:val="0"/>
+                <w:i w:val="0"/>
+                <w:sz w:val="17"/>
+              </w:rPr>
+              <w:t>app-release.apk, 19.0 MB (19,873,821 bytes), arm64-v8a, APK signature scheme v2 (debug key), SHA-256 starts 1e8848241c77dd1a. First build took about 13 minutes (cold Gradle cache)</w:t>
+            </w:r>
+          </w:p>
+        </w:tc>
+      </w:tr>
+      <w:tr>
+        <w:tblPrEx>
+          <w:tblBorders>
+            <w:top w:val="single" w:color="D9C3CC" w:sz="4" w:space="0"/>
+            <w:left w:val="single" w:color="D9C3CC" w:sz="4" w:space="0"/>
+            <w:bottom w:val="single" w:color="D9C3CC" w:sz="4" w:space="0"/>
+            <w:right w:val="single" w:color="D9C3CC" w:sz="4" w:space="0"/>
+            <w:insideH w:val="single" w:color="D9C3CC" w:sz="4" w:space="0"/>
+            <w:insideV w:val="single" w:color="D9C3CC" w:sz="4" w:space="0"/>
+          </w:tblBorders>
+          <w:tblCellMar>
+            <w:top w:w="50" w:type="dxa"/>
+            <w:left w:w="90" w:type="dxa"/>
+            <w:bottom w:w="50" w:type="dxa"/>
+            <w:right w:w="90" w:type="dxa"/>
+          </w:tblCellMar>
+        </w:tblPrEx>
+        <w:trPr>
+          <w:cantSplit/>
+          <w:jc w:val="center"/>
+        </w:trPr>
+        <w:tc>
+          <w:tcPr>
+            <w:tcW w:w="1701" w:type="dxa"/>
+            <w:shd w:val="clear" w:color="auto" w:fill="FBE9EF"/>
+          </w:tcPr>
+          <w:p>
+            <w:pPr>
+              <w:spacing w:after="0" w:line="240" w:lineRule="auto"/>
+            </w:pPr>
+            <w:r>
+              <w:rPr>
+                <w:b w:val="0"/>
+                <w:i w:val="0"/>
+                <w:sz w:val="17"/>
+              </w:rPr>
+              <w:t>2 (20 Sep 2026)</w:t>
+            </w:r>
+          </w:p>
+        </w:tc>
+        <w:tc>
+          <w:tcPr>
+            <w:tcW w:w="3175" w:type="dxa"/>
+            <w:shd w:val="clear" w:color="auto" w:fill="FBE9EF"/>
+          </w:tcPr>
+          <w:p>
+            <w:pPr>
+              <w:spacing w:after="0" w:line="240" w:lineRule="auto"/>
+            </w:pPr>
+            <w:r>
+              <w:rPr>
+                <w:b w:val="0"/>
+                <w:i w:val="0"/>
+                <w:sz w:val="17"/>
+              </w:rPr>
+              <w:t>Commit 8b0caf7 (only the report, README and scripts changed since build 1)</w:t>
+            </w:r>
+          </w:p>
+        </w:tc>
+        <w:tc>
+          <w:tcPr>
+            <w:tcW w:w="4535" w:type="dxa"/>
+            <w:shd w:val="clear" w:color="auto" w:fill="FBE9EF"/>
+          </w:tcPr>
+          <w:p>
+            <w:pPr>
+              <w:spacing w:after="0" w:line="240" w:lineRule="auto"/>
+            </w:pPr>
+            <w:r>
+              <w:rPr>
+                <w:b w:val="0"/>
+                <w:i w:val="0"/>
+                <w:sz w:val="17"/>
+              </w:rPr>
+              <w:t>Same size, same SHA-256: the rebuild is byte-for-byte identical, which confirms the APK matches the current app code. Took under one minute (warm cache)</w:t>
+            </w:r>
+          </w:p>
+        </w:tc>
+      </w:tr>
+    </w:tbl>
+    <w:p>
+      <w:pPr>
+        <w:spacing w:before="60" w:after="160"/>
+      </w:pPr>
+      <w:r>
+        <w:rPr>
+          <w:b w:val="0"/>
+          <w:i/>
+          <w:color w:val="555555"/>
+          <w:sz w:val="17"/>
+        </w:rPr>
+        <w:t>Both builds pass apksigner verification and request INTERNET, POST_NOTIFICATIONS, RECEIVE_BOOT_COMPLETED and VIBRATE. The file is copied to the user's Desktop as femora-release-arm64.apk. It has not yet been run on a physical phone.</w:t>
+      </w:r>
+    </w:p>
+    <w:p>
+      <w:pPr>
+        <w:pStyle w:val="2"/>
+        <w:pageBreakBefore w:val="0"/>
+      </w:pPr>
+      <w:bookmarkStart w:id="53" w:name="_Toc22350"/>
+      <w:r>
+        <w:t>10. Verification and testing</w:t>
+      </w:r>
+      <w:bookmarkEnd w:id="53"/>
+    </w:p>
+    <w:p>
+      <w:pPr>
+        <w:pStyle w:val="16"/>
+        <w:keepNext/>
+        <w:spacing w:before="160" w:after="60"/>
+      </w:pPr>
+      <w:r>
+        <w:rPr>
+          <w:b w:val="0"/>
+          <w:i w:val="0"/>
+        </w:rPr>
+        <w:t>Table 47. Verification performed</w:t>
       </w:r>
     </w:p>
     <w:tbl>
@@ -37134,7 +37465,7 @@
                 <w:i w:val="0"/>
                 <w:sz w:val="18"/>
               </w:rPr>
-              <w:t>Signature and permission check</w:t>
+              <w:t>Signature and permission check; second build compared by checksum</w:t>
             </w:r>
           </w:p>
         </w:tc>
@@ -37152,7 +37483,7 @@
                 <w:i w:val="0"/>
                 <w:sz w:val="18"/>
               </w:rPr>
-              <w:t>Verified; internet permission present</w:t>
+              <w:t>Verified; internet permission present; rebuild identical to the first build</w:t>
             </w:r>
           </w:p>
         </w:tc>
@@ -37184,21 +37515,21 @@
         <w:pStyle w:val="2"/>
         <w:pageBreakBefore w:val="0"/>
       </w:pPr>
-      <w:bookmarkStart w:id="53" w:name="_Toc4450"/>
+      <w:bookmarkStart w:id="54" w:name="_Toc9832"/>
       <w:r>
         <w:t>11. Limitations, ethics and risks</w:t>
       </w:r>
-      <w:bookmarkEnd w:id="53"/>
+      <w:bookmarkEnd w:id="54"/>
     </w:p>
     <w:p>
       <w:pPr>
         <w:pStyle w:val="3"/>
       </w:pPr>
-      <w:bookmarkStart w:id="54" w:name="_Toc22977"/>
+      <w:bookmarkStart w:id="55" w:name="_Toc32270"/>
       <w:r>
         <w:t>11.1 Failure modes and mitigations</w:t>
       </w:r>
-      <w:bookmarkEnd w:id="54"/>
+      <w:bookmarkEnd w:id="55"/>
     </w:p>
     <w:p>
       <w:pPr>
@@ -37211,7 +37542,7 @@
           <w:b w:val="0"/>
           <w:i w:val="0"/>
         </w:rPr>
-        <w:t>Table 47. Failure modes</w:t>
+        <w:t>Table 48. Failure modes</w:t>
       </w:r>
     </w:p>
     <w:tbl>
@@ -37243,14 +37574,6 @@
       </w:tblGrid>
       <w:tr>
         <w:tblPrEx>
-          <w:tblBorders>
-            <w:top w:val="single" w:color="D9C3CC" w:sz="4" w:space="0"/>
-            <w:left w:val="single" w:color="D9C3CC" w:sz="4" w:space="0"/>
-            <w:bottom w:val="single" w:color="D9C3CC" w:sz="4" w:space="0"/>
-            <w:right w:val="single" w:color="D9C3CC" w:sz="4" w:space="0"/>
-            <w:insideH w:val="single" w:color="D9C3CC" w:sz="4" w:space="0"/>
-            <w:insideV w:val="single" w:color="D9C3CC" w:sz="4" w:space="0"/>
-          </w:tblBorders>
           <w:tblCellMar>
             <w:top w:w="50" w:type="dxa"/>
             <w:left w:w="90" w:type="dxa"/>
@@ -38051,114 +38374,9 @@
       <w:pPr>
         <w:pStyle w:val="3"/>
       </w:pPr>
-      <w:bookmarkStart w:id="55" w:name="_Toc8626"/>
+      <w:bookmarkStart w:id="56" w:name="_Toc30125"/>
       <w:r>
         <w:t>11.2 Ethical and legal points</w:t>
-      </w:r>
-      <w:bookmarkEnd w:id="55"/>
-    </w:p>
-    <w:p>
-      <w:pPr>
-        <w:pStyle w:val="23"/>
-      </w:pPr>
-      <w:r>
-        <w:rPr>
-          <w:b/>
-          <w:i w:val="0"/>
-        </w:rPr>
-        <w:t>Not a medical device.</w:t>
-      </w:r>
-      <w:r>
-        <w:rPr>
-          <w:b w:val="0"/>
-          <w:i w:val="0"/>
-        </w:rPr>
-        <w:t xml:space="preserve"> Femora offers awareness and risk information. Using it as a diagnostic tool would require clinical validation and regulatory approval that this project does not claim.</w:t>
-      </w:r>
-    </w:p>
-    <w:p>
-      <w:pPr>
-        <w:pStyle w:val="23"/>
-      </w:pPr>
-      <w:r>
-        <w:rPr>
-          <w:b/>
-          <w:i w:val="0"/>
-        </w:rPr>
-        <w:t>Bias and representation.</w:t>
-      </w:r>
-      <w:r>
-        <w:rPr>
-          <w:b w:val="0"/>
-          <w:i w:val="0"/>
-        </w:rPr>
-        <w:t xml:space="preserve"> The ultrasound data comes from Egypt, Poland and Brazil and the risk data from the United States. None is from Pakistan, the intended users, so performance there is unknown. This is stated in the report and should be in the app's about screen.</w:t>
-      </w:r>
-    </w:p>
-    <w:p>
-      <w:pPr>
-        <w:pStyle w:val="23"/>
-      </w:pPr>
-      <w:r>
-        <w:rPr>
-          <w:b/>
-          <w:i w:val="0"/>
-        </w:rPr>
-        <w:t>Privacy.</w:t>
-      </w:r>
-      <w:r>
-        <w:rPr>
-          <w:b w:val="0"/>
-          <w:i w:val="0"/>
-        </w:rPr>
-        <w:t xml:space="preserve"> Scans and answers are processed in memory and not stored server-side. Images travel to a server, so real deployment needs HTTPS, a trusted host, a privacy notice and user consent. The demo tunnel passes traffic through Cloudflare.</w:t>
-      </w:r>
-    </w:p>
-    <w:p>
-      <w:pPr>
-        <w:pStyle w:val="23"/>
-      </w:pPr>
-      <w:r>
-        <w:rPr>
-          <w:b/>
-          <w:i w:val="0"/>
-        </w:rPr>
-        <w:t>Data terms.</w:t>
-      </w:r>
-      <w:r>
-        <w:rPr>
-          <w:b w:val="0"/>
-          <w:i w:val="0"/>
-        </w:rPr>
-        <w:t xml:space="preserve"> BUS-BRA requires citation; BCSC requires the funding citation and its redistribution terms are not spelled out, so the private Kaggle copy must not be made public without checking them.</w:t>
-      </w:r>
-    </w:p>
-    <w:p>
-      <w:pPr>
-        <w:pStyle w:val="23"/>
-      </w:pPr>
-      <w:r>
-        <w:rPr>
-          <w:b/>
-          <w:i w:val="0"/>
-        </w:rPr>
-        <w:t>Fairness of communication.</w:t>
-      </w:r>
-      <w:r>
-        <w:rPr>
-          <w:b w:val="0"/>
-          <w:i w:val="0"/>
-        </w:rPr>
-        <w:t xml:space="preserve"> Results avoid diagnostic words, always recommend a doctor and present uncertainty (calibrated probabilities, honest accuracy).</w:t>
-      </w:r>
-    </w:p>
-    <w:p>
-      <w:pPr>
-        <w:pStyle w:val="3"/>
-      </w:pPr>
-      <w:bookmarkStart w:id="56" w:name="_Toc27239"/>
-      <w:r>
-        <w:t>11.3 Other limitations</w:t>
       </w:r>
       <w:bookmarkEnd w:id="56"/>
     </w:p>
@@ -38171,6 +38389,111 @@
           <w:b/>
           <w:i w:val="0"/>
         </w:rPr>
+        <w:t>Not a medical device.</w:t>
+      </w:r>
+      <w:r>
+        <w:rPr>
+          <w:b w:val="0"/>
+          <w:i w:val="0"/>
+        </w:rPr>
+        <w:t xml:space="preserve"> Femora offers awareness and risk information. Using it as a diagnostic tool would require clinical validation and regulatory approval that this project does not claim.</w:t>
+      </w:r>
+    </w:p>
+    <w:p>
+      <w:pPr>
+        <w:pStyle w:val="23"/>
+      </w:pPr>
+      <w:r>
+        <w:rPr>
+          <w:b/>
+          <w:i w:val="0"/>
+        </w:rPr>
+        <w:t>Bias and representation.</w:t>
+      </w:r>
+      <w:r>
+        <w:rPr>
+          <w:b w:val="0"/>
+          <w:i w:val="0"/>
+        </w:rPr>
+        <w:t xml:space="preserve"> The ultrasound data comes from Egypt, Poland and Brazil and the risk data from the United States. None is from Pakistan, the intended users, so performance there is unknown. This is stated in the report and should be in the app's about screen.</w:t>
+      </w:r>
+    </w:p>
+    <w:p>
+      <w:pPr>
+        <w:pStyle w:val="23"/>
+      </w:pPr>
+      <w:r>
+        <w:rPr>
+          <w:b/>
+          <w:i w:val="0"/>
+        </w:rPr>
+        <w:t>Privacy.</w:t>
+      </w:r>
+      <w:r>
+        <w:rPr>
+          <w:b w:val="0"/>
+          <w:i w:val="0"/>
+        </w:rPr>
+        <w:t xml:space="preserve"> Scans and answers are processed in memory and not stored server-side. Images travel to a server, so real deployment needs HTTPS, a trusted host, a privacy notice and user consent. The demo tunnel passes traffic through Cloudflare.</w:t>
+      </w:r>
+    </w:p>
+    <w:p>
+      <w:pPr>
+        <w:pStyle w:val="23"/>
+      </w:pPr>
+      <w:r>
+        <w:rPr>
+          <w:b/>
+          <w:i w:val="0"/>
+        </w:rPr>
+        <w:t>Data terms.</w:t>
+      </w:r>
+      <w:r>
+        <w:rPr>
+          <w:b w:val="0"/>
+          <w:i w:val="0"/>
+        </w:rPr>
+        <w:t xml:space="preserve"> BUS-BRA requires citation; BCSC requires the funding citation and its redistribution terms are not spelled out, so the private Kaggle copy must not be made public without checking them.</w:t>
+      </w:r>
+    </w:p>
+    <w:p>
+      <w:pPr>
+        <w:pStyle w:val="23"/>
+      </w:pPr>
+      <w:r>
+        <w:rPr>
+          <w:b/>
+          <w:i w:val="0"/>
+        </w:rPr>
+        <w:t>Fairness of communication.</w:t>
+      </w:r>
+      <w:r>
+        <w:rPr>
+          <w:b w:val="0"/>
+          <w:i w:val="0"/>
+        </w:rPr>
+        <w:t xml:space="preserve"> Results avoid diagnostic words, always recommend a doctor and present uncertainty (calibrated probabilities, honest accuracy).</w:t>
+      </w:r>
+    </w:p>
+    <w:p>
+      <w:pPr>
+        <w:pStyle w:val="3"/>
+      </w:pPr>
+      <w:bookmarkStart w:id="57" w:name="_Toc27337"/>
+      <w:r>
+        <w:t>11.3 Other limitations</w:t>
+      </w:r>
+      <w:bookmarkEnd w:id="57"/>
+    </w:p>
+    <w:p>
+      <w:pPr>
+        <w:pStyle w:val="23"/>
+      </w:pPr>
+      <w:r>
+        <w:rPr>
+          <w:b/>
+          <w:i w:val="0"/>
+        </w:rPr>
         <w:t>Test-set tuning.</w:t>
       </w:r>
       <w:r>
@@ -38243,11 +38566,11 @@
         <w:pStyle w:val="2"/>
         <w:pageBreakBefore w:val="0"/>
       </w:pPr>
-      <w:bookmarkStart w:id="57" w:name="_Toc25503"/>
+      <w:bookmarkStart w:id="58" w:name="_Toc12410"/>
       <w:r>
         <w:t>12. Remaining work and recommended order</w:t>
       </w:r>
-      <w:bookmarkEnd w:id="57"/>
+      <w:bookmarkEnd w:id="58"/>
     </w:p>
     <w:p>
       <w:pPr>
@@ -38260,7 +38583,7 @@
           <w:b w:val="0"/>
           <w:i w:val="0"/>
         </w:rPr>
-        <w:t>Table 48. Suggested plan</w:t>
+        <w:t>Table 49. Suggested plan</w:t>
       </w:r>
     </w:p>
     <w:tbl>
@@ -38944,11 +39267,11 @@
         <w:pStyle w:val="2"/>
         <w:pageBreakBefore w:val="0"/>
       </w:pPr>
-      <w:bookmarkStart w:id="58" w:name="_Toc7972"/>
+      <w:bookmarkStart w:id="59" w:name="_Toc1420"/>
       <w:r>
         <w:t>13. Conclusion</w:t>
       </w:r>
-      <w:bookmarkEnd w:id="58"/>
+      <w:bookmarkEnd w:id="59"/>
     </w:p>
     <w:p>
       <w:r>
@@ -38964,11 +39287,11 @@
         <w:pStyle w:val="2"/>
         <w:pageBreakBefore/>
       </w:pPr>
-      <w:bookmarkStart w:id="59" w:name="_Toc21375"/>
+      <w:bookmarkStart w:id="60" w:name="_Toc5206"/>
       <w:r>
         <w:t>Appendix A. Metric glossary</w:t>
       </w:r>
-      <w:bookmarkEnd w:id="59"/>
+      <w:bookmarkEnd w:id="60"/>
     </w:p>
     <w:p>
       <w:pPr>
@@ -38981,7 +39304,7 @@
           <w:b w:val="0"/>
           <w:i w:val="0"/>
         </w:rPr>
-        <w:t>Table 49. Terms used in this report</w:t>
+        <w:t>Table 50. Terms used in this report</w:t>
       </w:r>
     </w:p>
     <w:tbl>
@@ -40144,11 +40467,11 @@
         <w:pStyle w:val="2"/>
         <w:pageBreakBefore w:val="0"/>
       </w:pPr>
-      <w:bookmarkStart w:id="60" w:name="_Toc11355"/>
+      <w:bookmarkStart w:id="61" w:name="_Toc31911"/>
       <w:r>
         <w:t>Appendix B. Reproducibility</w:t>
       </w:r>
-      <w:bookmarkEnd w:id="60"/>
+      <w:bookmarkEnd w:id="61"/>
     </w:p>
     <w:p>
       <w:pPr>
@@ -40161,7 +40484,7 @@
           <w:b w:val="0"/>
           <w:i w:val="0"/>
         </w:rPr>
-        <w:t>Table 50. Where things are</w:t>
+        <w:t>Table 51. Where things are</w:t>
       </w:r>
     </w:p>
     <w:tbl>
@@ -40743,11 +41066,11 @@
         <w:pStyle w:val="2"/>
         <w:pageBreakBefore w:val="0"/>
       </w:pPr>
-      <w:bookmarkStart w:id="61" w:name="_Toc32746"/>
+      <w:bookmarkStart w:id="62" w:name="_Toc2453"/>
       <w:r>
         <w:t>Appendix C. Data sources and citations</w:t>
       </w:r>
-      <w:bookmarkEnd w:id="61"/>
+      <w:bookmarkEnd w:id="62"/>
     </w:p>
     <w:p>
       <w:pPr>
@@ -40850,11 +41173,11 @@
         <w:pStyle w:val="2"/>
         <w:pageBreakBefore w:val="0"/>
       </w:pPr>
-      <w:bookmarkStart w:id="62" w:name="_Toc27398"/>
+      <w:bookmarkStart w:id="63" w:name="_Toc17757"/>
       <w:r>
         <w:t>Appendix D. Key decisions and why</w:t>
       </w:r>
-      <w:bookmarkEnd w:id="62"/>
+      <w:bookmarkEnd w:id="63"/>
     </w:p>
     <w:p>
       <w:pPr>
@@ -40867,7 +41190,7 @@
           <w:b w:val="0"/>
           <w:i w:val="0"/>
         </w:rPr>
-        <w:t>Table 51. Decision log</w:t>
+        <w:t>Table 52. Decision log</w:t>
       </w:r>
     </w:p>
     <w:tbl>
@@ -41558,11 +41881,11 @@
         <w:pStyle w:val="2"/>
         <w:pageBreakBefore w:val="0"/>
       </w:pPr>
-      <w:bookmarkStart w:id="63" w:name="_Toc14280"/>
+      <w:bookmarkStart w:id="64" w:name="_Toc3518"/>
       <w:r>
         <w:t>Appendix E. Commit history (main branch)</w:t>
       </w:r>
-      <w:bookmarkEnd w:id="63"/>
+      <w:bookmarkEnd w:id="64"/>
     </w:p>
     <w:p>
       <w:pPr>
@@ -41575,7 +41898,7 @@
           <w:b w:val="0"/>
           <w:i w:val="0"/>
         </w:rPr>
-        <w:t>Table 52. Commits made during this period</w:t>
+        <w:t>Table 53. Commits made during this period</w:t>
       </w:r>
     </w:p>
     <w:tbl>
@@ -42382,6 +42705,85 @@
           </w:p>
         </w:tc>
       </w:tr>
+      <w:tr>
+        <w:tblPrEx>
+          <w:tblBorders>
+            <w:top w:val="single" w:color="D9C3CC" w:sz="4" w:space="0"/>
+            <w:left w:val="single" w:color="D9C3CC" w:sz="4" w:space="0"/>
+            <w:bottom w:val="single" w:color="D9C3CC" w:sz="4" w:space="0"/>
+            <w:right w:val="single" w:color="D9C3CC" w:sz="4" w:space="0"/>
+            <w:insideH w:val="single" w:color="D9C3CC" w:sz="4" w:space="0"/>
+            <w:insideV w:val="single" w:color="D9C3CC" w:sz="4" w:space="0"/>
+          </w:tblBorders>
+          <w:tblCellMar>
+            <w:top w:w="50" w:type="dxa"/>
+            <w:left w:w="90" w:type="dxa"/>
+            <w:bottom w:w="50" w:type="dxa"/>
+            <w:right w:w="90" w:type="dxa"/>
+          </w:tblCellMar>
+        </w:tblPrEx>
+        <w:trPr>
+          <w:cantSplit/>
+          <w:jc w:val="center"/>
+        </w:trPr>
+        <w:tc>
+          <w:tcPr>
+            <w:tcW w:w="1361" w:type="dxa"/>
+            <w:shd w:val="clear" w:color="auto" w:fill="FBE9EF"/>
+          </w:tcPr>
+          <w:p>
+            <w:pPr>
+              <w:spacing w:after="0" w:line="240" w:lineRule="auto"/>
+            </w:pPr>
+            <w:r>
+              <w:rPr>
+                <w:b w:val="0"/>
+                <w:i w:val="0"/>
+                <w:sz w:val="18"/>
+              </w:rPr>
+              <w:t>8b0caf7</w:t>
+            </w:r>
+          </w:p>
+        </w:tc>
+        <w:tc>
+          <w:tcPr>
+            <w:tcW w:w="1701" w:type="dxa"/>
+            <w:shd w:val="clear" w:color="auto" w:fill="FBE9EF"/>
+          </w:tcPr>
+          <w:p>
+            <w:pPr>
+              <w:spacing w:after="0" w:line="240" w:lineRule="auto"/>
+            </w:pPr>
+            <w:r>
+              <w:rPr>
+                <w:b w:val="0"/>
+                <w:i w:val="0"/>
+                <w:sz w:val="18"/>
+              </w:rPr>
+              <w:t>20 Sep 2026</w:t>
+            </w:r>
+          </w:p>
+        </w:tc>
+        <w:tc>
+          <w:tcPr>
+            <w:tcW w:w="6350" w:type="dxa"/>
+            <w:shd w:val="clear" w:color="auto" w:fill="FBE9EF"/>
+          </w:tcPr>
+          <w:p>
+            <w:pPr>
+              <w:spacing w:after="0" w:line="240" w:lineRule="auto"/>
+            </w:pPr>
+            <w:r>
+              <w:rPr>
+                <w:b w:val="0"/>
+                <w:i w:val="0"/>
+                <w:sz w:val="18"/>
+              </w:rPr>
+              <w:t>Add detailed project progress and technical report (Word)</w:t>
+            </w:r>
+          </w:p>
+        </w:tc>
+      </w:tr>
     </w:tbl>
     <w:p>
       <w:pPr>
@@ -42393,11 +42795,11 @@
         <w:pStyle w:val="2"/>
         <w:pageBreakBefore w:val="0"/>
       </w:pPr>
-      <w:bookmarkStart w:id="64" w:name="_Toc10482"/>
+      <w:bookmarkStart w:id="65" w:name="_Toc5919"/>
       <w:r>
         <w:t>Appendix F. Questions a panel may ask</w:t>
       </w:r>
-      <w:bookmarkEnd w:id="64"/>
+      <w:bookmarkEnd w:id="65"/>
     </w:p>
     <w:p>
       <w:pPr>
@@ -42410,7 +42812,7 @@
           <w:b w:val="0"/>
           <w:i w:val="0"/>
         </w:rPr>
-        <w:t>Table 53. Anticipated questions</w:t>
+        <w:t>Table 54. Anticipated questions</w:t>
       </w:r>
     </w:p>
     <w:tbl>
@@ -44010,7 +44412,125 @@
                 <w:i w:val="0"/>
                 <w:sz w:val="17"/>
               </w:rPr>
-              <w:t>Q26. What is not finished?</w:t>
+              <w:t>Q26. Which phones can run the APK?</w:t>
+            </w:r>
+          </w:p>
+        </w:tc>
+        <w:tc>
+          <w:tcPr>
+            <w:tcW w:w="6350" w:type="dxa"/>
+            <w:shd w:val="clear" w:color="auto" w:fill="FBE9EF"/>
+          </w:tcPr>
+          <w:p>
+            <w:pPr>
+              <w:spacing w:after="0" w:line="240" w:lineRule="auto"/>
+            </w:pPr>
+            <w:r>
+              <w:rPr>
+                <w:b w:val="0"/>
+                <w:i w:val="0"/>
+                <w:sz w:val="17"/>
+              </w:rPr>
+              <w:t>The release build targets 64-bit ARM Android phones (arm64-v8a), which covers nearly all phones made in recent years, and uses Flutter's default minimum Android version. A phone that only supports 32-bit ARM would need a different build. It is 19 MB and is installed directly (not through the Play Store), so Android asks to allow installs from unknown sources.</w:t>
+            </w:r>
+          </w:p>
+        </w:tc>
+      </w:tr>
+      <w:tr>
+        <w:tblPrEx>
+          <w:tblBorders>
+            <w:top w:val="single" w:color="D9C3CC" w:sz="4" w:space="0"/>
+            <w:left w:val="single" w:color="D9C3CC" w:sz="4" w:space="0"/>
+            <w:bottom w:val="single" w:color="D9C3CC" w:sz="4" w:space="0"/>
+            <w:right w:val="single" w:color="D9C3CC" w:sz="4" w:space="0"/>
+            <w:insideH w:val="single" w:color="D9C3CC" w:sz="4" w:space="0"/>
+            <w:insideV w:val="single" w:color="D9C3CC" w:sz="4" w:space="0"/>
+          </w:tblBorders>
+          <w:tblCellMar>
+            <w:top w:w="50" w:type="dxa"/>
+            <w:left w:w="90" w:type="dxa"/>
+            <w:bottom w:w="50" w:type="dxa"/>
+            <w:right w:w="90" w:type="dxa"/>
+          </w:tblCellMar>
+        </w:tblPrEx>
+        <w:trPr>
+          <w:cantSplit/>
+          <w:jc w:val="center"/>
+        </w:trPr>
+        <w:tc>
+          <w:tcPr>
+            <w:tcW w:w="3061" w:type="dxa"/>
+          </w:tcPr>
+          <w:p>
+            <w:pPr>
+              <w:spacing w:after="0" w:line="240" w:lineRule="auto"/>
+            </w:pPr>
+            <w:r>
+              <w:rPr>
+                <w:b/>
+                <w:i w:val="0"/>
+                <w:sz w:val="17"/>
+              </w:rPr>
+              <w:t>Q27. Is the APK build reproducible?</w:t>
+            </w:r>
+          </w:p>
+        </w:tc>
+        <w:tc>
+          <w:tcPr>
+            <w:tcW w:w="6350" w:type="dxa"/>
+          </w:tcPr>
+          <w:p>
+            <w:pPr>
+              <w:spacing w:after="0" w:line="240" w:lineRule="auto"/>
+            </w:pPr>
+            <w:r>
+              <w:rPr>
+                <w:b w:val="0"/>
+                <w:i w:val="0"/>
+                <w:sz w:val="17"/>
+              </w:rPr>
+              <w:t>Yes in practice: a second build from the same source produced a byte-for-byte identical file (same SHA-256), so the APK on the phone matches the code in the repository.</w:t>
+            </w:r>
+          </w:p>
+        </w:tc>
+      </w:tr>
+      <w:tr>
+        <w:tblPrEx>
+          <w:tblBorders>
+            <w:top w:val="single" w:color="D9C3CC" w:sz="4" w:space="0"/>
+            <w:left w:val="single" w:color="D9C3CC" w:sz="4" w:space="0"/>
+            <w:bottom w:val="single" w:color="D9C3CC" w:sz="4" w:space="0"/>
+            <w:right w:val="single" w:color="D9C3CC" w:sz="4" w:space="0"/>
+            <w:insideH w:val="single" w:color="D9C3CC" w:sz="4" w:space="0"/>
+            <w:insideV w:val="single" w:color="D9C3CC" w:sz="4" w:space="0"/>
+          </w:tblBorders>
+          <w:tblCellMar>
+            <w:top w:w="50" w:type="dxa"/>
+            <w:left w:w="90" w:type="dxa"/>
+            <w:bottom w:w="50" w:type="dxa"/>
+            <w:right w:w="90" w:type="dxa"/>
+          </w:tblCellMar>
+        </w:tblPrEx>
+        <w:trPr>
+          <w:cantSplit/>
+          <w:jc w:val="center"/>
+        </w:trPr>
+        <w:tc>
+          <w:tcPr>
+            <w:tcW w:w="3061" w:type="dxa"/>
+            <w:shd w:val="clear" w:color="auto" w:fill="FBE9EF"/>
+          </w:tcPr>
+          <w:p>
+            <w:pPr>
+              <w:spacing w:after="0" w:line="240" w:lineRule="auto"/>
+            </w:pPr>
+            <w:r>
+              <w:rPr>
+                <w:b/>
+                <w:i w:val="0"/>
+                <w:sz w:val="17"/>
+              </w:rPr>
+              <w:t>Q28. What is not finished?</w:t>
             </w:r>
           </w:p>
         </w:tc>
@@ -44353,8 +44873,8 @@
     <w:lsdException w:uiPriority="99" w:name="Normal Indent"/>
     <w:lsdException w:uiPriority="99" w:name="footnote text"/>
     <w:lsdException w:uiPriority="99" w:name="annotation text"/>
-    <w:lsdException w:qFormat="1" w:uiPriority="99" w:semiHidden="0" w:name="header"/>
-    <w:lsdException w:qFormat="1" w:uiPriority="99" w:semiHidden="0" w:name="footer"/>
+    <w:lsdException w:uiPriority="99" w:semiHidden="0" w:name="header"/>
+    <w:lsdException w:uiPriority="99" w:semiHidden="0" w:name="footer"/>
     <w:lsdException w:uiPriority="99" w:name="index heading"/>
     <w:lsdException w:qFormat="1" w:uiPriority="35" w:name="caption"/>
     <w:lsdException w:uiPriority="99" w:name="table of figures"/>
@@ -44371,24 +44891,24 @@
     <w:lsdException w:uiPriority="99" w:name="toa heading"/>
     <w:lsdException w:qFormat="1" w:uiPriority="99" w:semiHidden="0" w:name="List"/>
     <w:lsdException w:uiPriority="99" w:semiHidden="0" w:name="List Bullet"/>
-    <w:lsdException w:qFormat="1" w:uiPriority="99" w:semiHidden="0" w:name="List Number"/>
-    <w:lsdException w:uiPriority="99" w:semiHidden="0" w:name="List 2"/>
+    <w:lsdException w:uiPriority="99" w:semiHidden="0" w:name="List Number"/>
+    <w:lsdException w:qFormat="1" w:uiPriority="99" w:semiHidden="0" w:name="List 2"/>
     <w:lsdException w:uiPriority="99" w:semiHidden="0" w:name="List 3"/>
     <w:lsdException w:uiPriority="99" w:name="List 4"/>
     <w:lsdException w:uiPriority="99" w:name="List 5"/>
     <w:lsdException w:uiPriority="99" w:semiHidden="0" w:name="List Bullet 2"/>
-    <w:lsdException w:qFormat="1" w:uiPriority="99" w:semiHidden="0" w:name="List Bullet 3"/>
+    <w:lsdException w:uiPriority="99" w:semiHidden="0" w:name="List Bullet 3"/>
     <w:lsdException w:uiPriority="99" w:name="List Bullet 4"/>
     <w:lsdException w:uiPriority="99" w:name="List Bullet 5"/>
-    <w:lsdException w:qFormat="1" w:uiPriority="99" w:semiHidden="0" w:name="List Number 2"/>
-    <w:lsdException w:qFormat="1" w:uiPriority="99" w:semiHidden="0" w:name="List Number 3"/>
+    <w:lsdException w:uiPriority="99" w:semiHidden="0" w:name="List Number 2"/>
+    <w:lsdException w:uiPriority="99" w:semiHidden="0" w:name="List Number 3"/>
     <w:lsdException w:uiPriority="99" w:name="List Number 4"/>
     <w:lsdException w:uiPriority="99" w:name="List Number 5"/>
     <w:lsdException w:qFormat="1" w:unhideWhenUsed="0" w:uiPriority="10" w:semiHidden="0" w:name="Title"/>
     <w:lsdException w:uiPriority="99" w:name="Closing"/>
     <w:lsdException w:uiPriority="99" w:name="Signature"/>
-    <w:lsdException w:uiPriority="1" w:name="Default Paragraph Font"/>
-    <w:lsdException w:qFormat="1" w:uiPriority="99" w:semiHidden="0" w:name="Body Text"/>
+    <w:lsdException w:qFormat="1" w:uiPriority="1" w:name="Default Paragraph Font"/>
+    <w:lsdException w:uiPriority="99" w:semiHidden="0" w:name="Body Text"/>
     <w:lsdException w:uiPriority="99" w:name="Body Text Indent"/>
     <w:lsdException w:uiPriority="99" w:semiHidden="0" w:name="List Continue"/>
     <w:lsdException w:uiPriority="99" w:semiHidden="0" w:name="List Continue 2"/>
@@ -44402,7 +44922,7 @@
     <w:lsdException w:uiPriority="99" w:name="Body Text First Indent"/>
     <w:lsdException w:uiPriority="99" w:name="Body Text First Indent 2"/>
     <w:lsdException w:uiPriority="99" w:name="Note Heading"/>
-    <w:lsdException w:qFormat="1" w:uiPriority="99" w:semiHidden="0" w:name="Body Text 2"/>
+    <w:lsdException w:uiPriority="99" w:semiHidden="0" w:name="Body Text 2"/>
     <w:lsdException w:uiPriority="99" w:semiHidden="0" w:name="Body Text 3"/>
     <w:lsdException w:uiPriority="99" w:name="Body Text Indent 2"/>
     <w:lsdException w:uiPriority="99" w:name="Body Text Indent 3"/>
@@ -44425,7 +44945,7 @@
     <w:lsdException w:uiPriority="99" w:name="HTML Sample"/>
     <w:lsdException w:uiPriority="99" w:name="HTML Typewriter"/>
     <w:lsdException w:uiPriority="99" w:name="HTML Variable"/>
-    <w:lsdException w:uiPriority="99" w:name="Normal Table"/>
+    <w:lsdException w:qFormat="1" w:uiPriority="99" w:name="Normal Table"/>
     <w:lsdException w:uiPriority="99" w:name="annotation subject"/>
     <w:lsdException w:uiPriority="99" w:name="Table Simple 1"/>
     <w:lsdException w:uiPriority="99" w:name="Table Simple 2"/>
@@ -44470,11 +44990,11 @@
     <w:lsdException w:uiPriority="99" w:name="Table Web 2"/>
     <w:lsdException w:uiPriority="99" w:name="Table Web 3"/>
     <w:lsdException w:uiPriority="99" w:name="Balloon Text"/>
-    <w:lsdException w:unhideWhenUsed="0" w:uiPriority="59" w:semiHidden="0" w:name="Table Grid"/>
+    <w:lsdException w:qFormat="1" w:unhideWhenUsed="0" w:uiPriority="59" w:semiHidden="0" w:name="Table Grid"/>
     <w:lsdException w:uiPriority="99" w:name="Table Theme"/>
     <w:lsdException w:qFormat="1" w:unhideWhenUsed="0" w:uiPriority="1" w:semiHidden="0" w:name="No Spacing"/>
     <w:lsdException w:unhideWhenUsed="0" w:uiPriority="60" w:semiHidden="0" w:name="Light Shading"/>
-    <w:lsdException w:unhideWhenUsed="0" w:uiPriority="61" w:semiHidden="0" w:name="Light List"/>
+    <w:lsdException w:qFormat="1" w:unhideWhenUsed="0" w:uiPriority="61" w:semiHidden="0" w:name="Light List"/>
     <w:lsdException w:unhideWhenUsed="0" w:uiPriority="62" w:semiHidden="0" w:name="Light Grid"/>
     <w:lsdException w:unhideWhenUsed="0" w:uiPriority="63" w:semiHidden="0" w:name="Medium Shading 1"/>
     <w:lsdException w:unhideWhenUsed="0" w:uiPriority="64" w:semiHidden="0" w:name="Medium Shading 2"/>
@@ -44489,7 +45009,7 @@
     <w:lsdException w:unhideWhenUsed="0" w:uiPriority="73" w:semiHidden="0" w:name="Colorful Grid"/>
     <w:lsdException w:unhideWhenUsed="0" w:uiPriority="60" w:semiHidden="0" w:name="Light Shading Accent 1"/>
     <w:lsdException w:unhideWhenUsed="0" w:uiPriority="61" w:semiHidden="0" w:name="Light List Accent 1"/>
-    <w:lsdException w:unhideWhenUsed="0" w:uiPriority="62" w:semiHidden="0" w:name="Light Grid Accent 1"/>
+    <w:lsdException w:qFormat="1" w:unhideWhenUsed="0" w:uiPriority="62" w:semiHidden="0" w:name="Light Grid Accent 1"/>
     <w:lsdException w:unhideWhenUsed="0" w:uiPriority="63" w:semiHidden="0" w:name="Medium Shading 1 Accent 1"/>
     <w:lsdException w:unhideWhenUsed="0" w:uiPriority="64" w:semiHidden="0" w:name="Medium Shading 2 Accent 1"/>
     <w:lsdException w:unhideWhenUsed="0" w:uiPriority="65" w:semiHidden="0" w:name="Medium List 1 Accent 1"/>
@@ -44506,7 +45026,7 @@
     <w:lsdException w:unhideWhenUsed="0" w:uiPriority="73" w:semiHidden="0" w:name="Colorful Grid Accent 1"/>
     <w:lsdException w:unhideWhenUsed="0" w:uiPriority="60" w:semiHidden="0" w:name="Light Shading Accent 2"/>
     <w:lsdException w:unhideWhenUsed="0" w:uiPriority="61" w:semiHidden="0" w:name="Light List Accent 2"/>
-    <w:lsdException w:unhideWhenUsed="0" w:uiPriority="62" w:semiHidden="0" w:name="Light Grid Accent 2"/>
+    <w:lsdException w:qFormat="1" w:unhideWhenUsed="0" w:uiPriority="62" w:semiHidden="0" w:name="Light Grid Accent 2"/>
     <w:lsdException w:unhideWhenUsed="0" w:uiPriority="63" w:semiHidden="0" w:name="Medium Shading 1 Accent 2"/>
     <w:lsdException w:unhideWhenUsed="0" w:uiPriority="64" w:semiHidden="0" w:name="Medium Shading 2 Accent 2"/>
     <w:lsdException w:unhideWhenUsed="0" w:uiPriority="65" w:semiHidden="0" w:name="Medium List 1 Accent 2"/>
@@ -44519,7 +45039,7 @@
     <w:lsdException w:unhideWhenUsed="0" w:uiPriority="72" w:semiHidden="0" w:name="Colorful List Accent 2"/>
     <w:lsdException w:unhideWhenUsed="0" w:uiPriority="73" w:semiHidden="0" w:name="Colorful Grid Accent 2"/>
     <w:lsdException w:unhideWhenUsed="0" w:uiPriority="60" w:semiHidden="0" w:name="Light Shading Accent 3"/>
-    <w:lsdException w:unhideWhenUsed="0" w:uiPriority="61" w:semiHidden="0" w:name="Light List Accent 3"/>
+    <w:lsdException w:qFormat="1" w:unhideWhenUsed="0" w:uiPriority="61" w:semiHidden="0" w:name="Light List Accent 3"/>
     <w:lsdException w:unhideWhenUsed="0" w:uiPriority="62" w:semiHidden="0" w:name="Light Grid Accent 3"/>
     <w:lsdException w:unhideWhenUsed="0" w:uiPriority="63" w:semiHidden="0" w:name="Medium Shading 1 Accent 3"/>
     <w:lsdException w:unhideWhenUsed="0" w:uiPriority="64" w:semiHidden="0" w:name="Medium Shading 2 Accent 3"/>
@@ -44820,12 +45340,14 @@
     <w:name w:val="Default Paragraph Font"/>
     <w:semiHidden/>
     <w:unhideWhenUsed/>
+    <w:qFormat/>
     <w:uiPriority w:val="1"/>
   </w:style>
   <w:style w:type="table" w:default="1" w:styleId="12">
     <w:name w:val="Normal Table"/>
     <w:semiHidden/>
     <w:unhideWhenUsed/>
+    <w:qFormat/>
     <w:uiPriority w:val="99"/>
     <w:tblPr>
       <w:tblCellMar>
@@ -44841,7 +45363,6 @@
     <w:basedOn w:val="1"/>
     <w:link w:val="146"/>
     <w:unhideWhenUsed/>
-    <w:qFormat/>
     <w:uiPriority w:val="99"/>
     <w:pPr>
       <w:spacing w:after="120"/>
@@ -44852,7 +45373,6 @@
     <w:basedOn w:val="1"/>
     <w:link w:val="147"/>
     <w:unhideWhenUsed/>
-    <w:qFormat/>
     <w:uiPriority w:val="99"/>
     <w:pPr>
       <w:spacing w:after="120" w:line="480" w:lineRule="auto"/>
@@ -44906,7 +45426,6 @@
     <w:basedOn w:val="1"/>
     <w:link w:val="138"/>
     <w:unhideWhenUsed/>
-    <w:qFormat/>
     <w:uiPriority w:val="99"/>
     <w:pPr>
       <w:tabs>
@@ -44921,7 +45440,6 @@
     <w:basedOn w:val="1"/>
     <w:link w:val="137"/>
     <w:unhideWhenUsed/>
-    <w:qFormat/>
     <w:uiPriority w:val="99"/>
     <w:pPr>
       <w:tabs>
@@ -44946,6 +45464,7 @@
     <w:name w:val="List 2"/>
     <w:basedOn w:val="1"/>
     <w:unhideWhenUsed/>
+    <w:qFormat/>
     <w:uiPriority w:val="99"/>
     <w:pPr>
       <w:ind w:left="720" w:hanging="360"/>
@@ -44997,7 +45516,6 @@
     <w:name w:val="List Bullet 3"/>
     <w:basedOn w:val="1"/>
     <w:unhideWhenUsed/>
-    <w:qFormat/>
     <w:uiPriority w:val="99"/>
     <w:pPr>
       <w:numPr>
@@ -45044,7 +45562,6 @@
     <w:name w:val="List Number"/>
     <w:basedOn w:val="1"/>
     <w:unhideWhenUsed/>
-    <w:qFormat/>
     <w:uiPriority w:val="99"/>
     <w:pPr>
       <w:numPr>
@@ -45058,7 +45575,6 @@
     <w:name w:val="List Number 2"/>
     <w:basedOn w:val="1"/>
     <w:unhideWhenUsed/>
-    <w:qFormat/>
     <w:uiPriority w:val="99"/>
     <w:pPr>
       <w:numPr>
@@ -45072,7 +45588,6 @@
     <w:name w:val="List Number 3"/>
     <w:basedOn w:val="1"/>
     <w:unhideWhenUsed/>
-    <w:qFormat/>
     <w:uiPriority w:val="99"/>
     <w:pPr>
       <w:numPr>
@@ -45141,6 +45656,7 @@
   <w:style w:type="table" w:styleId="35">
     <w:name w:val="Table Grid"/>
     <w:basedOn w:val="12"/>
+    <w:qFormat/>
     <w:uiPriority w:val="59"/>
     <w:pPr>
       <w:spacing w:after="0" w:line="240" w:lineRule="auto"/>
@@ -45911,6 +46427,7 @@
   <w:style w:type="table" w:styleId="46">
     <w:name w:val="Light List"/>
     <w:basedOn w:val="12"/>
+    <w:qFormat/>
     <w:uiPriority w:val="61"/>
     <w:pPr>
       <w:spacing w:after="0" w:line="240" w:lineRule="auto"/>
@@ -46190,6 +46707,7 @@
   <w:style w:type="table" w:styleId="49">
     <w:name w:val="Light List Accent 3"/>
     <w:basedOn w:val="12"/>
+    <w:qFormat/>
     <w:uiPriority w:val="61"/>
     <w:pPr>
       <w:spacing w:after="0" w:line="240" w:lineRule="auto"/>
@@ -46688,6 +47206,7 @@
   <w:style w:type="table" w:styleId="54">
     <w:name w:val="Light Grid Accent 1"/>
     <w:basedOn w:val="12"/>
+    <w:qFormat/>
     <w:uiPriority w:val="62"/>
     <w:pPr>
       <w:spacing w:after="0" w:line="240" w:lineRule="auto"/>
@@ -46814,6 +47333,7 @@
   <w:style w:type="table" w:styleId="55">
     <w:name w:val="Light Grid Accent 2"/>
     <w:basedOn w:val="12"/>
+    <w:qFormat/>
     <w:uiPriority w:val="62"/>
     <w:pPr>
       <w:spacing w:after="0" w:line="240" w:lineRule="auto"/>
@@ -56630,7 +57150,6 @@
     <w:name w:val="Footer Char"/>
     <w:basedOn w:val="11"/>
     <w:link w:val="18"/>
-    <w:qFormat/>
     <w:uiPriority w:val="99"/>
   </w:style>
   <w:style w:type="paragraph" w:styleId="139">
@@ -56686,7 +57205,6 @@
     <w:name w:val="Heading 3 Char"/>
     <w:basedOn w:val="11"/>
     <w:link w:val="4"/>
-    <w:qFormat/>
     <w:uiPriority w:val="9"/>
     <w:rPr>
       <w:rFonts w:asciiTheme="majorHAnsi" w:hAnsiTheme="majorHAnsi" w:eastAsiaTheme="majorEastAsia" w:cstheme="majorBidi"/>
@@ -56704,7 +57222,6 @@
     <w:name w:val="Title Char"/>
     <w:basedOn w:val="11"/>
     <w:link w:val="36"/>
-    <w:qFormat/>
     <w:uiPriority w:val="10"/>
     <w:rPr>
       <w:rFonts w:asciiTheme="majorHAnsi" w:hAnsiTheme="majorHAnsi" w:eastAsiaTheme="majorEastAsia" w:cstheme="majorBidi"/>
@@ -56719,7 +57236,6 @@
     <w:name w:val="Subtitle Char"/>
     <w:basedOn w:val="11"/>
     <w:link w:val="34"/>
-    <w:qFormat/>
     <w:uiPriority w:val="11"/>
     <w:rPr>
       <w:rFonts w:asciiTheme="majorHAnsi" w:hAnsiTheme="majorHAnsi" w:eastAsiaTheme="majorEastAsia" w:cstheme="majorBidi"/>
@@ -56750,12 +57266,14 @@
     <w:name w:val="Body Text Char"/>
     <w:basedOn w:val="11"/>
     <w:link w:val="13"/>
+    <w:qFormat/>
     <w:uiPriority w:val="99"/>
   </w:style>
   <w:style w:type="character" w:customStyle="1" w:styleId="147">
     <w:name w:val="Body Text 2 Char"/>
     <w:basedOn w:val="11"/>
     <w:link w:val="14"/>
+    <w:qFormat/>
     <w:uiPriority w:val="99"/>
   </w:style>
   <w:style w:type="character" w:customStyle="1" w:styleId="148">
@@ -56772,6 +57290,7 @@
     <w:name w:val="Macro Text Char"/>
     <w:basedOn w:val="11"/>
     <w:link w:val="32"/>
+    <w:qFormat/>
     <w:uiPriority w:val="99"/>
     <w:rPr>
       <w:rFonts w:ascii="Courier" w:hAnsi="Courier"/>
@@ -56819,7 +57338,6 @@
     <w:basedOn w:val="11"/>
     <w:link w:val="5"/>
     <w:semiHidden/>
-    <w:qFormat/>
     <w:uiPriority w:val="9"/>
     <w:rPr>
       <w:rFonts w:asciiTheme="majorHAnsi" w:hAnsiTheme="majorHAnsi" w:eastAsiaTheme="majorEastAsia" w:cstheme="majorBidi"/>
@@ -56840,7 +57358,6 @@
     <w:basedOn w:val="11"/>
     <w:link w:val="6"/>
     <w:semiHidden/>
-    <w:qFormat/>
     <w:uiPriority w:val="9"/>
     <w:rPr>
       <w:rFonts w:asciiTheme="majorHAnsi" w:hAnsiTheme="majorHAnsi" w:eastAsiaTheme="majorEastAsia" w:cstheme="majorBidi"/>
@@ -56866,7 +57383,6 @@
     <w:basedOn w:val="11"/>
     <w:link w:val="8"/>
     <w:semiHidden/>
-    <w:qFormat/>
     <w:uiPriority w:val="9"/>
     <w:rPr>
       <w:rFonts w:asciiTheme="majorHAnsi" w:hAnsiTheme="majorHAnsi" w:eastAsiaTheme="majorEastAsia" w:cstheme="majorBidi"/>
@@ -56907,7 +57423,6 @@
     <w:basedOn w:val="11"/>
     <w:link w:val="10"/>
     <w:semiHidden/>
-    <w:qFormat/>
     <w:uiPriority w:val="9"/>
     <w:rPr>
       <w:rFonts w:asciiTheme="majorHAnsi" w:hAnsiTheme="majorHAnsi" w:eastAsiaTheme="majorEastAsia" w:cstheme="majorBidi"/>

</xml_diff>

<commit_message>
Record first real-phone run; clearer demo script prompt
The app connected and worked on a physical phone after one retry. The
demo script no longer prints a harmless clean-up error and its stop prompt
now says not to type or paste there. Report and README updated.
</commit_message>
<xml_diff>
--- a/scope doument/Femora - Project Progress and Technical Report.docx
+++ b/scope doument/Femora - Project Progress and Technical Report.docx
@@ -402,7 +402,7 @@
         <w:fldChar w:fldCharType="begin"/>
       </w:r>
       <w:r>
-        <w:instrText xml:space="preserve"> HYPERLINK \l _Toc9710 </w:instrText>
+        <w:instrText xml:space="preserve"> HYPERLINK \l _Toc18048 </w:instrText>
       </w:r>
       <w:r>
         <w:fldChar w:fldCharType="separate"/>
@@ -417,7 +417,7 @@
         <w:fldChar w:fldCharType="begin"/>
       </w:r>
       <w:r>
-        <w:instrText xml:space="preserve"> PAGEREF _Toc9710 \h </w:instrText>
+        <w:instrText xml:space="preserve"> PAGEREF _Toc18048 \h </w:instrText>
       </w:r>
       <w:r>
         <w:fldChar w:fldCharType="separate"/>
@@ -443,7 +443,7 @@
         <w:fldChar w:fldCharType="begin"/>
       </w:r>
       <w:r>
-        <w:instrText xml:space="preserve"> HYPERLINK \l _Toc18566 </w:instrText>
+        <w:instrText xml:space="preserve"> HYPERLINK \l _Toc21959 </w:instrText>
       </w:r>
       <w:r>
         <w:fldChar w:fldCharType="separate"/>
@@ -458,7 +458,7 @@
         <w:fldChar w:fldCharType="begin"/>
       </w:r>
       <w:r>
-        <w:instrText xml:space="preserve"> PAGEREF _Toc18566 \h </w:instrText>
+        <w:instrText xml:space="preserve"> PAGEREF _Toc21959 \h </w:instrText>
       </w:r>
       <w:r>
         <w:fldChar w:fldCharType="separate"/>
@@ -484,7 +484,7 @@
         <w:fldChar w:fldCharType="begin"/>
       </w:r>
       <w:r>
-        <w:instrText xml:space="preserve"> HYPERLINK \l _Toc11336 </w:instrText>
+        <w:instrText xml:space="preserve"> HYPERLINK \l _Toc21421 </w:instrText>
       </w:r>
       <w:r>
         <w:fldChar w:fldCharType="separate"/>
@@ -499,7 +499,7 @@
         <w:fldChar w:fldCharType="begin"/>
       </w:r>
       <w:r>
-        <w:instrText xml:space="preserve"> PAGEREF _Toc11336 \h </w:instrText>
+        <w:instrText xml:space="preserve"> PAGEREF _Toc21421 \h </w:instrText>
       </w:r>
       <w:r>
         <w:fldChar w:fldCharType="separate"/>
@@ -525,7 +525,7 @@
         <w:fldChar w:fldCharType="begin"/>
       </w:r>
       <w:r>
-        <w:instrText xml:space="preserve"> HYPERLINK \l _Toc12689 </w:instrText>
+        <w:instrText xml:space="preserve"> HYPERLINK \l _Toc14776 </w:instrText>
       </w:r>
       <w:r>
         <w:fldChar w:fldCharType="separate"/>
@@ -540,7 +540,7 @@
         <w:fldChar w:fldCharType="begin"/>
       </w:r>
       <w:r>
-        <w:instrText xml:space="preserve"> PAGEREF _Toc12689 \h </w:instrText>
+        <w:instrText xml:space="preserve"> PAGEREF _Toc14776 \h </w:instrText>
       </w:r>
       <w:r>
         <w:fldChar w:fldCharType="separate"/>
@@ -566,7 +566,7 @@
         <w:fldChar w:fldCharType="begin"/>
       </w:r>
       <w:r>
-        <w:instrText xml:space="preserve"> HYPERLINK \l _Toc5752 </w:instrText>
+        <w:instrText xml:space="preserve"> HYPERLINK \l _Toc32659 </w:instrText>
       </w:r>
       <w:r>
         <w:fldChar w:fldCharType="separate"/>
@@ -581,7 +581,7 @@
         <w:fldChar w:fldCharType="begin"/>
       </w:r>
       <w:r>
-        <w:instrText xml:space="preserve"> PAGEREF _Toc5752 \h </w:instrText>
+        <w:instrText xml:space="preserve"> PAGEREF _Toc32659 \h </w:instrText>
       </w:r>
       <w:r>
         <w:fldChar w:fldCharType="separate"/>
@@ -607,7 +607,7 @@
         <w:fldChar w:fldCharType="begin"/>
       </w:r>
       <w:r>
-        <w:instrText xml:space="preserve"> HYPERLINK \l _Toc13866 </w:instrText>
+        <w:instrText xml:space="preserve"> HYPERLINK \l _Toc16509 </w:instrText>
       </w:r>
       <w:r>
         <w:fldChar w:fldCharType="separate"/>
@@ -622,7 +622,7 @@
         <w:fldChar w:fldCharType="begin"/>
       </w:r>
       <w:r>
-        <w:instrText xml:space="preserve"> PAGEREF _Toc13866 \h </w:instrText>
+        <w:instrText xml:space="preserve"> PAGEREF _Toc16509 \h </w:instrText>
       </w:r>
       <w:r>
         <w:fldChar w:fldCharType="separate"/>
@@ -648,7 +648,7 @@
         <w:fldChar w:fldCharType="begin"/>
       </w:r>
       <w:r>
-        <w:instrText xml:space="preserve"> HYPERLINK \l _Toc9682 </w:instrText>
+        <w:instrText xml:space="preserve"> HYPERLINK \l _Toc5884 </w:instrText>
       </w:r>
       <w:r>
         <w:fldChar w:fldCharType="separate"/>
@@ -663,7 +663,7 @@
         <w:fldChar w:fldCharType="begin"/>
       </w:r>
       <w:r>
-        <w:instrText xml:space="preserve"> PAGEREF _Toc9682 \h </w:instrText>
+        <w:instrText xml:space="preserve"> PAGEREF _Toc5884 \h </w:instrText>
       </w:r>
       <w:r>
         <w:fldChar w:fldCharType="separate"/>
@@ -689,7 +689,7 @@
         <w:fldChar w:fldCharType="begin"/>
       </w:r>
       <w:r>
-        <w:instrText xml:space="preserve"> HYPERLINK \l _Toc31949 </w:instrText>
+        <w:instrText xml:space="preserve"> HYPERLINK \l _Toc5566 </w:instrText>
       </w:r>
       <w:r>
         <w:fldChar w:fldCharType="separate"/>
@@ -704,7 +704,7 @@
         <w:fldChar w:fldCharType="begin"/>
       </w:r>
       <w:r>
-        <w:instrText xml:space="preserve"> PAGEREF _Toc31949 \h </w:instrText>
+        <w:instrText xml:space="preserve"> PAGEREF _Toc5566 \h </w:instrText>
       </w:r>
       <w:r>
         <w:fldChar w:fldCharType="separate"/>
@@ -730,7 +730,7 @@
         <w:fldChar w:fldCharType="begin"/>
       </w:r>
       <w:r>
-        <w:instrText xml:space="preserve"> HYPERLINK \l _Toc3954 </w:instrText>
+        <w:instrText xml:space="preserve"> HYPERLINK \l _Toc26855 </w:instrText>
       </w:r>
       <w:r>
         <w:fldChar w:fldCharType="separate"/>
@@ -745,7 +745,7 @@
         <w:fldChar w:fldCharType="begin"/>
       </w:r>
       <w:r>
-        <w:instrText xml:space="preserve"> PAGEREF _Toc3954 \h </w:instrText>
+        <w:instrText xml:space="preserve"> PAGEREF _Toc26855 \h </w:instrText>
       </w:r>
       <w:r>
         <w:fldChar w:fldCharType="separate"/>
@@ -771,7 +771,7 @@
         <w:fldChar w:fldCharType="begin"/>
       </w:r>
       <w:r>
-        <w:instrText xml:space="preserve"> HYPERLINK \l _Toc13427 </w:instrText>
+        <w:instrText xml:space="preserve"> HYPERLINK \l _Toc16011 </w:instrText>
       </w:r>
       <w:r>
         <w:fldChar w:fldCharType="separate"/>
@@ -786,7 +786,7 @@
         <w:fldChar w:fldCharType="begin"/>
       </w:r>
       <w:r>
-        <w:instrText xml:space="preserve"> PAGEREF _Toc13427 \h </w:instrText>
+        <w:instrText xml:space="preserve"> PAGEREF _Toc16011 \h </w:instrText>
       </w:r>
       <w:r>
         <w:fldChar w:fldCharType="separate"/>
@@ -812,7 +812,7 @@
         <w:fldChar w:fldCharType="begin"/>
       </w:r>
       <w:r>
-        <w:instrText xml:space="preserve"> HYPERLINK \l _Toc911 </w:instrText>
+        <w:instrText xml:space="preserve"> HYPERLINK \l _Toc22518 </w:instrText>
       </w:r>
       <w:r>
         <w:fldChar w:fldCharType="separate"/>
@@ -827,7 +827,7 @@
         <w:fldChar w:fldCharType="begin"/>
       </w:r>
       <w:r>
-        <w:instrText xml:space="preserve"> PAGEREF _Toc911 \h </w:instrText>
+        <w:instrText xml:space="preserve"> PAGEREF _Toc22518 \h </w:instrText>
       </w:r>
       <w:r>
         <w:fldChar w:fldCharType="separate"/>
@@ -853,7 +853,7 @@
         <w:fldChar w:fldCharType="begin"/>
       </w:r>
       <w:r>
-        <w:instrText xml:space="preserve"> HYPERLINK \l _Toc7441 </w:instrText>
+        <w:instrText xml:space="preserve"> HYPERLINK \l _Toc26019 </w:instrText>
       </w:r>
       <w:r>
         <w:fldChar w:fldCharType="separate"/>
@@ -868,7 +868,7 @@
         <w:fldChar w:fldCharType="begin"/>
       </w:r>
       <w:r>
-        <w:instrText xml:space="preserve"> PAGEREF _Toc7441 \h </w:instrText>
+        <w:instrText xml:space="preserve"> PAGEREF _Toc26019 \h </w:instrText>
       </w:r>
       <w:r>
         <w:fldChar w:fldCharType="separate"/>
@@ -894,7 +894,7 @@
         <w:fldChar w:fldCharType="begin"/>
       </w:r>
       <w:r>
-        <w:instrText xml:space="preserve"> HYPERLINK \l _Toc14462 </w:instrText>
+        <w:instrText xml:space="preserve"> HYPERLINK \l _Toc29695 </w:instrText>
       </w:r>
       <w:r>
         <w:fldChar w:fldCharType="separate"/>
@@ -909,7 +909,7 @@
         <w:fldChar w:fldCharType="begin"/>
       </w:r>
       <w:r>
-        <w:instrText xml:space="preserve"> PAGEREF _Toc14462 \h </w:instrText>
+        <w:instrText xml:space="preserve"> PAGEREF _Toc29695 \h </w:instrText>
       </w:r>
       <w:r>
         <w:fldChar w:fldCharType="separate"/>
@@ -935,7 +935,7 @@
         <w:fldChar w:fldCharType="begin"/>
       </w:r>
       <w:r>
-        <w:instrText xml:space="preserve"> HYPERLINK \l _Toc30988 </w:instrText>
+        <w:instrText xml:space="preserve"> HYPERLINK \l _Toc4918 </w:instrText>
       </w:r>
       <w:r>
         <w:fldChar w:fldCharType="separate"/>
@@ -950,7 +950,7 @@
         <w:fldChar w:fldCharType="begin"/>
       </w:r>
       <w:r>
-        <w:instrText xml:space="preserve"> PAGEREF _Toc30988 \h </w:instrText>
+        <w:instrText xml:space="preserve"> PAGEREF _Toc4918 \h </w:instrText>
       </w:r>
       <w:r>
         <w:fldChar w:fldCharType="separate"/>
@@ -976,7 +976,7 @@
         <w:fldChar w:fldCharType="begin"/>
       </w:r>
       <w:r>
-        <w:instrText xml:space="preserve"> HYPERLINK \l _Toc24270 </w:instrText>
+        <w:instrText xml:space="preserve"> HYPERLINK \l _Toc17758 </w:instrText>
       </w:r>
       <w:r>
         <w:fldChar w:fldCharType="separate"/>
@@ -991,7 +991,7 @@
         <w:fldChar w:fldCharType="begin"/>
       </w:r>
       <w:r>
-        <w:instrText xml:space="preserve"> PAGEREF _Toc24270 \h </w:instrText>
+        <w:instrText xml:space="preserve"> PAGEREF _Toc17758 \h </w:instrText>
       </w:r>
       <w:r>
         <w:fldChar w:fldCharType="separate"/>
@@ -1017,7 +1017,7 @@
         <w:fldChar w:fldCharType="begin"/>
       </w:r>
       <w:r>
-        <w:instrText xml:space="preserve"> HYPERLINK \l _Toc22393 </w:instrText>
+        <w:instrText xml:space="preserve"> HYPERLINK \l _Toc29553 </w:instrText>
       </w:r>
       <w:r>
         <w:fldChar w:fldCharType="separate"/>
@@ -1032,7 +1032,7 @@
         <w:fldChar w:fldCharType="begin"/>
       </w:r>
       <w:r>
-        <w:instrText xml:space="preserve"> PAGEREF _Toc22393 \h </w:instrText>
+        <w:instrText xml:space="preserve"> PAGEREF _Toc29553 \h </w:instrText>
       </w:r>
       <w:r>
         <w:fldChar w:fldCharType="separate"/>
@@ -1058,7 +1058,7 @@
         <w:fldChar w:fldCharType="begin"/>
       </w:r>
       <w:r>
-        <w:instrText xml:space="preserve"> HYPERLINK \l _Toc20246 </w:instrText>
+        <w:instrText xml:space="preserve"> HYPERLINK \l _Toc32711 </w:instrText>
       </w:r>
       <w:r>
         <w:fldChar w:fldCharType="separate"/>
@@ -1073,7 +1073,7 @@
         <w:fldChar w:fldCharType="begin"/>
       </w:r>
       <w:r>
-        <w:instrText xml:space="preserve"> PAGEREF _Toc20246 \h </w:instrText>
+        <w:instrText xml:space="preserve"> PAGEREF _Toc32711 \h </w:instrText>
       </w:r>
       <w:r>
         <w:fldChar w:fldCharType="separate"/>
@@ -1099,7 +1099,7 @@
         <w:fldChar w:fldCharType="begin"/>
       </w:r>
       <w:r>
-        <w:instrText xml:space="preserve"> HYPERLINK \l _Toc25880 </w:instrText>
+        <w:instrText xml:space="preserve"> HYPERLINK \l _Toc10890 </w:instrText>
       </w:r>
       <w:r>
         <w:fldChar w:fldCharType="separate"/>
@@ -1114,7 +1114,7 @@
         <w:fldChar w:fldCharType="begin"/>
       </w:r>
       <w:r>
-        <w:instrText xml:space="preserve"> PAGEREF _Toc25880 \h </w:instrText>
+        <w:instrText xml:space="preserve"> PAGEREF _Toc10890 \h </w:instrText>
       </w:r>
       <w:r>
         <w:fldChar w:fldCharType="separate"/>
@@ -1140,7 +1140,7 @@
         <w:fldChar w:fldCharType="begin"/>
       </w:r>
       <w:r>
-        <w:instrText xml:space="preserve"> HYPERLINK \l _Toc1906 </w:instrText>
+        <w:instrText xml:space="preserve"> HYPERLINK \l _Toc16542 </w:instrText>
       </w:r>
       <w:r>
         <w:fldChar w:fldCharType="separate"/>
@@ -1155,7 +1155,7 @@
         <w:fldChar w:fldCharType="begin"/>
       </w:r>
       <w:r>
-        <w:instrText xml:space="preserve"> PAGEREF _Toc1906 \h </w:instrText>
+        <w:instrText xml:space="preserve"> PAGEREF _Toc16542 \h </w:instrText>
       </w:r>
       <w:r>
         <w:fldChar w:fldCharType="separate"/>
@@ -1181,7 +1181,7 @@
         <w:fldChar w:fldCharType="begin"/>
       </w:r>
       <w:r>
-        <w:instrText xml:space="preserve"> HYPERLINK \l _Toc8814 </w:instrText>
+        <w:instrText xml:space="preserve"> HYPERLINK \l _Toc27190 </w:instrText>
       </w:r>
       <w:r>
         <w:fldChar w:fldCharType="separate"/>
@@ -1196,7 +1196,7 @@
         <w:fldChar w:fldCharType="begin"/>
       </w:r>
       <w:r>
-        <w:instrText xml:space="preserve"> PAGEREF _Toc8814 \h </w:instrText>
+        <w:instrText xml:space="preserve"> PAGEREF _Toc27190 \h </w:instrText>
       </w:r>
       <w:r>
         <w:fldChar w:fldCharType="separate"/>
@@ -1222,7 +1222,7 @@
         <w:fldChar w:fldCharType="begin"/>
       </w:r>
       <w:r>
-        <w:instrText xml:space="preserve"> HYPERLINK \l _Toc32204 </w:instrText>
+        <w:instrText xml:space="preserve"> HYPERLINK \l _Toc23846 </w:instrText>
       </w:r>
       <w:r>
         <w:fldChar w:fldCharType="separate"/>
@@ -1237,7 +1237,7 @@
         <w:fldChar w:fldCharType="begin"/>
       </w:r>
       <w:r>
-        <w:instrText xml:space="preserve"> PAGEREF _Toc32204 \h </w:instrText>
+        <w:instrText xml:space="preserve"> PAGEREF _Toc23846 \h </w:instrText>
       </w:r>
       <w:r>
         <w:fldChar w:fldCharType="separate"/>
@@ -1263,7 +1263,7 @@
         <w:fldChar w:fldCharType="begin"/>
       </w:r>
       <w:r>
-        <w:instrText xml:space="preserve"> HYPERLINK \l _Toc3948 </w:instrText>
+        <w:instrText xml:space="preserve"> HYPERLINK \l _Toc23456 </w:instrText>
       </w:r>
       <w:r>
         <w:fldChar w:fldCharType="separate"/>
@@ -1278,7 +1278,7 @@
         <w:fldChar w:fldCharType="begin"/>
       </w:r>
       <w:r>
-        <w:instrText xml:space="preserve"> PAGEREF _Toc3948 \h </w:instrText>
+        <w:instrText xml:space="preserve"> PAGEREF _Toc23456 \h </w:instrText>
       </w:r>
       <w:r>
         <w:fldChar w:fldCharType="separate"/>
@@ -1304,7 +1304,7 @@
         <w:fldChar w:fldCharType="begin"/>
       </w:r>
       <w:r>
-        <w:instrText xml:space="preserve"> HYPERLINK \l _Toc13651 </w:instrText>
+        <w:instrText xml:space="preserve"> HYPERLINK \l _Toc9985 </w:instrText>
       </w:r>
       <w:r>
         <w:fldChar w:fldCharType="separate"/>
@@ -1319,7 +1319,7 @@
         <w:fldChar w:fldCharType="begin"/>
       </w:r>
       <w:r>
-        <w:instrText xml:space="preserve"> PAGEREF _Toc13651 \h </w:instrText>
+        <w:instrText xml:space="preserve"> PAGEREF _Toc9985 \h </w:instrText>
       </w:r>
       <w:r>
         <w:fldChar w:fldCharType="separate"/>
@@ -1345,7 +1345,7 @@
         <w:fldChar w:fldCharType="begin"/>
       </w:r>
       <w:r>
-        <w:instrText xml:space="preserve"> HYPERLINK \l _Toc8572 </w:instrText>
+        <w:instrText xml:space="preserve"> HYPERLINK \l _Toc19044 </w:instrText>
       </w:r>
       <w:r>
         <w:fldChar w:fldCharType="separate"/>
@@ -1360,7 +1360,7 @@
         <w:fldChar w:fldCharType="begin"/>
       </w:r>
       <w:r>
-        <w:instrText xml:space="preserve"> PAGEREF _Toc8572 \h </w:instrText>
+        <w:instrText xml:space="preserve"> PAGEREF _Toc19044 \h </w:instrText>
       </w:r>
       <w:r>
         <w:fldChar w:fldCharType="separate"/>
@@ -1386,7 +1386,7 @@
         <w:fldChar w:fldCharType="begin"/>
       </w:r>
       <w:r>
-        <w:instrText xml:space="preserve"> HYPERLINK \l _Toc14550 </w:instrText>
+        <w:instrText xml:space="preserve"> HYPERLINK \l _Toc470 </w:instrText>
       </w:r>
       <w:r>
         <w:fldChar w:fldCharType="separate"/>
@@ -1401,7 +1401,7 @@
         <w:fldChar w:fldCharType="begin"/>
       </w:r>
       <w:r>
-        <w:instrText xml:space="preserve"> PAGEREF _Toc14550 \h </w:instrText>
+        <w:instrText xml:space="preserve"> PAGEREF _Toc470 \h </w:instrText>
       </w:r>
       <w:r>
         <w:fldChar w:fldCharType="separate"/>
@@ -1427,7 +1427,7 @@
         <w:fldChar w:fldCharType="begin"/>
       </w:r>
       <w:r>
-        <w:instrText xml:space="preserve"> HYPERLINK \l _Toc16123 </w:instrText>
+        <w:instrText xml:space="preserve"> HYPERLINK \l _Toc8221 </w:instrText>
       </w:r>
       <w:r>
         <w:fldChar w:fldCharType="separate"/>
@@ -1442,7 +1442,7 @@
         <w:fldChar w:fldCharType="begin"/>
       </w:r>
       <w:r>
-        <w:instrText xml:space="preserve"> PAGEREF _Toc16123 \h </w:instrText>
+        <w:instrText xml:space="preserve"> PAGEREF _Toc8221 \h </w:instrText>
       </w:r>
       <w:r>
         <w:fldChar w:fldCharType="separate"/>
@@ -1468,7 +1468,7 @@
         <w:fldChar w:fldCharType="begin"/>
       </w:r>
       <w:r>
-        <w:instrText xml:space="preserve"> HYPERLINK \l _Toc26849 </w:instrText>
+        <w:instrText xml:space="preserve"> HYPERLINK \l _Toc15138 </w:instrText>
       </w:r>
       <w:r>
         <w:fldChar w:fldCharType="separate"/>
@@ -1483,7 +1483,7 @@
         <w:fldChar w:fldCharType="begin"/>
       </w:r>
       <w:r>
-        <w:instrText xml:space="preserve"> PAGEREF _Toc26849 \h </w:instrText>
+        <w:instrText xml:space="preserve"> PAGEREF _Toc15138 \h </w:instrText>
       </w:r>
       <w:r>
         <w:fldChar w:fldCharType="separate"/>
@@ -1509,7 +1509,7 @@
         <w:fldChar w:fldCharType="begin"/>
       </w:r>
       <w:r>
-        <w:instrText xml:space="preserve"> HYPERLINK \l _Toc4958 </w:instrText>
+        <w:instrText xml:space="preserve"> HYPERLINK \l _Toc32120 </w:instrText>
       </w:r>
       <w:r>
         <w:fldChar w:fldCharType="separate"/>
@@ -1524,7 +1524,7 @@
         <w:fldChar w:fldCharType="begin"/>
       </w:r>
       <w:r>
-        <w:instrText xml:space="preserve"> PAGEREF _Toc4958 \h </w:instrText>
+        <w:instrText xml:space="preserve"> PAGEREF _Toc32120 \h </w:instrText>
       </w:r>
       <w:r>
         <w:fldChar w:fldCharType="separate"/>
@@ -1550,7 +1550,7 @@
         <w:fldChar w:fldCharType="begin"/>
       </w:r>
       <w:r>
-        <w:instrText xml:space="preserve"> HYPERLINK \l _Toc17353 </w:instrText>
+        <w:instrText xml:space="preserve"> HYPERLINK \l _Toc23924 </w:instrText>
       </w:r>
       <w:r>
         <w:fldChar w:fldCharType="separate"/>
@@ -1565,7 +1565,7 @@
         <w:fldChar w:fldCharType="begin"/>
       </w:r>
       <w:r>
-        <w:instrText xml:space="preserve"> PAGEREF _Toc17353 \h </w:instrText>
+        <w:instrText xml:space="preserve"> PAGEREF _Toc23924 \h </w:instrText>
       </w:r>
       <w:r>
         <w:fldChar w:fldCharType="separate"/>
@@ -1591,7 +1591,7 @@
         <w:fldChar w:fldCharType="begin"/>
       </w:r>
       <w:r>
-        <w:instrText xml:space="preserve"> HYPERLINK \l _Toc27025 </w:instrText>
+        <w:instrText xml:space="preserve"> HYPERLINK \l _Toc25851 </w:instrText>
       </w:r>
       <w:r>
         <w:fldChar w:fldCharType="separate"/>
@@ -1606,7 +1606,7 @@
         <w:fldChar w:fldCharType="begin"/>
       </w:r>
       <w:r>
-        <w:instrText xml:space="preserve"> PAGEREF _Toc27025 \h </w:instrText>
+        <w:instrText xml:space="preserve"> PAGEREF _Toc25851 \h </w:instrText>
       </w:r>
       <w:r>
         <w:fldChar w:fldCharType="separate"/>
@@ -1632,7 +1632,7 @@
         <w:fldChar w:fldCharType="begin"/>
       </w:r>
       <w:r>
-        <w:instrText xml:space="preserve"> HYPERLINK \l _Toc16139 </w:instrText>
+        <w:instrText xml:space="preserve"> HYPERLINK \l _Toc17061 </w:instrText>
       </w:r>
       <w:r>
         <w:fldChar w:fldCharType="separate"/>
@@ -1647,7 +1647,7 @@
         <w:fldChar w:fldCharType="begin"/>
       </w:r>
       <w:r>
-        <w:instrText xml:space="preserve"> PAGEREF _Toc16139 \h </w:instrText>
+        <w:instrText xml:space="preserve"> PAGEREF _Toc17061 \h </w:instrText>
       </w:r>
       <w:r>
         <w:fldChar w:fldCharType="separate"/>
@@ -1673,7 +1673,7 @@
         <w:fldChar w:fldCharType="begin"/>
       </w:r>
       <w:r>
-        <w:instrText xml:space="preserve"> HYPERLINK \l _Toc26203 </w:instrText>
+        <w:instrText xml:space="preserve"> HYPERLINK \l _Toc19674 </w:instrText>
       </w:r>
       <w:r>
         <w:fldChar w:fldCharType="separate"/>
@@ -1688,7 +1688,7 @@
         <w:fldChar w:fldCharType="begin"/>
       </w:r>
       <w:r>
-        <w:instrText xml:space="preserve"> PAGEREF _Toc26203 \h </w:instrText>
+        <w:instrText xml:space="preserve"> PAGEREF _Toc19674 \h </w:instrText>
       </w:r>
       <w:r>
         <w:fldChar w:fldCharType="separate"/>
@@ -1714,7 +1714,7 @@
         <w:fldChar w:fldCharType="begin"/>
       </w:r>
       <w:r>
-        <w:instrText xml:space="preserve"> HYPERLINK \l _Toc17573 </w:instrText>
+        <w:instrText xml:space="preserve"> HYPERLINK \l _Toc1235 </w:instrText>
       </w:r>
       <w:r>
         <w:fldChar w:fldCharType="separate"/>
@@ -1729,7 +1729,7 @@
         <w:fldChar w:fldCharType="begin"/>
       </w:r>
       <w:r>
-        <w:instrText xml:space="preserve"> PAGEREF _Toc17573 \h </w:instrText>
+        <w:instrText xml:space="preserve"> PAGEREF _Toc1235 \h </w:instrText>
       </w:r>
       <w:r>
         <w:fldChar w:fldCharType="separate"/>
@@ -1755,7 +1755,7 @@
         <w:fldChar w:fldCharType="begin"/>
       </w:r>
       <w:r>
-        <w:instrText xml:space="preserve"> HYPERLINK \l _Toc2757 </w:instrText>
+        <w:instrText xml:space="preserve"> HYPERLINK \l _Toc22668 </w:instrText>
       </w:r>
       <w:r>
         <w:fldChar w:fldCharType="separate"/>
@@ -1770,7 +1770,7 @@
         <w:fldChar w:fldCharType="begin"/>
       </w:r>
       <w:r>
-        <w:instrText xml:space="preserve"> PAGEREF _Toc2757 \h </w:instrText>
+        <w:instrText xml:space="preserve"> PAGEREF _Toc22668 \h </w:instrText>
       </w:r>
       <w:r>
         <w:fldChar w:fldCharType="separate"/>
@@ -1796,7 +1796,7 @@
         <w:fldChar w:fldCharType="begin"/>
       </w:r>
       <w:r>
-        <w:instrText xml:space="preserve"> HYPERLINK \l _Toc15455 </w:instrText>
+        <w:instrText xml:space="preserve"> HYPERLINK \l _Toc11300 </w:instrText>
       </w:r>
       <w:r>
         <w:fldChar w:fldCharType="separate"/>
@@ -1811,7 +1811,7 @@
         <w:fldChar w:fldCharType="begin"/>
       </w:r>
       <w:r>
-        <w:instrText xml:space="preserve"> PAGEREF _Toc15455 \h </w:instrText>
+        <w:instrText xml:space="preserve"> PAGEREF _Toc11300 \h </w:instrText>
       </w:r>
       <w:r>
         <w:fldChar w:fldCharType="separate"/>
@@ -1837,7 +1837,7 @@
         <w:fldChar w:fldCharType="begin"/>
       </w:r>
       <w:r>
-        <w:instrText xml:space="preserve"> HYPERLINK \l _Toc26326 </w:instrText>
+        <w:instrText xml:space="preserve"> HYPERLINK \l _Toc16388 </w:instrText>
       </w:r>
       <w:r>
         <w:fldChar w:fldCharType="separate"/>
@@ -1852,7 +1852,7 @@
         <w:fldChar w:fldCharType="begin"/>
       </w:r>
       <w:r>
-        <w:instrText xml:space="preserve"> PAGEREF _Toc26326 \h </w:instrText>
+        <w:instrText xml:space="preserve"> PAGEREF _Toc16388 \h </w:instrText>
       </w:r>
       <w:r>
         <w:fldChar w:fldCharType="separate"/>
@@ -1878,7 +1878,7 @@
         <w:fldChar w:fldCharType="begin"/>
       </w:r>
       <w:r>
-        <w:instrText xml:space="preserve"> HYPERLINK \l _Toc2066 </w:instrText>
+        <w:instrText xml:space="preserve"> HYPERLINK \l _Toc10134 </w:instrText>
       </w:r>
       <w:r>
         <w:fldChar w:fldCharType="separate"/>
@@ -1893,7 +1893,7 @@
         <w:fldChar w:fldCharType="begin"/>
       </w:r>
       <w:r>
-        <w:instrText xml:space="preserve"> PAGEREF _Toc2066 \h </w:instrText>
+        <w:instrText xml:space="preserve"> PAGEREF _Toc10134 \h </w:instrText>
       </w:r>
       <w:r>
         <w:fldChar w:fldCharType="separate"/>
@@ -1919,7 +1919,7 @@
         <w:fldChar w:fldCharType="begin"/>
       </w:r>
       <w:r>
-        <w:instrText xml:space="preserve"> HYPERLINK \l _Toc26409 </w:instrText>
+        <w:instrText xml:space="preserve"> HYPERLINK \l _Toc22971 </w:instrText>
       </w:r>
       <w:r>
         <w:fldChar w:fldCharType="separate"/>
@@ -1934,7 +1934,7 @@
         <w:fldChar w:fldCharType="begin"/>
       </w:r>
       <w:r>
-        <w:instrText xml:space="preserve"> PAGEREF _Toc26409 \h </w:instrText>
+        <w:instrText xml:space="preserve"> PAGEREF _Toc22971 \h </w:instrText>
       </w:r>
       <w:r>
         <w:fldChar w:fldCharType="separate"/>
@@ -1960,7 +1960,7 @@
         <w:fldChar w:fldCharType="begin"/>
       </w:r>
       <w:r>
-        <w:instrText xml:space="preserve"> HYPERLINK \l _Toc21362 </w:instrText>
+        <w:instrText xml:space="preserve"> HYPERLINK \l _Toc20844 </w:instrText>
       </w:r>
       <w:r>
         <w:fldChar w:fldCharType="separate"/>
@@ -1975,7 +1975,7 @@
         <w:fldChar w:fldCharType="begin"/>
       </w:r>
       <w:r>
-        <w:instrText xml:space="preserve"> PAGEREF _Toc21362 \h </w:instrText>
+        <w:instrText xml:space="preserve"> PAGEREF _Toc20844 \h </w:instrText>
       </w:r>
       <w:r>
         <w:fldChar w:fldCharType="separate"/>
@@ -2001,7 +2001,7 @@
         <w:fldChar w:fldCharType="begin"/>
       </w:r>
       <w:r>
-        <w:instrText xml:space="preserve"> HYPERLINK \l _Toc15392 </w:instrText>
+        <w:instrText xml:space="preserve"> HYPERLINK \l _Toc9703 </w:instrText>
       </w:r>
       <w:r>
         <w:fldChar w:fldCharType="separate"/>
@@ -2016,7 +2016,7 @@
         <w:fldChar w:fldCharType="begin"/>
       </w:r>
       <w:r>
-        <w:instrText xml:space="preserve"> PAGEREF _Toc15392 \h </w:instrText>
+        <w:instrText xml:space="preserve"> PAGEREF _Toc9703 \h </w:instrText>
       </w:r>
       <w:r>
         <w:fldChar w:fldCharType="separate"/>
@@ -2042,7 +2042,7 @@
         <w:fldChar w:fldCharType="begin"/>
       </w:r>
       <w:r>
-        <w:instrText xml:space="preserve"> HYPERLINK \l _Toc23273 </w:instrText>
+        <w:instrText xml:space="preserve"> HYPERLINK \l _Toc1022 </w:instrText>
       </w:r>
       <w:r>
         <w:fldChar w:fldCharType="separate"/>
@@ -2057,7 +2057,7 @@
         <w:fldChar w:fldCharType="begin"/>
       </w:r>
       <w:r>
-        <w:instrText xml:space="preserve"> PAGEREF _Toc23273 \h </w:instrText>
+        <w:instrText xml:space="preserve"> PAGEREF _Toc1022 \h </w:instrText>
       </w:r>
       <w:r>
         <w:fldChar w:fldCharType="separate"/>
@@ -2083,7 +2083,7 @@
         <w:fldChar w:fldCharType="begin"/>
       </w:r>
       <w:r>
-        <w:instrText xml:space="preserve"> HYPERLINK \l _Toc4035 </w:instrText>
+        <w:instrText xml:space="preserve"> HYPERLINK \l _Toc27798 </w:instrText>
       </w:r>
       <w:r>
         <w:fldChar w:fldCharType="separate"/>
@@ -2098,7 +2098,7 @@
         <w:fldChar w:fldCharType="begin"/>
       </w:r>
       <w:r>
-        <w:instrText xml:space="preserve"> PAGEREF _Toc4035 \h </w:instrText>
+        <w:instrText xml:space="preserve"> PAGEREF _Toc27798 \h </w:instrText>
       </w:r>
       <w:r>
         <w:fldChar w:fldCharType="separate"/>
@@ -2124,7 +2124,7 @@
         <w:fldChar w:fldCharType="begin"/>
       </w:r>
       <w:r>
-        <w:instrText xml:space="preserve"> HYPERLINK \l _Toc10882 </w:instrText>
+        <w:instrText xml:space="preserve"> HYPERLINK \l _Toc10730 </w:instrText>
       </w:r>
       <w:r>
         <w:fldChar w:fldCharType="separate"/>
@@ -2139,7 +2139,7 @@
         <w:fldChar w:fldCharType="begin"/>
       </w:r>
       <w:r>
-        <w:instrText xml:space="preserve"> PAGEREF _Toc10882 \h </w:instrText>
+        <w:instrText xml:space="preserve"> PAGEREF _Toc10730 \h </w:instrText>
       </w:r>
       <w:r>
         <w:fldChar w:fldCharType="separate"/>
@@ -2165,7 +2165,7 @@
         <w:fldChar w:fldCharType="begin"/>
       </w:r>
       <w:r>
-        <w:instrText xml:space="preserve"> HYPERLINK \l _Toc10128 </w:instrText>
+        <w:instrText xml:space="preserve"> HYPERLINK \l _Toc19850 </w:instrText>
       </w:r>
       <w:r>
         <w:fldChar w:fldCharType="separate"/>
@@ -2180,7 +2180,7 @@
         <w:fldChar w:fldCharType="begin"/>
       </w:r>
       <w:r>
-        <w:instrText xml:space="preserve"> PAGEREF _Toc10128 \h </w:instrText>
+        <w:instrText xml:space="preserve"> PAGEREF _Toc19850 \h </w:instrText>
       </w:r>
       <w:r>
         <w:fldChar w:fldCharType="separate"/>
@@ -2206,7 +2206,7 @@
         <w:fldChar w:fldCharType="begin"/>
       </w:r>
       <w:r>
-        <w:instrText xml:space="preserve"> HYPERLINK \l _Toc7414 </w:instrText>
+        <w:instrText xml:space="preserve"> HYPERLINK \l _Toc19712 </w:instrText>
       </w:r>
       <w:r>
         <w:fldChar w:fldCharType="separate"/>
@@ -2221,7 +2221,7 @@
         <w:fldChar w:fldCharType="begin"/>
       </w:r>
       <w:r>
-        <w:instrText xml:space="preserve"> PAGEREF _Toc7414 \h </w:instrText>
+        <w:instrText xml:space="preserve"> PAGEREF _Toc19712 \h </w:instrText>
       </w:r>
       <w:r>
         <w:fldChar w:fldCharType="separate"/>
@@ -2247,7 +2247,7 @@
         <w:fldChar w:fldCharType="begin"/>
       </w:r>
       <w:r>
-        <w:instrText xml:space="preserve"> HYPERLINK \l _Toc14785 </w:instrText>
+        <w:instrText xml:space="preserve"> HYPERLINK \l _Toc22537 </w:instrText>
       </w:r>
       <w:r>
         <w:fldChar w:fldCharType="separate"/>
@@ -2262,7 +2262,7 @@
         <w:fldChar w:fldCharType="begin"/>
       </w:r>
       <w:r>
-        <w:instrText xml:space="preserve"> PAGEREF _Toc14785 \h </w:instrText>
+        <w:instrText xml:space="preserve"> PAGEREF _Toc22537 \h </w:instrText>
       </w:r>
       <w:r>
         <w:fldChar w:fldCharType="separate"/>
@@ -2288,7 +2288,7 @@
         <w:fldChar w:fldCharType="begin"/>
       </w:r>
       <w:r>
-        <w:instrText xml:space="preserve"> HYPERLINK \l _Toc25690 </w:instrText>
+        <w:instrText xml:space="preserve"> HYPERLINK \l _Toc352 </w:instrText>
       </w:r>
       <w:r>
         <w:fldChar w:fldCharType="separate"/>
@@ -2303,7 +2303,7 @@
         <w:fldChar w:fldCharType="begin"/>
       </w:r>
       <w:r>
-        <w:instrText xml:space="preserve"> PAGEREF _Toc25690 \h </w:instrText>
+        <w:instrText xml:space="preserve"> PAGEREF _Toc352 \h </w:instrText>
       </w:r>
       <w:r>
         <w:fldChar w:fldCharType="separate"/>
@@ -2329,7 +2329,7 @@
         <w:fldChar w:fldCharType="begin"/>
       </w:r>
       <w:r>
-        <w:instrText xml:space="preserve"> HYPERLINK \l _Toc14806 </w:instrText>
+        <w:instrText xml:space="preserve"> HYPERLINK \l _Toc12789 </w:instrText>
       </w:r>
       <w:r>
         <w:fldChar w:fldCharType="separate"/>
@@ -2344,7 +2344,7 @@
         <w:fldChar w:fldCharType="begin"/>
       </w:r>
       <w:r>
-        <w:instrText xml:space="preserve"> PAGEREF _Toc14806 \h </w:instrText>
+        <w:instrText xml:space="preserve"> PAGEREF _Toc12789 \h </w:instrText>
       </w:r>
       <w:r>
         <w:fldChar w:fldCharType="separate"/>
@@ -2370,7 +2370,7 @@
         <w:fldChar w:fldCharType="begin"/>
       </w:r>
       <w:r>
-        <w:instrText xml:space="preserve"> HYPERLINK \l _Toc28925 </w:instrText>
+        <w:instrText xml:space="preserve"> HYPERLINK \l _Toc13979 </w:instrText>
       </w:r>
       <w:r>
         <w:fldChar w:fldCharType="separate"/>
@@ -2385,7 +2385,7 @@
         <w:fldChar w:fldCharType="begin"/>
       </w:r>
       <w:r>
-        <w:instrText xml:space="preserve"> PAGEREF _Toc28925 \h </w:instrText>
+        <w:instrText xml:space="preserve"> PAGEREF _Toc13979 \h </w:instrText>
       </w:r>
       <w:r>
         <w:fldChar w:fldCharType="separate"/>
@@ -2411,7 +2411,7 @@
         <w:fldChar w:fldCharType="begin"/>
       </w:r>
       <w:r>
-        <w:instrText xml:space="preserve"> HYPERLINK \l _Toc15976 </w:instrText>
+        <w:instrText xml:space="preserve"> HYPERLINK \l _Toc20716 </w:instrText>
       </w:r>
       <w:r>
         <w:fldChar w:fldCharType="separate"/>
@@ -2426,7 +2426,7 @@
         <w:fldChar w:fldCharType="begin"/>
       </w:r>
       <w:r>
-        <w:instrText xml:space="preserve"> PAGEREF _Toc15976 \h </w:instrText>
+        <w:instrText xml:space="preserve"> PAGEREF _Toc20716 \h </w:instrText>
       </w:r>
       <w:r>
         <w:fldChar w:fldCharType="separate"/>
@@ -2452,7 +2452,7 @@
         <w:fldChar w:fldCharType="begin"/>
       </w:r>
       <w:r>
-        <w:instrText xml:space="preserve"> HYPERLINK \l _Toc28790 </w:instrText>
+        <w:instrText xml:space="preserve"> HYPERLINK \l _Toc1756 </w:instrText>
       </w:r>
       <w:r>
         <w:fldChar w:fldCharType="separate"/>
@@ -2467,7 +2467,7 @@
         <w:fldChar w:fldCharType="begin"/>
       </w:r>
       <w:r>
-        <w:instrText xml:space="preserve"> PAGEREF _Toc28790 \h </w:instrText>
+        <w:instrText xml:space="preserve"> PAGEREF _Toc1756 \h </w:instrText>
       </w:r>
       <w:r>
         <w:fldChar w:fldCharType="separate"/>
@@ -2493,7 +2493,7 @@
         <w:fldChar w:fldCharType="begin"/>
       </w:r>
       <w:r>
-        <w:instrText xml:space="preserve"> HYPERLINK \l _Toc29324 </w:instrText>
+        <w:instrText xml:space="preserve"> HYPERLINK \l _Toc7501 </w:instrText>
       </w:r>
       <w:r>
         <w:fldChar w:fldCharType="separate"/>
@@ -2508,13 +2508,13 @@
         <w:fldChar w:fldCharType="begin"/>
       </w:r>
       <w:r>
-        <w:instrText xml:space="preserve"> PAGEREF _Toc29324 \h </w:instrText>
+        <w:instrText xml:space="preserve"> PAGEREF _Toc7501 \h </w:instrText>
       </w:r>
       <w:r>
         <w:fldChar w:fldCharType="separate"/>
       </w:r>
       <w:r>
-        <w:t>26</w:t>
+        <w:t>27</w:t>
       </w:r>
       <w:r>
         <w:fldChar w:fldCharType="end"/>
@@ -2534,7 +2534,7 @@
         <w:fldChar w:fldCharType="begin"/>
       </w:r>
       <w:r>
-        <w:instrText xml:space="preserve"> HYPERLINK \l _Toc11770 </w:instrText>
+        <w:instrText xml:space="preserve"> HYPERLINK \l _Toc7272 </w:instrText>
       </w:r>
       <w:r>
         <w:fldChar w:fldCharType="separate"/>
@@ -2549,7 +2549,7 @@
         <w:fldChar w:fldCharType="begin"/>
       </w:r>
       <w:r>
-        <w:instrText xml:space="preserve"> PAGEREF _Toc11770 \h </w:instrText>
+        <w:instrText xml:space="preserve"> PAGEREF _Toc7272 \h </w:instrText>
       </w:r>
       <w:r>
         <w:fldChar w:fldCharType="separate"/>
@@ -2575,7 +2575,7 @@
         <w:fldChar w:fldCharType="begin"/>
       </w:r>
       <w:r>
-        <w:instrText xml:space="preserve"> HYPERLINK \l _Toc22350 </w:instrText>
+        <w:instrText xml:space="preserve"> HYPERLINK \l _Toc22081 </w:instrText>
       </w:r>
       <w:r>
         <w:fldChar w:fldCharType="separate"/>
@@ -2590,7 +2590,7 @@
         <w:fldChar w:fldCharType="begin"/>
       </w:r>
       <w:r>
-        <w:instrText xml:space="preserve"> PAGEREF _Toc22350 \h </w:instrText>
+        <w:instrText xml:space="preserve"> PAGEREF _Toc22081 \h </w:instrText>
       </w:r>
       <w:r>
         <w:fldChar w:fldCharType="separate"/>
@@ -2616,7 +2616,7 @@
         <w:fldChar w:fldCharType="begin"/>
       </w:r>
       <w:r>
-        <w:instrText xml:space="preserve"> HYPERLINK \l _Toc9832 </w:instrText>
+        <w:instrText xml:space="preserve"> HYPERLINK \l _Toc18411 </w:instrText>
       </w:r>
       <w:r>
         <w:fldChar w:fldCharType="separate"/>
@@ -2631,7 +2631,7 @@
         <w:fldChar w:fldCharType="begin"/>
       </w:r>
       <w:r>
-        <w:instrText xml:space="preserve"> PAGEREF _Toc9832 \h </w:instrText>
+        <w:instrText xml:space="preserve"> PAGEREF _Toc18411 \h </w:instrText>
       </w:r>
       <w:r>
         <w:fldChar w:fldCharType="separate"/>
@@ -2657,7 +2657,7 @@
         <w:fldChar w:fldCharType="begin"/>
       </w:r>
       <w:r>
-        <w:instrText xml:space="preserve"> HYPERLINK \l _Toc32270 </w:instrText>
+        <w:instrText xml:space="preserve"> HYPERLINK \l _Toc1856 </w:instrText>
       </w:r>
       <w:r>
         <w:fldChar w:fldCharType="separate"/>
@@ -2672,7 +2672,7 @@
         <w:fldChar w:fldCharType="begin"/>
       </w:r>
       <w:r>
-        <w:instrText xml:space="preserve"> PAGEREF _Toc32270 \h </w:instrText>
+        <w:instrText xml:space="preserve"> PAGEREF _Toc1856 \h </w:instrText>
       </w:r>
       <w:r>
         <w:fldChar w:fldCharType="separate"/>
@@ -2698,7 +2698,7 @@
         <w:fldChar w:fldCharType="begin"/>
       </w:r>
       <w:r>
-        <w:instrText xml:space="preserve"> HYPERLINK \l _Toc30125 </w:instrText>
+        <w:instrText xml:space="preserve"> HYPERLINK \l _Toc30323 </w:instrText>
       </w:r>
       <w:r>
         <w:fldChar w:fldCharType="separate"/>
@@ -2713,7 +2713,7 @@
         <w:fldChar w:fldCharType="begin"/>
       </w:r>
       <w:r>
-        <w:instrText xml:space="preserve"> PAGEREF _Toc30125 \h </w:instrText>
+        <w:instrText xml:space="preserve"> PAGEREF _Toc30323 \h </w:instrText>
       </w:r>
       <w:r>
         <w:fldChar w:fldCharType="separate"/>
@@ -2739,7 +2739,7 @@
         <w:fldChar w:fldCharType="begin"/>
       </w:r>
       <w:r>
-        <w:instrText xml:space="preserve"> HYPERLINK \l _Toc27337 </w:instrText>
+        <w:instrText xml:space="preserve"> HYPERLINK \l _Toc8886 </w:instrText>
       </w:r>
       <w:r>
         <w:fldChar w:fldCharType="separate"/>
@@ -2754,13 +2754,13 @@
         <w:fldChar w:fldCharType="begin"/>
       </w:r>
       <w:r>
-        <w:instrText xml:space="preserve"> PAGEREF _Toc27337 \h </w:instrText>
+        <w:instrText xml:space="preserve"> PAGEREF _Toc8886 \h </w:instrText>
       </w:r>
       <w:r>
         <w:fldChar w:fldCharType="separate"/>
       </w:r>
       <w:r>
-        <w:t>28</w:t>
+        <w:t>29</w:t>
       </w:r>
       <w:r>
         <w:fldChar w:fldCharType="end"/>
@@ -2780,7 +2780,7 @@
         <w:fldChar w:fldCharType="begin"/>
       </w:r>
       <w:r>
-        <w:instrText xml:space="preserve"> HYPERLINK \l _Toc12410 </w:instrText>
+        <w:instrText xml:space="preserve"> HYPERLINK \l _Toc27658 </w:instrText>
       </w:r>
       <w:r>
         <w:fldChar w:fldCharType="separate"/>
@@ -2795,7 +2795,7 @@
         <w:fldChar w:fldCharType="begin"/>
       </w:r>
       <w:r>
-        <w:instrText xml:space="preserve"> PAGEREF _Toc12410 \h </w:instrText>
+        <w:instrText xml:space="preserve"> PAGEREF _Toc27658 \h </w:instrText>
       </w:r>
       <w:r>
         <w:fldChar w:fldCharType="separate"/>
@@ -2821,7 +2821,7 @@
         <w:fldChar w:fldCharType="begin"/>
       </w:r>
       <w:r>
-        <w:instrText xml:space="preserve"> HYPERLINK \l _Toc1420 </w:instrText>
+        <w:instrText xml:space="preserve"> HYPERLINK \l _Toc12964 </w:instrText>
       </w:r>
       <w:r>
         <w:fldChar w:fldCharType="separate"/>
@@ -2836,7 +2836,7 @@
         <w:fldChar w:fldCharType="begin"/>
       </w:r>
       <w:r>
-        <w:instrText xml:space="preserve"> PAGEREF _Toc1420 \h </w:instrText>
+        <w:instrText xml:space="preserve"> PAGEREF _Toc12964 \h </w:instrText>
       </w:r>
       <w:r>
         <w:fldChar w:fldCharType="separate"/>
@@ -2862,7 +2862,7 @@
         <w:fldChar w:fldCharType="begin"/>
       </w:r>
       <w:r>
-        <w:instrText xml:space="preserve"> HYPERLINK \l _Toc5206 </w:instrText>
+        <w:instrText xml:space="preserve"> HYPERLINK \l _Toc4169 </w:instrText>
       </w:r>
       <w:r>
         <w:fldChar w:fldCharType="separate"/>
@@ -2877,7 +2877,7 @@
         <w:fldChar w:fldCharType="begin"/>
       </w:r>
       <w:r>
-        <w:instrText xml:space="preserve"> PAGEREF _Toc5206 \h </w:instrText>
+        <w:instrText xml:space="preserve"> PAGEREF _Toc4169 \h </w:instrText>
       </w:r>
       <w:r>
         <w:fldChar w:fldCharType="separate"/>
@@ -2903,7 +2903,7 @@
         <w:fldChar w:fldCharType="begin"/>
       </w:r>
       <w:r>
-        <w:instrText xml:space="preserve"> HYPERLINK \l _Toc31911 </w:instrText>
+        <w:instrText xml:space="preserve"> HYPERLINK \l _Toc22386 </w:instrText>
       </w:r>
       <w:r>
         <w:fldChar w:fldCharType="separate"/>
@@ -2918,7 +2918,7 @@
         <w:fldChar w:fldCharType="begin"/>
       </w:r>
       <w:r>
-        <w:instrText xml:space="preserve"> PAGEREF _Toc31911 \h </w:instrText>
+        <w:instrText xml:space="preserve"> PAGEREF _Toc22386 \h </w:instrText>
       </w:r>
       <w:r>
         <w:fldChar w:fldCharType="separate"/>
@@ -2944,7 +2944,7 @@
         <w:fldChar w:fldCharType="begin"/>
       </w:r>
       <w:r>
-        <w:instrText xml:space="preserve"> HYPERLINK \l _Toc2453 </w:instrText>
+        <w:instrText xml:space="preserve"> HYPERLINK \l _Toc17501 </w:instrText>
       </w:r>
       <w:r>
         <w:fldChar w:fldCharType="separate"/>
@@ -2959,7 +2959,7 @@
         <w:fldChar w:fldCharType="begin"/>
       </w:r>
       <w:r>
-        <w:instrText xml:space="preserve"> PAGEREF _Toc2453 \h </w:instrText>
+        <w:instrText xml:space="preserve"> PAGEREF _Toc17501 \h </w:instrText>
       </w:r>
       <w:r>
         <w:fldChar w:fldCharType="separate"/>
@@ -2985,7 +2985,7 @@
         <w:fldChar w:fldCharType="begin"/>
       </w:r>
       <w:r>
-        <w:instrText xml:space="preserve"> HYPERLINK \l _Toc17757 </w:instrText>
+        <w:instrText xml:space="preserve"> HYPERLINK \l _Toc20058 </w:instrText>
       </w:r>
       <w:r>
         <w:fldChar w:fldCharType="separate"/>
@@ -3000,7 +3000,7 @@
         <w:fldChar w:fldCharType="begin"/>
       </w:r>
       <w:r>
-        <w:instrText xml:space="preserve"> PAGEREF _Toc17757 \h </w:instrText>
+        <w:instrText xml:space="preserve"> PAGEREF _Toc20058 \h </w:instrText>
       </w:r>
       <w:r>
         <w:fldChar w:fldCharType="separate"/>
@@ -3026,7 +3026,7 @@
         <w:fldChar w:fldCharType="begin"/>
       </w:r>
       <w:r>
-        <w:instrText xml:space="preserve"> HYPERLINK \l _Toc3518 </w:instrText>
+        <w:instrText xml:space="preserve"> HYPERLINK \l _Toc13906 </w:instrText>
       </w:r>
       <w:r>
         <w:fldChar w:fldCharType="separate"/>
@@ -3041,7 +3041,7 @@
         <w:fldChar w:fldCharType="begin"/>
       </w:r>
       <w:r>
-        <w:instrText xml:space="preserve"> PAGEREF _Toc3518 \h </w:instrText>
+        <w:instrText xml:space="preserve"> PAGEREF _Toc13906 \h </w:instrText>
       </w:r>
       <w:r>
         <w:fldChar w:fldCharType="separate"/>
@@ -3067,7 +3067,7 @@
         <w:fldChar w:fldCharType="begin"/>
       </w:r>
       <w:r>
-        <w:instrText xml:space="preserve"> HYPERLINK \l _Toc5919 </w:instrText>
+        <w:instrText xml:space="preserve"> HYPERLINK \l _Toc17421 </w:instrText>
       </w:r>
       <w:r>
         <w:fldChar w:fldCharType="separate"/>
@@ -3082,7 +3082,7 @@
         <w:fldChar w:fldCharType="begin"/>
       </w:r>
       <w:r>
-        <w:instrText xml:space="preserve"> PAGEREF _Toc5919 \h </w:instrText>
+        <w:instrText xml:space="preserve"> PAGEREF _Toc17421 \h </w:instrText>
       </w:r>
       <w:r>
         <w:fldChar w:fldCharType="separate"/>
@@ -3107,7 +3107,7 @@
         <w:pStyle w:val="2"/>
         <w:pageBreakBefore/>
       </w:pPr>
-      <w:bookmarkStart w:id="0" w:name="_Toc9710"/>
+      <w:bookmarkStart w:id="0" w:name="_Toc18048"/>
       <w:r>
         <w:t>1. Executive summary</w:t>
       </w:r>
@@ -4092,7 +4092,7 @@
         <w:pStyle w:val="2"/>
         <w:pageBreakBefore w:val="0"/>
       </w:pPr>
-      <w:bookmarkStart w:id="1" w:name="_Toc18566"/>
+      <w:bookmarkStart w:id="1" w:name="_Toc21959"/>
       <w:r>
         <w:t>2. Project background and scope</w:t>
       </w:r>
@@ -4178,7 +4178,7 @@
         <w:pStyle w:val="2"/>
         <w:pageBreakBefore w:val="0"/>
       </w:pPr>
-      <w:bookmarkStart w:id="2" w:name="_Toc11336"/>
+      <w:bookmarkStart w:id="2" w:name="_Toc21421"/>
       <w:r>
         <w:t>3. System architecture</w:t>
       </w:r>
@@ -4188,7 +4188,7 @@
       <w:pPr>
         <w:pStyle w:val="3"/>
       </w:pPr>
-      <w:bookmarkStart w:id="3" w:name="_Toc12689"/>
+      <w:bookmarkStart w:id="3" w:name="_Toc14776"/>
       <w:r>
         <w:t>3.1 Overview</w:t>
       </w:r>
@@ -4736,7 +4736,7 @@
       <w:pPr>
         <w:pStyle w:val="3"/>
       </w:pPr>
-      <w:bookmarkStart w:id="4" w:name="_Toc5752"/>
+      <w:bookmarkStart w:id="4" w:name="_Toc32659"/>
       <w:r>
         <w:t>3.2 What happens when a user taps a button</w:t>
       </w:r>
@@ -4898,7 +4898,7 @@
       <w:pPr>
         <w:pStyle w:val="3"/>
       </w:pPr>
-      <w:bookmarkStart w:id="5" w:name="_Toc13866"/>
+      <w:bookmarkStart w:id="5" w:name="_Toc16509"/>
       <w:r>
         <w:t>3.3 API reference</w:t>
       </w:r>
@@ -8589,7 +8589,7 @@
       <w:pPr>
         <w:pStyle w:val="3"/>
       </w:pPr>
-      <w:bookmarkStart w:id="6" w:name="_Toc9682"/>
+      <w:bookmarkStart w:id="6" w:name="_Toc5884"/>
       <w:r>
         <w:t>3.4 Privacy, safety and security design</w:t>
       </w:r>
@@ -8654,7 +8654,7 @@
       <w:pPr>
         <w:pStyle w:val="3"/>
       </w:pPr>
-      <w:bookmarkStart w:id="7" w:name="_Toc31949"/>
+      <w:bookmarkStart w:id="7" w:name="_Toc5566"/>
       <w:r>
         <w:t>3.5 Repository layout</w:t>
       </w:r>
@@ -9198,7 +9198,7 @@
         <w:pStyle w:val="2"/>
         <w:pageBreakBefore w:val="0"/>
       </w:pPr>
-      <w:bookmarkStart w:id="8" w:name="_Toc3954"/>
+      <w:bookmarkStart w:id="8" w:name="_Toc26855"/>
       <w:r>
         <w:t>4. Mobile application in detail</w:t>
       </w:r>
@@ -9208,7 +9208,7 @@
       <w:pPr>
         <w:pStyle w:val="3"/>
       </w:pPr>
-      <w:bookmarkStart w:id="9" w:name="_Toc13427"/>
+      <w:bookmarkStart w:id="9" w:name="_Toc16011"/>
       <w:r>
         <w:t>4.1 Technology</w:t>
       </w:r>
@@ -9797,7 +9797,7 @@
       <w:pPr>
         <w:pStyle w:val="3"/>
       </w:pPr>
-      <w:bookmarkStart w:id="10" w:name="_Toc911"/>
+      <w:bookmarkStart w:id="10" w:name="_Toc22518"/>
       <w:r>
         <w:t>4.2 Screens</w:t>
       </w:r>
@@ -10336,7 +10336,7 @@
       <w:pPr>
         <w:pStyle w:val="3"/>
       </w:pPr>
-      <w:bookmarkStart w:id="11" w:name="_Toc7441"/>
+      <w:bookmarkStart w:id="11" w:name="_Toc26019"/>
       <w:r>
         <w:t>4.3 State and data flow</w:t>
       </w:r>
@@ -10757,7 +10757,7 @@
       <w:pPr>
         <w:pStyle w:val="3"/>
       </w:pPr>
-      <w:bookmarkStart w:id="12" w:name="_Toc14462"/>
+      <w:bookmarkStart w:id="12" w:name="_Toc29695"/>
       <w:r>
         <w:t>4.4 PCOS assessment flow</w:t>
       </w:r>
@@ -10810,7 +10810,7 @@
       <w:pPr>
         <w:pStyle w:val="3"/>
       </w:pPr>
-      <w:bookmarkStart w:id="13" w:name="_Toc30988"/>
+      <w:bookmarkStart w:id="13" w:name="_Toc4918"/>
       <w:r>
         <w:t>4.5 Breast health flow</w:t>
       </w:r>
@@ -10915,7 +10915,7 @@
       <w:pPr>
         <w:pStyle w:val="3"/>
       </w:pPr>
-      <w:bookmarkStart w:id="14" w:name="_Toc24270"/>
+      <w:bookmarkStart w:id="14" w:name="_Toc17758"/>
       <w:r>
         <w:t>4.6 Breast self-exam and the monthly reminder</w:t>
       </w:r>
@@ -10989,7 +10989,7 @@
       <w:pPr>
         <w:pStyle w:val="3"/>
       </w:pPr>
-      <w:bookmarkStart w:id="15" w:name="_Toc22393"/>
+      <w:bookmarkStart w:id="15" w:name="_Toc29553"/>
       <w:r>
         <w:t>4.7 Server address setting</w:t>
       </w:r>
@@ -11008,7 +11008,7 @@
       <w:pPr>
         <w:pStyle w:val="3"/>
       </w:pPr>
-      <w:bookmarkStart w:id="16" w:name="_Toc20246"/>
+      <w:bookmarkStart w:id="16" w:name="_Toc32711"/>
       <w:r>
         <w:t>4.8 Android configuration</w:t>
       </w:r>
@@ -11054,7 +11054,7 @@
       <w:pPr>
         <w:pStyle w:val="3"/>
       </w:pPr>
-      <w:bookmarkStart w:id="17" w:name="_Toc25880"/>
+      <w:bookmarkStart w:id="17" w:name="_Toc10890"/>
       <w:r>
         <w:t>4.9 Automated tests</w:t>
       </w:r>
@@ -12044,7 +12044,7 @@
         <w:pStyle w:val="2"/>
         <w:pageBreakBefore w:val="0"/>
       </w:pPr>
-      <w:bookmarkStart w:id="18" w:name="_Toc1906"/>
+      <w:bookmarkStart w:id="18" w:name="_Toc16542"/>
       <w:r>
         <w:t>5. PCOS risk model</w:t>
       </w:r>
@@ -12063,7 +12063,7 @@
       <w:pPr>
         <w:pStyle w:val="3"/>
       </w:pPr>
-      <w:bookmarkStart w:id="19" w:name="_Toc8814"/>
+      <w:bookmarkStart w:id="19" w:name="_Toc27190"/>
       <w:r>
         <w:t>5.1 Data and preparation</w:t>
       </w:r>
@@ -12130,7 +12130,7 @@
       <w:pPr>
         <w:pStyle w:val="3"/>
       </w:pPr>
-      <w:bookmarkStart w:id="20" w:name="_Toc32204"/>
+      <w:bookmarkStart w:id="20" w:name="_Toc23846"/>
       <w:r>
         <w:t>5.2 Features and constraints</w:t>
       </w:r>
@@ -13402,7 +13402,7 @@
       <w:pPr>
         <w:pStyle w:val="3"/>
       </w:pPr>
-      <w:bookmarkStart w:id="21" w:name="_Toc3948"/>
+      <w:bookmarkStart w:id="21" w:name="_Toc23456"/>
       <w:r>
         <w:t>5.3 Model and training</w:t>
       </w:r>
@@ -13945,7 +13945,7 @@
       <w:pPr>
         <w:pStyle w:val="3"/>
       </w:pPr>
-      <w:bookmarkStart w:id="22" w:name="_Toc13651"/>
+      <w:bookmarkStart w:id="22" w:name="_Toc9985"/>
       <w:r>
         <w:t>5.4 Results</w:t>
       </w:r>
@@ -15863,7 +15863,7 @@
       <w:pPr>
         <w:pStyle w:val="3"/>
       </w:pPr>
-      <w:bookmarkStart w:id="23" w:name="_Toc8572"/>
+      <w:bookmarkStart w:id="23" w:name="_Toc19044"/>
       <w:r>
         <w:t>5.5 How the app uses it</w:t>
       </w:r>
@@ -15923,7 +15923,7 @@
       <w:pPr>
         <w:pStyle w:val="3"/>
       </w:pPr>
-      <w:bookmarkStart w:id="24" w:name="_Toc14550"/>
+      <w:bookmarkStart w:id="24" w:name="_Toc470"/>
       <w:r>
         <w:t>5.6 Limitations</w:t>
       </w:r>
@@ -15970,7 +15970,7 @@
         <w:pStyle w:val="2"/>
         <w:pageBreakBefore w:val="0"/>
       </w:pPr>
-      <w:bookmarkStart w:id="25" w:name="_Toc16123"/>
+      <w:bookmarkStart w:id="25" w:name="_Toc8221"/>
       <w:r>
         <w:t>6. Breast ultrasound classifier (component A)</w:t>
       </w:r>
@@ -15980,7 +15980,7 @@
       <w:pPr>
         <w:pStyle w:val="3"/>
       </w:pPr>
-      <w:bookmarkStart w:id="26" w:name="_Toc26849"/>
+      <w:bookmarkStart w:id="26" w:name="_Toc15138"/>
       <w:r>
         <w:t>6.1 What it does</w:t>
       </w:r>
@@ -15999,7 +15999,7 @@
       <w:pPr>
         <w:pStyle w:val="3"/>
       </w:pPr>
-      <w:bookmarkStart w:id="27" w:name="_Toc4958"/>
+      <w:bookmarkStart w:id="27" w:name="_Toc32120"/>
       <w:r>
         <w:t>6.2 Datasets</w:t>
       </w:r>
@@ -16697,6 +16697,14 @@
       </w:tblGrid>
       <w:tr>
         <w:tblPrEx>
+          <w:tblBorders>
+            <w:top w:val="single" w:color="D9C3CC" w:sz="4" w:space="0"/>
+            <w:left w:val="single" w:color="D9C3CC" w:sz="4" w:space="0"/>
+            <w:bottom w:val="single" w:color="D9C3CC" w:sz="4" w:space="0"/>
+            <w:right w:val="single" w:color="D9C3CC" w:sz="4" w:space="0"/>
+            <w:insideH w:val="single" w:color="D9C3CC" w:sz="4" w:space="0"/>
+            <w:insideV w:val="single" w:color="D9C3CC" w:sz="4" w:space="0"/>
+          </w:tblBorders>
           <w:tblCellMar>
             <w:top w:w="50" w:type="dxa"/>
             <w:left w:w="90" w:type="dxa"/>
@@ -18356,7 +18364,7 @@
       <w:pPr>
         <w:pStyle w:val="3"/>
       </w:pPr>
-      <w:bookmarkStart w:id="28" w:name="_Toc17353"/>
+      <w:bookmarkStart w:id="28" w:name="_Toc23924"/>
       <w:r>
         <w:t>6.3 Data-quality decisions</w:t>
       </w:r>
@@ -18480,7 +18488,7 @@
       <w:pPr>
         <w:pStyle w:val="3"/>
       </w:pPr>
-      <w:bookmarkStart w:id="29" w:name="_Toc27025"/>
+      <w:bookmarkStart w:id="29" w:name="_Toc25851"/>
       <w:r>
         <w:t>6.4 Method and settings</w:t>
       </w:r>
@@ -20122,7 +20130,7 @@
       <w:pPr>
         <w:pStyle w:val="3"/>
       </w:pPr>
-      <w:bookmarkStart w:id="30" w:name="_Toc16139"/>
+      <w:bookmarkStart w:id="30" w:name="_Toc17061"/>
       <w:r>
         <w:t>6.5 Selecting the recipe by cross-validation</w:t>
       </w:r>
@@ -22273,7 +22281,7 @@
       <w:pPr>
         <w:pStyle w:val="3"/>
       </w:pPr>
-      <w:bookmarkStart w:id="31" w:name="_Toc26203"/>
+      <w:bookmarkStart w:id="31" w:name="_Toc19674"/>
       <w:r>
         <w:t>6.6 Calibration, threshold and export</w:t>
       </w:r>
@@ -22359,7 +22367,7 @@
       <w:pPr>
         <w:pStyle w:val="3"/>
       </w:pPr>
-      <w:bookmarkStart w:id="32" w:name="_Toc17573"/>
+      <w:bookmarkStart w:id="32" w:name="_Toc1235"/>
       <w:r>
         <w:t>6.7 Model versions</w:t>
       </w:r>
@@ -22819,7 +22827,7 @@
       <w:pPr>
         <w:pStyle w:val="3"/>
       </w:pPr>
-      <w:bookmarkStart w:id="33" w:name="_Toc2757"/>
+      <w:bookmarkStart w:id="33" w:name="_Toc22668"/>
       <w:r>
         <w:t>6.8 Results</w:t>
       </w:r>
@@ -23569,6 +23577,14 @@
       </w:tblGrid>
       <w:tr>
         <w:tblPrEx>
+          <w:tblBorders>
+            <w:top w:val="single" w:color="D9C3CC" w:sz="4" w:space="0"/>
+            <w:left w:val="single" w:color="D9C3CC" w:sz="4" w:space="0"/>
+            <w:bottom w:val="single" w:color="D9C3CC" w:sz="4" w:space="0"/>
+            <w:right w:val="single" w:color="D9C3CC" w:sz="4" w:space="0"/>
+            <w:insideH w:val="single" w:color="D9C3CC" w:sz="4" w:space="0"/>
+            <w:insideV w:val="single" w:color="D9C3CC" w:sz="4" w:space="0"/>
+          </w:tblBorders>
           <w:tblCellMar>
             <w:top w:w="50" w:type="dxa"/>
             <w:left w:w="90" w:type="dxa"/>
@@ -26948,6 +26964,14 @@
       </w:tblGrid>
       <w:tr>
         <w:tblPrEx>
+          <w:tblBorders>
+            <w:top w:val="single" w:color="D9C3CC" w:sz="4" w:space="0"/>
+            <w:left w:val="single" w:color="D9C3CC" w:sz="4" w:space="0"/>
+            <w:bottom w:val="single" w:color="D9C3CC" w:sz="4" w:space="0"/>
+            <w:right w:val="single" w:color="D9C3CC" w:sz="4" w:space="0"/>
+            <w:insideH w:val="single" w:color="D9C3CC" w:sz="4" w:space="0"/>
+            <w:insideV w:val="single" w:color="D9C3CC" w:sz="4" w:space="0"/>
+          </w:tblBorders>
           <w:tblCellMar>
             <w:top w:w="50" w:type="dxa"/>
             <w:left w:w="90" w:type="dxa"/>
@@ -28775,7 +28799,7 @@
       <w:pPr>
         <w:pStyle w:val="3"/>
       </w:pPr>
-      <w:bookmarkStart w:id="34" w:name="_Toc15455"/>
+      <w:bookmarkStart w:id="34" w:name="_Toc11300"/>
       <w:r>
         <w:t>6.9 Rejecting uploads that are not breast ultrasounds</w:t>
       </w:r>
@@ -29709,7 +29733,7 @@
       <w:pPr>
         <w:pStyle w:val="3"/>
       </w:pPr>
-      <w:bookmarkStart w:id="35" w:name="_Toc26326"/>
+      <w:bookmarkStart w:id="35" w:name="_Toc16388"/>
       <w:r>
         <w:t>6.10 The screening threshold decision</w:t>
       </w:r>
@@ -30341,7 +30365,7 @@
       <w:pPr>
         <w:pStyle w:val="3"/>
       </w:pPr>
-      <w:bookmarkStart w:id="36" w:name="_Toc2066"/>
+      <w:bookmarkStart w:id="36" w:name="_Toc10134"/>
       <w:r>
         <w:t>6.11 Explainability</w:t>
       </w:r>
@@ -30420,7 +30444,7 @@
       <w:pPr>
         <w:pStyle w:val="3"/>
       </w:pPr>
-      <w:bookmarkStart w:id="37" w:name="_Toc26409"/>
+      <w:bookmarkStart w:id="37" w:name="_Toc22971"/>
       <w:r>
         <w:t>6.12 Limitations</w:t>
       </w:r>
@@ -30503,7 +30527,7 @@
         <w:pStyle w:val="2"/>
         <w:pageBreakBefore w:val="0"/>
       </w:pPr>
-      <w:bookmarkStart w:id="38" w:name="_Toc21362"/>
+      <w:bookmarkStart w:id="38" w:name="_Toc20844"/>
       <w:r>
         <w:t>7. Breast cancer risk questionnaire (component B)</w:t>
       </w:r>
@@ -30513,7 +30537,7 @@
       <w:pPr>
         <w:pStyle w:val="3"/>
       </w:pPr>
-      <w:bookmarkStart w:id="39" w:name="_Toc15392"/>
+      <w:bookmarkStart w:id="39" w:name="_Toc9703"/>
       <w:r>
         <w:t>7.1 Data and design</w:t>
       </w:r>
@@ -30627,7 +30651,7 @@
       <w:pPr>
         <w:pStyle w:val="3"/>
       </w:pPr>
-      <w:bookmarkStart w:id="40" w:name="_Toc23273"/>
+      <w:bookmarkStart w:id="40" w:name="_Toc1022"/>
       <w:r>
         <w:t>7.2 How answers become model inputs</w:t>
       </w:r>
@@ -31274,7 +31298,7 @@
       <w:pPr>
         <w:pStyle w:val="3"/>
       </w:pPr>
-      <w:bookmarkStart w:id="41" w:name="_Toc4035"/>
+      <w:bookmarkStart w:id="41" w:name="_Toc27798"/>
       <w:r>
         <w:t>7.3 Model settings</w:t>
       </w:r>
@@ -31863,7 +31887,7 @@
       <w:pPr>
         <w:pStyle w:val="3"/>
       </w:pPr>
-      <w:bookmarkStart w:id="42" w:name="_Toc10882"/>
+      <w:bookmarkStart w:id="42" w:name="_Toc10730"/>
       <w:r>
         <w:t>7.4 Results</w:t>
       </w:r>
@@ -33653,7 +33677,7 @@
       <w:pPr>
         <w:pStyle w:val="3"/>
       </w:pPr>
-      <w:bookmarkStart w:id="43" w:name="_Toc10128"/>
+      <w:bookmarkStart w:id="43" w:name="_Toc19850"/>
       <w:r>
         <w:t>7.5 What the user sees and why</w:t>
       </w:r>
@@ -34429,7 +34453,7 @@
       <w:pPr>
         <w:pStyle w:val="3"/>
       </w:pPr>
-      <w:bookmarkStart w:id="44" w:name="_Toc7414"/>
+      <w:bookmarkStart w:id="44" w:name="_Toc19712"/>
       <w:r>
         <w:t>7.6 Behaviour check through the API</w:t>
       </w:r>
@@ -35383,7 +35407,7 @@
       <w:pPr>
         <w:pStyle w:val="3"/>
       </w:pPr>
-      <w:bookmarkStart w:id="45" w:name="_Toc14785"/>
+      <w:bookmarkStart w:id="45" w:name="_Toc22537"/>
       <w:r>
         <w:t>7.7 Deviation from the scope document</w:t>
       </w:r>
@@ -35402,7 +35426,7 @@
       <w:pPr>
         <w:pStyle w:val="3"/>
       </w:pPr>
-      <w:bookmarkStart w:id="46" w:name="_Toc25690"/>
+      <w:bookmarkStart w:id="46" w:name="_Toc352"/>
       <w:r>
         <w:t>7.8 Limitations</w:t>
       </w:r>
@@ -35449,7 +35473,7 @@
         <w:pStyle w:val="2"/>
         <w:pageBreakBefore w:val="0"/>
       </w:pPr>
-      <w:bookmarkStart w:id="47" w:name="_Toc14806"/>
+      <w:bookmarkStart w:id="47" w:name="_Toc12789"/>
       <w:r>
         <w:t>8. Other parts of the breast module</w:t>
       </w:r>
@@ -35517,7 +35541,7 @@
         <w:pStyle w:val="2"/>
         <w:pageBreakBefore w:val="0"/>
       </w:pPr>
-      <w:bookmarkStart w:id="48" w:name="_Toc28925"/>
+      <w:bookmarkStart w:id="48" w:name="_Toc13979"/>
       <w:r>
         <w:t>9. Deployment and demo build</w:t>
       </w:r>
@@ -35527,7 +35551,7 @@
       <w:pPr>
         <w:pStyle w:val="3"/>
       </w:pPr>
-      <w:bookmarkStart w:id="49" w:name="_Toc15976"/>
+      <w:bookmarkStart w:id="49" w:name="_Toc20716"/>
       <w:r>
         <w:t>9.1 Hosting options considered</w:t>
       </w:r>
@@ -35888,7 +35912,7 @@
       <w:pPr>
         <w:pStyle w:val="3"/>
       </w:pPr>
-      <w:bookmarkStart w:id="50" w:name="_Toc28790"/>
+      <w:bookmarkStart w:id="50" w:name="_Toc1756"/>
       <w:r>
         <w:t>9.2 Demo procedure</w:t>
       </w:r>
@@ -35927,14 +35951,30 @@
           <w:b w:val="0"/>
           <w:i w:val="0"/>
         </w:rPr>
-        <w:t>Keep the PC awake during the demo; press Enter in the script window to stop everything.</w:t>
+        <w:t>Keep the PC awake during the demo. Do not type or paste anything in the script window: pressing Enter there stops the server and the tunnel, and the address must be pasted into the phone app instead.</w:t>
+      </w:r>
+    </w:p>
+    <w:p>
+      <w:r>
+        <w:rPr>
+          <w:b/>
+          <w:i w:val="0"/>
+        </w:rPr>
+        <w:t>Lesson from the first phone run (20 September 2026).</w:t>
+      </w:r>
+      <w:r>
+        <w:rPr>
+          <w:b w:val="0"/>
+          <w:i w:val="0"/>
+        </w:rPr>
+        <w:t xml:space="preserve"> The first attempt failed because the address was pasted into the script window's "press Enter to stop" prompt, which shut the server and tunnel down (and the emulator default address was typed instead of the tunnel address). After restarting the script and pasting the new address into the app, the app connected and worked. The script's stop prompt now says clearly not to type or paste there, and a harmless clean-up error message about the temporary log file (caused by the short Windows temp path) was removed.</w:t>
       </w:r>
     </w:p>
     <w:p>
       <w:pPr>
         <w:pStyle w:val="3"/>
       </w:pPr>
-      <w:bookmarkStart w:id="51" w:name="_Toc29324"/>
+      <w:bookmarkStart w:id="51" w:name="_Toc7501"/>
       <w:r>
         <w:t>9.3 Build environment and workarounds</w:t>
       </w:r>
@@ -36355,7 +36395,7 @@
       <w:pPr>
         <w:pStyle w:val="3"/>
       </w:pPr>
-      <w:bookmarkStart w:id="52" w:name="_Toc11770"/>
+      <w:bookmarkStart w:id="52" w:name="_Toc7272"/>
       <w:r>
         <w:t>9.4 APK builds</w:t>
       </w:r>
@@ -36656,7 +36696,7 @@
           <w:color w:val="555555"/>
           <w:sz w:val="17"/>
         </w:rPr>
-        <w:t>Both builds pass apksigner verification and request INTERNET, POST_NOTIFICATIONS, RECEIVE_BOOT_COMPLETED and VIBRATE. The file is copied to the user's Desktop as femora-release-arm64.apk. It has not yet been run on a physical phone.</w:t>
+        <w:t>Both builds pass apksigner verification and request INTERNET, POST_NOTIFICATIONS, RECEIVE_BOOT_COMPLETED and VIBRATE. The file is copied to the user's Desktop as femora-release-arm64.apk. Build 1 was installed and run on the developer's phone on 20 September 2026 (section 10).</w:t>
       </w:r>
     </w:p>
     <w:p>
@@ -36664,7 +36704,7 @@
         <w:pStyle w:val="2"/>
         <w:pageBreakBefore w:val="0"/>
       </w:pPr>
-      <w:bookmarkStart w:id="53" w:name="_Toc22350"/>
+      <w:bookmarkStart w:id="53" w:name="_Toc22081"/>
       <w:r>
         <w:t>10. Verification and testing</w:t>
       </w:r>
@@ -37488,6 +37528,85 @@
           </w:p>
         </w:tc>
       </w:tr>
+      <w:tr>
+        <w:tblPrEx>
+          <w:tblBorders>
+            <w:top w:val="single" w:color="D9C3CC" w:sz="4" w:space="0"/>
+            <w:left w:val="single" w:color="D9C3CC" w:sz="4" w:space="0"/>
+            <w:bottom w:val="single" w:color="D9C3CC" w:sz="4" w:space="0"/>
+            <w:right w:val="single" w:color="D9C3CC" w:sz="4" w:space="0"/>
+            <w:insideH w:val="single" w:color="D9C3CC" w:sz="4" w:space="0"/>
+            <w:insideV w:val="single" w:color="D9C3CC" w:sz="4" w:space="0"/>
+          </w:tblBorders>
+          <w:tblCellMar>
+            <w:top w:w="50" w:type="dxa"/>
+            <w:left w:w="90" w:type="dxa"/>
+            <w:bottom w:w="50" w:type="dxa"/>
+            <w:right w:w="90" w:type="dxa"/>
+          </w:tblCellMar>
+        </w:tblPrEx>
+        <w:trPr>
+          <w:cantSplit/>
+          <w:jc w:val="center"/>
+        </w:trPr>
+        <w:tc>
+          <w:tcPr>
+            <w:tcW w:w="2041" w:type="dxa"/>
+            <w:shd w:val="clear" w:color="auto" w:fill="FBE9EF"/>
+          </w:tcPr>
+          <w:p>
+            <w:pPr>
+              <w:spacing w:after="0" w:line="240" w:lineRule="auto"/>
+            </w:pPr>
+            <w:r>
+              <w:rPr>
+                <w:b w:val="0"/>
+                <w:i w:val="0"/>
+                <w:sz w:val="18"/>
+              </w:rPr>
+              <w:t>First run on a real phone</w:t>
+            </w:r>
+          </w:p>
+        </w:tc>
+        <w:tc>
+          <w:tcPr>
+            <w:tcW w:w="4082" w:type="dxa"/>
+            <w:shd w:val="clear" w:color="auto" w:fill="FBE9EF"/>
+          </w:tcPr>
+          <w:p>
+            <w:pPr>
+              <w:spacing w:after="0" w:line="240" w:lineRule="auto"/>
+            </w:pPr>
+            <w:r>
+              <w:rPr>
+                <w:b w:val="0"/>
+                <w:i w:val="0"/>
+                <w:sz w:val="18"/>
+              </w:rPr>
+              <w:t>APK installed on the developer's phone; demo script started; tunnel address pasted into the in-app Server address dialog</w:t>
+            </w:r>
+          </w:p>
+        </w:tc>
+        <w:tc>
+          <w:tcPr>
+            <w:tcW w:w="3288" w:type="dxa"/>
+            <w:shd w:val="clear" w:color="auto" w:fill="FBE9EF"/>
+          </w:tcPr>
+          <w:p>
+            <w:pPr>
+              <w:spacing w:after="0" w:line="240" w:lineRule="auto"/>
+            </w:pPr>
+            <w:r>
+              <w:rPr>
+                <w:b w:val="0"/>
+                <w:i w:val="0"/>
+                <w:sz w:val="18"/>
+              </w:rPr>
+              <w:t>Connected and working, confirmed by the developer after one retry (see the lesson in section 9.2)</w:t>
+            </w:r>
+          </w:p>
+        </w:tc>
+      </w:tr>
     </w:tbl>
     <w:p>
       <w:pPr>
@@ -37507,7 +37626,7 @@
           <w:b w:val="0"/>
           <w:i w:val="0"/>
         </w:rPr>
-        <w:t xml:space="preserve"> the APK has not yet been run on a physical phone; the server-address dialog has been tested for its logic but not clicked through on a device; the backend Docker image has not been built; one older template test (widget_test.dart, which looks for the text "Femora" on the first screen) fails and also fails on the previous main branch.</w:t>
+        <w:t xml:space="preserve"> the phone run was confirmed as working in general; each feature (both questionnaires, scan upload with the demo scans and a wrong image, heatmap toggle, self-exam reminder notification) was not itemised, so per-feature results on the phone are not yet recorded. The backend Docker image has not been built. One older template test (widget_test.dart, which looks for the text "Femora" on the first screen) fails and also fails on the previous main branch.</w:t>
       </w:r>
     </w:p>
     <w:p>
@@ -37515,7 +37634,7 @@
         <w:pStyle w:val="2"/>
         <w:pageBreakBefore w:val="0"/>
       </w:pPr>
-      <w:bookmarkStart w:id="54" w:name="_Toc9832"/>
+      <w:bookmarkStart w:id="54" w:name="_Toc18411"/>
       <w:r>
         <w:t>11. Limitations, ethics and risks</w:t>
       </w:r>
@@ -37525,7 +37644,7 @@
       <w:pPr>
         <w:pStyle w:val="3"/>
       </w:pPr>
-      <w:bookmarkStart w:id="55" w:name="_Toc32270"/>
+      <w:bookmarkStart w:id="55" w:name="_Toc1856"/>
       <w:r>
         <w:t>11.1 Failure modes and mitigations</w:t>
       </w:r>
@@ -37574,6 +37693,14 @@
       </w:tblGrid>
       <w:tr>
         <w:tblPrEx>
+          <w:tblBorders>
+            <w:top w:val="single" w:color="D9C3CC" w:sz="4" w:space="0"/>
+            <w:left w:val="single" w:color="D9C3CC" w:sz="4" w:space="0"/>
+            <w:bottom w:val="single" w:color="D9C3CC" w:sz="4" w:space="0"/>
+            <w:right w:val="single" w:color="D9C3CC" w:sz="4" w:space="0"/>
+            <w:insideH w:val="single" w:color="D9C3CC" w:sz="4" w:space="0"/>
+            <w:insideV w:val="single" w:color="D9C3CC" w:sz="4" w:space="0"/>
+          </w:tblBorders>
           <w:tblCellMar>
             <w:top w:w="50" w:type="dxa"/>
             <w:left w:w="90" w:type="dxa"/>
@@ -38374,7 +38501,7 @@
       <w:pPr>
         <w:pStyle w:val="3"/>
       </w:pPr>
-      <w:bookmarkStart w:id="56" w:name="_Toc30125"/>
+      <w:bookmarkStart w:id="56" w:name="_Toc30323"/>
       <w:r>
         <w:t>11.2 Ethical and legal points</w:t>
       </w:r>
@@ -38479,7 +38606,7 @@
       <w:pPr>
         <w:pStyle w:val="3"/>
       </w:pPr>
-      <w:bookmarkStart w:id="57" w:name="_Toc27337"/>
+      <w:bookmarkStart w:id="57" w:name="_Toc8886"/>
       <w:r>
         <w:t>11.3 Other limitations</w:t>
       </w:r>
@@ -38566,7 +38693,7 @@
         <w:pStyle w:val="2"/>
         <w:pageBreakBefore w:val="0"/>
       </w:pPr>
-      <w:bookmarkStart w:id="58" w:name="_Toc12410"/>
+      <w:bookmarkStart w:id="58" w:name="_Toc27658"/>
       <w:r>
         <w:t>12. Remaining work and recommended order</w:t>
       </w:r>
@@ -39267,7 +39394,7 @@
         <w:pStyle w:val="2"/>
         <w:pageBreakBefore w:val="0"/>
       </w:pPr>
-      <w:bookmarkStart w:id="59" w:name="_Toc1420"/>
+      <w:bookmarkStart w:id="59" w:name="_Toc12964"/>
       <w:r>
         <w:t>13. Conclusion</w:t>
       </w:r>
@@ -39287,7 +39414,7 @@
         <w:pStyle w:val="2"/>
         <w:pageBreakBefore/>
       </w:pPr>
-      <w:bookmarkStart w:id="60" w:name="_Toc5206"/>
+      <w:bookmarkStart w:id="60" w:name="_Toc4169"/>
       <w:r>
         <w:t>Appendix A. Metric glossary</w:t>
       </w:r>
@@ -40467,7 +40594,7 @@
         <w:pStyle w:val="2"/>
         <w:pageBreakBefore w:val="0"/>
       </w:pPr>
-      <w:bookmarkStart w:id="61" w:name="_Toc31911"/>
+      <w:bookmarkStart w:id="61" w:name="_Toc22386"/>
       <w:r>
         <w:t>Appendix B. Reproducibility</w:t>
       </w:r>
@@ -41066,7 +41193,7 @@
         <w:pStyle w:val="2"/>
         <w:pageBreakBefore w:val="0"/>
       </w:pPr>
-      <w:bookmarkStart w:id="62" w:name="_Toc2453"/>
+      <w:bookmarkStart w:id="62" w:name="_Toc17501"/>
       <w:r>
         <w:t>Appendix C. Data sources and citations</w:t>
       </w:r>
@@ -41173,7 +41300,7 @@
         <w:pStyle w:val="2"/>
         <w:pageBreakBefore w:val="0"/>
       </w:pPr>
-      <w:bookmarkStart w:id="63" w:name="_Toc17757"/>
+      <w:bookmarkStart w:id="63" w:name="_Toc20058"/>
       <w:r>
         <w:t>Appendix D. Key decisions and why</w:t>
       </w:r>
@@ -41881,7 +42008,7 @@
         <w:pStyle w:val="2"/>
         <w:pageBreakBefore w:val="0"/>
       </w:pPr>
-      <w:bookmarkStart w:id="64" w:name="_Toc3518"/>
+      <w:bookmarkStart w:id="64" w:name="_Toc13906"/>
       <w:r>
         <w:t>Appendix E. Commit history (main branch)</w:t>
       </w:r>
@@ -42795,7 +42922,7 @@
         <w:pStyle w:val="2"/>
         <w:pageBreakBefore w:val="0"/>
       </w:pPr>
-      <w:bookmarkStart w:id="65" w:name="_Toc5919"/>
+      <w:bookmarkStart w:id="65" w:name="_Toc17421"/>
       <w:r>
         <w:t>Appendix F. Questions a panel may ask</w:t>
       </w:r>
@@ -44873,8 +45000,8 @@
     <w:lsdException w:uiPriority="99" w:name="Normal Indent"/>
     <w:lsdException w:uiPriority="99" w:name="footnote text"/>
     <w:lsdException w:uiPriority="99" w:name="annotation text"/>
-    <w:lsdException w:uiPriority="99" w:semiHidden="0" w:name="header"/>
-    <w:lsdException w:uiPriority="99" w:semiHidden="0" w:name="footer"/>
+    <w:lsdException w:qFormat="1" w:uiPriority="99" w:semiHidden="0" w:name="header"/>
+    <w:lsdException w:qFormat="1" w:uiPriority="99" w:semiHidden="0" w:name="footer"/>
     <w:lsdException w:uiPriority="99" w:name="index heading"/>
     <w:lsdException w:qFormat="1" w:uiPriority="35" w:name="caption"/>
     <w:lsdException w:uiPriority="99" w:name="table of figures"/>
@@ -44887,32 +45014,32 @@
     <w:lsdException w:uiPriority="99" w:name="endnote reference"/>
     <w:lsdException w:uiPriority="99" w:name="endnote text"/>
     <w:lsdException w:uiPriority="99" w:name="table of authorities"/>
-    <w:lsdException w:uiPriority="99" w:semiHidden="0" w:name="macro"/>
+    <w:lsdException w:qFormat="1" w:uiPriority="99" w:semiHidden="0" w:name="macro"/>
     <w:lsdException w:uiPriority="99" w:name="toa heading"/>
     <w:lsdException w:qFormat="1" w:uiPriority="99" w:semiHidden="0" w:name="List"/>
-    <w:lsdException w:uiPriority="99" w:semiHidden="0" w:name="List Bullet"/>
-    <w:lsdException w:uiPriority="99" w:semiHidden="0" w:name="List Number"/>
+    <w:lsdException w:qFormat="1" w:uiPriority="99" w:semiHidden="0" w:name="List Bullet"/>
+    <w:lsdException w:qFormat="1" w:uiPriority="99" w:semiHidden="0" w:name="List Number"/>
     <w:lsdException w:qFormat="1" w:uiPriority="99" w:semiHidden="0" w:name="List 2"/>
-    <w:lsdException w:uiPriority="99" w:semiHidden="0" w:name="List 3"/>
+    <w:lsdException w:qFormat="1" w:uiPriority="99" w:semiHidden="0" w:name="List 3"/>
     <w:lsdException w:uiPriority="99" w:name="List 4"/>
     <w:lsdException w:uiPriority="99" w:name="List 5"/>
-    <w:lsdException w:uiPriority="99" w:semiHidden="0" w:name="List Bullet 2"/>
-    <w:lsdException w:uiPriority="99" w:semiHidden="0" w:name="List Bullet 3"/>
+    <w:lsdException w:qFormat="1" w:uiPriority="99" w:semiHidden="0" w:name="List Bullet 2"/>
+    <w:lsdException w:qFormat="1" w:uiPriority="99" w:semiHidden="0" w:name="List Bullet 3"/>
     <w:lsdException w:uiPriority="99" w:name="List Bullet 4"/>
     <w:lsdException w:uiPriority="99" w:name="List Bullet 5"/>
-    <w:lsdException w:uiPriority="99" w:semiHidden="0" w:name="List Number 2"/>
-    <w:lsdException w:uiPriority="99" w:semiHidden="0" w:name="List Number 3"/>
+    <w:lsdException w:qFormat="1" w:uiPriority="99" w:semiHidden="0" w:name="List Number 2"/>
+    <w:lsdException w:qFormat="1" w:uiPriority="99" w:semiHidden="0" w:name="List Number 3"/>
     <w:lsdException w:uiPriority="99" w:name="List Number 4"/>
     <w:lsdException w:uiPriority="99" w:name="List Number 5"/>
     <w:lsdException w:qFormat="1" w:unhideWhenUsed="0" w:uiPriority="10" w:semiHidden="0" w:name="Title"/>
     <w:lsdException w:uiPriority="99" w:name="Closing"/>
     <w:lsdException w:uiPriority="99" w:name="Signature"/>
     <w:lsdException w:qFormat="1" w:uiPriority="1" w:name="Default Paragraph Font"/>
-    <w:lsdException w:uiPriority="99" w:semiHidden="0" w:name="Body Text"/>
+    <w:lsdException w:qFormat="1" w:uiPriority="99" w:semiHidden="0" w:name="Body Text"/>
     <w:lsdException w:uiPriority="99" w:name="Body Text Indent"/>
-    <w:lsdException w:uiPriority="99" w:semiHidden="0" w:name="List Continue"/>
-    <w:lsdException w:uiPriority="99" w:semiHidden="0" w:name="List Continue 2"/>
-    <w:lsdException w:uiPriority="99" w:semiHidden="0" w:name="List Continue 3"/>
+    <w:lsdException w:qFormat="1" w:uiPriority="99" w:semiHidden="0" w:name="List Continue"/>
+    <w:lsdException w:qFormat="1" w:uiPriority="99" w:semiHidden="0" w:name="List Continue 2"/>
+    <w:lsdException w:qFormat="1" w:uiPriority="99" w:semiHidden="0" w:name="List Continue 3"/>
     <w:lsdException w:uiPriority="99" w:name="List Continue 4"/>
     <w:lsdException w:uiPriority="99" w:name="List Continue 5"/>
     <w:lsdException w:uiPriority="99" w:name="Message Header"/>
@@ -44922,8 +45049,8 @@
     <w:lsdException w:uiPriority="99" w:name="Body Text First Indent"/>
     <w:lsdException w:uiPriority="99" w:name="Body Text First Indent 2"/>
     <w:lsdException w:uiPriority="99" w:name="Note Heading"/>
-    <w:lsdException w:uiPriority="99" w:semiHidden="0" w:name="Body Text 2"/>
-    <w:lsdException w:uiPriority="99" w:semiHidden="0" w:name="Body Text 3"/>
+    <w:lsdException w:qFormat="1" w:uiPriority="99" w:semiHidden="0" w:name="Body Text 2"/>
+    <w:lsdException w:qFormat="1" w:uiPriority="99" w:semiHidden="0" w:name="Body Text 3"/>
     <w:lsdException w:uiPriority="99" w:name="Body Text Indent 2"/>
     <w:lsdException w:uiPriority="99" w:name="Body Text Indent 3"/>
     <w:lsdException w:uiPriority="99" w:name="Block Text"/>
@@ -44990,11 +45117,11 @@
     <w:lsdException w:uiPriority="99" w:name="Table Web 2"/>
     <w:lsdException w:uiPriority="99" w:name="Table Web 3"/>
     <w:lsdException w:uiPriority="99" w:name="Balloon Text"/>
-    <w:lsdException w:qFormat="1" w:unhideWhenUsed="0" w:uiPriority="59" w:semiHidden="0" w:name="Table Grid"/>
+    <w:lsdException w:unhideWhenUsed="0" w:uiPriority="59" w:semiHidden="0" w:name="Table Grid"/>
     <w:lsdException w:uiPriority="99" w:name="Table Theme"/>
     <w:lsdException w:qFormat="1" w:unhideWhenUsed="0" w:uiPriority="1" w:semiHidden="0" w:name="No Spacing"/>
     <w:lsdException w:unhideWhenUsed="0" w:uiPriority="60" w:semiHidden="0" w:name="Light Shading"/>
-    <w:lsdException w:qFormat="1" w:unhideWhenUsed="0" w:uiPriority="61" w:semiHidden="0" w:name="Light List"/>
+    <w:lsdException w:unhideWhenUsed="0" w:uiPriority="61" w:semiHidden="0" w:name="Light List"/>
     <w:lsdException w:unhideWhenUsed="0" w:uiPriority="62" w:semiHidden="0" w:name="Light Grid"/>
     <w:lsdException w:unhideWhenUsed="0" w:uiPriority="63" w:semiHidden="0" w:name="Medium Shading 1"/>
     <w:lsdException w:unhideWhenUsed="0" w:uiPriority="64" w:semiHidden="0" w:name="Medium Shading 2"/>
@@ -45009,7 +45136,7 @@
     <w:lsdException w:unhideWhenUsed="0" w:uiPriority="73" w:semiHidden="0" w:name="Colorful Grid"/>
     <w:lsdException w:unhideWhenUsed="0" w:uiPriority="60" w:semiHidden="0" w:name="Light Shading Accent 1"/>
     <w:lsdException w:unhideWhenUsed="0" w:uiPriority="61" w:semiHidden="0" w:name="Light List Accent 1"/>
-    <w:lsdException w:qFormat="1" w:unhideWhenUsed="0" w:uiPriority="62" w:semiHidden="0" w:name="Light Grid Accent 1"/>
+    <w:lsdException w:unhideWhenUsed="0" w:uiPriority="62" w:semiHidden="0" w:name="Light Grid Accent 1"/>
     <w:lsdException w:unhideWhenUsed="0" w:uiPriority="63" w:semiHidden="0" w:name="Medium Shading 1 Accent 1"/>
     <w:lsdException w:unhideWhenUsed="0" w:uiPriority="64" w:semiHidden="0" w:name="Medium Shading 2 Accent 1"/>
     <w:lsdException w:unhideWhenUsed="0" w:uiPriority="65" w:semiHidden="0" w:name="Medium List 1 Accent 1"/>
@@ -45026,7 +45153,7 @@
     <w:lsdException w:unhideWhenUsed="0" w:uiPriority="73" w:semiHidden="0" w:name="Colorful Grid Accent 1"/>
     <w:lsdException w:unhideWhenUsed="0" w:uiPriority="60" w:semiHidden="0" w:name="Light Shading Accent 2"/>
     <w:lsdException w:unhideWhenUsed="0" w:uiPriority="61" w:semiHidden="0" w:name="Light List Accent 2"/>
-    <w:lsdException w:qFormat="1" w:unhideWhenUsed="0" w:uiPriority="62" w:semiHidden="0" w:name="Light Grid Accent 2"/>
+    <w:lsdException w:unhideWhenUsed="0" w:uiPriority="62" w:semiHidden="0" w:name="Light Grid Accent 2"/>
     <w:lsdException w:unhideWhenUsed="0" w:uiPriority="63" w:semiHidden="0" w:name="Medium Shading 1 Accent 2"/>
     <w:lsdException w:unhideWhenUsed="0" w:uiPriority="64" w:semiHidden="0" w:name="Medium Shading 2 Accent 2"/>
     <w:lsdException w:unhideWhenUsed="0" w:uiPriority="65" w:semiHidden="0" w:name="Medium List 1 Accent 2"/>
@@ -45039,7 +45166,7 @@
     <w:lsdException w:unhideWhenUsed="0" w:uiPriority="72" w:semiHidden="0" w:name="Colorful List Accent 2"/>
     <w:lsdException w:unhideWhenUsed="0" w:uiPriority="73" w:semiHidden="0" w:name="Colorful Grid Accent 2"/>
     <w:lsdException w:unhideWhenUsed="0" w:uiPriority="60" w:semiHidden="0" w:name="Light Shading Accent 3"/>
-    <w:lsdException w:qFormat="1" w:unhideWhenUsed="0" w:uiPriority="61" w:semiHidden="0" w:name="Light List Accent 3"/>
+    <w:lsdException w:unhideWhenUsed="0" w:uiPriority="61" w:semiHidden="0" w:name="Light List Accent 3"/>
     <w:lsdException w:unhideWhenUsed="0" w:uiPriority="62" w:semiHidden="0" w:name="Light Grid Accent 3"/>
     <w:lsdException w:unhideWhenUsed="0" w:uiPriority="63" w:semiHidden="0" w:name="Medium Shading 1 Accent 3"/>
     <w:lsdException w:unhideWhenUsed="0" w:uiPriority="64" w:semiHidden="0" w:name="Medium Shading 2 Accent 3"/>
@@ -45363,6 +45490,7 @@
     <w:basedOn w:val="1"/>
     <w:link w:val="146"/>
     <w:unhideWhenUsed/>
+    <w:qFormat/>
     <w:uiPriority w:val="99"/>
     <w:pPr>
       <w:spacing w:after="120"/>
@@ -45373,6 +45501,7 @@
     <w:basedOn w:val="1"/>
     <w:link w:val="147"/>
     <w:unhideWhenUsed/>
+    <w:qFormat/>
     <w:uiPriority w:val="99"/>
     <w:pPr>
       <w:spacing w:after="120" w:line="480" w:lineRule="auto"/>
@@ -45383,6 +45512,7 @@
     <w:basedOn w:val="1"/>
     <w:link w:val="148"/>
     <w:unhideWhenUsed/>
+    <w:qFormat/>
     <w:uiPriority w:val="99"/>
     <w:pPr>
       <w:spacing w:after="120"/>
@@ -45426,6 +45556,7 @@
     <w:basedOn w:val="1"/>
     <w:link w:val="138"/>
     <w:unhideWhenUsed/>
+    <w:qFormat/>
     <w:uiPriority w:val="99"/>
     <w:pPr>
       <w:tabs>
@@ -45440,6 +45571,7 @@
     <w:basedOn w:val="1"/>
     <w:link w:val="137"/>
     <w:unhideWhenUsed/>
+    <w:qFormat/>
     <w:uiPriority w:val="99"/>
     <w:pPr>
       <w:tabs>
@@ -45475,6 +45607,7 @@
     <w:name w:val="List 3"/>
     <w:basedOn w:val="1"/>
     <w:unhideWhenUsed/>
+    <w:qFormat/>
     <w:uiPriority w:val="99"/>
     <w:pPr>
       <w:ind w:left="1080" w:hanging="360"/>
@@ -45485,6 +45618,7 @@
     <w:name w:val="List Bullet"/>
     <w:basedOn w:val="1"/>
     <w:unhideWhenUsed/>
+    <w:qFormat/>
     <w:uiPriority w:val="99"/>
     <w:pPr>
       <w:numPr>
@@ -45503,6 +45637,7 @@
     <w:name w:val="List Bullet 2"/>
     <w:basedOn w:val="1"/>
     <w:unhideWhenUsed/>
+    <w:qFormat/>
     <w:uiPriority w:val="99"/>
     <w:pPr>
       <w:numPr>
@@ -45516,6 +45651,7 @@
     <w:name w:val="List Bullet 3"/>
     <w:basedOn w:val="1"/>
     <w:unhideWhenUsed/>
+    <w:qFormat/>
     <w:uiPriority w:val="99"/>
     <w:pPr>
       <w:numPr>
@@ -45529,6 +45665,7 @@
     <w:name w:val="List Continue"/>
     <w:basedOn w:val="1"/>
     <w:unhideWhenUsed/>
+    <w:qFormat/>
     <w:uiPriority w:val="99"/>
     <w:pPr>
       <w:spacing w:after="120"/>
@@ -45540,6 +45677,7 @@
     <w:name w:val="List Continue 2"/>
     <w:basedOn w:val="1"/>
     <w:unhideWhenUsed/>
+    <w:qFormat/>
     <w:uiPriority w:val="99"/>
     <w:pPr>
       <w:spacing w:after="120"/>
@@ -45551,6 +45689,7 @@
     <w:name w:val="List Continue 3"/>
     <w:basedOn w:val="1"/>
     <w:unhideWhenUsed/>
+    <w:qFormat/>
     <w:uiPriority w:val="99"/>
     <w:pPr>
       <w:spacing w:after="120"/>
@@ -45562,6 +45701,7 @@
     <w:name w:val="List Number"/>
     <w:basedOn w:val="1"/>
     <w:unhideWhenUsed/>
+    <w:qFormat/>
     <w:uiPriority w:val="99"/>
     <w:pPr>
       <w:numPr>
@@ -45575,6 +45715,7 @@
     <w:name w:val="List Number 2"/>
     <w:basedOn w:val="1"/>
     <w:unhideWhenUsed/>
+    <w:qFormat/>
     <w:uiPriority w:val="99"/>
     <w:pPr>
       <w:numPr>
@@ -45588,6 +45729,7 @@
     <w:name w:val="List Number 3"/>
     <w:basedOn w:val="1"/>
     <w:unhideWhenUsed/>
+    <w:qFormat/>
     <w:uiPriority w:val="99"/>
     <w:pPr>
       <w:numPr>
@@ -45601,6 +45743,7 @@
     <w:name w:val="macro"/>
     <w:link w:val="149"/>
     <w:unhideWhenUsed/>
+    <w:qFormat/>
     <w:uiPriority w:val="99"/>
     <w:pPr>
       <w:tabs>
@@ -45656,7 +45799,6 @@
   <w:style w:type="table" w:styleId="35">
     <w:name w:val="Table Grid"/>
     <w:basedOn w:val="12"/>
-    <w:qFormat/>
     <w:uiPriority w:val="59"/>
     <w:pPr>
       <w:spacing w:after="0" w:line="240" w:lineRule="auto"/>
@@ -46427,7 +46569,6 @@
   <w:style w:type="table" w:styleId="46">
     <w:name w:val="Light List"/>
     <w:basedOn w:val="12"/>
-    <w:qFormat/>
     <w:uiPriority w:val="61"/>
     <w:pPr>
       <w:spacing w:after="0" w:line="240" w:lineRule="auto"/>
@@ -46707,7 +46848,6 @@
   <w:style w:type="table" w:styleId="49">
     <w:name w:val="Light List Accent 3"/>
     <w:basedOn w:val="12"/>
-    <w:qFormat/>
     <w:uiPriority w:val="61"/>
     <w:pPr>
       <w:spacing w:after="0" w:line="240" w:lineRule="auto"/>
@@ -47206,7 +47346,6 @@
   <w:style w:type="table" w:styleId="54">
     <w:name w:val="Light Grid Accent 1"/>
     <w:basedOn w:val="12"/>
-    <w:qFormat/>
     <w:uiPriority w:val="62"/>
     <w:pPr>
       <w:spacing w:after="0" w:line="240" w:lineRule="auto"/>
@@ -47333,7 +47472,6 @@
   <w:style w:type="table" w:styleId="55">
     <w:name w:val="Light Grid Accent 2"/>
     <w:basedOn w:val="12"/>
-    <w:qFormat/>
     <w:uiPriority w:val="62"/>
     <w:pPr>
       <w:spacing w:after="0" w:line="240" w:lineRule="auto"/>
@@ -57150,6 +57288,7 @@
     <w:name w:val="Footer Char"/>
     <w:basedOn w:val="11"/>
     <w:link w:val="18"/>
+    <w:qFormat/>
     <w:uiPriority w:val="99"/>
   </w:style>
   <w:style w:type="paragraph" w:styleId="139">
@@ -57205,6 +57344,7 @@
     <w:name w:val="Heading 3 Char"/>
     <w:basedOn w:val="11"/>
     <w:link w:val="4"/>
+    <w:qFormat/>
     <w:uiPriority w:val="9"/>
     <w:rPr>
       <w:rFonts w:asciiTheme="majorHAnsi" w:hAnsiTheme="majorHAnsi" w:eastAsiaTheme="majorEastAsia" w:cstheme="majorBidi"/>
@@ -57222,6 +57362,7 @@
     <w:name w:val="Title Char"/>
     <w:basedOn w:val="11"/>
     <w:link w:val="36"/>
+    <w:qFormat/>
     <w:uiPriority w:val="10"/>
     <w:rPr>
       <w:rFonts w:asciiTheme="majorHAnsi" w:hAnsiTheme="majorHAnsi" w:eastAsiaTheme="majorEastAsia" w:cstheme="majorBidi"/>
@@ -57236,6 +57377,7 @@
     <w:name w:val="Subtitle Char"/>
     <w:basedOn w:val="11"/>
     <w:link w:val="34"/>
+    <w:qFormat/>
     <w:uiPriority w:val="11"/>
     <w:rPr>
       <w:rFonts w:asciiTheme="majorHAnsi" w:hAnsiTheme="majorHAnsi" w:eastAsiaTheme="majorEastAsia" w:cstheme="majorBidi"/>
@@ -57280,6 +57422,7 @@
     <w:name w:val="Body Text 3 Char"/>
     <w:basedOn w:val="11"/>
     <w:link w:val="15"/>
+    <w:qFormat/>
     <w:uiPriority w:val="99"/>
     <w:rPr>
       <w:sz w:val="16"/>
@@ -57338,6 +57481,7 @@
     <w:basedOn w:val="11"/>
     <w:link w:val="5"/>
     <w:semiHidden/>
+    <w:qFormat/>
     <w:uiPriority w:val="9"/>
     <w:rPr>
       <w:rFonts w:asciiTheme="majorHAnsi" w:hAnsiTheme="majorHAnsi" w:eastAsiaTheme="majorEastAsia" w:cstheme="majorBidi"/>
@@ -57369,7 +57513,6 @@
     <w:basedOn w:val="11"/>
     <w:link w:val="7"/>
     <w:semiHidden/>
-    <w:qFormat/>
     <w:uiPriority w:val="9"/>
     <w:rPr>
       <w:rFonts w:asciiTheme="majorHAnsi" w:hAnsiTheme="majorHAnsi" w:eastAsiaTheme="majorEastAsia" w:cstheme="majorBidi"/>
@@ -57404,7 +57547,6 @@
     <w:basedOn w:val="11"/>
     <w:link w:val="9"/>
     <w:semiHidden/>
-    <w:qFormat/>
     <w:uiPriority w:val="9"/>
     <w:rPr>
       <w:rFonts w:asciiTheme="majorHAnsi" w:hAnsiTheme="majorHAnsi" w:eastAsiaTheme="majorEastAsia" w:cstheme="majorBidi"/>

</xml_diff>

<commit_message>
Report: informal web-image check and the non-breast ultrasound gate gap
Co-Authored-By: Claude Sonnet 5 <noreply@anthropic.com>
</commit_message>
<xml_diff>
--- a/scope doument/Femora - Project Progress and Technical Report.docx
+++ b/scope doument/Femora - Project Progress and Technical Report.docx
@@ -6,8 +6,8 @@
       <w:pPr>
         <w:spacing w:after="200"/>
       </w:pPr>
-      <w:bookmarkStart w:id="67" w:name="_GoBack"/>
-      <w:bookmarkEnd w:id="67"/>
+      <w:bookmarkStart w:id="68" w:name="_GoBack"/>
+      <w:bookmarkEnd w:id="68"/>
     </w:p>
     <w:p>
       <w:pPr>
@@ -98,6 +98,14 @@
         <w:gridCol w:w="7143"/>
       </w:tblGrid>
       <w:tr>
+        <w:tblPrEx>
+          <w:tblCellMar>
+            <w:top w:w="0" w:type="dxa"/>
+            <w:left w:w="108" w:type="dxa"/>
+            <w:bottom w:w="0" w:type="dxa"/>
+            <w:right w:w="108" w:type="dxa"/>
+          </w:tblCellMar>
+        </w:tblPrEx>
         <w:tc>
           <w:tcPr>
             <w:tcW w:w="2041" w:type="dxa"/>
@@ -394,7 +402,7 @@
         <w:fldChar w:fldCharType="begin"/>
       </w:r>
       <w:r>
-        <w:instrText xml:space="preserve"> HYPERLINK \l _Toc13185 </w:instrText>
+        <w:instrText xml:space="preserve"> HYPERLINK \l _Toc10838 </w:instrText>
       </w:r>
       <w:r>
         <w:fldChar w:fldCharType="separate"/>
@@ -409,7 +417,7 @@
         <w:fldChar w:fldCharType="begin"/>
       </w:r>
       <w:r>
-        <w:instrText xml:space="preserve"> PAGEREF _Toc13185 \h </w:instrText>
+        <w:instrText xml:space="preserve"> PAGEREF _Toc10838 \h </w:instrText>
       </w:r>
       <w:r>
         <w:fldChar w:fldCharType="separate"/>
@@ -435,7 +443,7 @@
         <w:fldChar w:fldCharType="begin"/>
       </w:r>
       <w:r>
-        <w:instrText xml:space="preserve"> HYPERLINK \l _Toc1868 </w:instrText>
+        <w:instrText xml:space="preserve"> HYPERLINK \l _Toc29466 </w:instrText>
       </w:r>
       <w:r>
         <w:fldChar w:fldCharType="separate"/>
@@ -450,7 +458,7 @@
         <w:fldChar w:fldCharType="begin"/>
       </w:r>
       <w:r>
-        <w:instrText xml:space="preserve"> PAGEREF _Toc1868 \h </w:instrText>
+        <w:instrText xml:space="preserve"> PAGEREF _Toc29466 \h </w:instrText>
       </w:r>
       <w:r>
         <w:fldChar w:fldCharType="separate"/>
@@ -476,7 +484,7 @@
         <w:fldChar w:fldCharType="begin"/>
       </w:r>
       <w:r>
-        <w:instrText xml:space="preserve"> HYPERLINK \l _Toc29416 </w:instrText>
+        <w:instrText xml:space="preserve"> HYPERLINK \l _Toc25681 </w:instrText>
       </w:r>
       <w:r>
         <w:fldChar w:fldCharType="separate"/>
@@ -491,7 +499,7 @@
         <w:fldChar w:fldCharType="begin"/>
       </w:r>
       <w:r>
-        <w:instrText xml:space="preserve"> PAGEREF _Toc29416 \h </w:instrText>
+        <w:instrText xml:space="preserve"> PAGEREF _Toc25681 \h </w:instrText>
       </w:r>
       <w:r>
         <w:fldChar w:fldCharType="separate"/>
@@ -517,7 +525,7 @@
         <w:fldChar w:fldCharType="begin"/>
       </w:r>
       <w:r>
-        <w:instrText xml:space="preserve"> HYPERLINK \l _Toc26767 </w:instrText>
+        <w:instrText xml:space="preserve"> HYPERLINK \l _Toc1171 </w:instrText>
       </w:r>
       <w:r>
         <w:fldChar w:fldCharType="separate"/>
@@ -532,7 +540,7 @@
         <w:fldChar w:fldCharType="begin"/>
       </w:r>
       <w:r>
-        <w:instrText xml:space="preserve"> PAGEREF _Toc26767 \h </w:instrText>
+        <w:instrText xml:space="preserve"> PAGEREF _Toc1171 \h </w:instrText>
       </w:r>
       <w:r>
         <w:fldChar w:fldCharType="separate"/>
@@ -558,7 +566,7 @@
         <w:fldChar w:fldCharType="begin"/>
       </w:r>
       <w:r>
-        <w:instrText xml:space="preserve"> HYPERLINK \l _Toc21978 </w:instrText>
+        <w:instrText xml:space="preserve"> HYPERLINK \l _Toc1223 </w:instrText>
       </w:r>
       <w:r>
         <w:fldChar w:fldCharType="separate"/>
@@ -573,7 +581,7 @@
         <w:fldChar w:fldCharType="begin"/>
       </w:r>
       <w:r>
-        <w:instrText xml:space="preserve"> PAGEREF _Toc21978 \h </w:instrText>
+        <w:instrText xml:space="preserve"> PAGEREF _Toc1223 \h </w:instrText>
       </w:r>
       <w:r>
         <w:fldChar w:fldCharType="separate"/>
@@ -599,7 +607,7 @@
         <w:fldChar w:fldCharType="begin"/>
       </w:r>
       <w:r>
-        <w:instrText xml:space="preserve"> HYPERLINK \l _Toc31779 </w:instrText>
+        <w:instrText xml:space="preserve"> HYPERLINK \l _Toc27439 </w:instrText>
       </w:r>
       <w:r>
         <w:fldChar w:fldCharType="separate"/>
@@ -614,7 +622,7 @@
         <w:fldChar w:fldCharType="begin"/>
       </w:r>
       <w:r>
-        <w:instrText xml:space="preserve"> PAGEREF _Toc31779 \h </w:instrText>
+        <w:instrText xml:space="preserve"> PAGEREF _Toc27439 \h </w:instrText>
       </w:r>
       <w:r>
         <w:fldChar w:fldCharType="separate"/>
@@ -640,7 +648,7 @@
         <w:fldChar w:fldCharType="begin"/>
       </w:r>
       <w:r>
-        <w:instrText xml:space="preserve"> HYPERLINK \l _Toc29686 </w:instrText>
+        <w:instrText xml:space="preserve"> HYPERLINK \l _Toc9501 </w:instrText>
       </w:r>
       <w:r>
         <w:fldChar w:fldCharType="separate"/>
@@ -655,7 +663,7 @@
         <w:fldChar w:fldCharType="begin"/>
       </w:r>
       <w:r>
-        <w:instrText xml:space="preserve"> PAGEREF _Toc29686 \h </w:instrText>
+        <w:instrText xml:space="preserve"> PAGEREF _Toc9501 \h </w:instrText>
       </w:r>
       <w:r>
         <w:fldChar w:fldCharType="separate"/>
@@ -681,7 +689,7 @@
         <w:fldChar w:fldCharType="begin"/>
       </w:r>
       <w:r>
-        <w:instrText xml:space="preserve"> HYPERLINK \l _Toc27877 </w:instrText>
+        <w:instrText xml:space="preserve"> HYPERLINK \l _Toc2381 </w:instrText>
       </w:r>
       <w:r>
         <w:fldChar w:fldCharType="separate"/>
@@ -696,7 +704,7 @@
         <w:fldChar w:fldCharType="begin"/>
       </w:r>
       <w:r>
-        <w:instrText xml:space="preserve"> PAGEREF _Toc27877 \h </w:instrText>
+        <w:instrText xml:space="preserve"> PAGEREF _Toc2381 \h </w:instrText>
       </w:r>
       <w:r>
         <w:fldChar w:fldCharType="separate"/>
@@ -722,7 +730,7 @@
         <w:fldChar w:fldCharType="begin"/>
       </w:r>
       <w:r>
-        <w:instrText xml:space="preserve"> HYPERLINK \l _Toc16274 </w:instrText>
+        <w:instrText xml:space="preserve"> HYPERLINK \l _Toc23171 </w:instrText>
       </w:r>
       <w:r>
         <w:fldChar w:fldCharType="separate"/>
@@ -737,7 +745,7 @@
         <w:fldChar w:fldCharType="begin"/>
       </w:r>
       <w:r>
-        <w:instrText xml:space="preserve"> PAGEREF _Toc16274 \h </w:instrText>
+        <w:instrText xml:space="preserve"> PAGEREF _Toc23171 \h </w:instrText>
       </w:r>
       <w:r>
         <w:fldChar w:fldCharType="separate"/>
@@ -763,7 +771,7 @@
         <w:fldChar w:fldCharType="begin"/>
       </w:r>
       <w:r>
-        <w:instrText xml:space="preserve"> HYPERLINK \l _Toc13072 </w:instrText>
+        <w:instrText xml:space="preserve"> HYPERLINK \l _Toc4738 </w:instrText>
       </w:r>
       <w:r>
         <w:fldChar w:fldCharType="separate"/>
@@ -778,7 +786,7 @@
         <w:fldChar w:fldCharType="begin"/>
       </w:r>
       <w:r>
-        <w:instrText xml:space="preserve"> PAGEREF _Toc13072 \h </w:instrText>
+        <w:instrText xml:space="preserve"> PAGEREF _Toc4738 \h </w:instrText>
       </w:r>
       <w:r>
         <w:fldChar w:fldCharType="separate"/>
@@ -804,7 +812,7 @@
         <w:fldChar w:fldCharType="begin"/>
       </w:r>
       <w:r>
-        <w:instrText xml:space="preserve"> HYPERLINK \l _Toc27184 </w:instrText>
+        <w:instrText xml:space="preserve"> HYPERLINK \l _Toc14542 </w:instrText>
       </w:r>
       <w:r>
         <w:fldChar w:fldCharType="separate"/>
@@ -819,7 +827,7 @@
         <w:fldChar w:fldCharType="begin"/>
       </w:r>
       <w:r>
-        <w:instrText xml:space="preserve"> PAGEREF _Toc27184 \h </w:instrText>
+        <w:instrText xml:space="preserve"> PAGEREF _Toc14542 \h </w:instrText>
       </w:r>
       <w:r>
         <w:fldChar w:fldCharType="separate"/>
@@ -845,7 +853,7 @@
         <w:fldChar w:fldCharType="begin"/>
       </w:r>
       <w:r>
-        <w:instrText xml:space="preserve"> HYPERLINK \l _Toc21362 </w:instrText>
+        <w:instrText xml:space="preserve"> HYPERLINK \l _Toc10113 </w:instrText>
       </w:r>
       <w:r>
         <w:fldChar w:fldCharType="separate"/>
@@ -860,7 +868,7 @@
         <w:fldChar w:fldCharType="begin"/>
       </w:r>
       <w:r>
-        <w:instrText xml:space="preserve"> PAGEREF _Toc21362 \h </w:instrText>
+        <w:instrText xml:space="preserve"> PAGEREF _Toc10113 \h </w:instrText>
       </w:r>
       <w:r>
         <w:fldChar w:fldCharType="separate"/>
@@ -886,7 +894,7 @@
         <w:fldChar w:fldCharType="begin"/>
       </w:r>
       <w:r>
-        <w:instrText xml:space="preserve"> HYPERLINK \l _Toc24952 </w:instrText>
+        <w:instrText xml:space="preserve"> HYPERLINK \l _Toc4434 </w:instrText>
       </w:r>
       <w:r>
         <w:fldChar w:fldCharType="separate"/>
@@ -901,7 +909,7 @@
         <w:fldChar w:fldCharType="begin"/>
       </w:r>
       <w:r>
-        <w:instrText xml:space="preserve"> PAGEREF _Toc24952 \h </w:instrText>
+        <w:instrText xml:space="preserve"> PAGEREF _Toc4434 \h </w:instrText>
       </w:r>
       <w:r>
         <w:fldChar w:fldCharType="separate"/>
@@ -927,7 +935,7 @@
         <w:fldChar w:fldCharType="begin"/>
       </w:r>
       <w:r>
-        <w:instrText xml:space="preserve"> HYPERLINK \l _Toc14581 </w:instrText>
+        <w:instrText xml:space="preserve"> HYPERLINK \l _Toc25103 </w:instrText>
       </w:r>
       <w:r>
         <w:fldChar w:fldCharType="separate"/>
@@ -942,7 +950,7 @@
         <w:fldChar w:fldCharType="begin"/>
       </w:r>
       <w:r>
-        <w:instrText xml:space="preserve"> PAGEREF _Toc14581 \h </w:instrText>
+        <w:instrText xml:space="preserve"> PAGEREF _Toc25103 \h </w:instrText>
       </w:r>
       <w:r>
         <w:fldChar w:fldCharType="separate"/>
@@ -968,7 +976,7 @@
         <w:fldChar w:fldCharType="begin"/>
       </w:r>
       <w:r>
-        <w:instrText xml:space="preserve"> HYPERLINK \l _Toc20738 </w:instrText>
+        <w:instrText xml:space="preserve"> HYPERLINK \l _Toc30076 </w:instrText>
       </w:r>
       <w:r>
         <w:fldChar w:fldCharType="separate"/>
@@ -983,7 +991,7 @@
         <w:fldChar w:fldCharType="begin"/>
       </w:r>
       <w:r>
-        <w:instrText xml:space="preserve"> PAGEREF _Toc20738 \h </w:instrText>
+        <w:instrText xml:space="preserve"> PAGEREF _Toc30076 \h </w:instrText>
       </w:r>
       <w:r>
         <w:fldChar w:fldCharType="separate"/>
@@ -1009,7 +1017,7 @@
         <w:fldChar w:fldCharType="begin"/>
       </w:r>
       <w:r>
-        <w:instrText xml:space="preserve"> HYPERLINK \l _Toc962 </w:instrText>
+        <w:instrText xml:space="preserve"> HYPERLINK \l _Toc22967 </w:instrText>
       </w:r>
       <w:r>
         <w:fldChar w:fldCharType="separate"/>
@@ -1024,7 +1032,7 @@
         <w:fldChar w:fldCharType="begin"/>
       </w:r>
       <w:r>
-        <w:instrText xml:space="preserve"> PAGEREF _Toc962 \h </w:instrText>
+        <w:instrText xml:space="preserve"> PAGEREF _Toc22967 \h </w:instrText>
       </w:r>
       <w:r>
         <w:fldChar w:fldCharType="separate"/>
@@ -1050,7 +1058,7 @@
         <w:fldChar w:fldCharType="begin"/>
       </w:r>
       <w:r>
-        <w:instrText xml:space="preserve"> HYPERLINK \l _Toc14202 </w:instrText>
+        <w:instrText xml:space="preserve"> HYPERLINK \l _Toc819 </w:instrText>
       </w:r>
       <w:r>
         <w:fldChar w:fldCharType="separate"/>
@@ -1065,7 +1073,7 @@
         <w:fldChar w:fldCharType="begin"/>
       </w:r>
       <w:r>
-        <w:instrText xml:space="preserve"> PAGEREF _Toc14202 \h </w:instrText>
+        <w:instrText xml:space="preserve"> PAGEREF _Toc819 \h </w:instrText>
       </w:r>
       <w:r>
         <w:fldChar w:fldCharType="separate"/>
@@ -1091,7 +1099,7 @@
         <w:fldChar w:fldCharType="begin"/>
       </w:r>
       <w:r>
-        <w:instrText xml:space="preserve"> HYPERLINK \l _Toc16983 </w:instrText>
+        <w:instrText xml:space="preserve"> HYPERLINK \l _Toc12069 </w:instrText>
       </w:r>
       <w:r>
         <w:fldChar w:fldCharType="separate"/>
@@ -1106,7 +1114,7 @@
         <w:fldChar w:fldCharType="begin"/>
       </w:r>
       <w:r>
-        <w:instrText xml:space="preserve"> PAGEREF _Toc16983 \h </w:instrText>
+        <w:instrText xml:space="preserve"> PAGEREF _Toc12069 \h </w:instrText>
       </w:r>
       <w:r>
         <w:fldChar w:fldCharType="separate"/>
@@ -1132,7 +1140,7 @@
         <w:fldChar w:fldCharType="begin"/>
       </w:r>
       <w:r>
-        <w:instrText xml:space="preserve"> HYPERLINK \l _Toc20967 </w:instrText>
+        <w:instrText xml:space="preserve"> HYPERLINK \l _Toc29004 </w:instrText>
       </w:r>
       <w:r>
         <w:fldChar w:fldCharType="separate"/>
@@ -1147,7 +1155,7 @@
         <w:fldChar w:fldCharType="begin"/>
       </w:r>
       <w:r>
-        <w:instrText xml:space="preserve"> PAGEREF _Toc20967 \h </w:instrText>
+        <w:instrText xml:space="preserve"> PAGEREF _Toc29004 \h </w:instrText>
       </w:r>
       <w:r>
         <w:fldChar w:fldCharType="separate"/>
@@ -1173,7 +1181,7 @@
         <w:fldChar w:fldCharType="begin"/>
       </w:r>
       <w:r>
-        <w:instrText xml:space="preserve"> HYPERLINK \l _Toc27697 </w:instrText>
+        <w:instrText xml:space="preserve"> HYPERLINK \l _Toc23374 </w:instrText>
       </w:r>
       <w:r>
         <w:fldChar w:fldCharType="separate"/>
@@ -1188,7 +1196,7 @@
         <w:fldChar w:fldCharType="begin"/>
       </w:r>
       <w:r>
-        <w:instrText xml:space="preserve"> PAGEREF _Toc27697 \h </w:instrText>
+        <w:instrText xml:space="preserve"> PAGEREF _Toc23374 \h </w:instrText>
       </w:r>
       <w:r>
         <w:fldChar w:fldCharType="separate"/>
@@ -1214,7 +1222,7 @@
         <w:fldChar w:fldCharType="begin"/>
       </w:r>
       <w:r>
-        <w:instrText xml:space="preserve"> HYPERLINK \l _Toc30231 </w:instrText>
+        <w:instrText xml:space="preserve"> HYPERLINK \l _Toc17558 </w:instrText>
       </w:r>
       <w:r>
         <w:fldChar w:fldCharType="separate"/>
@@ -1229,7 +1237,7 @@
         <w:fldChar w:fldCharType="begin"/>
       </w:r>
       <w:r>
-        <w:instrText xml:space="preserve"> PAGEREF _Toc30231 \h </w:instrText>
+        <w:instrText xml:space="preserve"> PAGEREF _Toc17558 \h </w:instrText>
       </w:r>
       <w:r>
         <w:fldChar w:fldCharType="separate"/>
@@ -1255,7 +1263,7 @@
         <w:fldChar w:fldCharType="begin"/>
       </w:r>
       <w:r>
-        <w:instrText xml:space="preserve"> HYPERLINK \l _Toc29447 </w:instrText>
+        <w:instrText xml:space="preserve"> HYPERLINK \l _Toc10440 </w:instrText>
       </w:r>
       <w:r>
         <w:fldChar w:fldCharType="separate"/>
@@ -1270,7 +1278,7 @@
         <w:fldChar w:fldCharType="begin"/>
       </w:r>
       <w:r>
-        <w:instrText xml:space="preserve"> PAGEREF _Toc29447 \h </w:instrText>
+        <w:instrText xml:space="preserve"> PAGEREF _Toc10440 \h </w:instrText>
       </w:r>
       <w:r>
         <w:fldChar w:fldCharType="separate"/>
@@ -1296,7 +1304,7 @@
         <w:fldChar w:fldCharType="begin"/>
       </w:r>
       <w:r>
-        <w:instrText xml:space="preserve"> HYPERLINK \l _Toc32128 </w:instrText>
+        <w:instrText xml:space="preserve"> HYPERLINK \l _Toc6725 </w:instrText>
       </w:r>
       <w:r>
         <w:fldChar w:fldCharType="separate"/>
@@ -1311,7 +1319,7 @@
         <w:fldChar w:fldCharType="begin"/>
       </w:r>
       <w:r>
-        <w:instrText xml:space="preserve"> PAGEREF _Toc32128 \h </w:instrText>
+        <w:instrText xml:space="preserve"> PAGEREF _Toc6725 \h </w:instrText>
       </w:r>
       <w:r>
         <w:fldChar w:fldCharType="separate"/>
@@ -1337,7 +1345,7 @@
         <w:fldChar w:fldCharType="begin"/>
       </w:r>
       <w:r>
-        <w:instrText xml:space="preserve"> HYPERLINK \l _Toc9899 </w:instrText>
+        <w:instrText xml:space="preserve"> HYPERLINK \l _Toc12549 </w:instrText>
       </w:r>
       <w:r>
         <w:fldChar w:fldCharType="separate"/>
@@ -1352,7 +1360,7 @@
         <w:fldChar w:fldCharType="begin"/>
       </w:r>
       <w:r>
-        <w:instrText xml:space="preserve"> PAGEREF _Toc9899 \h </w:instrText>
+        <w:instrText xml:space="preserve"> PAGEREF _Toc12549 \h </w:instrText>
       </w:r>
       <w:r>
         <w:fldChar w:fldCharType="separate"/>
@@ -1378,7 +1386,7 @@
         <w:fldChar w:fldCharType="begin"/>
       </w:r>
       <w:r>
-        <w:instrText xml:space="preserve"> HYPERLINK \l _Toc11287 </w:instrText>
+        <w:instrText xml:space="preserve"> HYPERLINK \l _Toc6859 </w:instrText>
       </w:r>
       <w:r>
         <w:fldChar w:fldCharType="separate"/>
@@ -1393,7 +1401,7 @@
         <w:fldChar w:fldCharType="begin"/>
       </w:r>
       <w:r>
-        <w:instrText xml:space="preserve"> PAGEREF _Toc11287 \h </w:instrText>
+        <w:instrText xml:space="preserve"> PAGEREF _Toc6859 \h </w:instrText>
       </w:r>
       <w:r>
         <w:fldChar w:fldCharType="separate"/>
@@ -1419,7 +1427,7 @@
         <w:fldChar w:fldCharType="begin"/>
       </w:r>
       <w:r>
-        <w:instrText xml:space="preserve"> HYPERLINK \l _Toc18689 </w:instrText>
+        <w:instrText xml:space="preserve"> HYPERLINK \l _Toc17491 </w:instrText>
       </w:r>
       <w:r>
         <w:fldChar w:fldCharType="separate"/>
@@ -1434,7 +1442,7 @@
         <w:fldChar w:fldCharType="begin"/>
       </w:r>
       <w:r>
-        <w:instrText xml:space="preserve"> PAGEREF _Toc18689 \h </w:instrText>
+        <w:instrText xml:space="preserve"> PAGEREF _Toc17491 \h </w:instrText>
       </w:r>
       <w:r>
         <w:fldChar w:fldCharType="separate"/>
@@ -1460,7 +1468,7 @@
         <w:fldChar w:fldCharType="begin"/>
       </w:r>
       <w:r>
-        <w:instrText xml:space="preserve"> HYPERLINK \l _Toc6887 </w:instrText>
+        <w:instrText xml:space="preserve"> HYPERLINK \l _Toc95 </w:instrText>
       </w:r>
       <w:r>
         <w:fldChar w:fldCharType="separate"/>
@@ -1475,7 +1483,7 @@
         <w:fldChar w:fldCharType="begin"/>
       </w:r>
       <w:r>
-        <w:instrText xml:space="preserve"> PAGEREF _Toc6887 \h </w:instrText>
+        <w:instrText xml:space="preserve"> PAGEREF _Toc95 \h </w:instrText>
       </w:r>
       <w:r>
         <w:fldChar w:fldCharType="separate"/>
@@ -1501,7 +1509,7 @@
         <w:fldChar w:fldCharType="begin"/>
       </w:r>
       <w:r>
-        <w:instrText xml:space="preserve"> HYPERLINK \l _Toc23221 </w:instrText>
+        <w:instrText xml:space="preserve"> HYPERLINK \l _Toc6849 </w:instrText>
       </w:r>
       <w:r>
         <w:fldChar w:fldCharType="separate"/>
@@ -1516,7 +1524,7 @@
         <w:fldChar w:fldCharType="begin"/>
       </w:r>
       <w:r>
-        <w:instrText xml:space="preserve"> PAGEREF _Toc23221 \h </w:instrText>
+        <w:instrText xml:space="preserve"> PAGEREF _Toc6849 \h </w:instrText>
       </w:r>
       <w:r>
         <w:fldChar w:fldCharType="separate"/>
@@ -1542,7 +1550,7 @@
         <w:fldChar w:fldCharType="begin"/>
       </w:r>
       <w:r>
-        <w:instrText xml:space="preserve"> HYPERLINK \l _Toc11385 </w:instrText>
+        <w:instrText xml:space="preserve"> HYPERLINK \l _Toc14011 </w:instrText>
       </w:r>
       <w:r>
         <w:fldChar w:fldCharType="separate"/>
@@ -1557,7 +1565,7 @@
         <w:fldChar w:fldCharType="begin"/>
       </w:r>
       <w:r>
-        <w:instrText xml:space="preserve"> PAGEREF _Toc11385 \h </w:instrText>
+        <w:instrText xml:space="preserve"> PAGEREF _Toc14011 \h </w:instrText>
       </w:r>
       <w:r>
         <w:fldChar w:fldCharType="separate"/>
@@ -1583,7 +1591,7 @@
         <w:fldChar w:fldCharType="begin"/>
       </w:r>
       <w:r>
-        <w:instrText xml:space="preserve"> HYPERLINK \l _Toc11924 </w:instrText>
+        <w:instrText xml:space="preserve"> HYPERLINK \l _Toc23906 </w:instrText>
       </w:r>
       <w:r>
         <w:fldChar w:fldCharType="separate"/>
@@ -1598,7 +1606,7 @@
         <w:fldChar w:fldCharType="begin"/>
       </w:r>
       <w:r>
-        <w:instrText xml:space="preserve"> PAGEREF _Toc11924 \h </w:instrText>
+        <w:instrText xml:space="preserve"> PAGEREF _Toc23906 \h </w:instrText>
       </w:r>
       <w:r>
         <w:fldChar w:fldCharType="separate"/>
@@ -1624,7 +1632,7 @@
         <w:fldChar w:fldCharType="begin"/>
       </w:r>
       <w:r>
-        <w:instrText xml:space="preserve"> HYPERLINK \l _Toc321 </w:instrText>
+        <w:instrText xml:space="preserve"> HYPERLINK \l _Toc1501 </w:instrText>
       </w:r>
       <w:r>
         <w:fldChar w:fldCharType="separate"/>
@@ -1639,7 +1647,7 @@
         <w:fldChar w:fldCharType="begin"/>
       </w:r>
       <w:r>
-        <w:instrText xml:space="preserve"> PAGEREF _Toc321 \h </w:instrText>
+        <w:instrText xml:space="preserve"> PAGEREF _Toc1501 \h </w:instrText>
       </w:r>
       <w:r>
         <w:fldChar w:fldCharType="separate"/>
@@ -1665,7 +1673,7 @@
         <w:fldChar w:fldCharType="begin"/>
       </w:r>
       <w:r>
-        <w:instrText xml:space="preserve"> HYPERLINK \l _Toc177 </w:instrText>
+        <w:instrText xml:space="preserve"> HYPERLINK \l _Toc21130 </w:instrText>
       </w:r>
       <w:r>
         <w:fldChar w:fldCharType="separate"/>
@@ -1680,7 +1688,7 @@
         <w:fldChar w:fldCharType="begin"/>
       </w:r>
       <w:r>
-        <w:instrText xml:space="preserve"> PAGEREF _Toc177 \h </w:instrText>
+        <w:instrText xml:space="preserve"> PAGEREF _Toc21130 \h </w:instrText>
       </w:r>
       <w:r>
         <w:fldChar w:fldCharType="separate"/>
@@ -1706,7 +1714,7 @@
         <w:fldChar w:fldCharType="begin"/>
       </w:r>
       <w:r>
-        <w:instrText xml:space="preserve"> HYPERLINK \l _Toc21677 </w:instrText>
+        <w:instrText xml:space="preserve"> HYPERLINK \l _Toc2006 </w:instrText>
       </w:r>
       <w:r>
         <w:fldChar w:fldCharType="separate"/>
@@ -1721,7 +1729,7 @@
         <w:fldChar w:fldCharType="begin"/>
       </w:r>
       <w:r>
-        <w:instrText xml:space="preserve"> PAGEREF _Toc21677 \h </w:instrText>
+        <w:instrText xml:space="preserve"> PAGEREF _Toc2006 \h </w:instrText>
       </w:r>
       <w:r>
         <w:fldChar w:fldCharType="separate"/>
@@ -1747,7 +1755,7 @@
         <w:fldChar w:fldCharType="begin"/>
       </w:r>
       <w:r>
-        <w:instrText xml:space="preserve"> HYPERLINK \l _Toc30659 </w:instrText>
+        <w:instrText xml:space="preserve"> HYPERLINK \l _Toc3310 </w:instrText>
       </w:r>
       <w:r>
         <w:fldChar w:fldCharType="separate"/>
@@ -1762,7 +1770,7 @@
         <w:fldChar w:fldCharType="begin"/>
       </w:r>
       <w:r>
-        <w:instrText xml:space="preserve"> PAGEREF _Toc30659 \h </w:instrText>
+        <w:instrText xml:space="preserve"> PAGEREF _Toc3310 \h </w:instrText>
       </w:r>
       <w:r>
         <w:fldChar w:fldCharType="separate"/>
@@ -1788,7 +1796,7 @@
         <w:fldChar w:fldCharType="begin"/>
       </w:r>
       <w:r>
-        <w:instrText xml:space="preserve"> HYPERLINK \l _Toc12178 </w:instrText>
+        <w:instrText xml:space="preserve"> HYPERLINK \l _Toc27101 </w:instrText>
       </w:r>
       <w:r>
         <w:fldChar w:fldCharType="separate"/>
@@ -1803,7 +1811,7 @@
         <w:fldChar w:fldCharType="begin"/>
       </w:r>
       <w:r>
-        <w:instrText xml:space="preserve"> PAGEREF _Toc12178 \h </w:instrText>
+        <w:instrText xml:space="preserve"> PAGEREF _Toc27101 \h </w:instrText>
       </w:r>
       <w:r>
         <w:fldChar w:fldCharType="separate"/>
@@ -1829,7 +1837,7 @@
         <w:fldChar w:fldCharType="begin"/>
       </w:r>
       <w:r>
-        <w:instrText xml:space="preserve"> HYPERLINK \l _Toc27229 </w:instrText>
+        <w:instrText xml:space="preserve"> HYPERLINK \l _Toc15574 </w:instrText>
       </w:r>
       <w:r>
         <w:fldChar w:fldCharType="separate"/>
@@ -1844,7 +1852,7 @@
         <w:fldChar w:fldCharType="begin"/>
       </w:r>
       <w:r>
-        <w:instrText xml:space="preserve"> PAGEREF _Toc27229 \h </w:instrText>
+        <w:instrText xml:space="preserve"> PAGEREF _Toc15574 \h </w:instrText>
       </w:r>
       <w:r>
         <w:fldChar w:fldCharType="separate"/>
@@ -1870,7 +1878,7 @@
         <w:fldChar w:fldCharType="begin"/>
       </w:r>
       <w:r>
-        <w:instrText xml:space="preserve"> HYPERLINK \l _Toc771 </w:instrText>
+        <w:instrText xml:space="preserve"> HYPERLINK \l _Toc15180 </w:instrText>
       </w:r>
       <w:r>
         <w:fldChar w:fldCharType="separate"/>
@@ -1885,7 +1893,7 @@
         <w:fldChar w:fldCharType="begin"/>
       </w:r>
       <w:r>
-        <w:instrText xml:space="preserve"> PAGEREF _Toc771 \h </w:instrText>
+        <w:instrText xml:space="preserve"> PAGEREF _Toc15180 \h </w:instrText>
       </w:r>
       <w:r>
         <w:fldChar w:fldCharType="separate"/>
@@ -1911,7 +1919,7 @@
         <w:fldChar w:fldCharType="begin"/>
       </w:r>
       <w:r>
-        <w:instrText xml:space="preserve"> HYPERLINK \l _Toc20204 </w:instrText>
+        <w:instrText xml:space="preserve"> HYPERLINK \l _Toc31674 </w:instrText>
       </w:r>
       <w:r>
         <w:fldChar w:fldCharType="separate"/>
@@ -1926,7 +1934,48 @@
         <w:fldChar w:fldCharType="begin"/>
       </w:r>
       <w:r>
-        <w:instrText xml:space="preserve"> PAGEREF _Toc20204 \h </w:instrText>
+        <w:instrText xml:space="preserve"> PAGEREF _Toc31674 \h </w:instrText>
+      </w:r>
+      <w:r>
+        <w:fldChar w:fldCharType="separate"/>
+      </w:r>
+      <w:r>
+        <w:t>21</w:t>
+      </w:r>
+      <w:r>
+        <w:fldChar w:fldCharType="end"/>
+      </w:r>
+      <w:r>
+        <w:fldChar w:fldCharType="end"/>
+      </w:r>
+    </w:p>
+    <w:p>
+      <w:pPr>
+        <w:pStyle w:val="38"/>
+        <w:tabs>
+          <w:tab w:val="right" w:leader="dot" w:pos="9412"/>
+        </w:tabs>
+      </w:pPr>
+      <w:r>
+        <w:fldChar w:fldCharType="begin"/>
+      </w:r>
+      <w:r>
+        <w:instrText xml:space="preserve"> HYPERLINK \l _Toc24878 </w:instrText>
+      </w:r>
+      <w:r>
+        <w:fldChar w:fldCharType="separate"/>
+      </w:r>
+      <w:r>
+        <w:t>6.13 Informal check with images from the web</w:t>
+      </w:r>
+      <w:r>
+        <w:tab/>
+      </w:r>
+      <w:r>
+        <w:fldChar w:fldCharType="begin"/>
+      </w:r>
+      <w:r>
+        <w:instrText xml:space="preserve"> PAGEREF _Toc24878 \h </w:instrText>
       </w:r>
       <w:r>
         <w:fldChar w:fldCharType="separate"/>
@@ -1952,7 +2001,7 @@
         <w:fldChar w:fldCharType="begin"/>
       </w:r>
       <w:r>
-        <w:instrText xml:space="preserve"> HYPERLINK \l _Toc5846 </w:instrText>
+        <w:instrText xml:space="preserve"> HYPERLINK \l _Toc28170 </w:instrText>
       </w:r>
       <w:r>
         <w:fldChar w:fldCharType="separate"/>
@@ -1967,13 +2016,13 @@
         <w:fldChar w:fldCharType="begin"/>
       </w:r>
       <w:r>
-        <w:instrText xml:space="preserve"> PAGEREF _Toc5846 \h </w:instrText>
+        <w:instrText xml:space="preserve"> PAGEREF _Toc28170 \h </w:instrText>
       </w:r>
       <w:r>
         <w:fldChar w:fldCharType="separate"/>
       </w:r>
       <w:r>
-        <w:t>21</w:t>
+        <w:t>22</w:t>
       </w:r>
       <w:r>
         <w:fldChar w:fldCharType="end"/>
@@ -1993,7 +2042,7 @@
         <w:fldChar w:fldCharType="begin"/>
       </w:r>
       <w:r>
-        <w:instrText xml:space="preserve"> HYPERLINK \l _Toc13470 </w:instrText>
+        <w:instrText xml:space="preserve"> HYPERLINK \l _Toc15232 </w:instrText>
       </w:r>
       <w:r>
         <w:fldChar w:fldCharType="separate"/>
@@ -2008,13 +2057,13 @@
         <w:fldChar w:fldCharType="begin"/>
       </w:r>
       <w:r>
-        <w:instrText xml:space="preserve"> PAGEREF _Toc13470 \h </w:instrText>
+        <w:instrText xml:space="preserve"> PAGEREF _Toc15232 \h </w:instrText>
       </w:r>
       <w:r>
         <w:fldChar w:fldCharType="separate"/>
       </w:r>
       <w:r>
-        <w:t>21</w:t>
+        <w:t>22</w:t>
       </w:r>
       <w:r>
         <w:fldChar w:fldCharType="end"/>
@@ -2034,7 +2083,7 @@
         <w:fldChar w:fldCharType="begin"/>
       </w:r>
       <w:r>
-        <w:instrText xml:space="preserve"> HYPERLINK \l _Toc20836 </w:instrText>
+        <w:instrText xml:space="preserve"> HYPERLINK \l _Toc13294 </w:instrText>
       </w:r>
       <w:r>
         <w:fldChar w:fldCharType="separate"/>
@@ -2049,13 +2098,13 @@
         <w:fldChar w:fldCharType="begin"/>
       </w:r>
       <w:r>
-        <w:instrText xml:space="preserve"> PAGEREF _Toc20836 \h </w:instrText>
+        <w:instrText xml:space="preserve"> PAGEREF _Toc13294 \h </w:instrText>
       </w:r>
       <w:r>
         <w:fldChar w:fldCharType="separate"/>
       </w:r>
       <w:r>
-        <w:t>22</w:t>
+        <w:t>23</w:t>
       </w:r>
       <w:r>
         <w:fldChar w:fldCharType="end"/>
@@ -2075,7 +2124,7 @@
         <w:fldChar w:fldCharType="begin"/>
       </w:r>
       <w:r>
-        <w:instrText xml:space="preserve"> HYPERLINK \l _Toc21671 </w:instrText>
+        <w:instrText xml:space="preserve"> HYPERLINK \l _Toc12641 </w:instrText>
       </w:r>
       <w:r>
         <w:fldChar w:fldCharType="separate"/>
@@ -2090,13 +2139,13 @@
         <w:fldChar w:fldCharType="begin"/>
       </w:r>
       <w:r>
-        <w:instrText xml:space="preserve"> PAGEREF _Toc21671 \h </w:instrText>
+        <w:instrText xml:space="preserve"> PAGEREF _Toc12641 \h </w:instrText>
       </w:r>
       <w:r>
         <w:fldChar w:fldCharType="separate"/>
       </w:r>
       <w:r>
-        <w:t>22</w:t>
+        <w:t>23</w:t>
       </w:r>
       <w:r>
         <w:fldChar w:fldCharType="end"/>
@@ -2116,7 +2165,7 @@
         <w:fldChar w:fldCharType="begin"/>
       </w:r>
       <w:r>
-        <w:instrText xml:space="preserve"> HYPERLINK \l _Toc19021 </w:instrText>
+        <w:instrText xml:space="preserve"> HYPERLINK \l _Toc10558 </w:instrText>
       </w:r>
       <w:r>
         <w:fldChar w:fldCharType="separate"/>
@@ -2131,7 +2180,7 @@
         <w:fldChar w:fldCharType="begin"/>
       </w:r>
       <w:r>
-        <w:instrText xml:space="preserve"> PAGEREF _Toc19021 \h </w:instrText>
+        <w:instrText xml:space="preserve"> PAGEREF _Toc10558 \h </w:instrText>
       </w:r>
       <w:r>
         <w:fldChar w:fldCharType="separate"/>
@@ -2157,7 +2206,7 @@
         <w:fldChar w:fldCharType="begin"/>
       </w:r>
       <w:r>
-        <w:instrText xml:space="preserve"> HYPERLINK \l _Toc1660 </w:instrText>
+        <w:instrText xml:space="preserve"> HYPERLINK \l _Toc17338 </w:instrText>
       </w:r>
       <w:r>
         <w:fldChar w:fldCharType="separate"/>
@@ -2172,13 +2221,13 @@
         <w:fldChar w:fldCharType="begin"/>
       </w:r>
       <w:r>
-        <w:instrText xml:space="preserve"> PAGEREF _Toc1660 \h </w:instrText>
+        <w:instrText xml:space="preserve"> PAGEREF _Toc17338 \h </w:instrText>
       </w:r>
       <w:r>
         <w:fldChar w:fldCharType="separate"/>
       </w:r>
       <w:r>
-        <w:t>24</w:t>
+        <w:t>25</w:t>
       </w:r>
       <w:r>
         <w:fldChar w:fldCharType="end"/>
@@ -2198,7 +2247,7 @@
         <w:fldChar w:fldCharType="begin"/>
       </w:r>
       <w:r>
-        <w:instrText xml:space="preserve"> HYPERLINK \l _Toc26688 </w:instrText>
+        <w:instrText xml:space="preserve"> HYPERLINK \l _Toc13826 </w:instrText>
       </w:r>
       <w:r>
         <w:fldChar w:fldCharType="separate"/>
@@ -2213,7 +2262,7 @@
         <w:fldChar w:fldCharType="begin"/>
       </w:r>
       <w:r>
-        <w:instrText xml:space="preserve"> PAGEREF _Toc26688 \h </w:instrText>
+        <w:instrText xml:space="preserve"> PAGEREF _Toc13826 \h </w:instrText>
       </w:r>
       <w:r>
         <w:fldChar w:fldCharType="separate"/>
@@ -2239,7 +2288,7 @@
         <w:fldChar w:fldCharType="begin"/>
       </w:r>
       <w:r>
-        <w:instrText xml:space="preserve"> HYPERLINK \l _Toc30449 </w:instrText>
+        <w:instrText xml:space="preserve"> HYPERLINK \l _Toc547 </w:instrText>
       </w:r>
       <w:r>
         <w:fldChar w:fldCharType="separate"/>
@@ -2254,13 +2303,13 @@
         <w:fldChar w:fldCharType="begin"/>
       </w:r>
       <w:r>
-        <w:instrText xml:space="preserve"> PAGEREF _Toc30449 \h </w:instrText>
+        <w:instrText xml:space="preserve"> PAGEREF _Toc547 \h </w:instrText>
       </w:r>
       <w:r>
         <w:fldChar w:fldCharType="separate"/>
       </w:r>
       <w:r>
-        <w:t>25</w:t>
+        <w:t>26</w:t>
       </w:r>
       <w:r>
         <w:fldChar w:fldCharType="end"/>
@@ -2280,7 +2329,7 @@
         <w:fldChar w:fldCharType="begin"/>
       </w:r>
       <w:r>
-        <w:instrText xml:space="preserve"> HYPERLINK \l _Toc2582 </w:instrText>
+        <w:instrText xml:space="preserve"> HYPERLINK \l _Toc15424 </w:instrText>
       </w:r>
       <w:r>
         <w:fldChar w:fldCharType="separate"/>
@@ -2295,13 +2344,13 @@
         <w:fldChar w:fldCharType="begin"/>
       </w:r>
       <w:r>
-        <w:instrText xml:space="preserve"> PAGEREF _Toc2582 \h </w:instrText>
+        <w:instrText xml:space="preserve"> PAGEREF _Toc15424 \h </w:instrText>
       </w:r>
       <w:r>
         <w:fldChar w:fldCharType="separate"/>
       </w:r>
       <w:r>
-        <w:t>25</w:t>
+        <w:t>26</w:t>
       </w:r>
       <w:r>
         <w:fldChar w:fldCharType="end"/>
@@ -2321,7 +2370,7 @@
         <w:fldChar w:fldCharType="begin"/>
       </w:r>
       <w:r>
-        <w:instrText xml:space="preserve"> HYPERLINK \l _Toc16749 </w:instrText>
+        <w:instrText xml:space="preserve"> HYPERLINK \l _Toc23579 </w:instrText>
       </w:r>
       <w:r>
         <w:fldChar w:fldCharType="separate"/>
@@ -2336,13 +2385,13 @@
         <w:fldChar w:fldCharType="begin"/>
       </w:r>
       <w:r>
-        <w:instrText xml:space="preserve"> PAGEREF _Toc16749 \h </w:instrText>
+        <w:instrText xml:space="preserve"> PAGEREF _Toc23579 \h </w:instrText>
       </w:r>
       <w:r>
         <w:fldChar w:fldCharType="separate"/>
       </w:r>
       <w:r>
-        <w:t>25</w:t>
+        <w:t>26</w:t>
       </w:r>
       <w:r>
         <w:fldChar w:fldCharType="end"/>
@@ -2362,7 +2411,7 @@
         <w:fldChar w:fldCharType="begin"/>
       </w:r>
       <w:r>
-        <w:instrText xml:space="preserve"> HYPERLINK \l _Toc32199 </w:instrText>
+        <w:instrText xml:space="preserve"> HYPERLINK \l _Toc21726 </w:instrText>
       </w:r>
       <w:r>
         <w:fldChar w:fldCharType="separate"/>
@@ -2377,13 +2426,13 @@
         <w:fldChar w:fldCharType="begin"/>
       </w:r>
       <w:r>
-        <w:instrText xml:space="preserve"> PAGEREF _Toc32199 \h </w:instrText>
+        <w:instrText xml:space="preserve"> PAGEREF _Toc21726 \h </w:instrText>
       </w:r>
       <w:r>
         <w:fldChar w:fldCharType="separate"/>
       </w:r>
       <w:r>
-        <w:t>26</w:t>
+        <w:t>27</w:t>
       </w:r>
       <w:r>
         <w:fldChar w:fldCharType="end"/>
@@ -2403,7 +2452,7 @@
         <w:fldChar w:fldCharType="begin"/>
       </w:r>
       <w:r>
-        <w:instrText xml:space="preserve"> HYPERLINK \l _Toc17290 </w:instrText>
+        <w:instrText xml:space="preserve"> HYPERLINK \l _Toc22730 </w:instrText>
       </w:r>
       <w:r>
         <w:fldChar w:fldCharType="separate"/>
@@ -2418,13 +2467,13 @@
         <w:fldChar w:fldCharType="begin"/>
       </w:r>
       <w:r>
-        <w:instrText xml:space="preserve"> PAGEREF _Toc17290 \h </w:instrText>
+        <w:instrText xml:space="preserve"> PAGEREF _Toc22730 \h </w:instrText>
       </w:r>
       <w:r>
         <w:fldChar w:fldCharType="separate"/>
       </w:r>
       <w:r>
-        <w:t>26</w:t>
+        <w:t>27</w:t>
       </w:r>
       <w:r>
         <w:fldChar w:fldCharType="end"/>
@@ -2444,7 +2493,7 @@
         <w:fldChar w:fldCharType="begin"/>
       </w:r>
       <w:r>
-        <w:instrText xml:space="preserve"> HYPERLINK \l _Toc23551 </w:instrText>
+        <w:instrText xml:space="preserve"> HYPERLINK \l _Toc23772 </w:instrText>
       </w:r>
       <w:r>
         <w:fldChar w:fldCharType="separate"/>
@@ -2459,13 +2508,13 @@
         <w:fldChar w:fldCharType="begin"/>
       </w:r>
       <w:r>
-        <w:instrText xml:space="preserve"> PAGEREF _Toc23551 \h </w:instrText>
+        <w:instrText xml:space="preserve"> PAGEREF _Toc23772 \h </w:instrText>
       </w:r>
       <w:r>
         <w:fldChar w:fldCharType="separate"/>
       </w:r>
       <w:r>
-        <w:t>26</w:t>
+        <w:t>27</w:t>
       </w:r>
       <w:r>
         <w:fldChar w:fldCharType="end"/>
@@ -2485,7 +2534,7 @@
         <w:fldChar w:fldCharType="begin"/>
       </w:r>
       <w:r>
-        <w:instrText xml:space="preserve"> HYPERLINK \l _Toc1750 </w:instrText>
+        <w:instrText xml:space="preserve"> HYPERLINK \l _Toc20951 </w:instrText>
       </w:r>
       <w:r>
         <w:fldChar w:fldCharType="separate"/>
@@ -2500,7 +2549,7 @@
         <w:fldChar w:fldCharType="begin"/>
       </w:r>
       <w:r>
-        <w:instrText xml:space="preserve"> PAGEREF _Toc1750 \h </w:instrText>
+        <w:instrText xml:space="preserve"> PAGEREF _Toc20951 \h </w:instrText>
       </w:r>
       <w:r>
         <w:fldChar w:fldCharType="separate"/>
@@ -2526,7 +2575,7 @@
         <w:fldChar w:fldCharType="begin"/>
       </w:r>
       <w:r>
-        <w:instrText xml:space="preserve"> HYPERLINK \l _Toc21852 </w:instrText>
+        <w:instrText xml:space="preserve"> HYPERLINK \l _Toc7488 </w:instrText>
       </w:r>
       <w:r>
         <w:fldChar w:fldCharType="separate"/>
@@ -2541,13 +2590,13 @@
         <w:fldChar w:fldCharType="begin"/>
       </w:r>
       <w:r>
-        <w:instrText xml:space="preserve"> PAGEREF _Toc21852 \h </w:instrText>
+        <w:instrText xml:space="preserve"> PAGEREF _Toc7488 \h </w:instrText>
       </w:r>
       <w:r>
         <w:fldChar w:fldCharType="separate"/>
       </w:r>
       <w:r>
-        <w:t>27</w:t>
+        <w:t>28</w:t>
       </w:r>
       <w:r>
         <w:fldChar w:fldCharType="end"/>
@@ -2567,7 +2616,7 @@
         <w:fldChar w:fldCharType="begin"/>
       </w:r>
       <w:r>
-        <w:instrText xml:space="preserve"> HYPERLINK \l _Toc14747 </w:instrText>
+        <w:instrText xml:space="preserve"> HYPERLINK \l _Toc29229 </w:instrText>
       </w:r>
       <w:r>
         <w:fldChar w:fldCharType="separate"/>
@@ -2582,13 +2631,13 @@
         <w:fldChar w:fldCharType="begin"/>
       </w:r>
       <w:r>
-        <w:instrText xml:space="preserve"> PAGEREF _Toc14747 \h </w:instrText>
+        <w:instrText xml:space="preserve"> PAGEREF _Toc29229 \h </w:instrText>
       </w:r>
       <w:r>
         <w:fldChar w:fldCharType="separate"/>
       </w:r>
       <w:r>
-        <w:t>27</w:t>
+        <w:t>28</w:t>
       </w:r>
       <w:r>
         <w:fldChar w:fldCharType="end"/>
@@ -2608,7 +2657,7 @@
         <w:fldChar w:fldCharType="begin"/>
       </w:r>
       <w:r>
-        <w:instrText xml:space="preserve"> HYPERLINK \l _Toc9884 </w:instrText>
+        <w:instrText xml:space="preserve"> HYPERLINK \l _Toc27483 </w:instrText>
       </w:r>
       <w:r>
         <w:fldChar w:fldCharType="separate"/>
@@ -2623,7 +2672,7 @@
         <w:fldChar w:fldCharType="begin"/>
       </w:r>
       <w:r>
-        <w:instrText xml:space="preserve"> PAGEREF _Toc9884 \h </w:instrText>
+        <w:instrText xml:space="preserve"> PAGEREF _Toc27483 \h </w:instrText>
       </w:r>
       <w:r>
         <w:fldChar w:fldCharType="separate"/>
@@ -2649,7 +2698,7 @@
         <w:fldChar w:fldCharType="begin"/>
       </w:r>
       <w:r>
-        <w:instrText xml:space="preserve"> HYPERLINK \l _Toc14031 </w:instrText>
+        <w:instrText xml:space="preserve"> HYPERLINK \l _Toc32670 </w:instrText>
       </w:r>
       <w:r>
         <w:fldChar w:fldCharType="separate"/>
@@ -2664,7 +2713,7 @@
         <w:fldChar w:fldCharType="begin"/>
       </w:r>
       <w:r>
-        <w:instrText xml:space="preserve"> PAGEREF _Toc14031 \h </w:instrText>
+        <w:instrText xml:space="preserve"> PAGEREF _Toc32670 \h </w:instrText>
       </w:r>
       <w:r>
         <w:fldChar w:fldCharType="separate"/>
@@ -2690,7 +2739,7 @@
         <w:fldChar w:fldCharType="begin"/>
       </w:r>
       <w:r>
-        <w:instrText xml:space="preserve"> HYPERLINK \l _Toc21318 </w:instrText>
+        <w:instrText xml:space="preserve"> HYPERLINK \l _Toc19549 </w:instrText>
       </w:r>
       <w:r>
         <w:fldChar w:fldCharType="separate"/>
@@ -2705,7 +2754,7 @@
         <w:fldChar w:fldCharType="begin"/>
       </w:r>
       <w:r>
-        <w:instrText xml:space="preserve"> PAGEREF _Toc21318 \h </w:instrText>
+        <w:instrText xml:space="preserve"> PAGEREF _Toc19549 \h </w:instrText>
       </w:r>
       <w:r>
         <w:fldChar w:fldCharType="separate"/>
@@ -2731,7 +2780,7 @@
         <w:fldChar w:fldCharType="begin"/>
       </w:r>
       <w:r>
-        <w:instrText xml:space="preserve"> HYPERLINK \l _Toc24220 </w:instrText>
+        <w:instrText xml:space="preserve"> HYPERLINK \l _Toc28345 </w:instrText>
       </w:r>
       <w:r>
         <w:fldChar w:fldCharType="separate"/>
@@ -2746,13 +2795,13 @@
         <w:fldChar w:fldCharType="begin"/>
       </w:r>
       <w:r>
-        <w:instrText xml:space="preserve"> PAGEREF _Toc24220 \h </w:instrText>
+        <w:instrText xml:space="preserve"> PAGEREF _Toc28345 \h </w:instrText>
       </w:r>
       <w:r>
         <w:fldChar w:fldCharType="separate"/>
       </w:r>
       <w:r>
-        <w:t>29</w:t>
+        <w:t>30</w:t>
       </w:r>
       <w:r>
         <w:fldChar w:fldCharType="end"/>
@@ -2772,7 +2821,7 @@
         <w:fldChar w:fldCharType="begin"/>
       </w:r>
       <w:r>
-        <w:instrText xml:space="preserve"> HYPERLINK \l _Toc662 </w:instrText>
+        <w:instrText xml:space="preserve"> HYPERLINK \l _Toc15946 </w:instrText>
       </w:r>
       <w:r>
         <w:fldChar w:fldCharType="separate"/>
@@ -2787,13 +2836,13 @@
         <w:fldChar w:fldCharType="begin"/>
       </w:r>
       <w:r>
-        <w:instrText xml:space="preserve"> PAGEREF _Toc662 \h </w:instrText>
+        <w:instrText xml:space="preserve"> PAGEREF _Toc15946 \h </w:instrText>
       </w:r>
       <w:r>
         <w:fldChar w:fldCharType="separate"/>
       </w:r>
       <w:r>
-        <w:t>29</w:t>
+        <w:t>30</w:t>
       </w:r>
       <w:r>
         <w:fldChar w:fldCharType="end"/>
@@ -2813,7 +2862,7 @@
         <w:fldChar w:fldCharType="begin"/>
       </w:r>
       <w:r>
-        <w:instrText xml:space="preserve"> HYPERLINK \l _Toc19495 </w:instrText>
+        <w:instrText xml:space="preserve"> HYPERLINK \l _Toc31323 </w:instrText>
       </w:r>
       <w:r>
         <w:fldChar w:fldCharType="separate"/>
@@ -2828,7 +2877,7 @@
         <w:fldChar w:fldCharType="begin"/>
       </w:r>
       <w:r>
-        <w:instrText xml:space="preserve"> PAGEREF _Toc19495 \h </w:instrText>
+        <w:instrText xml:space="preserve"> PAGEREF _Toc31323 \h </w:instrText>
       </w:r>
       <w:r>
         <w:fldChar w:fldCharType="separate"/>
@@ -2854,7 +2903,7 @@
         <w:fldChar w:fldCharType="begin"/>
       </w:r>
       <w:r>
-        <w:instrText xml:space="preserve"> HYPERLINK \l _Toc30889 </w:instrText>
+        <w:instrText xml:space="preserve"> HYPERLINK \l _Toc6603 </w:instrText>
       </w:r>
       <w:r>
         <w:fldChar w:fldCharType="separate"/>
@@ -2869,7 +2918,7 @@
         <w:fldChar w:fldCharType="begin"/>
       </w:r>
       <w:r>
-        <w:instrText xml:space="preserve"> PAGEREF _Toc30889 \h </w:instrText>
+        <w:instrText xml:space="preserve"> PAGEREF _Toc6603 \h </w:instrText>
       </w:r>
       <w:r>
         <w:fldChar w:fldCharType="separate"/>
@@ -2895,7 +2944,7 @@
         <w:fldChar w:fldCharType="begin"/>
       </w:r>
       <w:r>
-        <w:instrText xml:space="preserve"> HYPERLINK \l _Toc6773 </w:instrText>
+        <w:instrText xml:space="preserve"> HYPERLINK \l _Toc1217 </w:instrText>
       </w:r>
       <w:r>
         <w:fldChar w:fldCharType="separate"/>
@@ -2910,13 +2959,13 @@
         <w:fldChar w:fldCharType="begin"/>
       </w:r>
       <w:r>
-        <w:instrText xml:space="preserve"> PAGEREF _Toc6773 \h </w:instrText>
+        <w:instrText xml:space="preserve"> PAGEREF _Toc1217 \h </w:instrText>
       </w:r>
       <w:r>
         <w:fldChar w:fldCharType="separate"/>
       </w:r>
       <w:r>
-        <w:t>31</w:t>
+        <w:t>32</w:t>
       </w:r>
       <w:r>
         <w:fldChar w:fldCharType="end"/>
@@ -2936,7 +2985,7 @@
         <w:fldChar w:fldCharType="begin"/>
       </w:r>
       <w:r>
-        <w:instrText xml:space="preserve"> HYPERLINK \l _Toc13894 </w:instrText>
+        <w:instrText xml:space="preserve"> HYPERLINK \l _Toc23421 </w:instrText>
       </w:r>
       <w:r>
         <w:fldChar w:fldCharType="separate"/>
@@ -2951,13 +3000,13 @@
         <w:fldChar w:fldCharType="begin"/>
       </w:r>
       <w:r>
-        <w:instrText xml:space="preserve"> PAGEREF _Toc13894 \h </w:instrText>
+        <w:instrText xml:space="preserve"> PAGEREF _Toc23421 \h </w:instrText>
       </w:r>
       <w:r>
         <w:fldChar w:fldCharType="separate"/>
       </w:r>
       <w:r>
-        <w:t>31</w:t>
+        <w:t>32</w:t>
       </w:r>
       <w:r>
         <w:fldChar w:fldCharType="end"/>
@@ -2977,7 +3026,7 @@
         <w:fldChar w:fldCharType="begin"/>
       </w:r>
       <w:r>
-        <w:instrText xml:space="preserve"> HYPERLINK \l _Toc14759 </w:instrText>
+        <w:instrText xml:space="preserve"> HYPERLINK \l _Toc30241 </w:instrText>
       </w:r>
       <w:r>
         <w:fldChar w:fldCharType="separate"/>
@@ -2992,13 +3041,13 @@
         <w:fldChar w:fldCharType="begin"/>
       </w:r>
       <w:r>
-        <w:instrText xml:space="preserve"> PAGEREF _Toc14759 \h </w:instrText>
+        <w:instrText xml:space="preserve"> PAGEREF _Toc30241 \h </w:instrText>
       </w:r>
       <w:r>
         <w:fldChar w:fldCharType="separate"/>
       </w:r>
       <w:r>
-        <w:t>32</w:t>
+        <w:t>33</w:t>
       </w:r>
       <w:r>
         <w:fldChar w:fldCharType="end"/>
@@ -3018,7 +3067,7 @@
         <w:fldChar w:fldCharType="begin"/>
       </w:r>
       <w:r>
-        <w:instrText xml:space="preserve"> HYPERLINK \l _Toc23477 </w:instrText>
+        <w:instrText xml:space="preserve"> HYPERLINK \l _Toc22686 </w:instrText>
       </w:r>
       <w:r>
         <w:fldChar w:fldCharType="separate"/>
@@ -3033,13 +3082,13 @@
         <w:fldChar w:fldCharType="begin"/>
       </w:r>
       <w:r>
-        <w:instrText xml:space="preserve"> PAGEREF _Toc23477 \h </w:instrText>
+        <w:instrText xml:space="preserve"> PAGEREF _Toc22686 \h </w:instrText>
       </w:r>
       <w:r>
         <w:fldChar w:fldCharType="separate"/>
       </w:r>
       <w:r>
-        <w:t>32</w:t>
+        <w:t>33</w:t>
       </w:r>
       <w:r>
         <w:fldChar w:fldCharType="end"/>
@@ -3059,7 +3108,7 @@
         <w:fldChar w:fldCharType="begin"/>
       </w:r>
       <w:r>
-        <w:instrText xml:space="preserve"> HYPERLINK \l _Toc7907 </w:instrText>
+        <w:instrText xml:space="preserve"> HYPERLINK \l _Toc11542 </w:instrText>
       </w:r>
       <w:r>
         <w:fldChar w:fldCharType="separate"/>
@@ -3074,13 +3123,13 @@
         <w:fldChar w:fldCharType="begin"/>
       </w:r>
       <w:r>
-        <w:instrText xml:space="preserve"> PAGEREF _Toc7907 \h </w:instrText>
+        <w:instrText xml:space="preserve"> PAGEREF _Toc11542 \h </w:instrText>
       </w:r>
       <w:r>
         <w:fldChar w:fldCharType="separate"/>
       </w:r>
       <w:r>
-        <w:t>32</w:t>
+        <w:t>33</w:t>
       </w:r>
       <w:r>
         <w:fldChar w:fldCharType="end"/>
@@ -3100,7 +3149,7 @@
         <w:fldChar w:fldCharType="begin"/>
       </w:r>
       <w:r>
-        <w:instrText xml:space="preserve"> HYPERLINK \l _Toc3970 </w:instrText>
+        <w:instrText xml:space="preserve"> HYPERLINK \l _Toc16979 </w:instrText>
       </w:r>
       <w:r>
         <w:fldChar w:fldCharType="separate"/>
@@ -3115,13 +3164,13 @@
         <w:fldChar w:fldCharType="begin"/>
       </w:r>
       <w:r>
-        <w:instrText xml:space="preserve"> PAGEREF _Toc3970 \h </w:instrText>
+        <w:instrText xml:space="preserve"> PAGEREF _Toc16979 \h </w:instrText>
       </w:r>
       <w:r>
         <w:fldChar w:fldCharType="separate"/>
       </w:r>
       <w:r>
-        <w:t>33</w:t>
+        <w:t>34</w:t>
       </w:r>
       <w:r>
         <w:fldChar w:fldCharType="end"/>
@@ -3140,7 +3189,7 @@
         <w:pStyle w:val="2"/>
         <w:pageBreakBefore/>
       </w:pPr>
-      <w:bookmarkStart w:id="0" w:name="_Toc13185"/>
+      <w:bookmarkStart w:id="0" w:name="_Toc10838"/>
       <w:r>
         <w:t>1. Executive summary</w:t>
       </w:r>
@@ -3205,6 +3254,12 @@
             <w:insideH w:val="single" w:color="D9C3CC" w:sz="4" w:space="0"/>
             <w:insideV w:val="single" w:color="D9C3CC" w:sz="4" w:space="0"/>
           </w:tblBorders>
+          <w:tblCellMar>
+            <w:top w:w="50" w:type="dxa"/>
+            <w:left w:w="90" w:type="dxa"/>
+            <w:bottom w:w="50" w:type="dxa"/>
+            <w:right w:w="90" w:type="dxa"/>
+          </w:tblCellMar>
         </w:tblPrEx>
         <w:trPr>
           <w:tblHeader/>
@@ -4119,7 +4174,7 @@
         <w:pStyle w:val="2"/>
         <w:pageBreakBefore w:val="0"/>
       </w:pPr>
-      <w:bookmarkStart w:id="1" w:name="_Toc1868"/>
+      <w:bookmarkStart w:id="1" w:name="_Toc29466"/>
       <w:r>
         <w:t>2. Project background and scope</w:t>
       </w:r>
@@ -4205,7 +4260,7 @@
         <w:pStyle w:val="2"/>
         <w:pageBreakBefore w:val="0"/>
       </w:pPr>
-      <w:bookmarkStart w:id="2" w:name="_Toc29416"/>
+      <w:bookmarkStart w:id="2" w:name="_Toc25681"/>
       <w:r>
         <w:t>3. System architecture</w:t>
       </w:r>
@@ -4215,7 +4270,7 @@
       <w:pPr>
         <w:pStyle w:val="3"/>
       </w:pPr>
-      <w:bookmarkStart w:id="3" w:name="_Toc26767"/>
+      <w:bookmarkStart w:id="3" w:name="_Toc1171"/>
       <w:r>
         <w:t>3.1 Overview</w:t>
       </w:r>
@@ -4763,7 +4818,7 @@
       <w:pPr>
         <w:pStyle w:val="3"/>
       </w:pPr>
-      <w:bookmarkStart w:id="4" w:name="_Toc21978"/>
+      <w:bookmarkStart w:id="4" w:name="_Toc1223"/>
       <w:r>
         <w:t>3.2 What happens when a user taps a button</w:t>
       </w:r>
@@ -4925,7 +4980,7 @@
       <w:pPr>
         <w:pStyle w:val="3"/>
       </w:pPr>
-      <w:bookmarkStart w:id="5" w:name="_Toc31779"/>
+      <w:bookmarkStart w:id="5" w:name="_Toc27439"/>
       <w:r>
         <w:t>3.3 API reference</w:t>
       </w:r>
@@ -4990,6 +5045,12 @@
             <w:insideH w:val="single" w:color="D9C3CC" w:sz="4" w:space="0"/>
             <w:insideV w:val="single" w:color="D9C3CC" w:sz="4" w:space="0"/>
           </w:tblBorders>
+          <w:tblCellMar>
+            <w:top w:w="50" w:type="dxa"/>
+            <w:left w:w="90" w:type="dxa"/>
+            <w:bottom w:w="50" w:type="dxa"/>
+            <w:right w:w="90" w:type="dxa"/>
+          </w:tblCellMar>
         </w:tblPrEx>
         <w:trPr>
           <w:tblHeader/>
@@ -6025,6 +6086,12 @@
             <w:insideH w:val="single" w:color="D9C3CC" w:sz="4" w:space="0"/>
             <w:insideV w:val="single" w:color="D9C3CC" w:sz="4" w:space="0"/>
           </w:tblBorders>
+          <w:tblCellMar>
+            <w:top w:w="50" w:type="dxa"/>
+            <w:left w:w="90" w:type="dxa"/>
+            <w:bottom w:w="50" w:type="dxa"/>
+            <w:right w:w="90" w:type="dxa"/>
+          </w:tblCellMar>
         </w:tblPrEx>
         <w:trPr>
           <w:tblHeader/>
@@ -7332,6 +7399,12 @@
             <w:insideH w:val="single" w:color="D9C3CC" w:sz="4" w:space="0"/>
             <w:insideV w:val="single" w:color="D9C3CC" w:sz="4" w:space="0"/>
           </w:tblBorders>
+          <w:tblCellMar>
+            <w:top w:w="50" w:type="dxa"/>
+            <w:left w:w="90" w:type="dxa"/>
+            <w:bottom w:w="50" w:type="dxa"/>
+            <w:right w:w="90" w:type="dxa"/>
+          </w:tblCellMar>
         </w:tblPrEx>
         <w:trPr>
           <w:tblHeader/>
@@ -8598,7 +8671,7 @@
       <w:pPr>
         <w:pStyle w:val="3"/>
       </w:pPr>
-      <w:bookmarkStart w:id="6" w:name="_Toc29686"/>
+      <w:bookmarkStart w:id="6" w:name="_Toc9501"/>
       <w:r>
         <w:t>3.4 Privacy, safety and security design</w:t>
       </w:r>
@@ -8663,7 +8736,7 @@
       <w:pPr>
         <w:pStyle w:val="3"/>
       </w:pPr>
-      <w:bookmarkStart w:id="7" w:name="_Toc27877"/>
+      <w:bookmarkStart w:id="7" w:name="_Toc2381"/>
       <w:r>
         <w:t>3.5 Repository layout</w:t>
       </w:r>
@@ -8718,6 +8791,12 @@
             <w:insideH w:val="single" w:color="D9C3CC" w:sz="4" w:space="0"/>
             <w:insideV w:val="single" w:color="D9C3CC" w:sz="4" w:space="0"/>
           </w:tblBorders>
+          <w:tblCellMar>
+            <w:top w:w="50" w:type="dxa"/>
+            <w:left w:w="90" w:type="dxa"/>
+            <w:bottom w:w="50" w:type="dxa"/>
+            <w:right w:w="90" w:type="dxa"/>
+          </w:tblCellMar>
         </w:tblPrEx>
         <w:trPr>
           <w:tblHeader/>
@@ -9201,7 +9280,7 @@
         <w:pStyle w:val="2"/>
         <w:pageBreakBefore w:val="0"/>
       </w:pPr>
-      <w:bookmarkStart w:id="8" w:name="_Toc16274"/>
+      <w:bookmarkStart w:id="8" w:name="_Toc23171"/>
       <w:r>
         <w:t>4. Mobile application in detail</w:t>
       </w:r>
@@ -9211,7 +9290,7 @@
       <w:pPr>
         <w:pStyle w:val="3"/>
       </w:pPr>
-      <w:bookmarkStart w:id="9" w:name="_Toc13072"/>
+      <w:bookmarkStart w:id="9" w:name="_Toc4738"/>
       <w:r>
         <w:t>4.1 Technology</w:t>
       </w:r>
@@ -9266,6 +9345,12 @@
             <w:insideH w:val="single" w:color="D9C3CC" w:sz="4" w:space="0"/>
             <w:insideV w:val="single" w:color="D9C3CC" w:sz="4" w:space="0"/>
           </w:tblBorders>
+          <w:tblCellMar>
+            <w:top w:w="50" w:type="dxa"/>
+            <w:left w:w="90" w:type="dxa"/>
+            <w:bottom w:w="50" w:type="dxa"/>
+            <w:right w:w="90" w:type="dxa"/>
+          </w:tblCellMar>
         </w:tblPrEx>
         <w:trPr>
           <w:tblHeader/>
@@ -9794,7 +9879,7 @@
       <w:pPr>
         <w:pStyle w:val="3"/>
       </w:pPr>
-      <w:bookmarkStart w:id="10" w:name="_Toc27184"/>
+      <w:bookmarkStart w:id="10" w:name="_Toc14542"/>
       <w:r>
         <w:t>4.2 Screens</w:t>
       </w:r>
@@ -9850,6 +9935,12 @@
             <w:insideH w:val="single" w:color="D9C3CC" w:sz="4" w:space="0"/>
             <w:insideV w:val="single" w:color="D9C3CC" w:sz="4" w:space="0"/>
           </w:tblBorders>
+          <w:tblCellMar>
+            <w:top w:w="50" w:type="dxa"/>
+            <w:left w:w="90" w:type="dxa"/>
+            <w:bottom w:w="50" w:type="dxa"/>
+            <w:right w:w="90" w:type="dxa"/>
+          </w:tblCellMar>
         </w:tblPrEx>
         <w:trPr>
           <w:tblHeader/>
@@ -10327,7 +10418,7 @@
       <w:pPr>
         <w:pStyle w:val="3"/>
       </w:pPr>
-      <w:bookmarkStart w:id="11" w:name="_Toc21362"/>
+      <w:bookmarkStart w:id="11" w:name="_Toc10113"/>
       <w:r>
         <w:t>4.3 State and data flow</w:t>
       </w:r>
@@ -10748,7 +10839,7 @@
       <w:pPr>
         <w:pStyle w:val="3"/>
       </w:pPr>
-      <w:bookmarkStart w:id="12" w:name="_Toc24952"/>
+      <w:bookmarkStart w:id="12" w:name="_Toc4434"/>
       <w:r>
         <w:t>4.4 PCOS assessment flow</w:t>
       </w:r>
@@ -10801,7 +10892,7 @@
       <w:pPr>
         <w:pStyle w:val="3"/>
       </w:pPr>
-      <w:bookmarkStart w:id="13" w:name="_Toc14581"/>
+      <w:bookmarkStart w:id="13" w:name="_Toc25103"/>
       <w:r>
         <w:t>4.5 Breast health flow</w:t>
       </w:r>
@@ -10906,7 +10997,7 @@
       <w:pPr>
         <w:pStyle w:val="3"/>
       </w:pPr>
-      <w:bookmarkStart w:id="14" w:name="_Toc20738"/>
+      <w:bookmarkStart w:id="14" w:name="_Toc30076"/>
       <w:r>
         <w:t>4.6 Breast self-exam and the monthly reminder</w:t>
       </w:r>
@@ -10980,7 +11071,7 @@
       <w:pPr>
         <w:pStyle w:val="3"/>
       </w:pPr>
-      <w:bookmarkStart w:id="15" w:name="_Toc962"/>
+      <w:bookmarkStart w:id="15" w:name="_Toc22967"/>
       <w:r>
         <w:t>4.7 Server address setting</w:t>
       </w:r>
@@ -10999,7 +11090,7 @@
       <w:pPr>
         <w:pStyle w:val="3"/>
       </w:pPr>
-      <w:bookmarkStart w:id="16" w:name="_Toc14202"/>
+      <w:bookmarkStart w:id="16" w:name="_Toc819"/>
       <w:r>
         <w:t>4.8 Android configuration</w:t>
       </w:r>
@@ -11045,7 +11136,7 @@
       <w:pPr>
         <w:pStyle w:val="3"/>
       </w:pPr>
-      <w:bookmarkStart w:id="17" w:name="_Toc16983"/>
+      <w:bookmarkStart w:id="17" w:name="_Toc12069"/>
       <w:r>
         <w:t>4.9 Automated tests</w:t>
       </w:r>
@@ -12035,7 +12126,7 @@
         <w:pStyle w:val="2"/>
         <w:pageBreakBefore w:val="0"/>
       </w:pPr>
-      <w:bookmarkStart w:id="18" w:name="_Toc20967"/>
+      <w:bookmarkStart w:id="18" w:name="_Toc29004"/>
       <w:r>
         <w:t>5. PCOS risk model</w:t>
       </w:r>
@@ -12054,7 +12145,7 @@
       <w:pPr>
         <w:pStyle w:val="3"/>
       </w:pPr>
-      <w:bookmarkStart w:id="19" w:name="_Toc27697"/>
+      <w:bookmarkStart w:id="19" w:name="_Toc23374"/>
       <w:r>
         <w:t>5.1 Data and preparation</w:t>
       </w:r>
@@ -12121,7 +12212,7 @@
       <w:pPr>
         <w:pStyle w:val="3"/>
       </w:pPr>
-      <w:bookmarkStart w:id="20" w:name="_Toc30231"/>
+      <w:bookmarkStart w:id="20" w:name="_Toc17558"/>
       <w:r>
         <w:t>5.2 Features and constraints</w:t>
       </w:r>
@@ -12187,6 +12278,12 @@
             <w:insideH w:val="single" w:color="D9C3CC" w:sz="4" w:space="0"/>
             <w:insideV w:val="single" w:color="D9C3CC" w:sz="4" w:space="0"/>
           </w:tblBorders>
+          <w:tblCellMar>
+            <w:top w:w="50" w:type="dxa"/>
+            <w:left w:w="90" w:type="dxa"/>
+            <w:bottom w:w="50" w:type="dxa"/>
+            <w:right w:w="90" w:type="dxa"/>
+          </w:tblCellMar>
         </w:tblPrEx>
         <w:trPr>
           <w:tblHeader/>
@@ -13387,7 +13484,7 @@
       <w:pPr>
         <w:pStyle w:val="3"/>
       </w:pPr>
-      <w:bookmarkStart w:id="21" w:name="_Toc29447"/>
+      <w:bookmarkStart w:id="21" w:name="_Toc10440"/>
       <w:r>
         <w:t>5.3 Model and training</w:t>
       </w:r>
@@ -13930,7 +14027,7 @@
       <w:pPr>
         <w:pStyle w:val="3"/>
       </w:pPr>
-      <w:bookmarkStart w:id="22" w:name="_Toc32128"/>
+      <w:bookmarkStart w:id="22" w:name="_Toc6725"/>
       <w:r>
         <w:t>5.4 Results</w:t>
       </w:r>
@@ -15848,7 +15945,7 @@
       <w:pPr>
         <w:pStyle w:val="3"/>
       </w:pPr>
-      <w:bookmarkStart w:id="23" w:name="_Toc9899"/>
+      <w:bookmarkStart w:id="23" w:name="_Toc12549"/>
       <w:r>
         <w:t>5.5 How the app uses it</w:t>
       </w:r>
@@ -15908,7 +16005,7 @@
       <w:pPr>
         <w:pStyle w:val="3"/>
       </w:pPr>
-      <w:bookmarkStart w:id="24" w:name="_Toc11287"/>
+      <w:bookmarkStart w:id="24" w:name="_Toc6859"/>
       <w:r>
         <w:t>5.6 Limitations</w:t>
       </w:r>
@@ -15955,7 +16052,7 @@
         <w:pStyle w:val="2"/>
         <w:pageBreakBefore w:val="0"/>
       </w:pPr>
-      <w:bookmarkStart w:id="25" w:name="_Toc18689"/>
+      <w:bookmarkStart w:id="25" w:name="_Toc17491"/>
       <w:r>
         <w:t>6. Breast ultrasound classifier (component A)</w:t>
       </w:r>
@@ -15965,7 +16062,7 @@
       <w:pPr>
         <w:pStyle w:val="3"/>
       </w:pPr>
-      <w:bookmarkStart w:id="26" w:name="_Toc6887"/>
+      <w:bookmarkStart w:id="26" w:name="_Toc95"/>
       <w:r>
         <w:t>6.1 What it does</w:t>
       </w:r>
@@ -15984,7 +16081,7 @@
       <w:pPr>
         <w:pStyle w:val="3"/>
       </w:pPr>
-      <w:bookmarkStart w:id="27" w:name="_Toc23221"/>
+      <w:bookmarkStart w:id="27" w:name="_Toc6849"/>
       <w:r>
         <w:t>6.2 Datasets</w:t>
       </w:r>
@@ -18349,7 +18446,7 @@
       <w:pPr>
         <w:pStyle w:val="3"/>
       </w:pPr>
-      <w:bookmarkStart w:id="28" w:name="_Toc11385"/>
+      <w:bookmarkStart w:id="28" w:name="_Toc14011"/>
       <w:r>
         <w:t>6.3 Data-quality decisions</w:t>
       </w:r>
@@ -18473,7 +18570,7 @@
       <w:pPr>
         <w:pStyle w:val="3"/>
       </w:pPr>
-      <w:bookmarkStart w:id="29" w:name="_Toc11924"/>
+      <w:bookmarkStart w:id="29" w:name="_Toc23906"/>
       <w:r>
         <w:t>6.4 Method and settings</w:t>
       </w:r>
@@ -18528,6 +18625,12 @@
             <w:insideH w:val="single" w:color="D9C3CC" w:sz="4" w:space="0"/>
             <w:insideV w:val="single" w:color="D9C3CC" w:sz="4" w:space="0"/>
           </w:tblBorders>
+          <w:tblCellMar>
+            <w:top w:w="50" w:type="dxa"/>
+            <w:left w:w="90" w:type="dxa"/>
+            <w:bottom w:w="50" w:type="dxa"/>
+            <w:right w:w="90" w:type="dxa"/>
+          </w:tblCellMar>
         </w:tblPrEx>
         <w:trPr>
           <w:tblHeader/>
@@ -19456,6 +19559,12 @@
             <w:insideH w:val="single" w:color="D9C3CC" w:sz="4" w:space="0"/>
             <w:insideV w:val="single" w:color="D9C3CC" w:sz="4" w:space="0"/>
           </w:tblBorders>
+          <w:tblCellMar>
+            <w:top w:w="50" w:type="dxa"/>
+            <w:left w:w="90" w:type="dxa"/>
+            <w:bottom w:w="50" w:type="dxa"/>
+            <w:right w:w="90" w:type="dxa"/>
+          </w:tblCellMar>
         </w:tblPrEx>
         <w:trPr>
           <w:tblHeader/>
@@ -20103,7 +20212,7 @@
       <w:pPr>
         <w:pStyle w:val="3"/>
       </w:pPr>
-      <w:bookmarkStart w:id="30" w:name="_Toc321"/>
+      <w:bookmarkStart w:id="30" w:name="_Toc1501"/>
       <w:r>
         <w:t>6.5 Selecting the recipe by cross-validation</w:t>
       </w:r>
@@ -20171,6 +20280,12 @@
             <w:insideH w:val="single" w:color="D9C3CC" w:sz="4" w:space="0"/>
             <w:insideV w:val="single" w:color="D9C3CC" w:sz="4" w:space="0"/>
           </w:tblBorders>
+          <w:tblCellMar>
+            <w:top w:w="50" w:type="dxa"/>
+            <w:left w:w="90" w:type="dxa"/>
+            <w:bottom w:w="50" w:type="dxa"/>
+            <w:right w:w="90" w:type="dxa"/>
+          </w:tblCellMar>
         </w:tblPrEx>
         <w:trPr>
           <w:tblHeader/>
@@ -22248,7 +22363,7 @@
       <w:pPr>
         <w:pStyle w:val="3"/>
       </w:pPr>
-      <w:bookmarkStart w:id="31" w:name="_Toc177"/>
+      <w:bookmarkStart w:id="31" w:name="_Toc21130"/>
       <w:r>
         <w:t>6.6 Calibration, threshold and export</w:t>
       </w:r>
@@ -22334,7 +22449,7 @@
       <w:pPr>
         <w:pStyle w:val="3"/>
       </w:pPr>
-      <w:bookmarkStart w:id="32" w:name="_Toc21677"/>
+      <w:bookmarkStart w:id="32" w:name="_Toc2006"/>
       <w:r>
         <w:t>6.7 Model versions</w:t>
       </w:r>
@@ -22794,7 +22909,7 @@
       <w:pPr>
         <w:pStyle w:val="3"/>
       </w:pPr>
-      <w:bookmarkStart w:id="33" w:name="_Toc30659"/>
+      <w:bookmarkStart w:id="33" w:name="_Toc3310"/>
       <w:r>
         <w:t>6.8 Results</w:t>
       </w:r>
@@ -24407,6 +24522,12 @@
             <w:insideH w:val="single" w:color="D9C3CC" w:sz="4" w:space="0"/>
             <w:insideV w:val="single" w:color="D9C3CC" w:sz="4" w:space="0"/>
           </w:tblBorders>
+          <w:tblCellMar>
+            <w:top w:w="50" w:type="dxa"/>
+            <w:left w:w="90" w:type="dxa"/>
+            <w:bottom w:w="50" w:type="dxa"/>
+            <w:right w:w="90" w:type="dxa"/>
+          </w:tblCellMar>
         </w:tblPrEx>
         <w:trPr>
           <w:tblHeader/>
@@ -26373,6 +26494,12 @@
             <w:insideH w:val="single" w:color="D9C3CC" w:sz="4" w:space="0"/>
             <w:insideV w:val="single" w:color="D9C3CC" w:sz="4" w:space="0"/>
           </w:tblBorders>
+          <w:tblCellMar>
+            <w:top w:w="50" w:type="dxa"/>
+            <w:left w:w="90" w:type="dxa"/>
+            <w:bottom w:w="50" w:type="dxa"/>
+            <w:right w:w="90" w:type="dxa"/>
+          </w:tblCellMar>
         </w:tblPrEx>
         <w:trPr>
           <w:tblHeader/>
@@ -28754,7 +28881,7 @@
       <w:pPr>
         <w:pStyle w:val="3"/>
       </w:pPr>
-      <w:bookmarkStart w:id="34" w:name="_Toc12178"/>
+      <w:bookmarkStart w:id="34" w:name="_Toc27101"/>
       <w:r>
         <w:t>6.9 Rejecting uploads that are not breast ultrasounds</w:t>
       </w:r>
@@ -29621,7 +29748,7 @@
           <w:color w:val="555555"/>
           <w:sz w:val="17"/>
         </w:rPr>
-        <w:t>Real test ultrasounds are never wrongly rejected. About 6% of unseen brain MRIs still pass, so a dark fan-shaped image of the wrong body part is not guaranteed to be refused.</w:t>
+        <w:t>Real test ultrasounds are never wrongly rejected. About 6% of unseen brain MRIs still pass, so a dark fan-shaped image of the wrong body part is not guaranteed to be refused. Ultrasounds of other organs were not part of this test, and one such image passed (section 6.13).</w:t>
       </w:r>
     </w:p>
     <w:p>
@@ -29688,7 +29815,7 @@
       <w:pPr>
         <w:pStyle w:val="3"/>
       </w:pPr>
-      <w:bookmarkStart w:id="35" w:name="_Toc27229"/>
+      <w:bookmarkStart w:id="35" w:name="_Toc15574"/>
       <w:r>
         <w:t>6.10 The screening threshold decision</w:t>
       </w:r>
@@ -30262,6 +30389,14 @@
         <w:gridCol w:w="9411"/>
       </w:tblGrid>
       <w:tr>
+        <w:tblPrEx>
+          <w:tblCellMar>
+            <w:top w:w="90" w:type="dxa"/>
+            <w:left w:w="160" w:type="dxa"/>
+            <w:bottom w:w="90" w:type="dxa"/>
+            <w:right w:w="160" w:type="dxa"/>
+          </w:tblCellMar>
+        </w:tblPrEx>
         <w:trPr>
           <w:jc w:val="center"/>
         </w:trPr>
@@ -30312,7 +30447,7 @@
       <w:pPr>
         <w:pStyle w:val="3"/>
       </w:pPr>
-      <w:bookmarkStart w:id="36" w:name="_Toc771"/>
+      <w:bookmarkStart w:id="36" w:name="_Toc15180"/>
       <w:r>
         <w:t>6.11 Explainability</w:t>
       </w:r>
@@ -30391,7 +30526,7 @@
       <w:pPr>
         <w:pStyle w:val="3"/>
       </w:pPr>
-      <w:bookmarkStart w:id="37" w:name="_Toc20204"/>
+      <w:bookmarkStart w:id="37" w:name="_Toc31674"/>
       <w:r>
         <w:t>6.12 Limitations</w:t>
       </w:r>
@@ -30471,24 +30606,32 @@
     </w:p>
     <w:p>
       <w:pPr>
-        <w:pStyle w:val="2"/>
-        <w:pageBreakBefore w:val="0"/>
+        <w:pStyle w:val="23"/>
       </w:pPr>
-      <w:bookmarkStart w:id="38" w:name="_Toc5846"/>
-      <w:r>
-        <w:t>7. Breast cancer risk questionnaire (component B)</w:t>
-      </w:r>
-      <w:bookmarkEnd w:id="38"/>
+      <w:r>
+        <w:rPr>
+          <w:b/>
+          <w:i w:val="0"/>
+        </w:rPr>
+        <w:t>Ultrasounds of other body parts are not refused.</w:t>
+      </w:r>
+      <w:r>
+        <w:rPr>
+          <w:b w:val="0"/>
+          <w:i w:val="0"/>
+        </w:rPr>
+        <w:t xml:space="preserve"> The gate was trained against photos and X-rays, not against ultrasounds of other organs, so a non-breast ultrasound passes and receives a breast verdict (section 6.13).</w:t>
+      </w:r>
     </w:p>
     <w:p>
       <w:pPr>
         <w:pStyle w:val="3"/>
       </w:pPr>
-      <w:bookmarkStart w:id="39" w:name="_Toc13470"/>
-      <w:r>
-        <w:t>7.1 Data and design</w:t>
-      </w:r>
-      <w:bookmarkEnd w:id="39"/>
+      <w:bookmarkStart w:id="38" w:name="_Toc24878"/>
+      <w:r>
+        <w:t>6.13 Informal check with images from the web</w:t>
+      </w:r>
+      <w:bookmarkEnd w:id="38"/>
     </w:p>
     <w:p>
       <w:r>
@@ -30496,113 +30639,16 @@
           <w:b w:val="0"/>
           <w:i w:val="0"/>
         </w:rPr>
-        <w:t>The model is trained on the Breast Cancer Surveillance Consortium (BCSC) Risk Estimation dataset: 2,392,998 screening mammograms of women with no previous breast cancer (recorded 1996 to 2002), aggregated into 280,660 risk-factor combinations, with 11,638 cancers (invasive or DCIS) diagnosed within one year of the mammogram. Each row is one combination plus a count, so training uses the counts as sample weights. The dataset ships with its own training and validation flag, used as supplied.</w:t>
+        <w:t>Because users may try images found online, two experiments were run through the running server (20 September 2026). They are informal: two real web images are far too few to estimate accuracy.</w:t>
       </w:r>
     </w:p>
     <w:p>
       <w:pPr>
-        <w:pStyle w:val="23"/>
+        <w:pStyle w:val="4"/>
       </w:pPr>
       <w:r>
-        <w:rPr>
-          <w:b/>
-          <w:i w:val="0"/>
-        </w:rPr>
-        <w:t>Only questions a woman can answer:</w:t>
-      </w:r>
-      <w:r>
-        <w:rPr>
-          <w:b w:val="0"/>
-          <w:i w:val="0"/>
-        </w:rPr>
-        <w:t xml:space="preserve"> age, menopause, body-mass index, age at first birth, close relatives with breast cancer, previous breast biopsy, hormone therapy. Breast density and the last mammogram result are optional. "Don't know" is treated as missing, exactly as BCSC codes it (XGBoost learns which branch missing values should follow).</w:t>
-      </w:r>
-    </w:p>
-    <w:p>
-      <w:pPr>
-        <w:pStyle w:val="23"/>
-      </w:pPr>
-      <w:r>
-        <w:rPr>
-          <w:b/>
-          <w:i w:val="0"/>
-        </w:rPr>
-        <w:t>Race and ethnicity are excluded:</w:t>
-      </w:r>
-      <w:r>
-        <w:rPr>
-          <w:b w:val="0"/>
-          <w:i w:val="0"/>
-        </w:rPr>
-        <w:t xml:space="preserve"> US census categories do not transfer to Femora's users.</w:t>
-      </w:r>
-    </w:p>
-    <w:p>
-      <w:pPr>
-        <w:pStyle w:val="23"/>
-      </w:pPr>
-      <w:r>
-        <w:rPr>
-          <w:b/>
-          <w:i w:val="0"/>
-        </w:rPr>
-        <w:t>Monotonic constraints</w:t>
-      </w:r>
-      <w:r>
-        <w:rPr>
-          <w:b w:val="0"/>
-          <w:i w:val="0"/>
-        </w:rPr>
-        <w:t xml:space="preserve"> on established risk factors (age, family history, biopsy, density, hormone therapy) keep the model medically sensible: adding a risk factor never lowers the estimate.</w:t>
-      </w:r>
-    </w:p>
-    <w:p>
-      <w:pPr>
-        <w:pStyle w:val="23"/>
-      </w:pPr>
-      <w:r>
-        <w:rPr>
-          <w:b/>
-          <w:i w:val="0"/>
-        </w:rPr>
-        <w:t>No re-balancing (SMOTE):</w:t>
-      </w:r>
-      <w:r>
-        <w:rPr>
-          <w:b w:val="0"/>
-          <w:i w:val="0"/>
-        </w:rPr>
-        <w:t xml:space="preserve"> the goal is a calibrated absolute risk, not a classifier.</w:t>
-      </w:r>
-    </w:p>
-    <w:p>
-      <w:pPr>
-        <w:pStyle w:val="23"/>
-      </w:pPr>
-      <w:r>
-        <w:rPr>
-          <w:b/>
-          <w:i w:val="0"/>
-        </w:rPr>
-        <w:t>Symptoms</w:t>
-      </w:r>
-      <w:r>
-        <w:rPr>
-          <w:b w:val="0"/>
-          <w:i w:val="0"/>
-        </w:rPr>
-        <w:t xml:space="preserve"> (lump, nipple discharge, skin change) are not in any public outcome dataset, so the app handles them with NICE NG12 referral rules, separate from the model (section 7.5).</w:t>
-      </w:r>
-    </w:p>
-    <w:p>
-      <w:pPr>
-        <w:pStyle w:val="3"/>
-      </w:pPr>
-      <w:bookmarkStart w:id="40" w:name="_Toc20836"/>
-      <w:r>
-        <w:t>7.2 How answers become model inputs</w:t>
-      </w:r>
-      <w:bookmarkEnd w:id="40"/>
+        <w:t>Real images from Wikipedia (free licences; descriptions give the label)</w:t>
+      </w:r>
     </w:p>
     <w:p>
       <w:pPr>
@@ -30615,7 +30661,1116 @@
           <w:b w:val="0"/>
           <w:i w:val="0"/>
         </w:rPr>
-        <w:t>Table 37. Feature coding (identical in the notebook and the server)</w:t>
+        <w:t>Table 37. Web images through the deployed model</w:t>
+      </w:r>
+    </w:p>
+    <w:tbl>
+      <w:tblPr>
+        <w:tblStyle w:val="12"/>
+        <w:tblW w:w="0" w:type="auto"/>
+        <w:jc w:val="center"/>
+        <w:tblBorders>
+          <w:top w:val="single" w:color="D9C3CC" w:sz="4" w:space="0"/>
+          <w:left w:val="single" w:color="D9C3CC" w:sz="4" w:space="0"/>
+          <w:bottom w:val="single" w:color="D9C3CC" w:sz="4" w:space="0"/>
+          <w:right w:val="single" w:color="D9C3CC" w:sz="4" w:space="0"/>
+          <w:insideH w:val="single" w:color="D9C3CC" w:sz="4" w:space="0"/>
+          <w:insideV w:val="single" w:color="D9C3CC" w:sz="4" w:space="0"/>
+        </w:tblBorders>
+        <w:tblLayout w:type="fixed"/>
+        <w:tblCellMar>
+          <w:top w:w="50" w:type="dxa"/>
+          <w:left w:w="90" w:type="dxa"/>
+          <w:bottom w:w="50" w:type="dxa"/>
+          <w:right w:w="90" w:type="dxa"/>
+        </w:tblCellMar>
+      </w:tblPr>
+      <w:tblGrid>
+        <w:gridCol w:w="3061"/>
+        <w:gridCol w:w="3175"/>
+        <w:gridCol w:w="3175"/>
+      </w:tblGrid>
+      <w:tr>
+        <w:tblPrEx>
+          <w:tblBorders>
+            <w:top w:val="single" w:color="D9C3CC" w:sz="4" w:space="0"/>
+            <w:left w:val="single" w:color="D9C3CC" w:sz="4" w:space="0"/>
+            <w:bottom w:val="single" w:color="D9C3CC" w:sz="4" w:space="0"/>
+            <w:right w:val="single" w:color="D9C3CC" w:sz="4" w:space="0"/>
+            <w:insideH w:val="single" w:color="D9C3CC" w:sz="4" w:space="0"/>
+            <w:insideV w:val="single" w:color="D9C3CC" w:sz="4" w:space="0"/>
+          </w:tblBorders>
+          <w:tblCellMar>
+            <w:top w:w="50" w:type="dxa"/>
+            <w:left w:w="90" w:type="dxa"/>
+            <w:bottom w:w="50" w:type="dxa"/>
+            <w:right w:w="90" w:type="dxa"/>
+          </w:tblCellMar>
+        </w:tblPrEx>
+        <w:trPr>
+          <w:tblHeader/>
+          <w:jc w:val="center"/>
+        </w:trPr>
+        <w:tc>
+          <w:tcPr>
+            <w:tcW w:w="3061" w:type="dxa"/>
+            <w:shd w:val="clear" w:color="auto" w:fill="9E1B46"/>
+          </w:tcPr>
+          <w:p>
+            <w:pPr>
+              <w:keepNext/>
+              <w:spacing w:after="0" w:line="240" w:lineRule="auto"/>
+            </w:pPr>
+            <w:r>
+              <w:rPr>
+                <w:b/>
+                <w:i w:val="0"/>
+                <w:color w:val="FFFFFF"/>
+                <w:sz w:val="17"/>
+              </w:rPr>
+              <w:t>Image</w:t>
+            </w:r>
+          </w:p>
+        </w:tc>
+        <w:tc>
+          <w:tcPr>
+            <w:tcW w:w="3175" w:type="dxa"/>
+            <w:shd w:val="clear" w:color="auto" w:fill="9E1B46"/>
+          </w:tcPr>
+          <w:p>
+            <w:pPr>
+              <w:keepNext/>
+              <w:spacing w:after="0" w:line="240" w:lineRule="auto"/>
+            </w:pPr>
+            <w:r>
+              <w:rPr>
+                <w:b/>
+                <w:i w:val="0"/>
+                <w:color w:val="FFFFFF"/>
+                <w:sz w:val="17"/>
+              </w:rPr>
+              <w:t>Description</w:t>
+            </w:r>
+          </w:p>
+        </w:tc>
+        <w:tc>
+          <w:tcPr>
+            <w:tcW w:w="3175" w:type="dxa"/>
+            <w:shd w:val="clear" w:color="auto" w:fill="9E1B46"/>
+          </w:tcPr>
+          <w:p>
+            <w:pPr>
+              <w:keepNext/>
+              <w:spacing w:after="0" w:line="240" w:lineRule="auto"/>
+            </w:pPr>
+            <w:r>
+              <w:rPr>
+                <w:b/>
+                <w:i w:val="0"/>
+                <w:color w:val="FFFFFF"/>
+                <w:sz w:val="17"/>
+              </w:rPr>
+              <w:t>App result</w:t>
+            </w:r>
+          </w:p>
+        </w:tc>
+      </w:tr>
+      <w:tr>
+        <w:tblPrEx>
+          <w:tblBorders>
+            <w:top w:val="single" w:color="D9C3CC" w:sz="4" w:space="0"/>
+            <w:left w:val="single" w:color="D9C3CC" w:sz="4" w:space="0"/>
+            <w:bottom w:val="single" w:color="D9C3CC" w:sz="4" w:space="0"/>
+            <w:right w:val="single" w:color="D9C3CC" w:sz="4" w:space="0"/>
+            <w:insideH w:val="single" w:color="D9C3CC" w:sz="4" w:space="0"/>
+            <w:insideV w:val="single" w:color="D9C3CC" w:sz="4" w:space="0"/>
+          </w:tblBorders>
+          <w:tblCellMar>
+            <w:top w:w="50" w:type="dxa"/>
+            <w:left w:w="90" w:type="dxa"/>
+            <w:bottom w:w="50" w:type="dxa"/>
+            <w:right w:w="90" w:type="dxa"/>
+          </w:tblCellMar>
+        </w:tblPrEx>
+        <w:trPr>
+          <w:cantSplit/>
+          <w:jc w:val="center"/>
+        </w:trPr>
+        <w:tc>
+          <w:tcPr>
+            <w:tcW w:w="3061" w:type="dxa"/>
+          </w:tcPr>
+          <w:p>
+            <w:pPr>
+              <w:keepNext/>
+              <w:spacing w:after="0" w:line="240" w:lineRule="auto"/>
+            </w:pPr>
+            <w:r>
+              <w:rPr>
+                <w:b w:val="0"/>
+                <w:i w:val="0"/>
+                <w:sz w:val="17"/>
+              </w:rPr>
+              <w:t>Mamma ca 1.jpg (497 x 344 px)</w:t>
+            </w:r>
+          </w:p>
+        </w:tc>
+        <w:tc>
+          <w:tcPr>
+            <w:tcW w:w="3175" w:type="dxa"/>
+          </w:tcPr>
+          <w:p>
+            <w:pPr>
+              <w:keepNext/>
+              <w:spacing w:after="0" w:line="240" w:lineRule="auto"/>
+            </w:pPr>
+            <w:r>
+              <w:rPr>
+                <w:b w:val="0"/>
+                <w:i w:val="0"/>
+                <w:sz w:val="17"/>
+              </w:rPr>
+              <w:t>Breast carcinoma on ultrasound (malignant)</w:t>
+            </w:r>
+          </w:p>
+        </w:tc>
+        <w:tc>
+          <w:tcPr>
+            <w:tcW w:w="3175" w:type="dxa"/>
+          </w:tcPr>
+          <w:p>
+            <w:pPr>
+              <w:keepNext/>
+              <w:spacing w:after="0" w:line="240" w:lineRule="auto"/>
+            </w:pPr>
+            <w:r>
+              <w:rPr>
+                <w:b w:val="0"/>
+                <w:i w:val="0"/>
+                <w:sz w:val="17"/>
+              </w:rPr>
+              <w:t>Suspicious Finding, 93%: correct</w:t>
+            </w:r>
+          </w:p>
+        </w:tc>
+      </w:tr>
+      <w:tr>
+        <w:tblPrEx>
+          <w:tblBorders>
+            <w:top w:val="single" w:color="D9C3CC" w:sz="4" w:space="0"/>
+            <w:left w:val="single" w:color="D9C3CC" w:sz="4" w:space="0"/>
+            <w:bottom w:val="single" w:color="D9C3CC" w:sz="4" w:space="0"/>
+            <w:right w:val="single" w:color="D9C3CC" w:sz="4" w:space="0"/>
+            <w:insideH w:val="single" w:color="D9C3CC" w:sz="4" w:space="0"/>
+            <w:insideV w:val="single" w:color="D9C3CC" w:sz="4" w:space="0"/>
+          </w:tblBorders>
+          <w:tblCellMar>
+            <w:top w:w="50" w:type="dxa"/>
+            <w:left w:w="90" w:type="dxa"/>
+            <w:bottom w:w="50" w:type="dxa"/>
+            <w:right w:w="90" w:type="dxa"/>
+          </w:tblCellMar>
+        </w:tblPrEx>
+        <w:trPr>
+          <w:cantSplit/>
+          <w:jc w:val="center"/>
+        </w:trPr>
+        <w:tc>
+          <w:tcPr>
+            <w:tcW w:w="3061" w:type="dxa"/>
+            <w:shd w:val="clear" w:color="auto" w:fill="FBE9EF"/>
+          </w:tcPr>
+          <w:p>
+            <w:pPr>
+              <w:keepNext/>
+              <w:spacing w:after="0" w:line="240" w:lineRule="auto"/>
+            </w:pPr>
+            <w:r>
+              <w:rPr>
+                <w:b w:val="0"/>
+                <w:i w:val="0"/>
+                <w:sz w:val="17"/>
+              </w:rPr>
+              <w:t>Breast US Fibroadenoma (Nevit, 600 x 550 px)</w:t>
+            </w:r>
+          </w:p>
+        </w:tc>
+        <w:tc>
+          <w:tcPr>
+            <w:tcW w:w="3175" w:type="dxa"/>
+            <w:shd w:val="clear" w:color="auto" w:fill="FBE9EF"/>
+          </w:tcPr>
+          <w:p>
+            <w:pPr>
+              <w:keepNext/>
+              <w:spacing w:after="0" w:line="240" w:lineRule="auto"/>
+            </w:pPr>
+            <w:r>
+              <w:rPr>
+                <w:b w:val="0"/>
+                <w:i w:val="0"/>
+                <w:sz w:val="17"/>
+              </w:rPr>
+              <w:t>Fibroadenoma (benign)</w:t>
+            </w:r>
+          </w:p>
+        </w:tc>
+        <w:tc>
+          <w:tcPr>
+            <w:tcW w:w="3175" w:type="dxa"/>
+            <w:shd w:val="clear" w:color="auto" w:fill="FBE9EF"/>
+          </w:tcPr>
+          <w:p>
+            <w:pPr>
+              <w:keepNext/>
+              <w:spacing w:after="0" w:line="240" w:lineRule="auto"/>
+            </w:pPr>
+            <w:r>
+              <w:rPr>
+                <w:b w:val="0"/>
+                <w:i w:val="0"/>
+                <w:sz w:val="17"/>
+              </w:rPr>
+              <w:t>Suspicious Finding, 66%: a false alarm (malignant 66%, benign 29%)</w:t>
+            </w:r>
+          </w:p>
+        </w:tc>
+      </w:tr>
+      <w:tr>
+        <w:tblPrEx>
+          <w:tblBorders>
+            <w:top w:val="single" w:color="D9C3CC" w:sz="4" w:space="0"/>
+            <w:left w:val="single" w:color="D9C3CC" w:sz="4" w:space="0"/>
+            <w:bottom w:val="single" w:color="D9C3CC" w:sz="4" w:space="0"/>
+            <w:right w:val="single" w:color="D9C3CC" w:sz="4" w:space="0"/>
+            <w:insideH w:val="single" w:color="D9C3CC" w:sz="4" w:space="0"/>
+            <w:insideV w:val="single" w:color="D9C3CC" w:sz="4" w:space="0"/>
+          </w:tblBorders>
+          <w:tblCellMar>
+            <w:top w:w="50" w:type="dxa"/>
+            <w:left w:w="90" w:type="dxa"/>
+            <w:bottom w:w="50" w:type="dxa"/>
+            <w:right w:w="90" w:type="dxa"/>
+          </w:tblCellMar>
+        </w:tblPrEx>
+        <w:trPr>
+          <w:cantSplit/>
+          <w:jc w:val="center"/>
+        </w:trPr>
+        <w:tc>
+          <w:tcPr>
+            <w:tcW w:w="3061" w:type="dxa"/>
+          </w:tcPr>
+          <w:p>
+            <w:pPr>
+              <w:spacing w:after="0" w:line="240" w:lineRule="auto"/>
+            </w:pPr>
+            <w:r>
+              <w:rPr>
+                <w:b w:val="0"/>
+                <w:i w:val="0"/>
+                <w:sz w:val="17"/>
+              </w:rPr>
+              <w:t>Ultrasound Scan ND (800 x 600 px)</w:t>
+            </w:r>
+          </w:p>
+        </w:tc>
+        <w:tc>
+          <w:tcPr>
+            <w:tcW w:w="3175" w:type="dxa"/>
+          </w:tcPr>
+          <w:p>
+            <w:pPr>
+              <w:spacing w:after="0" w:line="240" w:lineRule="auto"/>
+            </w:pPr>
+            <w:r>
+              <w:rPr>
+                <w:b w:val="0"/>
+                <w:i w:val="0"/>
+                <w:sz w:val="17"/>
+              </w:rPr>
+              <w:t>Generic medical ultrasound, organ not stated (not a breast scan)</w:t>
+            </w:r>
+          </w:p>
+        </w:tc>
+        <w:tc>
+          <w:tcPr>
+            <w:tcW w:w="3175" w:type="dxa"/>
+          </w:tcPr>
+          <w:p>
+            <w:pPr>
+              <w:spacing w:after="0" w:line="240" w:lineRule="auto"/>
+            </w:pPr>
+            <w:r>
+              <w:rPr>
+                <w:b w:val="0"/>
+                <w:i w:val="0"/>
+                <w:sz w:val="17"/>
+              </w:rPr>
+              <w:t>Passed the gate and returned Likely Benign, 96%: should have been refused</w:t>
+            </w:r>
+          </w:p>
+        </w:tc>
+      </w:tr>
+    </w:tbl>
+    <w:p>
+      <w:pPr>
+        <w:spacing w:before="60" w:after="160"/>
+      </w:pPr>
+      <w:r>
+        <w:rPr>
+          <w:b w:val="0"/>
+          <w:i/>
+          <w:color w:val="555555"/>
+          <w:sz w:val="17"/>
+        </w:rPr>
+        <w:t>The images were taken from Wikipedia articles (the Wikimedia Commons site itself was not reachable from the development PC). The benign false alarm is consistent with the measured false-alarm rate (about a third of non-cancer scans).</w:t>
+      </w:r>
+    </w:p>
+    <w:p>
+      <w:pPr>
+        <w:pStyle w:val="4"/>
+      </w:pPr>
+      <w:r>
+        <w:t>Web-style damage to the seven test-kit scans</w:t>
+      </w:r>
+    </w:p>
+    <w:p>
+      <w:pPr>
+        <w:pStyle w:val="16"/>
+        <w:keepNext/>
+        <w:spacing w:before="160" w:after="60"/>
+      </w:pPr>
+      <w:r>
+        <w:rPr>
+          <w:b w:val="0"/>
+          <w:i w:val="0"/>
+        </w:rPr>
+        <w:t>Table 38. Robustness to typical web changes (7 scans)</w:t>
+      </w:r>
+    </w:p>
+    <w:tbl>
+      <w:tblPr>
+        <w:tblStyle w:val="12"/>
+        <w:tblW w:w="0" w:type="auto"/>
+        <w:jc w:val="center"/>
+        <w:tblBorders>
+          <w:top w:val="single" w:color="D9C3CC" w:sz="4" w:space="0"/>
+          <w:left w:val="single" w:color="D9C3CC" w:sz="4" w:space="0"/>
+          <w:bottom w:val="single" w:color="D9C3CC" w:sz="4" w:space="0"/>
+          <w:right w:val="single" w:color="D9C3CC" w:sz="4" w:space="0"/>
+          <w:insideH w:val="single" w:color="D9C3CC" w:sz="4" w:space="0"/>
+          <w:insideV w:val="single" w:color="D9C3CC" w:sz="4" w:space="0"/>
+        </w:tblBorders>
+        <w:tblLayout w:type="fixed"/>
+        <w:tblCellMar>
+          <w:top w:w="50" w:type="dxa"/>
+          <w:left w:w="90" w:type="dxa"/>
+          <w:bottom w:w="50" w:type="dxa"/>
+          <w:right w:w="90" w:type="dxa"/>
+        </w:tblCellMar>
+      </w:tblPr>
+      <w:tblGrid>
+        <w:gridCol w:w="4195"/>
+        <w:gridCol w:w="2154"/>
+        <w:gridCol w:w="1587"/>
+        <w:gridCol w:w="1474"/>
+      </w:tblGrid>
+      <w:tr>
+        <w:tblPrEx>
+          <w:tblBorders>
+            <w:top w:val="single" w:color="D9C3CC" w:sz="4" w:space="0"/>
+            <w:left w:val="single" w:color="D9C3CC" w:sz="4" w:space="0"/>
+            <w:bottom w:val="single" w:color="D9C3CC" w:sz="4" w:space="0"/>
+            <w:right w:val="single" w:color="D9C3CC" w:sz="4" w:space="0"/>
+            <w:insideH w:val="single" w:color="D9C3CC" w:sz="4" w:space="0"/>
+            <w:insideV w:val="single" w:color="D9C3CC" w:sz="4" w:space="0"/>
+          </w:tblBorders>
+          <w:tblCellMar>
+            <w:top w:w="50" w:type="dxa"/>
+            <w:left w:w="90" w:type="dxa"/>
+            <w:bottom w:w="50" w:type="dxa"/>
+            <w:right w:w="90" w:type="dxa"/>
+          </w:tblCellMar>
+        </w:tblPrEx>
+        <w:trPr>
+          <w:tblHeader/>
+          <w:jc w:val="center"/>
+        </w:trPr>
+        <w:tc>
+          <w:tcPr>
+            <w:tcW w:w="4195" w:type="dxa"/>
+            <w:shd w:val="clear" w:color="auto" w:fill="9E1B46"/>
+          </w:tcPr>
+          <w:p>
+            <w:pPr>
+              <w:keepNext/>
+              <w:spacing w:after="0" w:line="240" w:lineRule="auto"/>
+            </w:pPr>
+            <w:r>
+              <w:rPr>
+                <w:b/>
+                <w:i w:val="0"/>
+                <w:color w:val="FFFFFF"/>
+                <w:sz w:val="17"/>
+              </w:rPr>
+              <w:t>Change applied</w:t>
+            </w:r>
+          </w:p>
+        </w:tc>
+        <w:tc>
+          <w:tcPr>
+            <w:tcW w:w="2154" w:type="dxa"/>
+            <w:shd w:val="clear" w:color="auto" w:fill="9E1B46"/>
+          </w:tcPr>
+          <w:p>
+            <w:pPr>
+              <w:keepNext/>
+              <w:spacing w:after="0" w:line="240" w:lineRule="auto"/>
+              <w:jc w:val="right"/>
+            </w:pPr>
+            <w:r>
+              <w:rPr>
+                <w:b/>
+                <w:i w:val="0"/>
+                <w:color w:val="FFFFFF"/>
+                <w:sz w:val="17"/>
+              </w:rPr>
+              <w:t>Same answer as the clean upload</w:t>
+            </w:r>
+          </w:p>
+        </w:tc>
+        <w:tc>
+          <w:tcPr>
+            <w:tcW w:w="1587" w:type="dxa"/>
+            <w:shd w:val="clear" w:color="auto" w:fill="9E1B46"/>
+          </w:tcPr>
+          <w:p>
+            <w:pPr>
+              <w:keepNext/>
+              <w:spacing w:after="0" w:line="240" w:lineRule="auto"/>
+              <w:jc w:val="right"/>
+            </w:pPr>
+            <w:r>
+              <w:rPr>
+                <w:b/>
+                <w:i w:val="0"/>
+                <w:color w:val="FFFFFF"/>
+                <w:sz w:val="17"/>
+              </w:rPr>
+              <w:t>Refused by the checks</w:t>
+            </w:r>
+          </w:p>
+        </w:tc>
+        <w:tc>
+          <w:tcPr>
+            <w:tcW w:w="1474" w:type="dxa"/>
+            <w:shd w:val="clear" w:color="auto" w:fill="9E1B46"/>
+          </w:tcPr>
+          <w:p>
+            <w:pPr>
+              <w:keepNext/>
+              <w:spacing w:after="0" w:line="240" w:lineRule="auto"/>
+              <w:jc w:val="right"/>
+            </w:pPr>
+            <w:r>
+              <w:rPr>
+                <w:b/>
+                <w:i w:val="0"/>
+                <w:color w:val="FFFFFF"/>
+                <w:sz w:val="17"/>
+              </w:rPr>
+              <w:t>Different answer</w:t>
+            </w:r>
+          </w:p>
+        </w:tc>
+      </w:tr>
+      <w:tr>
+        <w:tblPrEx>
+          <w:tblBorders>
+            <w:top w:val="single" w:color="D9C3CC" w:sz="4" w:space="0"/>
+            <w:left w:val="single" w:color="D9C3CC" w:sz="4" w:space="0"/>
+            <w:bottom w:val="single" w:color="D9C3CC" w:sz="4" w:space="0"/>
+            <w:right w:val="single" w:color="D9C3CC" w:sz="4" w:space="0"/>
+            <w:insideH w:val="single" w:color="D9C3CC" w:sz="4" w:space="0"/>
+            <w:insideV w:val="single" w:color="D9C3CC" w:sz="4" w:space="0"/>
+          </w:tblBorders>
+          <w:tblCellMar>
+            <w:top w:w="50" w:type="dxa"/>
+            <w:left w:w="90" w:type="dxa"/>
+            <w:bottom w:w="50" w:type="dxa"/>
+            <w:right w:w="90" w:type="dxa"/>
+          </w:tblCellMar>
+        </w:tblPrEx>
+        <w:trPr>
+          <w:cantSplit/>
+          <w:jc w:val="center"/>
+        </w:trPr>
+        <w:tc>
+          <w:tcPr>
+            <w:tcW w:w="4195" w:type="dxa"/>
+          </w:tcPr>
+          <w:p>
+            <w:pPr>
+              <w:keepNext/>
+              <w:spacing w:after="0" w:line="240" w:lineRule="auto"/>
+            </w:pPr>
+            <w:r>
+              <w:rPr>
+                <w:b w:val="0"/>
+                <w:i w:val="0"/>
+                <w:sz w:val="17"/>
+              </w:rPr>
+              <w:t>Heavy JPEG compression (quality 30)</w:t>
+            </w:r>
+          </w:p>
+        </w:tc>
+        <w:tc>
+          <w:tcPr>
+            <w:tcW w:w="2154" w:type="dxa"/>
+          </w:tcPr>
+          <w:p>
+            <w:pPr>
+              <w:keepNext/>
+              <w:spacing w:after="0" w:line="240" w:lineRule="auto"/>
+              <w:jc w:val="right"/>
+            </w:pPr>
+            <w:r>
+              <w:rPr>
+                <w:b w:val="0"/>
+                <w:i w:val="0"/>
+                <w:sz w:val="17"/>
+              </w:rPr>
+              <w:t>7 of 7</w:t>
+            </w:r>
+          </w:p>
+        </w:tc>
+        <w:tc>
+          <w:tcPr>
+            <w:tcW w:w="1587" w:type="dxa"/>
+          </w:tcPr>
+          <w:p>
+            <w:pPr>
+              <w:keepNext/>
+              <w:spacing w:after="0" w:line="240" w:lineRule="auto"/>
+              <w:jc w:val="right"/>
+            </w:pPr>
+            <w:r>
+              <w:rPr>
+                <w:b w:val="0"/>
+                <w:i w:val="0"/>
+                <w:sz w:val="17"/>
+              </w:rPr>
+              <w:t>0</w:t>
+            </w:r>
+          </w:p>
+        </w:tc>
+        <w:tc>
+          <w:tcPr>
+            <w:tcW w:w="1474" w:type="dxa"/>
+          </w:tcPr>
+          <w:p>
+            <w:pPr>
+              <w:keepNext/>
+              <w:spacing w:after="0" w:line="240" w:lineRule="auto"/>
+              <w:jc w:val="right"/>
+            </w:pPr>
+            <w:r>
+              <w:rPr>
+                <w:b w:val="0"/>
+                <w:i w:val="0"/>
+                <w:sz w:val="17"/>
+              </w:rPr>
+              <w:t>0</w:t>
+            </w:r>
+          </w:p>
+        </w:tc>
+      </w:tr>
+      <w:tr>
+        <w:tblPrEx>
+          <w:tblBorders>
+            <w:top w:val="single" w:color="D9C3CC" w:sz="4" w:space="0"/>
+            <w:left w:val="single" w:color="D9C3CC" w:sz="4" w:space="0"/>
+            <w:bottom w:val="single" w:color="D9C3CC" w:sz="4" w:space="0"/>
+            <w:right w:val="single" w:color="D9C3CC" w:sz="4" w:space="0"/>
+            <w:insideH w:val="single" w:color="D9C3CC" w:sz="4" w:space="0"/>
+            <w:insideV w:val="single" w:color="D9C3CC" w:sz="4" w:space="0"/>
+          </w:tblBorders>
+          <w:tblCellMar>
+            <w:top w:w="50" w:type="dxa"/>
+            <w:left w:w="90" w:type="dxa"/>
+            <w:bottom w:w="50" w:type="dxa"/>
+            <w:right w:w="90" w:type="dxa"/>
+          </w:tblCellMar>
+        </w:tblPrEx>
+        <w:trPr>
+          <w:cantSplit/>
+          <w:jc w:val="center"/>
+        </w:trPr>
+        <w:tc>
+          <w:tcPr>
+            <w:tcW w:w="4195" w:type="dxa"/>
+            <w:shd w:val="clear" w:color="auto" w:fill="FBE9EF"/>
+          </w:tcPr>
+          <w:p>
+            <w:pPr>
+              <w:keepNext/>
+              <w:spacing w:after="0" w:line="240" w:lineRule="auto"/>
+            </w:pPr>
+            <w:r>
+              <w:rPr>
+                <w:b w:val="0"/>
+                <w:i w:val="0"/>
+                <w:sz w:val="17"/>
+              </w:rPr>
+              <w:t>Low resolution (shrunk to a quarter, enlarged back)</w:t>
+            </w:r>
+          </w:p>
+        </w:tc>
+        <w:tc>
+          <w:tcPr>
+            <w:tcW w:w="2154" w:type="dxa"/>
+            <w:shd w:val="clear" w:color="auto" w:fill="FBE9EF"/>
+          </w:tcPr>
+          <w:p>
+            <w:pPr>
+              <w:keepNext/>
+              <w:spacing w:after="0" w:line="240" w:lineRule="auto"/>
+              <w:jc w:val="right"/>
+            </w:pPr>
+            <w:r>
+              <w:rPr>
+                <w:b w:val="0"/>
+                <w:i w:val="0"/>
+                <w:sz w:val="17"/>
+              </w:rPr>
+              <w:t>7 of 7</w:t>
+            </w:r>
+          </w:p>
+        </w:tc>
+        <w:tc>
+          <w:tcPr>
+            <w:tcW w:w="1587" w:type="dxa"/>
+            <w:shd w:val="clear" w:color="auto" w:fill="FBE9EF"/>
+          </w:tcPr>
+          <w:p>
+            <w:pPr>
+              <w:keepNext/>
+              <w:spacing w:after="0" w:line="240" w:lineRule="auto"/>
+              <w:jc w:val="right"/>
+            </w:pPr>
+            <w:r>
+              <w:rPr>
+                <w:b w:val="0"/>
+                <w:i w:val="0"/>
+                <w:sz w:val="17"/>
+              </w:rPr>
+              <w:t>0</w:t>
+            </w:r>
+          </w:p>
+        </w:tc>
+        <w:tc>
+          <w:tcPr>
+            <w:tcW w:w="1474" w:type="dxa"/>
+            <w:shd w:val="clear" w:color="auto" w:fill="FBE9EF"/>
+          </w:tcPr>
+          <w:p>
+            <w:pPr>
+              <w:keepNext/>
+              <w:spacing w:after="0" w:line="240" w:lineRule="auto"/>
+              <w:jc w:val="right"/>
+            </w:pPr>
+            <w:r>
+              <w:rPr>
+                <w:b w:val="0"/>
+                <w:i w:val="0"/>
+                <w:sz w:val="17"/>
+              </w:rPr>
+              <w:t>0</w:t>
+            </w:r>
+          </w:p>
+        </w:tc>
+      </w:tr>
+      <w:tr>
+        <w:tblPrEx>
+          <w:tblBorders>
+            <w:top w:val="single" w:color="D9C3CC" w:sz="4" w:space="0"/>
+            <w:left w:val="single" w:color="D9C3CC" w:sz="4" w:space="0"/>
+            <w:bottom w:val="single" w:color="D9C3CC" w:sz="4" w:space="0"/>
+            <w:right w:val="single" w:color="D9C3CC" w:sz="4" w:space="0"/>
+            <w:insideH w:val="single" w:color="D9C3CC" w:sz="4" w:space="0"/>
+            <w:insideV w:val="single" w:color="D9C3CC" w:sz="4" w:space="0"/>
+          </w:tblBorders>
+          <w:tblCellMar>
+            <w:top w:w="50" w:type="dxa"/>
+            <w:left w:w="90" w:type="dxa"/>
+            <w:bottom w:w="50" w:type="dxa"/>
+            <w:right w:w="90" w:type="dxa"/>
+          </w:tblCellMar>
+        </w:tblPrEx>
+        <w:trPr>
+          <w:cantSplit/>
+          <w:jc w:val="center"/>
+        </w:trPr>
+        <w:tc>
+          <w:tcPr>
+            <w:tcW w:w="4195" w:type="dxa"/>
+          </w:tcPr>
+          <w:p>
+            <w:pPr>
+              <w:keepNext/>
+              <w:spacing w:after="0" w:line="240" w:lineRule="auto"/>
+            </w:pPr>
+            <w:r>
+              <w:rPr>
+                <w:b w:val="0"/>
+                <w:i w:val="0"/>
+                <w:sz w:val="17"/>
+              </w:rPr>
+              <w:t>Annotation marks and text (white line, yellow crosses, caption)</w:t>
+            </w:r>
+          </w:p>
+        </w:tc>
+        <w:tc>
+          <w:tcPr>
+            <w:tcW w:w="2154" w:type="dxa"/>
+          </w:tcPr>
+          <w:p>
+            <w:pPr>
+              <w:keepNext/>
+              <w:spacing w:after="0" w:line="240" w:lineRule="auto"/>
+              <w:jc w:val="right"/>
+            </w:pPr>
+            <w:r>
+              <w:rPr>
+                <w:b w:val="0"/>
+                <w:i w:val="0"/>
+                <w:sz w:val="17"/>
+              </w:rPr>
+              <w:t>7 of 7</w:t>
+            </w:r>
+          </w:p>
+        </w:tc>
+        <w:tc>
+          <w:tcPr>
+            <w:tcW w:w="1587" w:type="dxa"/>
+          </w:tcPr>
+          <w:p>
+            <w:pPr>
+              <w:keepNext/>
+              <w:spacing w:after="0" w:line="240" w:lineRule="auto"/>
+              <w:jc w:val="right"/>
+            </w:pPr>
+            <w:r>
+              <w:rPr>
+                <w:b w:val="0"/>
+                <w:i w:val="0"/>
+                <w:sz w:val="17"/>
+              </w:rPr>
+              <w:t>0</w:t>
+            </w:r>
+          </w:p>
+        </w:tc>
+        <w:tc>
+          <w:tcPr>
+            <w:tcW w:w="1474" w:type="dxa"/>
+          </w:tcPr>
+          <w:p>
+            <w:pPr>
+              <w:keepNext/>
+              <w:spacing w:after="0" w:line="240" w:lineRule="auto"/>
+              <w:jc w:val="right"/>
+            </w:pPr>
+            <w:r>
+              <w:rPr>
+                <w:b w:val="0"/>
+                <w:i w:val="0"/>
+                <w:sz w:val="17"/>
+              </w:rPr>
+              <w:t>0</w:t>
+            </w:r>
+          </w:p>
+        </w:tc>
+      </w:tr>
+      <w:tr>
+        <w:tblPrEx>
+          <w:tblBorders>
+            <w:top w:val="single" w:color="D9C3CC" w:sz="4" w:space="0"/>
+            <w:left w:val="single" w:color="D9C3CC" w:sz="4" w:space="0"/>
+            <w:bottom w:val="single" w:color="D9C3CC" w:sz="4" w:space="0"/>
+            <w:right w:val="single" w:color="D9C3CC" w:sz="4" w:space="0"/>
+            <w:insideH w:val="single" w:color="D9C3CC" w:sz="4" w:space="0"/>
+            <w:insideV w:val="single" w:color="D9C3CC" w:sz="4" w:space="0"/>
+          </w:tblBorders>
+          <w:tblCellMar>
+            <w:top w:w="50" w:type="dxa"/>
+            <w:left w:w="90" w:type="dxa"/>
+            <w:bottom w:w="50" w:type="dxa"/>
+            <w:right w:w="90" w:type="dxa"/>
+          </w:tblCellMar>
+        </w:tblPrEx>
+        <w:trPr>
+          <w:cantSplit/>
+          <w:jc w:val="center"/>
+        </w:trPr>
+        <w:tc>
+          <w:tcPr>
+            <w:tcW w:w="4195" w:type="dxa"/>
+            <w:shd w:val="clear" w:color="auto" w:fill="FBE9EF"/>
+          </w:tcPr>
+          <w:p>
+            <w:pPr>
+              <w:spacing w:after="0" w:line="240" w:lineRule="auto"/>
+            </w:pPr>
+            <w:r>
+              <w:rPr>
+                <w:b w:val="0"/>
+                <w:i w:val="0"/>
+                <w:sz w:val="17"/>
+              </w:rPr>
+              <w:t>Sepia colour tint</w:t>
+            </w:r>
+          </w:p>
+        </w:tc>
+        <w:tc>
+          <w:tcPr>
+            <w:tcW w:w="2154" w:type="dxa"/>
+            <w:shd w:val="clear" w:color="auto" w:fill="FBE9EF"/>
+          </w:tcPr>
+          <w:p>
+            <w:pPr>
+              <w:spacing w:after="0" w:line="240" w:lineRule="auto"/>
+              <w:jc w:val="right"/>
+            </w:pPr>
+            <w:r>
+              <w:rPr>
+                <w:b w:val="0"/>
+                <w:i w:val="0"/>
+                <w:sz w:val="17"/>
+              </w:rPr>
+              <w:t>4 of 7</w:t>
+            </w:r>
+          </w:p>
+        </w:tc>
+        <w:tc>
+          <w:tcPr>
+            <w:tcW w:w="1587" w:type="dxa"/>
+            <w:shd w:val="clear" w:color="auto" w:fill="FBE9EF"/>
+          </w:tcPr>
+          <w:p>
+            <w:pPr>
+              <w:spacing w:after="0" w:line="240" w:lineRule="auto"/>
+              <w:jc w:val="right"/>
+            </w:pPr>
+            <w:r>
+              <w:rPr>
+                <w:b w:val="0"/>
+                <w:i w:val="0"/>
+                <w:sz w:val="17"/>
+              </w:rPr>
+              <w:t>3</w:t>
+            </w:r>
+          </w:p>
+        </w:tc>
+        <w:tc>
+          <w:tcPr>
+            <w:tcW w:w="1474" w:type="dxa"/>
+            <w:shd w:val="clear" w:color="auto" w:fill="FBE9EF"/>
+          </w:tcPr>
+          <w:p>
+            <w:pPr>
+              <w:spacing w:after="0" w:line="240" w:lineRule="auto"/>
+              <w:jc w:val="right"/>
+            </w:pPr>
+            <w:r>
+              <w:rPr>
+                <w:b w:val="0"/>
+                <w:i w:val="0"/>
+                <w:sz w:val="17"/>
+              </w:rPr>
+              <w:t>0</w:t>
+            </w:r>
+          </w:p>
+        </w:tc>
+      </w:tr>
+    </w:tbl>
+    <w:p>
+      <w:pPr>
+        <w:spacing w:before="60" w:after="160"/>
+      </w:pPr>
+      <w:r>
+        <w:rPr>
+          <w:b w:val="0"/>
+          <w:i/>
+          <w:color w:val="555555"/>
+          <w:sz w:val="17"/>
+        </w:rPr>
+        <w:t>Confidence moved by up to about 35 points on one scan with annotation marks (79% to 44%), but the class did not change. Tinted images are often refused because the colour check treats them as photos or Doppler scans.</w:t>
+      </w:r>
+    </w:p>
+    <w:p>
+      <w:r>
+        <w:rPr>
+          <w:b/>
+          <w:i w:val="0"/>
+        </w:rPr>
+        <w:t>Conclusion.</w:t>
+      </w:r>
+      <w:r>
+        <w:rPr>
+          <w:b w:val="0"/>
+          <w:i w:val="0"/>
+        </w:rPr>
+        <w:t xml:space="preserve"> Compression, low resolution and on-screen marks do not change the answer. Colour-tinted or colour Doppler images are refused. Grayscale ultrasounds of other organs are wrongly accepted, and a benign lesion can still be flagged, so results on web images should not be read as validation. A future improvement is to add ultrasounds of other organs (abdomen, thyroid, obstetric) as negatives when training the gate.</w:t>
+      </w:r>
+    </w:p>
+    <w:p>
+      <w:pPr>
+        <w:pStyle w:val="2"/>
+        <w:pageBreakBefore w:val="0"/>
+      </w:pPr>
+      <w:bookmarkStart w:id="39" w:name="_Toc28170"/>
+      <w:r>
+        <w:t>7. Breast cancer risk questionnaire (component B)</w:t>
+      </w:r>
+      <w:bookmarkEnd w:id="39"/>
+    </w:p>
+    <w:p>
+      <w:pPr>
+        <w:pStyle w:val="3"/>
+      </w:pPr>
+      <w:bookmarkStart w:id="40" w:name="_Toc15232"/>
+      <w:r>
+        <w:t>7.1 Data and design</w:t>
+      </w:r>
+      <w:bookmarkEnd w:id="40"/>
+    </w:p>
+    <w:p>
+      <w:r>
+        <w:rPr>
+          <w:b w:val="0"/>
+          <w:i w:val="0"/>
+        </w:rPr>
+        <w:t>The model is trained on the Breast Cancer Surveillance Consortium (BCSC) Risk Estimation dataset: 2,392,998 screening mammograms of women with no previous breast cancer (recorded 1996 to 2002), aggregated into 280,660 risk-factor combinations, with 11,638 cancers (invasive or DCIS) diagnosed within one year of the mammogram. Each row is one combination plus a count, so training uses the counts as sample weights. The dataset ships with its own training and validation flag, used as supplied.</w:t>
+      </w:r>
+    </w:p>
+    <w:p>
+      <w:pPr>
+        <w:pStyle w:val="23"/>
+      </w:pPr>
+      <w:r>
+        <w:rPr>
+          <w:b/>
+          <w:i w:val="0"/>
+        </w:rPr>
+        <w:t>Only questions a woman can answer:</w:t>
+      </w:r>
+      <w:r>
+        <w:rPr>
+          <w:b w:val="0"/>
+          <w:i w:val="0"/>
+        </w:rPr>
+        <w:t xml:space="preserve"> age, menopause, body-mass index, age at first birth, close relatives with breast cancer, previous breast biopsy, hormone therapy. Breast density and the last mammogram result are optional. "Don't know" is treated as missing, exactly as BCSC codes it (XGBoost learns which branch missing values should follow).</w:t>
+      </w:r>
+    </w:p>
+    <w:p>
+      <w:pPr>
+        <w:pStyle w:val="23"/>
+      </w:pPr>
+      <w:r>
+        <w:rPr>
+          <w:b/>
+          <w:i w:val="0"/>
+        </w:rPr>
+        <w:t>Race and ethnicity are excluded:</w:t>
+      </w:r>
+      <w:r>
+        <w:rPr>
+          <w:b w:val="0"/>
+          <w:i w:val="0"/>
+        </w:rPr>
+        <w:t xml:space="preserve"> US census categories do not transfer to Femora's users.</w:t>
+      </w:r>
+    </w:p>
+    <w:p>
+      <w:pPr>
+        <w:pStyle w:val="23"/>
+      </w:pPr>
+      <w:r>
+        <w:rPr>
+          <w:b/>
+          <w:i w:val="0"/>
+        </w:rPr>
+        <w:t>Monotonic constraints</w:t>
+      </w:r>
+      <w:r>
+        <w:rPr>
+          <w:b w:val="0"/>
+          <w:i w:val="0"/>
+        </w:rPr>
+        <w:t xml:space="preserve"> on established risk factors (age, family history, biopsy, density, hormone therapy) keep the model medically sensible: adding a risk factor never lowers the estimate.</w:t>
+      </w:r>
+    </w:p>
+    <w:p>
+      <w:pPr>
+        <w:pStyle w:val="23"/>
+      </w:pPr>
+      <w:r>
+        <w:rPr>
+          <w:b/>
+          <w:i w:val="0"/>
+        </w:rPr>
+        <w:t>No re-balancing (SMOTE):</w:t>
+      </w:r>
+      <w:r>
+        <w:rPr>
+          <w:b w:val="0"/>
+          <w:i w:val="0"/>
+        </w:rPr>
+        <w:t xml:space="preserve"> the goal is a calibrated absolute risk, not a classifier.</w:t>
+      </w:r>
+    </w:p>
+    <w:p>
+      <w:pPr>
+        <w:pStyle w:val="23"/>
+      </w:pPr>
+      <w:r>
+        <w:rPr>
+          <w:b/>
+          <w:i w:val="0"/>
+        </w:rPr>
+        <w:t>Symptoms</w:t>
+      </w:r>
+      <w:r>
+        <w:rPr>
+          <w:b w:val="0"/>
+          <w:i w:val="0"/>
+        </w:rPr>
+        <w:t xml:space="preserve"> (lump, nipple discharge, skin change) are not in any public outcome dataset, so the app handles them with NICE NG12 referral rules, separate from the model (section 7.5).</w:t>
+      </w:r>
+    </w:p>
+    <w:p>
+      <w:pPr>
+        <w:pStyle w:val="3"/>
+      </w:pPr>
+      <w:bookmarkStart w:id="41" w:name="_Toc13294"/>
+      <w:r>
+        <w:t>7.2 How answers become model inputs</w:t>
+      </w:r>
+      <w:bookmarkEnd w:id="41"/>
+    </w:p>
+    <w:p>
+      <w:pPr>
+        <w:pStyle w:val="16"/>
+        <w:keepNext/>
+        <w:spacing w:before="160" w:after="60"/>
+      </w:pPr>
+      <w:r>
+        <w:rPr>
+          <w:b w:val="0"/>
+          <w:i w:val="0"/>
+        </w:rPr>
+        <w:t>Table 39. Feature coding (identical in the notebook and the server)</w:t>
       </w:r>
     </w:p>
     <w:tbl>
@@ -31245,11 +32400,11 @@
       <w:pPr>
         <w:pStyle w:val="3"/>
       </w:pPr>
-      <w:bookmarkStart w:id="41" w:name="_Toc21671"/>
+      <w:bookmarkStart w:id="42" w:name="_Toc12641"/>
       <w:r>
         <w:t>7.3 Model settings</w:t>
       </w:r>
-      <w:bookmarkEnd w:id="41"/>
+      <w:bookmarkEnd w:id="42"/>
     </w:p>
     <w:p>
       <w:pPr>
@@ -31262,7 +32417,7 @@
           <w:b w:val="0"/>
           <w:i w:val="0"/>
         </w:rPr>
-        <w:t>Table 38. Risk model training settings</w:t>
+        <w:t>Table 40. Risk model training settings</w:t>
       </w:r>
     </w:p>
     <w:tbl>
@@ -31834,11 +32989,11 @@
       <w:pPr>
         <w:pStyle w:val="3"/>
       </w:pPr>
-      <w:bookmarkStart w:id="42" w:name="_Toc19021"/>
+      <w:bookmarkStart w:id="43" w:name="_Toc10558"/>
       <w:r>
         <w:t>7.4 Results</w:t>
       </w:r>
-      <w:bookmarkEnd w:id="42"/>
+      <w:bookmarkEnd w:id="43"/>
     </w:p>
     <w:p>
       <w:pPr>
@@ -31851,7 +33006,7 @@
           <w:b w:val="0"/>
           <w:i w:val="0"/>
         </w:rPr>
-        <w:t>Table 39. Validation on about 597,859 mammograms</w:t>
+        <w:t>Table 41. Validation on about 597,859 mammograms</w:t>
       </w:r>
     </w:p>
     <w:tbl>
@@ -32335,7 +33490,7 @@
           <w:b w:val="0"/>
           <w:i w:val="0"/>
         </w:rPr>
-        <w:t>Table 40. Do the bands separate risk? (validation data)</w:t>
+        <w:t>Table 42. Do the bands separate risk? (validation data)</w:t>
       </w:r>
     </w:p>
     <w:tbl>
@@ -32803,7 +33958,7 @@
           <w:b w:val="0"/>
           <w:i w:val="0"/>
         </w:rPr>
-        <w:t>Table 41. Age baseline used for the comparison</w:t>
+        <w:t>Table 43. Age baseline used for the comparison</w:t>
       </w:r>
     </w:p>
     <w:tbl>
@@ -32841,6 +33996,12 @@
             <w:insideH w:val="single" w:color="D9C3CC" w:sz="4" w:space="0"/>
             <w:insideV w:val="single" w:color="D9C3CC" w:sz="4" w:space="0"/>
           </w:tblBorders>
+          <w:tblCellMar>
+            <w:top w:w="50" w:type="dxa"/>
+            <w:left w:w="90" w:type="dxa"/>
+            <w:bottom w:w="50" w:type="dxa"/>
+            <w:right w:w="90" w:type="dxa"/>
+          </w:tblCellMar>
         </w:tblPrEx>
         <w:trPr>
           <w:tblHeader/>
@@ -33618,11 +34779,11 @@
       <w:pPr>
         <w:pStyle w:val="3"/>
       </w:pPr>
-      <w:bookmarkStart w:id="43" w:name="_Toc1660"/>
+      <w:bookmarkStart w:id="44" w:name="_Toc17338"/>
       <w:r>
         <w:t>7.5 What the user sees and why</w:t>
       </w:r>
-      <w:bookmarkEnd w:id="43"/>
+      <w:bookmarkEnd w:id="44"/>
     </w:p>
     <w:p>
       <w:pPr>
@@ -33711,7 +34872,7 @@
           <w:b w:val="0"/>
           <w:i w:val="0"/>
         </w:rPr>
-        <w:t>Table 42. Symptom referral rules (NICE NG12)</w:t>
+        <w:t>Table 44. Symptom referral rules (NICE NG12)</w:t>
       </w:r>
     </w:p>
     <w:tbl>
@@ -33750,6 +34911,12 @@
             <w:insideH w:val="single" w:color="D9C3CC" w:sz="4" w:space="0"/>
             <w:insideV w:val="single" w:color="D9C3CC" w:sz="4" w:space="0"/>
           </w:tblBorders>
+          <w:tblCellMar>
+            <w:top w:w="50" w:type="dxa"/>
+            <w:left w:w="90" w:type="dxa"/>
+            <w:bottom w:w="50" w:type="dxa"/>
+            <w:right w:w="90" w:type="dxa"/>
+          </w:tblCellMar>
         </w:tblPrEx>
         <w:trPr>
           <w:tblHeader/>
@@ -34388,11 +35555,11 @@
       <w:pPr>
         <w:pStyle w:val="3"/>
       </w:pPr>
-      <w:bookmarkStart w:id="44" w:name="_Toc26688"/>
+      <w:bookmarkStart w:id="45" w:name="_Toc13826"/>
       <w:r>
         <w:t>7.6 Behaviour check through the API</w:t>
       </w:r>
-      <w:bookmarkEnd w:id="44"/>
+      <w:bookmarkEnd w:id="45"/>
     </w:p>
     <w:p>
       <w:pPr>
@@ -34405,7 +35572,7 @@
           <w:b w:val="0"/>
           <w:i w:val="0"/>
         </w:rPr>
-        <w:t>Table 43. Risk estimates rise sensibly as factors are added</w:t>
+        <w:t>Table 45. Risk estimates rise sensibly as factors are added</w:t>
       </w:r>
     </w:p>
     <w:tbl>
@@ -34445,6 +35612,12 @@
             <w:insideH w:val="single" w:color="D9C3CC" w:sz="4" w:space="0"/>
             <w:insideV w:val="single" w:color="D9C3CC" w:sz="4" w:space="0"/>
           </w:tblBorders>
+          <w:tblCellMar>
+            <w:top w:w="50" w:type="dxa"/>
+            <w:left w:w="90" w:type="dxa"/>
+            <w:bottom w:w="50" w:type="dxa"/>
+            <w:right w:w="90" w:type="dxa"/>
+          </w:tblCellMar>
         </w:tblPrEx>
         <w:trPr>
           <w:tblHeader/>
@@ -35336,11 +36509,11 @@
       <w:pPr>
         <w:pStyle w:val="3"/>
       </w:pPr>
-      <w:bookmarkStart w:id="45" w:name="_Toc30449"/>
+      <w:bookmarkStart w:id="46" w:name="_Toc547"/>
       <w:r>
         <w:t>7.7 Deviation from the scope document</w:t>
       </w:r>
-      <w:bookmarkEnd w:id="45"/>
+      <w:bookmarkEnd w:id="46"/>
     </w:p>
     <w:p>
       <w:r>
@@ -35355,11 +36528,11 @@
       <w:pPr>
         <w:pStyle w:val="3"/>
       </w:pPr>
-      <w:bookmarkStart w:id="46" w:name="_Toc2582"/>
+      <w:bookmarkStart w:id="47" w:name="_Toc15424"/>
       <w:r>
         <w:t>7.8 Limitations</w:t>
       </w:r>
-      <w:bookmarkEnd w:id="46"/>
+      <w:bookmarkEnd w:id="47"/>
     </w:p>
     <w:p>
       <w:pPr>
@@ -35402,11 +36575,11 @@
         <w:pStyle w:val="2"/>
         <w:pageBreakBefore w:val="0"/>
       </w:pPr>
-      <w:bookmarkStart w:id="47" w:name="_Toc16749"/>
+      <w:bookmarkStart w:id="48" w:name="_Toc23579"/>
       <w:r>
         <w:t>8. Other parts of the breast module</w:t>
       </w:r>
-      <w:bookmarkEnd w:id="47"/>
+      <w:bookmarkEnd w:id="48"/>
     </w:p>
     <w:p>
       <w:pPr>
@@ -35470,21 +36643,21 @@
         <w:pStyle w:val="2"/>
         <w:pageBreakBefore w:val="0"/>
       </w:pPr>
-      <w:bookmarkStart w:id="48" w:name="_Toc32199"/>
+      <w:bookmarkStart w:id="49" w:name="_Toc21726"/>
       <w:r>
         <w:t>9. Deployment and demo build</w:t>
       </w:r>
-      <w:bookmarkEnd w:id="48"/>
+      <w:bookmarkEnd w:id="49"/>
     </w:p>
     <w:p>
       <w:pPr>
         <w:pStyle w:val="3"/>
       </w:pPr>
-      <w:bookmarkStart w:id="49" w:name="_Toc17290"/>
+      <w:bookmarkStart w:id="50" w:name="_Toc22730"/>
       <w:r>
         <w:t>9.1 Hosting options considered</w:t>
       </w:r>
-      <w:bookmarkEnd w:id="49"/>
+      <w:bookmarkEnd w:id="50"/>
     </w:p>
     <w:p>
       <w:pPr>
@@ -35497,7 +36670,7 @@
           <w:b w:val="0"/>
           <w:i w:val="0"/>
         </w:rPr>
-        <w:t>Table 44. Where the backend can run</w:t>
+        <w:t>Table 46. Where the backend can run</w:t>
       </w:r>
     </w:p>
     <w:tbl>
@@ -35841,11 +37014,11 @@
       <w:pPr>
         <w:pStyle w:val="3"/>
       </w:pPr>
-      <w:bookmarkStart w:id="50" w:name="_Toc23551"/>
+      <w:bookmarkStart w:id="51" w:name="_Toc23772"/>
       <w:r>
         <w:t>9.2 Demo procedure</w:t>
       </w:r>
-      <w:bookmarkEnd w:id="50"/>
+      <w:bookmarkEnd w:id="51"/>
     </w:p>
     <w:p>
       <w:pPr>
@@ -35903,11 +37076,11 @@
       <w:pPr>
         <w:pStyle w:val="3"/>
       </w:pPr>
-      <w:bookmarkStart w:id="51" w:name="_Toc1750"/>
+      <w:bookmarkStart w:id="52" w:name="_Toc20951"/>
       <w:r>
         <w:t>9.3 Build environment and workarounds</w:t>
       </w:r>
-      <w:bookmarkEnd w:id="51"/>
+      <w:bookmarkEnd w:id="52"/>
     </w:p>
     <w:p>
       <w:pPr>
@@ -35920,7 +37093,7 @@
           <w:b w:val="0"/>
           <w:i w:val="0"/>
         </w:rPr>
-        <w:t>Table 45. Environment</w:t>
+        <w:t>Table 47. Environment</w:t>
       </w:r>
     </w:p>
     <w:tbl>
@@ -36324,11 +37497,11 @@
       <w:pPr>
         <w:pStyle w:val="3"/>
       </w:pPr>
-      <w:bookmarkStart w:id="52" w:name="_Toc21852"/>
+      <w:bookmarkStart w:id="53" w:name="_Toc7488"/>
       <w:r>
         <w:t>9.4 APK builds</w:t>
       </w:r>
-      <w:bookmarkEnd w:id="52"/>
+      <w:bookmarkEnd w:id="53"/>
     </w:p>
     <w:p>
       <w:pPr>
@@ -36341,7 +37514,7 @@
           <w:b w:val="0"/>
           <w:i w:val="0"/>
         </w:rPr>
-        <w:t>Table 46. Release APK builds</w:t>
+        <w:t>Table 48. Release APK builds</w:t>
       </w:r>
     </w:p>
     <w:tbl>
@@ -36633,11 +37806,11 @@
         <w:pStyle w:val="2"/>
         <w:pageBreakBefore w:val="0"/>
       </w:pPr>
-      <w:bookmarkStart w:id="53" w:name="_Toc14747"/>
+      <w:bookmarkStart w:id="54" w:name="_Toc29229"/>
       <w:r>
         <w:t>10. Verification and testing</w:t>
       </w:r>
-      <w:bookmarkEnd w:id="53"/>
+      <w:bookmarkEnd w:id="54"/>
     </w:p>
     <w:p>
       <w:pPr>
@@ -36650,7 +37823,7 @@
           <w:b w:val="0"/>
           <w:i w:val="0"/>
         </w:rPr>
-        <w:t>Table 47. Verification performed</w:t>
+        <w:t>Table 49. Verification performed</w:t>
       </w:r>
     </w:p>
     <w:tbl>
@@ -36689,6 +37862,12 @@
             <w:insideH w:val="single" w:color="D9C3CC" w:sz="4" w:space="0"/>
             <w:insideV w:val="single" w:color="D9C3CC" w:sz="4" w:space="0"/>
           </w:tblBorders>
+          <w:tblCellMar>
+            <w:top w:w="50" w:type="dxa"/>
+            <w:left w:w="90" w:type="dxa"/>
+            <w:bottom w:w="50" w:type="dxa"/>
+            <w:right w:w="90" w:type="dxa"/>
+          </w:tblCellMar>
         </w:tblPrEx>
         <w:trPr>
           <w:tblHeader/>
@@ -37556,11 +38735,11 @@
       <w:pPr>
         <w:pStyle w:val="3"/>
       </w:pPr>
-      <w:bookmarkStart w:id="54" w:name="_Toc9884"/>
+      <w:bookmarkStart w:id="55" w:name="_Toc27483"/>
       <w:r>
         <w:t>10.1 Checking the ultrasound module on a phone</w:t>
       </w:r>
-      <w:bookmarkEnd w:id="54"/>
+      <w:bookmarkEnd w:id="55"/>
     </w:p>
     <w:p>
       <w:r>
@@ -37582,7 +38761,7 @@
           <w:b w:val="0"/>
           <w:i w:val="0"/>
         </w:rPr>
-        <w:t>Table 48. Phone test kit for the ultrasound module</w:t>
+        <w:t>Table 50. Phone test kit for the ultrasound module</w:t>
       </w:r>
     </w:p>
     <w:tbl>
@@ -38425,21 +39604,21 @@
         <w:pStyle w:val="2"/>
         <w:pageBreakBefore w:val="0"/>
       </w:pPr>
-      <w:bookmarkStart w:id="55" w:name="_Toc14031"/>
+      <w:bookmarkStart w:id="56" w:name="_Toc32670"/>
       <w:r>
         <w:t>11. Limitations, ethics and risks</w:t>
       </w:r>
-      <w:bookmarkEnd w:id="55"/>
+      <w:bookmarkEnd w:id="56"/>
     </w:p>
     <w:p>
       <w:pPr>
         <w:pStyle w:val="3"/>
       </w:pPr>
-      <w:bookmarkStart w:id="56" w:name="_Toc21318"/>
+      <w:bookmarkStart w:id="57" w:name="_Toc19549"/>
       <w:r>
         <w:t>11.1 Failure modes and mitigations</w:t>
       </w:r>
-      <w:bookmarkEnd w:id="56"/>
+      <w:bookmarkEnd w:id="57"/>
     </w:p>
     <w:p>
       <w:pPr>
@@ -38452,7 +39631,7 @@
           <w:b w:val="0"/>
           <w:i w:val="0"/>
         </w:rPr>
-        <w:t>Table 49. Failure modes</w:t>
+        <w:t>Table 51. Failure modes</w:t>
       </w:r>
     </w:p>
     <w:tbl>
@@ -38492,6 +39671,12 @@
             <w:insideH w:val="single" w:color="D9C3CC" w:sz="4" w:space="0"/>
             <w:insideV w:val="single" w:color="D9C3CC" w:sz="4" w:space="0"/>
           </w:tblBorders>
+          <w:tblCellMar>
+            <w:top w:w="50" w:type="dxa"/>
+            <w:left w:w="90" w:type="dxa"/>
+            <w:bottom w:w="50" w:type="dxa"/>
+            <w:right w:w="90" w:type="dxa"/>
+          </w:tblCellMar>
         </w:tblPrEx>
         <w:trPr>
           <w:tblHeader/>
@@ -38504,7 +39689,6 @@
           </w:tcPr>
           <w:p>
             <w:pPr>
-              <w:keepNext/>
               <w:spacing w:after="0" w:line="240" w:lineRule="auto"/>
             </w:pPr>
             <w:r>
@@ -38525,7 +39709,6 @@
           </w:tcPr>
           <w:p>
             <w:pPr>
-              <w:keepNext/>
               <w:spacing w:after="0" w:line="240" w:lineRule="auto"/>
             </w:pPr>
             <w:r>
@@ -38546,7 +39729,6 @@
           </w:tcPr>
           <w:p>
             <w:pPr>
-              <w:keepNext/>
               <w:spacing w:after="0" w:line="240" w:lineRule="auto"/>
             </w:pPr>
             <w:r>
@@ -38567,7 +39749,6 @@
           </w:tcPr>
           <w:p>
             <w:pPr>
-              <w:keepNext/>
               <w:spacing w:after="0" w:line="240" w:lineRule="auto"/>
             </w:pPr>
             <w:r>
@@ -38609,7 +39790,6 @@
           </w:tcPr>
           <w:p>
             <w:pPr>
-              <w:keepNext/>
               <w:spacing w:after="0" w:line="240" w:lineRule="auto"/>
             </w:pPr>
             <w:r>
@@ -38628,7 +39808,6 @@
           </w:tcPr>
           <w:p>
             <w:pPr>
-              <w:keepNext/>
               <w:spacing w:after="0" w:line="240" w:lineRule="auto"/>
             </w:pPr>
             <w:r>
@@ -38647,7 +39826,6 @@
           </w:tcPr>
           <w:p>
             <w:pPr>
-              <w:keepNext/>
               <w:spacing w:after="0" w:line="240" w:lineRule="auto"/>
             </w:pPr>
             <w:r>
@@ -38666,7 +39844,6 @@
           </w:tcPr>
           <w:p>
             <w:pPr>
-              <w:keepNext/>
               <w:spacing w:after="0" w:line="240" w:lineRule="auto"/>
             </w:pPr>
             <w:r>
@@ -38708,7 +39885,6 @@
           </w:tcPr>
           <w:p>
             <w:pPr>
-              <w:keepNext/>
               <w:spacing w:after="0" w:line="240" w:lineRule="auto"/>
             </w:pPr>
             <w:r>
@@ -38728,7 +39904,6 @@
           </w:tcPr>
           <w:p>
             <w:pPr>
-              <w:keepNext/>
               <w:spacing w:after="0" w:line="240" w:lineRule="auto"/>
             </w:pPr>
             <w:r>
@@ -38748,7 +39923,6 @@
           </w:tcPr>
           <w:p>
             <w:pPr>
-              <w:keepNext/>
               <w:spacing w:after="0" w:line="240" w:lineRule="auto"/>
             </w:pPr>
             <w:r>
@@ -38768,7 +39942,6 @@
           </w:tcPr>
           <w:p>
             <w:pPr>
-              <w:keepNext/>
               <w:spacing w:after="0" w:line="240" w:lineRule="auto"/>
             </w:pPr>
             <w:r>
@@ -38809,7 +39982,6 @@
           </w:tcPr>
           <w:p>
             <w:pPr>
-              <w:keepNext/>
               <w:spacing w:after="0" w:line="240" w:lineRule="auto"/>
             </w:pPr>
             <w:r>
@@ -38828,7 +40000,6 @@
           </w:tcPr>
           <w:p>
             <w:pPr>
-              <w:keepNext/>
               <w:spacing w:after="0" w:line="240" w:lineRule="auto"/>
             </w:pPr>
             <w:r>
@@ -38847,7 +40018,6 @@
           </w:tcPr>
           <w:p>
             <w:pPr>
-              <w:keepNext/>
               <w:spacing w:after="0" w:line="240" w:lineRule="auto"/>
             </w:pPr>
             <w:r>
@@ -38866,7 +40036,6 @@
           </w:tcPr>
           <w:p>
             <w:pPr>
-              <w:keepNext/>
               <w:spacing w:after="0" w:line="240" w:lineRule="auto"/>
             </w:pPr>
             <w:r>
@@ -38908,7 +40077,6 @@
           </w:tcPr>
           <w:p>
             <w:pPr>
-              <w:keepNext/>
               <w:spacing w:after="0" w:line="240" w:lineRule="auto"/>
             </w:pPr>
             <w:r>
@@ -38917,7 +40085,7 @@
                 <w:i w:val="0"/>
                 <w:sz w:val="17"/>
               </w:rPr>
-              <w:t>New scanner or hospital</w:t>
+              <w:t>Ultrasound of another body part</w:t>
             </w:r>
           </w:p>
         </w:tc>
@@ -38928,7 +40096,6 @@
           </w:tcPr>
           <w:p>
             <w:pPr>
-              <w:keepNext/>
               <w:spacing w:after="0" w:line="240" w:lineRule="auto"/>
             </w:pPr>
             <w:r>
@@ -38937,7 +40104,7 @@
                 <w:i w:val="0"/>
                 <w:sz w:val="17"/>
               </w:rPr>
-              <w:t>Lower accuracy than reported</w:t>
+              <w:t>A breast verdict for a non-breast scan (observed once)</w:t>
             </w:r>
           </w:p>
         </w:tc>
@@ -38948,7 +40115,6 @@
           </w:tcPr>
           <w:p>
             <w:pPr>
-              <w:keepNext/>
               <w:spacing w:after="0" w:line="240" w:lineRule="auto"/>
             </w:pPr>
             <w:r>
@@ -38957,7 +40123,7 @@
                 <w:i w:val="0"/>
                 <w:sz w:val="17"/>
               </w:rPr>
-              <w:t>Trained on three hospitals and four scanners</w:t>
+              <w:t>None: the gate was not trained against other ultrasounds</w:t>
             </w:r>
           </w:p>
         </w:tc>
@@ -38968,7 +40134,6 @@
           </w:tcPr>
           <w:p>
             <w:pPr>
-              <w:keepNext/>
               <w:spacing w:after="0" w:line="240" w:lineRule="auto"/>
             </w:pPr>
             <w:r>
@@ -38977,7 +40142,7 @@
                 <w:i w:val="0"/>
                 <w:sz w:val="17"/>
               </w:rPr>
-              <w:t>More local data; per-scanner monitoring</w:t>
+              <w:t>Add other-organ ultrasounds as gate negatives</w:t>
             </w:r>
           </w:p>
         </w:tc>
@@ -39009,7 +40174,6 @@
           </w:tcPr>
           <w:p>
             <w:pPr>
-              <w:keepNext/>
               <w:spacing w:after="0" w:line="240" w:lineRule="auto"/>
             </w:pPr>
             <w:r>
@@ -39018,7 +40182,7 @@
                 <w:i w:val="0"/>
                 <w:sz w:val="17"/>
               </w:rPr>
-              <w:t>Risk model on a different population</w:t>
+              <w:t>New scanner or hospital</w:t>
             </w:r>
           </w:p>
         </w:tc>
@@ -39028,7 +40192,6 @@
           </w:tcPr>
           <w:p>
             <w:pPr>
-              <w:keepNext/>
               <w:spacing w:after="0" w:line="240" w:lineRule="auto"/>
             </w:pPr>
             <w:r>
@@ -39037,7 +40200,7 @@
                 <w:i w:val="0"/>
                 <w:sz w:val="17"/>
               </w:rPr>
-              <w:t>Miscalibrated risk</w:t>
+              <w:t>Lower accuracy than reported</w:t>
             </w:r>
           </w:p>
         </w:tc>
@@ -39047,7 +40210,6 @@
           </w:tcPr>
           <w:p>
             <w:pPr>
-              <w:keepNext/>
               <w:spacing w:after="0" w:line="240" w:lineRule="auto"/>
             </w:pPr>
             <w:r>
@@ -39056,7 +40218,7 @@
                 <w:i w:val="0"/>
                 <w:sz w:val="17"/>
               </w:rPr>
-              <w:t>Relative-to-age wording</w:t>
+              <w:t>Trained on three hospitals and four scanners</w:t>
             </w:r>
           </w:p>
         </w:tc>
@@ -39066,7 +40228,6 @@
           </w:tcPr>
           <w:p>
             <w:pPr>
-              <w:keepNext/>
               <w:spacing w:after="0" w:line="240" w:lineRule="auto"/>
             </w:pPr>
             <w:r>
@@ -39075,7 +40236,7 @@
                 <w:i w:val="0"/>
                 <w:sz w:val="17"/>
               </w:rPr>
-              <w:t>Validation on local data</w:t>
+              <w:t>More local data; per-scanner monitoring</w:t>
             </w:r>
           </w:p>
         </w:tc>
@@ -39108,7 +40269,6 @@
           </w:tcPr>
           <w:p>
             <w:pPr>
-              <w:keepNext/>
               <w:spacing w:after="0" w:line="240" w:lineRule="auto"/>
             </w:pPr>
             <w:r>
@@ -39117,7 +40277,7 @@
                 <w:i w:val="0"/>
                 <w:sz w:val="17"/>
               </w:rPr>
-              <w:t>Server unreachable</w:t>
+              <w:t>Risk model on a different population</w:t>
             </w:r>
           </w:p>
         </w:tc>
@@ -39128,7 +40288,6 @@
           </w:tcPr>
           <w:p>
             <w:pPr>
-              <w:keepNext/>
               <w:spacing w:after="0" w:line="240" w:lineRule="auto"/>
             </w:pPr>
             <w:r>
@@ -39137,7 +40296,7 @@
                 <w:i w:val="0"/>
                 <w:sz w:val="17"/>
               </w:rPr>
-              <w:t>No result</w:t>
+              <w:t>Miscalibrated risk</w:t>
             </w:r>
           </w:p>
         </w:tc>
@@ -39148,7 +40307,6 @@
           </w:tcPr>
           <w:p>
             <w:pPr>
-              <w:keepNext/>
               <w:spacing w:after="0" w:line="240" w:lineRule="auto"/>
             </w:pPr>
             <w:r>
@@ -39157,7 +40315,7 @@
                 <w:i w:val="0"/>
                 <w:sz w:val="17"/>
               </w:rPr>
-              <w:t>Clear error messages, form stays open</w:t>
+              <w:t>Relative-to-age wording</w:t>
             </w:r>
           </w:p>
         </w:tc>
@@ -39168,7 +40326,6 @@
           </w:tcPr>
           <w:p>
             <w:pPr>
-              <w:keepNext/>
               <w:spacing w:after="0" w:line="240" w:lineRule="auto"/>
             </w:pPr>
             <w:r>
@@ -39177,7 +40334,7 @@
                 <w:i w:val="0"/>
                 <w:sz w:val="17"/>
               </w:rPr>
-              <w:t>Real hosting; offline fallback</w:t>
+              <w:t>Validation on local data</w:t>
             </w:r>
           </w:p>
         </w:tc>
@@ -39217,6 +40374,101 @@
                 <w:i w:val="0"/>
                 <w:sz w:val="17"/>
               </w:rPr>
+              <w:t>Server unreachable</w:t>
+            </w:r>
+          </w:p>
+        </w:tc>
+        <w:tc>
+          <w:tcPr>
+            <w:tcW w:w="1814" w:type="dxa"/>
+          </w:tcPr>
+          <w:p>
+            <w:pPr>
+              <w:spacing w:after="0" w:line="240" w:lineRule="auto"/>
+            </w:pPr>
+            <w:r>
+              <w:rPr>
+                <w:b w:val="0"/>
+                <w:i w:val="0"/>
+                <w:sz w:val="17"/>
+              </w:rPr>
+              <w:t>No result</w:t>
+            </w:r>
+          </w:p>
+        </w:tc>
+        <w:tc>
+          <w:tcPr>
+            <w:tcW w:w="2835" w:type="dxa"/>
+          </w:tcPr>
+          <w:p>
+            <w:pPr>
+              <w:spacing w:after="0" w:line="240" w:lineRule="auto"/>
+            </w:pPr>
+            <w:r>
+              <w:rPr>
+                <w:b w:val="0"/>
+                <w:i w:val="0"/>
+                <w:sz w:val="17"/>
+              </w:rPr>
+              <w:t>Clear error messages, form stays open</w:t>
+            </w:r>
+          </w:p>
+        </w:tc>
+        <w:tc>
+          <w:tcPr>
+            <w:tcW w:w="2268" w:type="dxa"/>
+          </w:tcPr>
+          <w:p>
+            <w:pPr>
+              <w:spacing w:after="0" w:line="240" w:lineRule="auto"/>
+            </w:pPr>
+            <w:r>
+              <w:rPr>
+                <w:b w:val="0"/>
+                <w:i w:val="0"/>
+                <w:sz w:val="17"/>
+              </w:rPr>
+              <w:t>Real hosting; offline fallback</w:t>
+            </w:r>
+          </w:p>
+        </w:tc>
+      </w:tr>
+      <w:tr>
+        <w:tblPrEx>
+          <w:tblBorders>
+            <w:top w:val="single" w:color="D9C3CC" w:sz="4" w:space="0"/>
+            <w:left w:val="single" w:color="D9C3CC" w:sz="4" w:space="0"/>
+            <w:bottom w:val="single" w:color="D9C3CC" w:sz="4" w:space="0"/>
+            <w:right w:val="single" w:color="D9C3CC" w:sz="4" w:space="0"/>
+            <w:insideH w:val="single" w:color="D9C3CC" w:sz="4" w:space="0"/>
+            <w:insideV w:val="single" w:color="D9C3CC" w:sz="4" w:space="0"/>
+          </w:tblBorders>
+          <w:tblCellMar>
+            <w:top w:w="50" w:type="dxa"/>
+            <w:left w:w="90" w:type="dxa"/>
+            <w:bottom w:w="50" w:type="dxa"/>
+            <w:right w:w="90" w:type="dxa"/>
+          </w:tblCellMar>
+        </w:tblPrEx>
+        <w:trPr>
+          <w:cantSplit/>
+          <w:jc w:val="center"/>
+        </w:trPr>
+        <w:tc>
+          <w:tcPr>
+            <w:tcW w:w="2494" w:type="dxa"/>
+            <w:shd w:val="clear" w:color="auto" w:fill="FBE9EF"/>
+          </w:tcPr>
+          <w:p>
+            <w:pPr>
+              <w:spacing w:after="0" w:line="240" w:lineRule="auto"/>
+            </w:pPr>
+            <w:r>
+              <w:rPr>
+                <w:b w:val="0"/>
+                <w:i w:val="0"/>
+                <w:sz w:val="17"/>
+              </w:rPr>
               <w:t>User treats output as a diagnosis</w:t>
             </w:r>
           </w:p>
@@ -39224,6 +40476,7 @@
         <w:tc>
           <w:tcPr>
             <w:tcW w:w="1814" w:type="dxa"/>
+            <w:shd w:val="clear" w:color="auto" w:fill="FBE9EF"/>
           </w:tcPr>
           <w:p>
             <w:pPr>
@@ -39242,6 +40495,7 @@
         <w:tc>
           <w:tcPr>
             <w:tcW w:w="2835" w:type="dxa"/>
+            <w:shd w:val="clear" w:color="auto" w:fill="FBE9EF"/>
           </w:tcPr>
           <w:p>
             <w:pPr>
@@ -39260,6 +40514,7 @@
         <w:tc>
           <w:tcPr>
             <w:tcW w:w="2268" w:type="dxa"/>
+            <w:shd w:val="clear" w:color="auto" w:fill="FBE9EF"/>
           </w:tcPr>
           <w:p>
             <w:pPr>
@@ -39286,114 +40541,9 @@
       <w:pPr>
         <w:pStyle w:val="3"/>
       </w:pPr>
-      <w:bookmarkStart w:id="57" w:name="_Toc24220"/>
+      <w:bookmarkStart w:id="58" w:name="_Toc28345"/>
       <w:r>
         <w:t>11.2 Ethical and legal points</w:t>
-      </w:r>
-      <w:bookmarkEnd w:id="57"/>
-    </w:p>
-    <w:p>
-      <w:pPr>
-        <w:pStyle w:val="23"/>
-      </w:pPr>
-      <w:r>
-        <w:rPr>
-          <w:b/>
-          <w:i w:val="0"/>
-        </w:rPr>
-        <w:t>Not a medical device.</w:t>
-      </w:r>
-      <w:r>
-        <w:rPr>
-          <w:b w:val="0"/>
-          <w:i w:val="0"/>
-        </w:rPr>
-        <w:t xml:space="preserve"> Femora offers awareness and risk information. Using it as a diagnostic tool would require clinical validation and regulatory approval that this project does not claim.</w:t>
-      </w:r>
-    </w:p>
-    <w:p>
-      <w:pPr>
-        <w:pStyle w:val="23"/>
-      </w:pPr>
-      <w:r>
-        <w:rPr>
-          <w:b/>
-          <w:i w:val="0"/>
-        </w:rPr>
-        <w:t>Bias and representation.</w:t>
-      </w:r>
-      <w:r>
-        <w:rPr>
-          <w:b w:val="0"/>
-          <w:i w:val="0"/>
-        </w:rPr>
-        <w:t xml:space="preserve"> The ultrasound data comes from Egypt, Poland and Brazil and the risk data from the United States. None is from Pakistan, the intended users, so performance there is unknown. This is stated in the report and should be in the app's about screen.</w:t>
-      </w:r>
-    </w:p>
-    <w:p>
-      <w:pPr>
-        <w:pStyle w:val="23"/>
-      </w:pPr>
-      <w:r>
-        <w:rPr>
-          <w:b/>
-          <w:i w:val="0"/>
-        </w:rPr>
-        <w:t>Privacy.</w:t>
-      </w:r>
-      <w:r>
-        <w:rPr>
-          <w:b w:val="0"/>
-          <w:i w:val="0"/>
-        </w:rPr>
-        <w:t xml:space="preserve"> Scans and answers are processed in memory and not stored server-side. Images travel to a server, so real deployment needs HTTPS, a trusted host, a privacy notice and user consent. The demo tunnel passes traffic through Cloudflare.</w:t>
-      </w:r>
-    </w:p>
-    <w:p>
-      <w:pPr>
-        <w:pStyle w:val="23"/>
-      </w:pPr>
-      <w:r>
-        <w:rPr>
-          <w:b/>
-          <w:i w:val="0"/>
-        </w:rPr>
-        <w:t>Data terms.</w:t>
-      </w:r>
-      <w:r>
-        <w:rPr>
-          <w:b w:val="0"/>
-          <w:i w:val="0"/>
-        </w:rPr>
-        <w:t xml:space="preserve"> BUS-BRA requires citation; BCSC requires the funding citation and its redistribution terms are not spelled out, so the private Kaggle copy must not be made public without checking them.</w:t>
-      </w:r>
-    </w:p>
-    <w:p>
-      <w:pPr>
-        <w:pStyle w:val="23"/>
-      </w:pPr>
-      <w:r>
-        <w:rPr>
-          <w:b/>
-          <w:i w:val="0"/>
-        </w:rPr>
-        <w:t>Fairness of communication.</w:t>
-      </w:r>
-      <w:r>
-        <w:rPr>
-          <w:b w:val="0"/>
-          <w:i w:val="0"/>
-        </w:rPr>
-        <w:t xml:space="preserve"> Results avoid diagnostic words, always recommend a doctor and present uncertainty (calibrated probabilities, honest accuracy).</w:t>
-      </w:r>
-    </w:p>
-    <w:p>
-      <w:pPr>
-        <w:pStyle w:val="3"/>
-      </w:pPr>
-      <w:bookmarkStart w:id="58" w:name="_Toc662"/>
-      <w:r>
-        <w:t>11.3 Other limitations</w:t>
       </w:r>
       <w:bookmarkEnd w:id="58"/>
     </w:p>
@@ -39406,6 +40556,111 @@
           <w:b/>
           <w:i w:val="0"/>
         </w:rPr>
+        <w:t>Not a medical device.</w:t>
+      </w:r>
+      <w:r>
+        <w:rPr>
+          <w:b w:val="0"/>
+          <w:i w:val="0"/>
+        </w:rPr>
+        <w:t xml:space="preserve"> Femora offers awareness and risk information. Using it as a diagnostic tool would require clinical validation and regulatory approval that this project does not claim.</w:t>
+      </w:r>
+    </w:p>
+    <w:p>
+      <w:pPr>
+        <w:pStyle w:val="23"/>
+      </w:pPr>
+      <w:r>
+        <w:rPr>
+          <w:b/>
+          <w:i w:val="0"/>
+        </w:rPr>
+        <w:t>Bias and representation.</w:t>
+      </w:r>
+      <w:r>
+        <w:rPr>
+          <w:b w:val="0"/>
+          <w:i w:val="0"/>
+        </w:rPr>
+        <w:t xml:space="preserve"> The ultrasound data comes from Egypt, Poland and Brazil and the risk data from the United States. None is from Pakistan, the intended users, so performance there is unknown. This is stated in the report and should be in the app's about screen.</w:t>
+      </w:r>
+    </w:p>
+    <w:p>
+      <w:pPr>
+        <w:pStyle w:val="23"/>
+      </w:pPr>
+      <w:r>
+        <w:rPr>
+          <w:b/>
+          <w:i w:val="0"/>
+        </w:rPr>
+        <w:t>Privacy.</w:t>
+      </w:r>
+      <w:r>
+        <w:rPr>
+          <w:b w:val="0"/>
+          <w:i w:val="0"/>
+        </w:rPr>
+        <w:t xml:space="preserve"> Scans and answers are processed in memory and not stored server-side. Images travel to a server, so real deployment needs HTTPS, a trusted host, a privacy notice and user consent. The demo tunnel passes traffic through Cloudflare.</w:t>
+      </w:r>
+    </w:p>
+    <w:p>
+      <w:pPr>
+        <w:pStyle w:val="23"/>
+      </w:pPr>
+      <w:r>
+        <w:rPr>
+          <w:b/>
+          <w:i w:val="0"/>
+        </w:rPr>
+        <w:t>Data terms.</w:t>
+      </w:r>
+      <w:r>
+        <w:rPr>
+          <w:b w:val="0"/>
+          <w:i w:val="0"/>
+        </w:rPr>
+        <w:t xml:space="preserve"> BUS-BRA requires citation; BCSC requires the funding citation and its redistribution terms are not spelled out, so the private Kaggle copy must not be made public without checking them.</w:t>
+      </w:r>
+    </w:p>
+    <w:p>
+      <w:pPr>
+        <w:pStyle w:val="23"/>
+      </w:pPr>
+      <w:r>
+        <w:rPr>
+          <w:b/>
+          <w:i w:val="0"/>
+        </w:rPr>
+        <w:t>Fairness of communication.</w:t>
+      </w:r>
+      <w:r>
+        <w:rPr>
+          <w:b w:val="0"/>
+          <w:i w:val="0"/>
+        </w:rPr>
+        <w:t xml:space="preserve"> Results avoid diagnostic words, always recommend a doctor and present uncertainty (calibrated probabilities, honest accuracy).</w:t>
+      </w:r>
+    </w:p>
+    <w:p>
+      <w:pPr>
+        <w:pStyle w:val="3"/>
+      </w:pPr>
+      <w:bookmarkStart w:id="59" w:name="_Toc15946"/>
+      <w:r>
+        <w:t>11.3 Other limitations</w:t>
+      </w:r>
+      <w:bookmarkEnd w:id="59"/>
+    </w:p>
+    <w:p>
+      <w:pPr>
+        <w:pStyle w:val="23"/>
+      </w:pPr>
+      <w:r>
+        <w:rPr>
+          <w:b/>
+          <w:i w:val="0"/>
+        </w:rPr>
         <w:t>Test-set tuning.</w:t>
       </w:r>
       <w:r>
@@ -39478,11 +40733,11 @@
         <w:pStyle w:val="2"/>
         <w:pageBreakBefore w:val="0"/>
       </w:pPr>
-      <w:bookmarkStart w:id="59" w:name="_Toc19495"/>
+      <w:bookmarkStart w:id="60" w:name="_Toc31323"/>
       <w:r>
         <w:t>12. Remaining work and recommended order</w:t>
       </w:r>
-      <w:bookmarkEnd w:id="59"/>
+      <w:bookmarkEnd w:id="60"/>
     </w:p>
     <w:p>
       <w:pPr>
@@ -39495,7 +40750,7 @@
           <w:b w:val="0"/>
           <w:i w:val="0"/>
         </w:rPr>
-        <w:t>Table 50. Suggested plan</w:t>
+        <w:t>Table 52. Suggested plan</w:t>
       </w:r>
     </w:p>
     <w:tbl>
@@ -40179,11 +41434,11 @@
         <w:pStyle w:val="2"/>
         <w:pageBreakBefore w:val="0"/>
       </w:pPr>
-      <w:bookmarkStart w:id="60" w:name="_Toc30889"/>
+      <w:bookmarkStart w:id="61" w:name="_Toc6603"/>
       <w:r>
         <w:t>13. Conclusion</w:t>
       </w:r>
-      <w:bookmarkEnd w:id="60"/>
+      <w:bookmarkEnd w:id="61"/>
     </w:p>
     <w:p>
       <w:r>
@@ -40199,11 +41454,11 @@
         <w:pStyle w:val="2"/>
         <w:pageBreakBefore/>
       </w:pPr>
-      <w:bookmarkStart w:id="61" w:name="_Toc6773"/>
+      <w:bookmarkStart w:id="62" w:name="_Toc1217"/>
       <w:r>
         <w:t>Appendix A. Metric glossary</w:t>
       </w:r>
-      <w:bookmarkEnd w:id="61"/>
+      <w:bookmarkEnd w:id="62"/>
     </w:p>
     <w:p>
       <w:pPr>
@@ -40216,7 +41471,7 @@
           <w:b w:val="0"/>
           <w:i w:val="0"/>
         </w:rPr>
-        <w:t>Table 51. Terms used in this report</w:t>
+        <w:t>Table 53. Terms used in this report</w:t>
       </w:r>
     </w:p>
     <w:tbl>
@@ -40254,6 +41509,12 @@
             <w:insideH w:val="single" w:color="D9C3CC" w:sz="4" w:space="0"/>
             <w:insideV w:val="single" w:color="D9C3CC" w:sz="4" w:space="0"/>
           </w:tblBorders>
+          <w:tblCellMar>
+            <w:top w:w="50" w:type="dxa"/>
+            <w:left w:w="90" w:type="dxa"/>
+            <w:bottom w:w="50" w:type="dxa"/>
+            <w:right w:w="90" w:type="dxa"/>
+          </w:tblCellMar>
         </w:tblPrEx>
         <w:trPr>
           <w:tblHeader/>
@@ -41373,11 +42634,11 @@
         <w:pStyle w:val="2"/>
         <w:pageBreakBefore w:val="0"/>
       </w:pPr>
-      <w:bookmarkStart w:id="62" w:name="_Toc13894"/>
+      <w:bookmarkStart w:id="63" w:name="_Toc23421"/>
       <w:r>
         <w:t>Appendix B. Reproducibility</w:t>
       </w:r>
-      <w:bookmarkEnd w:id="62"/>
+      <w:bookmarkEnd w:id="63"/>
     </w:p>
     <w:p>
       <w:pPr>
@@ -41390,7 +42651,7 @@
           <w:b w:val="0"/>
           <w:i w:val="0"/>
         </w:rPr>
-        <w:t>Table 52. Where things are</w:t>
+        <w:t>Table 54. Where things are</w:t>
       </w:r>
     </w:p>
     <w:tbl>
@@ -41428,6 +42689,12 @@
             <w:insideH w:val="single" w:color="D9C3CC" w:sz="4" w:space="0"/>
             <w:insideV w:val="single" w:color="D9C3CC" w:sz="4" w:space="0"/>
           </w:tblBorders>
+          <w:tblCellMar>
+            <w:top w:w="50" w:type="dxa"/>
+            <w:left w:w="90" w:type="dxa"/>
+            <w:bottom w:w="50" w:type="dxa"/>
+            <w:right w:w="90" w:type="dxa"/>
+          </w:tblCellMar>
         </w:tblPrEx>
         <w:trPr>
           <w:tblHeader/>
@@ -41966,11 +43233,11 @@
         <w:pStyle w:val="2"/>
         <w:pageBreakBefore w:val="0"/>
       </w:pPr>
-      <w:bookmarkStart w:id="63" w:name="_Toc14759"/>
+      <w:bookmarkStart w:id="64" w:name="_Toc30241"/>
       <w:r>
         <w:t>Appendix C. Data sources and citations</w:t>
       </w:r>
-      <w:bookmarkEnd w:id="63"/>
+      <w:bookmarkEnd w:id="64"/>
     </w:p>
     <w:p>
       <w:pPr>
@@ -42073,11 +43340,11 @@
         <w:pStyle w:val="2"/>
         <w:pageBreakBefore w:val="0"/>
       </w:pPr>
-      <w:bookmarkStart w:id="64" w:name="_Toc23477"/>
+      <w:bookmarkStart w:id="65" w:name="_Toc22686"/>
       <w:r>
         <w:t>Appendix D. Key decisions and why</w:t>
       </w:r>
-      <w:bookmarkEnd w:id="64"/>
+      <w:bookmarkEnd w:id="65"/>
     </w:p>
     <w:p>
       <w:pPr>
@@ -42090,7 +43357,7 @@
           <w:b w:val="0"/>
           <w:i w:val="0"/>
         </w:rPr>
-        <w:t>Table 53. Decision log</w:t>
+        <w:t>Table 55. Decision log</w:t>
       </w:r>
     </w:p>
     <w:tbl>
@@ -42781,11 +44048,11 @@
         <w:pStyle w:val="2"/>
         <w:pageBreakBefore w:val="0"/>
       </w:pPr>
-      <w:bookmarkStart w:id="65" w:name="_Toc7907"/>
+      <w:bookmarkStart w:id="66" w:name="_Toc11542"/>
       <w:r>
         <w:t>Appendix E. Commit history (main branch)</w:t>
       </w:r>
-      <w:bookmarkEnd w:id="65"/>
+      <w:bookmarkEnd w:id="66"/>
     </w:p>
     <w:p>
       <w:pPr>
@@ -42798,7 +44065,7 @@
           <w:b w:val="0"/>
           <w:i w:val="0"/>
         </w:rPr>
-        <w:t>Table 54. Commits made during this period</w:t>
+        <w:t>Table 56. Commits made during this period</w:t>
       </w:r>
     </w:p>
     <w:tbl>
@@ -43695,11 +44962,11 @@
         <w:pStyle w:val="2"/>
         <w:pageBreakBefore w:val="0"/>
       </w:pPr>
-      <w:bookmarkStart w:id="66" w:name="_Toc3970"/>
+      <w:bookmarkStart w:id="67" w:name="_Toc16979"/>
       <w:r>
         <w:t>Appendix F. Questions a panel may ask</w:t>
       </w:r>
-      <w:bookmarkEnd w:id="66"/>
+      <w:bookmarkEnd w:id="67"/>
     </w:p>
     <w:p>
       <w:pPr>
@@ -43712,7 +44979,7 @@
           <w:b w:val="0"/>
           <w:i w:val="0"/>
         </w:rPr>
-        <w:t>Table 55. Anticipated questions</w:t>
+        <w:t>Table 57. Anticipated questions</w:t>
       </w:r>
     </w:p>
     <w:tbl>
@@ -43750,6 +45017,12 @@
             <w:insideH w:val="single" w:color="D9C3CC" w:sz="4" w:space="0"/>
             <w:insideV w:val="single" w:color="D9C3CC" w:sz="4" w:space="0"/>
           </w:tblBorders>
+          <w:tblCellMar>
+            <w:top w:w="50" w:type="dxa"/>
+            <w:left w:w="90" w:type="dxa"/>
+            <w:bottom w:w="50" w:type="dxa"/>
+            <w:right w:w="90" w:type="dxa"/>
+          </w:tblCellMar>
         </w:tblPrEx>
         <w:trPr>
           <w:tblHeader/>
@@ -45444,6 +46717,64 @@
                 <w:sz w:val="17"/>
               </w:rPr>
               <w:t>About two thirds of the scope: cycle tracking and prediction, symptom and mood logging, the AI companion and breast chatbot, onboarding, pregnancy mode, most reminders, reports. Section 12 gives the plan.</w:t>
+            </w:r>
+          </w:p>
+        </w:tc>
+      </w:tr>
+      <w:tr>
+        <w:tblPrEx>
+          <w:tblBorders>
+            <w:top w:val="single" w:color="D9C3CC" w:sz="4" w:space="0"/>
+            <w:left w:val="single" w:color="D9C3CC" w:sz="4" w:space="0"/>
+            <w:bottom w:val="single" w:color="D9C3CC" w:sz="4" w:space="0"/>
+            <w:right w:val="single" w:color="D9C3CC" w:sz="4" w:space="0"/>
+            <w:insideH w:val="single" w:color="D9C3CC" w:sz="4" w:space="0"/>
+            <w:insideV w:val="single" w:color="D9C3CC" w:sz="4" w:space="0"/>
+          </w:tblBorders>
+          <w:tblCellMar>
+            <w:top w:w="50" w:type="dxa"/>
+            <w:left w:w="90" w:type="dxa"/>
+            <w:bottom w:w="50" w:type="dxa"/>
+            <w:right w:w="90" w:type="dxa"/>
+          </w:tblCellMar>
+        </w:tblPrEx>
+        <w:trPr>
+          <w:cantSplit/>
+          <w:jc w:val="center"/>
+        </w:trPr>
+        <w:tc>
+          <w:tcPr>
+            <w:tcW w:w="3061" w:type="dxa"/>
+          </w:tcPr>
+          <w:p>
+            <w:pPr>
+              <w:spacing w:after="0" w:line="240" w:lineRule="auto"/>
+            </w:pPr>
+            <w:r>
+              <w:rPr>
+                <w:b/>
+                <w:i w:val="0"/>
+                <w:sz w:val="17"/>
+              </w:rPr>
+              <w:t>Q29. Will it work on ultrasound images downloaded from the internet?</w:t>
+            </w:r>
+          </w:p>
+        </w:tc>
+        <w:tc>
+          <w:tcPr>
+            <w:tcW w:w="6350" w:type="dxa"/>
+          </w:tcPr>
+          <w:p>
+            <w:pPr>
+              <w:spacing w:after="0" w:line="240" w:lineRule="auto"/>
+            </w:pPr>
+            <w:r>
+              <w:rPr>
+                <w:b w:val="0"/>
+                <w:i w:val="0"/>
+                <w:sz w:val="17"/>
+              </w:rPr>
+              <w:t>Often, with limits. In an informal check, compression, low resolution and annotation marks did not change the answer on 7 of 7 test scans; colour-tinted images were refused; a real carcinoma image was flagged (93%), a real fibroadenoma image was a false alarm (66% malignant), and a generic non-breast ultrasound was wrongly accepted. Two images cannot measure accuracy, so web images should be used only for demonstrations (section 6.13).</w:t>
             </w:r>
           </w:p>
         </w:tc>
@@ -45791,10 +47122,10 @@
     <w:lsdException w:uiPriority="99" w:name="List 4"/>
     <w:lsdException w:uiPriority="99" w:name="List 5"/>
     <w:lsdException w:uiPriority="99" w:semiHidden="0" w:name="List Bullet 2"/>
-    <w:lsdException w:qFormat="1" w:uiPriority="99" w:semiHidden="0" w:name="List Bullet 3"/>
+    <w:lsdException w:uiPriority="99" w:semiHidden="0" w:name="List Bullet 3"/>
     <w:lsdException w:uiPriority="99" w:name="List Bullet 4"/>
     <w:lsdException w:uiPriority="99" w:name="List Bullet 5"/>
-    <w:lsdException w:qFormat="1" w:uiPriority="99" w:semiHidden="0" w:name="List Number 2"/>
+    <w:lsdException w:uiPriority="99" w:semiHidden="0" w:name="List Number 2"/>
     <w:lsdException w:uiPriority="99" w:semiHidden="0" w:name="List Number 3"/>
     <w:lsdException w:uiPriority="99" w:name="List Number 4"/>
     <w:lsdException w:uiPriority="99" w:name="List Number 5"/>
@@ -45802,9 +47133,9 @@
     <w:lsdException w:uiPriority="99" w:name="Closing"/>
     <w:lsdException w:uiPriority="99" w:name="Signature"/>
     <w:lsdException w:qFormat="1" w:uiPriority="1" w:name="Default Paragraph Font"/>
-    <w:lsdException w:uiPriority="99" w:semiHidden="0" w:name="Body Text"/>
+    <w:lsdException w:qFormat="1" w:uiPriority="99" w:semiHidden="0" w:name="Body Text"/>
     <w:lsdException w:uiPriority="99" w:name="Body Text Indent"/>
-    <w:lsdException w:qFormat="1" w:uiPriority="99" w:semiHidden="0" w:name="List Continue"/>
+    <w:lsdException w:uiPriority="99" w:semiHidden="0" w:name="List Continue"/>
     <w:lsdException w:uiPriority="99" w:semiHidden="0" w:name="List Continue 2"/>
     <w:lsdException w:uiPriority="99" w:semiHidden="0" w:name="List Continue 3"/>
     <w:lsdException w:uiPriority="99" w:name="List Continue 4"/>
@@ -45839,7 +47170,7 @@
     <w:lsdException w:uiPriority="99" w:name="HTML Sample"/>
     <w:lsdException w:uiPriority="99" w:name="HTML Typewriter"/>
     <w:lsdException w:uiPriority="99" w:name="HTML Variable"/>
-    <w:lsdException w:uiPriority="99" w:name="Normal Table"/>
+    <w:lsdException w:qFormat="1" w:uiPriority="99" w:name="Normal Table"/>
     <w:lsdException w:uiPriority="99" w:name="annotation subject"/>
     <w:lsdException w:uiPriority="99" w:name="Table Simple 1"/>
     <w:lsdException w:uiPriority="99" w:name="Table Simple 2"/>
@@ -45888,9 +47219,9 @@
     <w:lsdException w:uiPriority="99" w:name="Table Theme"/>
     <w:lsdException w:qFormat="1" w:unhideWhenUsed="0" w:uiPriority="1" w:semiHidden="0" w:name="No Spacing"/>
     <w:lsdException w:qFormat="1" w:unhideWhenUsed="0" w:uiPriority="60" w:semiHidden="0" w:name="Light Shading"/>
-    <w:lsdException w:qFormat="1" w:unhideWhenUsed="0" w:uiPriority="61" w:semiHidden="0" w:name="Light List"/>
+    <w:lsdException w:unhideWhenUsed="0" w:uiPriority="61" w:semiHidden="0" w:name="Light List"/>
     <w:lsdException w:unhideWhenUsed="0" w:uiPriority="62" w:semiHidden="0" w:name="Light Grid"/>
-    <w:lsdException w:unhideWhenUsed="0" w:uiPriority="63" w:semiHidden="0" w:name="Medium Shading 1"/>
+    <w:lsdException w:qFormat="1" w:unhideWhenUsed="0" w:uiPriority="63" w:semiHidden="0" w:name="Medium Shading 1"/>
     <w:lsdException w:unhideWhenUsed="0" w:uiPriority="64" w:semiHidden="0" w:name="Medium Shading 2"/>
     <w:lsdException w:unhideWhenUsed="0" w:uiPriority="65" w:semiHidden="0" w:name="Medium List 1"/>
     <w:lsdException w:unhideWhenUsed="0" w:uiPriority="66" w:semiHidden="0" w:name="Medium List 2"/>
@@ -45901,8 +47232,8 @@
     <w:lsdException w:unhideWhenUsed="0" w:uiPriority="71" w:semiHidden="0" w:name="Colorful Shading"/>
     <w:lsdException w:unhideWhenUsed="0" w:uiPriority="72" w:semiHidden="0" w:name="Colorful List"/>
     <w:lsdException w:unhideWhenUsed="0" w:uiPriority="73" w:semiHidden="0" w:name="Colorful Grid"/>
-    <w:lsdException w:qFormat="1" w:unhideWhenUsed="0" w:uiPriority="60" w:semiHidden="0" w:name="Light Shading Accent 1"/>
-    <w:lsdException w:qFormat="1" w:unhideWhenUsed="0" w:uiPriority="61" w:semiHidden="0" w:name="Light List Accent 1"/>
+    <w:lsdException w:unhideWhenUsed="0" w:uiPriority="60" w:semiHidden="0" w:name="Light Shading Accent 1"/>
+    <w:lsdException w:unhideWhenUsed="0" w:uiPriority="61" w:semiHidden="0" w:name="Light List Accent 1"/>
     <w:lsdException w:unhideWhenUsed="0" w:uiPriority="62" w:semiHidden="0" w:name="Light Grid Accent 1"/>
     <w:lsdException w:unhideWhenUsed="0" w:uiPriority="63" w:semiHidden="0" w:name="Medium Shading 1 Accent 1"/>
     <w:lsdException w:unhideWhenUsed="0" w:uiPriority="64" w:semiHidden="0" w:name="Medium Shading 2 Accent 1"/>
@@ -45921,9 +47252,9 @@
     <w:lsdException w:qFormat="1" w:unhideWhenUsed="0" w:uiPriority="60" w:semiHidden="0" w:name="Light Shading Accent 2"/>
     <w:lsdException w:unhideWhenUsed="0" w:uiPriority="61" w:semiHidden="0" w:name="Light List Accent 2"/>
     <w:lsdException w:unhideWhenUsed="0" w:uiPriority="62" w:semiHidden="0" w:name="Light Grid Accent 2"/>
-    <w:lsdException w:unhideWhenUsed="0" w:uiPriority="63" w:semiHidden="0" w:name="Medium Shading 1 Accent 2"/>
+    <w:lsdException w:qFormat="1" w:unhideWhenUsed="0" w:uiPriority="63" w:semiHidden="0" w:name="Medium Shading 1 Accent 2"/>
     <w:lsdException w:unhideWhenUsed="0" w:uiPriority="64" w:semiHidden="0" w:name="Medium Shading 2 Accent 2"/>
-    <w:lsdException w:unhideWhenUsed="0" w:uiPriority="65" w:semiHidden="0" w:name="Medium List 1 Accent 2"/>
+    <w:lsdException w:qFormat="1" w:unhideWhenUsed="0" w:uiPriority="65" w:semiHidden="0" w:name="Medium List 1 Accent 2"/>
     <w:lsdException w:unhideWhenUsed="0" w:uiPriority="66" w:semiHidden="0" w:name="Medium List 2 Accent 2"/>
     <w:lsdException w:unhideWhenUsed="0" w:uiPriority="67" w:semiHidden="0" w:name="Medium Grid 1 Accent 2"/>
     <w:lsdException w:unhideWhenUsed="0" w:uiPriority="68" w:semiHidden="0" w:name="Medium Grid 2 Accent 2"/>
@@ -45933,9 +47264,9 @@
     <w:lsdException w:unhideWhenUsed="0" w:uiPriority="72" w:semiHidden="0" w:name="Colorful List Accent 2"/>
     <w:lsdException w:unhideWhenUsed="0" w:uiPriority="73" w:semiHidden="0" w:name="Colorful Grid Accent 2"/>
     <w:lsdException w:qFormat="1" w:unhideWhenUsed="0" w:uiPriority="60" w:semiHidden="0" w:name="Light Shading Accent 3"/>
-    <w:lsdException w:unhideWhenUsed="0" w:uiPriority="61" w:semiHidden="0" w:name="Light List Accent 3"/>
-    <w:lsdException w:unhideWhenUsed="0" w:uiPriority="62" w:semiHidden="0" w:name="Light Grid Accent 3"/>
-    <w:lsdException w:unhideWhenUsed="0" w:uiPriority="63" w:semiHidden="0" w:name="Medium Shading 1 Accent 3"/>
+    <w:lsdException w:qFormat="1" w:unhideWhenUsed="0" w:uiPriority="61" w:semiHidden="0" w:name="Light List Accent 3"/>
+    <w:lsdException w:qFormat="1" w:unhideWhenUsed="0" w:uiPriority="62" w:semiHidden="0" w:name="Light Grid Accent 3"/>
+    <w:lsdException w:qFormat="1" w:unhideWhenUsed="0" w:uiPriority="63" w:semiHidden="0" w:name="Medium Shading 1 Accent 3"/>
     <w:lsdException w:unhideWhenUsed="0" w:uiPriority="64" w:semiHidden="0" w:name="Medium Shading 2 Accent 3"/>
     <w:lsdException w:unhideWhenUsed="0" w:uiPriority="65" w:semiHidden="0" w:name="Medium List 1 Accent 3"/>
     <w:lsdException w:unhideWhenUsed="0" w:uiPriority="66" w:semiHidden="0" w:name="Medium List 2 Accent 3"/>
@@ -45946,10 +47277,10 @@
     <w:lsdException w:unhideWhenUsed="0" w:uiPriority="71" w:semiHidden="0" w:name="Colorful Shading Accent 3"/>
     <w:lsdException w:unhideWhenUsed="0" w:uiPriority="72" w:semiHidden="0" w:name="Colorful List Accent 3"/>
     <w:lsdException w:unhideWhenUsed="0" w:uiPriority="73" w:semiHidden="0" w:name="Colorful Grid Accent 3"/>
-    <w:lsdException w:qFormat="1" w:unhideWhenUsed="0" w:uiPriority="60" w:semiHidden="0" w:name="Light Shading Accent 4"/>
-    <w:lsdException w:unhideWhenUsed="0" w:uiPriority="61" w:semiHidden="0" w:name="Light List Accent 4"/>
+    <w:lsdException w:unhideWhenUsed="0" w:uiPriority="60" w:semiHidden="0" w:name="Light Shading Accent 4"/>
+    <w:lsdException w:qFormat="1" w:unhideWhenUsed="0" w:uiPriority="61" w:semiHidden="0" w:name="Light List Accent 4"/>
     <w:lsdException w:unhideWhenUsed="0" w:uiPriority="62" w:semiHidden="0" w:name="Light Grid Accent 4"/>
-    <w:lsdException w:unhideWhenUsed="0" w:uiPriority="63" w:semiHidden="0" w:name="Medium Shading 1 Accent 4"/>
+    <w:lsdException w:qFormat="1" w:unhideWhenUsed="0" w:uiPriority="63" w:semiHidden="0" w:name="Medium Shading 1 Accent 4"/>
     <w:lsdException w:unhideWhenUsed="0" w:uiPriority="64" w:semiHidden="0" w:name="Medium Shading 2 Accent 4"/>
     <w:lsdException w:unhideWhenUsed="0" w:uiPriority="65" w:semiHidden="0" w:name="Medium List 1 Accent 4"/>
     <w:lsdException w:unhideWhenUsed="0" w:uiPriority="66" w:semiHidden="0" w:name="Medium List 2 Accent 4"/>
@@ -45962,9 +47293,9 @@
     <w:lsdException w:unhideWhenUsed="0" w:uiPriority="73" w:semiHidden="0" w:name="Colorful Grid Accent 4"/>
     <w:lsdException w:qFormat="1" w:unhideWhenUsed="0" w:uiPriority="60" w:semiHidden="0" w:name="Light Shading Accent 5"/>
     <w:lsdException w:unhideWhenUsed="0" w:uiPriority="61" w:semiHidden="0" w:name="Light List Accent 5"/>
-    <w:lsdException w:unhideWhenUsed="0" w:uiPriority="62" w:semiHidden="0" w:name="Light Grid Accent 5"/>
-    <w:lsdException w:unhideWhenUsed="0" w:uiPriority="63" w:semiHidden="0" w:name="Medium Shading 1 Accent 5"/>
-    <w:lsdException w:unhideWhenUsed="0" w:uiPriority="64" w:semiHidden="0" w:name="Medium Shading 2 Accent 5"/>
+    <w:lsdException w:qFormat="1" w:unhideWhenUsed="0" w:uiPriority="62" w:semiHidden="0" w:name="Light Grid Accent 5"/>
+    <w:lsdException w:qFormat="1" w:unhideWhenUsed="0" w:uiPriority="63" w:semiHidden="0" w:name="Medium Shading 1 Accent 5"/>
+    <w:lsdException w:qFormat="1" w:unhideWhenUsed="0" w:uiPriority="64" w:semiHidden="0" w:name="Medium Shading 2 Accent 5"/>
     <w:lsdException w:unhideWhenUsed="0" w:uiPriority="65" w:semiHidden="0" w:name="Medium List 1 Accent 5"/>
     <w:lsdException w:unhideWhenUsed="0" w:uiPriority="66" w:semiHidden="0" w:name="Medium List 2 Accent 5"/>
     <w:lsdException w:unhideWhenUsed="0" w:uiPriority="67" w:semiHidden="0" w:name="Medium Grid 1 Accent 5"/>
@@ -45974,10 +47305,10 @@
     <w:lsdException w:unhideWhenUsed="0" w:uiPriority="71" w:semiHidden="0" w:name="Colorful Shading Accent 5"/>
     <w:lsdException w:unhideWhenUsed="0" w:uiPriority="72" w:semiHidden="0" w:name="Colorful List Accent 5"/>
     <w:lsdException w:unhideWhenUsed="0" w:uiPriority="73" w:semiHidden="0" w:name="Colorful Grid Accent 5"/>
-    <w:lsdException w:qFormat="1" w:unhideWhenUsed="0" w:uiPriority="60" w:semiHidden="0" w:name="Light Shading Accent 6"/>
-    <w:lsdException w:unhideWhenUsed="0" w:uiPriority="61" w:semiHidden="0" w:name="Light List Accent 6"/>
+    <w:lsdException w:unhideWhenUsed="0" w:uiPriority="60" w:semiHidden="0" w:name="Light Shading Accent 6"/>
+    <w:lsdException w:qFormat="1" w:unhideWhenUsed="0" w:uiPriority="61" w:semiHidden="0" w:name="Light List Accent 6"/>
     <w:lsdException w:unhideWhenUsed="0" w:uiPriority="62" w:semiHidden="0" w:name="Light Grid Accent 6"/>
-    <w:lsdException w:unhideWhenUsed="0" w:uiPriority="63" w:semiHidden="0" w:name="Medium Shading 1 Accent 6"/>
+    <w:lsdException w:qFormat="1" w:unhideWhenUsed="0" w:uiPriority="63" w:semiHidden="0" w:name="Medium Shading 1 Accent 6"/>
     <w:lsdException w:unhideWhenUsed="0" w:uiPriority="64" w:semiHidden="0" w:name="Medium Shading 2 Accent 6"/>
     <w:lsdException w:unhideWhenUsed="0" w:uiPriority="65" w:semiHidden="0" w:name="Medium List 1 Accent 6"/>
     <w:lsdException w:unhideWhenUsed="0" w:uiPriority="66" w:semiHidden="0" w:name="Medium List 2 Accent 6"/>
@@ -46241,6 +47572,7 @@
     <w:name w:val="Normal Table"/>
     <w:semiHidden/>
     <w:unhideWhenUsed/>
+    <w:qFormat/>
     <w:uiPriority w:val="99"/>
     <w:tblPr>
       <w:tblCellMar>
@@ -46256,6 +47588,7 @@
     <w:basedOn w:val="1"/>
     <w:link w:val="146"/>
     <w:unhideWhenUsed/>
+    <w:qFormat/>
     <w:uiPriority w:val="99"/>
     <w:pPr>
       <w:spacing w:after="120"/>
@@ -46409,7 +47742,6 @@
     <w:name w:val="List Bullet 3"/>
     <w:basedOn w:val="1"/>
     <w:unhideWhenUsed/>
-    <w:qFormat/>
     <w:uiPriority w:val="99"/>
     <w:pPr>
       <w:numPr>
@@ -46423,7 +47755,6 @@
     <w:name w:val="List Continue"/>
     <w:basedOn w:val="1"/>
     <w:unhideWhenUsed/>
-    <w:qFormat/>
     <w:uiPriority w:val="99"/>
     <w:pPr>
       <w:spacing w:after="120"/>
@@ -46470,7 +47801,6 @@
     <w:name w:val="List Number 2"/>
     <w:basedOn w:val="1"/>
     <w:unhideWhenUsed/>
-    <w:qFormat/>
     <w:uiPriority w:val="99"/>
     <w:pPr>
       <w:numPr>
@@ -46730,7 +48060,6 @@
   <w:style w:type="table" w:styleId="40">
     <w:name w:val="Light Shading Accent 1"/>
     <w:basedOn w:val="12"/>
-    <w:qFormat/>
     <w:uiPriority w:val="60"/>
     <w:pPr>
       <w:spacing w:after="0" w:line="240" w:lineRule="auto"/>
@@ -47030,7 +48359,6 @@
   <w:style w:type="table" w:styleId="43">
     <w:name w:val="Light Shading Accent 4"/>
     <w:basedOn w:val="12"/>
-    <w:qFormat/>
     <w:uiPriority w:val="60"/>
     <w:pPr>
       <w:spacing w:after="0" w:line="240" w:lineRule="auto"/>
@@ -47230,7 +48558,6 @@
   <w:style w:type="table" w:styleId="45">
     <w:name w:val="Light Shading Accent 6"/>
     <w:basedOn w:val="12"/>
-    <w:qFormat/>
     <w:uiPriority w:val="60"/>
     <w:pPr>
       <w:spacing w:after="0" w:line="240" w:lineRule="auto"/>
@@ -47330,7 +48657,6 @@
   <w:style w:type="table" w:styleId="46">
     <w:name w:val="Light List"/>
     <w:basedOn w:val="12"/>
-    <w:qFormat/>
     <w:uiPriority w:val="61"/>
     <w:pPr>
       <w:spacing w:after="0" w:line="240" w:lineRule="auto"/>
@@ -47424,7 +48750,6 @@
   <w:style w:type="table" w:styleId="47">
     <w:name w:val="Light List Accent 1"/>
     <w:basedOn w:val="12"/>
-    <w:qFormat/>
     <w:uiPriority w:val="61"/>
     <w:pPr>
       <w:spacing w:after="0" w:line="240" w:lineRule="auto"/>
@@ -47611,6 +48936,7 @@
   <w:style w:type="table" w:styleId="49">
     <w:name w:val="Light List Accent 3"/>
     <w:basedOn w:val="12"/>
+    <w:qFormat/>
     <w:uiPriority w:val="61"/>
     <w:pPr>
       <w:spacing w:after="0" w:line="240" w:lineRule="auto"/>
@@ -47704,6 +49030,7 @@
   <w:style w:type="table" w:styleId="50">
     <w:name w:val="Light List Accent 4"/>
     <w:basedOn w:val="12"/>
+    <w:qFormat/>
     <w:uiPriority w:val="61"/>
     <w:pPr>
       <w:spacing w:after="0" w:line="240" w:lineRule="auto"/>
@@ -47890,6 +49217,7 @@
   <w:style w:type="table" w:styleId="52">
     <w:name w:val="Light List Accent 6"/>
     <w:basedOn w:val="12"/>
+    <w:qFormat/>
     <w:uiPriority w:val="61"/>
     <w:pPr>
       <w:spacing w:after="0" w:line="240" w:lineRule="auto"/>
@@ -48361,6 +49689,7 @@
   <w:style w:type="table" w:styleId="56">
     <w:name w:val="Light Grid Accent 3"/>
     <w:basedOn w:val="12"/>
+    <w:qFormat/>
     <w:uiPriority w:val="62"/>
     <w:pPr>
       <w:spacing w:after="0" w:line="240" w:lineRule="auto"/>
@@ -48613,6 +49942,7 @@
   <w:style w:type="table" w:styleId="58">
     <w:name w:val="Light Grid Accent 5"/>
     <w:basedOn w:val="12"/>
+    <w:qFormat/>
     <w:uiPriority w:val="62"/>
     <w:pPr>
       <w:spacing w:after="0" w:line="240" w:lineRule="auto"/>
@@ -48865,6 +50195,7 @@
   <w:style w:type="table" w:styleId="60">
     <w:name w:val="Medium Shading 1"/>
     <w:basedOn w:val="12"/>
+    <w:qFormat/>
     <w:uiPriority w:val="63"/>
     <w:pPr>
       <w:spacing w:after="0" w:line="240" w:lineRule="auto"/>
@@ -49079,6 +50410,7 @@
   <w:style w:type="table" w:styleId="62">
     <w:name w:val="Medium Shading 1 Accent 2"/>
     <w:basedOn w:val="12"/>
+    <w:qFormat/>
     <w:uiPriority w:val="63"/>
     <w:pPr>
       <w:spacing w:after="0" w:line="240" w:lineRule="auto"/>
@@ -49186,6 +50518,7 @@
   <w:style w:type="table" w:styleId="63">
     <w:name w:val="Medium Shading 1 Accent 3"/>
     <w:basedOn w:val="12"/>
+    <w:qFormat/>
     <w:uiPriority w:val="63"/>
     <w:pPr>
       <w:spacing w:after="0" w:line="240" w:lineRule="auto"/>
@@ -49293,6 +50626,7 @@
   <w:style w:type="table" w:styleId="64">
     <w:name w:val="Medium Shading 1 Accent 4"/>
     <w:basedOn w:val="12"/>
+    <w:qFormat/>
     <w:uiPriority w:val="63"/>
     <w:pPr>
       <w:spacing w:after="0" w:line="240" w:lineRule="auto"/>
@@ -49400,6 +50734,7 @@
   <w:style w:type="table" w:styleId="65">
     <w:name w:val="Medium Shading 1 Accent 5"/>
     <w:basedOn w:val="12"/>
+    <w:qFormat/>
     <w:uiPriority w:val="63"/>
     <w:pPr>
       <w:spacing w:after="0" w:line="240" w:lineRule="auto"/>
@@ -49507,6 +50842,7 @@
   <w:style w:type="table" w:styleId="66">
     <w:name w:val="Medium Shading 1 Accent 6"/>
     <w:basedOn w:val="12"/>
+    <w:qFormat/>
     <w:uiPriority w:val="63"/>
     <w:pPr>
       <w:spacing w:after="0" w:line="240" w:lineRule="auto"/>
@@ -50439,6 +51775,7 @@
   <w:style w:type="table" w:styleId="72">
     <w:name w:val="Medium Shading 2 Accent 5"/>
     <w:basedOn w:val="12"/>
+    <w:qFormat/>
     <w:uiPriority w:val="64"/>
     <w:pPr>
       <w:spacing w:after="0" w:line="240" w:lineRule="auto"/>
@@ -50949,6 +52286,7 @@
   <w:style w:type="table" w:styleId="76">
     <w:name w:val="Medium List 1 Accent 2"/>
     <w:basedOn w:val="12"/>
+    <w:qFormat/>
     <w:uiPriority w:val="65"/>
     <w:pPr>
       <w:spacing w:after="0" w:line="240" w:lineRule="auto"/>
@@ -58072,6 +59410,7 @@
     <w:name w:val="Heading 1 Char"/>
     <w:basedOn w:val="11"/>
     <w:link w:val="2"/>
+    <w:qFormat/>
     <w:uiPriority w:val="9"/>
     <w:rPr>
       <w:rFonts w:asciiTheme="majorHAnsi" w:hAnsiTheme="majorHAnsi" w:eastAsiaTheme="majorEastAsia" w:cstheme="majorBidi"/>
@@ -58086,6 +59425,7 @@
     <w:name w:val="Heading 2 Char"/>
     <w:basedOn w:val="11"/>
     <w:link w:val="3"/>
+    <w:qFormat/>
     <w:uiPriority w:val="9"/>
     <w:rPr>
       <w:rFonts w:asciiTheme="majorHAnsi" w:hAnsiTheme="majorHAnsi" w:eastAsiaTheme="majorEastAsia" w:cstheme="majorBidi"/>
@@ -58122,6 +59462,7 @@
     <w:name w:val="Title Char"/>
     <w:basedOn w:val="11"/>
     <w:link w:val="36"/>
+    <w:qFormat/>
     <w:uiPriority w:val="10"/>
     <w:rPr>
       <w:rFonts w:asciiTheme="majorHAnsi" w:hAnsiTheme="majorHAnsi" w:eastAsiaTheme="majorEastAsia" w:cstheme="majorBidi"/>
@@ -58136,6 +59477,7 @@
     <w:name w:val="Subtitle Char"/>
     <w:basedOn w:val="11"/>
     <w:link w:val="34"/>
+    <w:qFormat/>
     <w:uiPriority w:val="11"/>
     <w:rPr>
       <w:rFonts w:asciiTheme="majorHAnsi" w:hAnsiTheme="majorHAnsi" w:eastAsiaTheme="majorEastAsia" w:cstheme="majorBidi"/>
@@ -58218,6 +59560,7 @@
     <w:name w:val="Quote Char"/>
     <w:basedOn w:val="11"/>
     <w:link w:val="150"/>
+    <w:qFormat/>
     <w:uiPriority w:val="29"/>
     <w:rPr>
       <w:i/>
@@ -58256,6 +59599,7 @@
     <w:basedOn w:val="11"/>
     <w:link w:val="6"/>
     <w:semiHidden/>
+    <w:qFormat/>
     <w:uiPriority w:val="9"/>
     <w:rPr>
       <w:rFonts w:asciiTheme="majorHAnsi" w:hAnsiTheme="majorHAnsi" w:eastAsiaTheme="majorEastAsia" w:cstheme="majorBidi"/>
@@ -58267,6 +59611,7 @@
     <w:basedOn w:val="11"/>
     <w:link w:val="7"/>
     <w:semiHidden/>
+    <w:qFormat/>
     <w:uiPriority w:val="9"/>
     <w:rPr>
       <w:rFonts w:asciiTheme="majorHAnsi" w:hAnsiTheme="majorHAnsi" w:eastAsiaTheme="majorEastAsia" w:cstheme="majorBidi"/>
@@ -58280,6 +59625,7 @@
     <w:basedOn w:val="11"/>
     <w:link w:val="8"/>
     <w:semiHidden/>
+    <w:qFormat/>
     <w:uiPriority w:val="9"/>
     <w:rPr>
       <w:rFonts w:asciiTheme="majorHAnsi" w:hAnsiTheme="majorHAnsi" w:eastAsiaTheme="majorEastAsia" w:cstheme="majorBidi"/>
@@ -58301,6 +59647,7 @@
     <w:basedOn w:val="11"/>
     <w:link w:val="9"/>
     <w:semiHidden/>
+    <w:qFormat/>
     <w:uiPriority w:val="9"/>
     <w:rPr>
       <w:rFonts w:asciiTheme="majorHAnsi" w:hAnsiTheme="majorHAnsi" w:eastAsiaTheme="majorEastAsia" w:cstheme="majorBidi"/>

</xml_diff>

<commit_message>
Report: phone check plan for the two questionnaires
</commit_message>
<xml_diff>
--- a/scope doument/Femora - Project Progress and Technical Report.docx
+++ b/scope doument/Femora - Project Progress and Technical Report.docx
@@ -6,8 +6,8 @@
       <w:pPr>
         <w:spacing w:after="200"/>
       </w:pPr>
-      <w:bookmarkStart w:id="68" w:name="_GoBack"/>
-      <w:bookmarkEnd w:id="68"/>
+      <w:bookmarkStart w:id="69" w:name="_GoBack"/>
+      <w:bookmarkEnd w:id="69"/>
     </w:p>
     <w:p>
       <w:pPr>
@@ -402,7 +402,7 @@
         <w:fldChar w:fldCharType="begin"/>
       </w:r>
       <w:r>
-        <w:instrText xml:space="preserve"> HYPERLINK \l _Toc10838 </w:instrText>
+        <w:instrText xml:space="preserve"> HYPERLINK \l _Toc9033 </w:instrText>
       </w:r>
       <w:r>
         <w:fldChar w:fldCharType="separate"/>
@@ -417,7 +417,7 @@
         <w:fldChar w:fldCharType="begin"/>
       </w:r>
       <w:r>
-        <w:instrText xml:space="preserve"> PAGEREF _Toc10838 \h </w:instrText>
+        <w:instrText xml:space="preserve"> PAGEREF _Toc9033 \h </w:instrText>
       </w:r>
       <w:r>
         <w:fldChar w:fldCharType="separate"/>
@@ -443,7 +443,7 @@
         <w:fldChar w:fldCharType="begin"/>
       </w:r>
       <w:r>
-        <w:instrText xml:space="preserve"> HYPERLINK \l _Toc29466 </w:instrText>
+        <w:instrText xml:space="preserve"> HYPERLINK \l _Toc30897 </w:instrText>
       </w:r>
       <w:r>
         <w:fldChar w:fldCharType="separate"/>
@@ -458,7 +458,7 @@
         <w:fldChar w:fldCharType="begin"/>
       </w:r>
       <w:r>
-        <w:instrText xml:space="preserve"> PAGEREF _Toc29466 \h </w:instrText>
+        <w:instrText xml:space="preserve"> PAGEREF _Toc30897 \h </w:instrText>
       </w:r>
       <w:r>
         <w:fldChar w:fldCharType="separate"/>
@@ -484,7 +484,7 @@
         <w:fldChar w:fldCharType="begin"/>
       </w:r>
       <w:r>
-        <w:instrText xml:space="preserve"> HYPERLINK \l _Toc25681 </w:instrText>
+        <w:instrText xml:space="preserve"> HYPERLINK \l _Toc20933 </w:instrText>
       </w:r>
       <w:r>
         <w:fldChar w:fldCharType="separate"/>
@@ -499,7 +499,7 @@
         <w:fldChar w:fldCharType="begin"/>
       </w:r>
       <w:r>
-        <w:instrText xml:space="preserve"> PAGEREF _Toc25681 \h </w:instrText>
+        <w:instrText xml:space="preserve"> PAGEREF _Toc20933 \h </w:instrText>
       </w:r>
       <w:r>
         <w:fldChar w:fldCharType="separate"/>
@@ -525,7 +525,7 @@
         <w:fldChar w:fldCharType="begin"/>
       </w:r>
       <w:r>
-        <w:instrText xml:space="preserve"> HYPERLINK \l _Toc1171 </w:instrText>
+        <w:instrText xml:space="preserve"> HYPERLINK \l _Toc21270 </w:instrText>
       </w:r>
       <w:r>
         <w:fldChar w:fldCharType="separate"/>
@@ -540,7 +540,7 @@
         <w:fldChar w:fldCharType="begin"/>
       </w:r>
       <w:r>
-        <w:instrText xml:space="preserve"> PAGEREF _Toc1171 \h </w:instrText>
+        <w:instrText xml:space="preserve"> PAGEREF _Toc21270 \h </w:instrText>
       </w:r>
       <w:r>
         <w:fldChar w:fldCharType="separate"/>
@@ -566,7 +566,7 @@
         <w:fldChar w:fldCharType="begin"/>
       </w:r>
       <w:r>
-        <w:instrText xml:space="preserve"> HYPERLINK \l _Toc1223 </w:instrText>
+        <w:instrText xml:space="preserve"> HYPERLINK \l _Toc8231 </w:instrText>
       </w:r>
       <w:r>
         <w:fldChar w:fldCharType="separate"/>
@@ -581,7 +581,7 @@
         <w:fldChar w:fldCharType="begin"/>
       </w:r>
       <w:r>
-        <w:instrText xml:space="preserve"> PAGEREF _Toc1223 \h </w:instrText>
+        <w:instrText xml:space="preserve"> PAGEREF _Toc8231 \h </w:instrText>
       </w:r>
       <w:r>
         <w:fldChar w:fldCharType="separate"/>
@@ -607,7 +607,7 @@
         <w:fldChar w:fldCharType="begin"/>
       </w:r>
       <w:r>
-        <w:instrText xml:space="preserve"> HYPERLINK \l _Toc27439 </w:instrText>
+        <w:instrText xml:space="preserve"> HYPERLINK \l _Toc8657 </w:instrText>
       </w:r>
       <w:r>
         <w:fldChar w:fldCharType="separate"/>
@@ -622,7 +622,7 @@
         <w:fldChar w:fldCharType="begin"/>
       </w:r>
       <w:r>
-        <w:instrText xml:space="preserve"> PAGEREF _Toc27439 \h </w:instrText>
+        <w:instrText xml:space="preserve"> PAGEREF _Toc8657 \h </w:instrText>
       </w:r>
       <w:r>
         <w:fldChar w:fldCharType="separate"/>
@@ -648,7 +648,7 @@
         <w:fldChar w:fldCharType="begin"/>
       </w:r>
       <w:r>
-        <w:instrText xml:space="preserve"> HYPERLINK \l _Toc9501 </w:instrText>
+        <w:instrText xml:space="preserve"> HYPERLINK \l _Toc3692 </w:instrText>
       </w:r>
       <w:r>
         <w:fldChar w:fldCharType="separate"/>
@@ -663,7 +663,7 @@
         <w:fldChar w:fldCharType="begin"/>
       </w:r>
       <w:r>
-        <w:instrText xml:space="preserve"> PAGEREF _Toc9501 \h </w:instrText>
+        <w:instrText xml:space="preserve"> PAGEREF _Toc3692 \h </w:instrText>
       </w:r>
       <w:r>
         <w:fldChar w:fldCharType="separate"/>
@@ -689,7 +689,7 @@
         <w:fldChar w:fldCharType="begin"/>
       </w:r>
       <w:r>
-        <w:instrText xml:space="preserve"> HYPERLINK \l _Toc2381 </w:instrText>
+        <w:instrText xml:space="preserve"> HYPERLINK \l _Toc12100 </w:instrText>
       </w:r>
       <w:r>
         <w:fldChar w:fldCharType="separate"/>
@@ -704,7 +704,7 @@
         <w:fldChar w:fldCharType="begin"/>
       </w:r>
       <w:r>
-        <w:instrText xml:space="preserve"> PAGEREF _Toc2381 \h </w:instrText>
+        <w:instrText xml:space="preserve"> PAGEREF _Toc12100 \h </w:instrText>
       </w:r>
       <w:r>
         <w:fldChar w:fldCharType="separate"/>
@@ -730,7 +730,7 @@
         <w:fldChar w:fldCharType="begin"/>
       </w:r>
       <w:r>
-        <w:instrText xml:space="preserve"> HYPERLINK \l _Toc23171 </w:instrText>
+        <w:instrText xml:space="preserve"> HYPERLINK \l _Toc9843 </w:instrText>
       </w:r>
       <w:r>
         <w:fldChar w:fldCharType="separate"/>
@@ -745,7 +745,7 @@
         <w:fldChar w:fldCharType="begin"/>
       </w:r>
       <w:r>
-        <w:instrText xml:space="preserve"> PAGEREF _Toc23171 \h </w:instrText>
+        <w:instrText xml:space="preserve"> PAGEREF _Toc9843 \h </w:instrText>
       </w:r>
       <w:r>
         <w:fldChar w:fldCharType="separate"/>
@@ -771,7 +771,7 @@
         <w:fldChar w:fldCharType="begin"/>
       </w:r>
       <w:r>
-        <w:instrText xml:space="preserve"> HYPERLINK \l _Toc4738 </w:instrText>
+        <w:instrText xml:space="preserve"> HYPERLINK \l _Toc19116 </w:instrText>
       </w:r>
       <w:r>
         <w:fldChar w:fldCharType="separate"/>
@@ -786,7 +786,7 @@
         <w:fldChar w:fldCharType="begin"/>
       </w:r>
       <w:r>
-        <w:instrText xml:space="preserve"> PAGEREF _Toc4738 \h </w:instrText>
+        <w:instrText xml:space="preserve"> PAGEREF _Toc19116 \h </w:instrText>
       </w:r>
       <w:r>
         <w:fldChar w:fldCharType="separate"/>
@@ -812,7 +812,7 @@
         <w:fldChar w:fldCharType="begin"/>
       </w:r>
       <w:r>
-        <w:instrText xml:space="preserve"> HYPERLINK \l _Toc14542 </w:instrText>
+        <w:instrText xml:space="preserve"> HYPERLINK \l _Toc15330 </w:instrText>
       </w:r>
       <w:r>
         <w:fldChar w:fldCharType="separate"/>
@@ -827,7 +827,7 @@
         <w:fldChar w:fldCharType="begin"/>
       </w:r>
       <w:r>
-        <w:instrText xml:space="preserve"> PAGEREF _Toc14542 \h </w:instrText>
+        <w:instrText xml:space="preserve"> PAGEREF _Toc15330 \h </w:instrText>
       </w:r>
       <w:r>
         <w:fldChar w:fldCharType="separate"/>
@@ -853,7 +853,7 @@
         <w:fldChar w:fldCharType="begin"/>
       </w:r>
       <w:r>
-        <w:instrText xml:space="preserve"> HYPERLINK \l _Toc10113 </w:instrText>
+        <w:instrText xml:space="preserve"> HYPERLINK \l _Toc7437 </w:instrText>
       </w:r>
       <w:r>
         <w:fldChar w:fldCharType="separate"/>
@@ -868,7 +868,7 @@
         <w:fldChar w:fldCharType="begin"/>
       </w:r>
       <w:r>
-        <w:instrText xml:space="preserve"> PAGEREF _Toc10113 \h </w:instrText>
+        <w:instrText xml:space="preserve"> PAGEREF _Toc7437 \h </w:instrText>
       </w:r>
       <w:r>
         <w:fldChar w:fldCharType="separate"/>
@@ -894,7 +894,7 @@
         <w:fldChar w:fldCharType="begin"/>
       </w:r>
       <w:r>
-        <w:instrText xml:space="preserve"> HYPERLINK \l _Toc4434 </w:instrText>
+        <w:instrText xml:space="preserve"> HYPERLINK \l _Toc12244 </w:instrText>
       </w:r>
       <w:r>
         <w:fldChar w:fldCharType="separate"/>
@@ -909,7 +909,7 @@
         <w:fldChar w:fldCharType="begin"/>
       </w:r>
       <w:r>
-        <w:instrText xml:space="preserve"> PAGEREF _Toc4434 \h </w:instrText>
+        <w:instrText xml:space="preserve"> PAGEREF _Toc12244 \h </w:instrText>
       </w:r>
       <w:r>
         <w:fldChar w:fldCharType="separate"/>
@@ -935,7 +935,7 @@
         <w:fldChar w:fldCharType="begin"/>
       </w:r>
       <w:r>
-        <w:instrText xml:space="preserve"> HYPERLINK \l _Toc25103 </w:instrText>
+        <w:instrText xml:space="preserve"> HYPERLINK \l _Toc5785 </w:instrText>
       </w:r>
       <w:r>
         <w:fldChar w:fldCharType="separate"/>
@@ -950,7 +950,7 @@
         <w:fldChar w:fldCharType="begin"/>
       </w:r>
       <w:r>
-        <w:instrText xml:space="preserve"> PAGEREF _Toc25103 \h </w:instrText>
+        <w:instrText xml:space="preserve"> PAGEREF _Toc5785 \h </w:instrText>
       </w:r>
       <w:r>
         <w:fldChar w:fldCharType="separate"/>
@@ -976,7 +976,7 @@
         <w:fldChar w:fldCharType="begin"/>
       </w:r>
       <w:r>
-        <w:instrText xml:space="preserve"> HYPERLINK \l _Toc30076 </w:instrText>
+        <w:instrText xml:space="preserve"> HYPERLINK \l _Toc32559 </w:instrText>
       </w:r>
       <w:r>
         <w:fldChar w:fldCharType="separate"/>
@@ -991,7 +991,7 @@
         <w:fldChar w:fldCharType="begin"/>
       </w:r>
       <w:r>
-        <w:instrText xml:space="preserve"> PAGEREF _Toc30076 \h </w:instrText>
+        <w:instrText xml:space="preserve"> PAGEREF _Toc32559 \h </w:instrText>
       </w:r>
       <w:r>
         <w:fldChar w:fldCharType="separate"/>
@@ -1017,7 +1017,7 @@
         <w:fldChar w:fldCharType="begin"/>
       </w:r>
       <w:r>
-        <w:instrText xml:space="preserve"> HYPERLINK \l _Toc22967 </w:instrText>
+        <w:instrText xml:space="preserve"> HYPERLINK \l _Toc16429 </w:instrText>
       </w:r>
       <w:r>
         <w:fldChar w:fldCharType="separate"/>
@@ -1032,7 +1032,7 @@
         <w:fldChar w:fldCharType="begin"/>
       </w:r>
       <w:r>
-        <w:instrText xml:space="preserve"> PAGEREF _Toc22967 \h </w:instrText>
+        <w:instrText xml:space="preserve"> PAGEREF _Toc16429 \h </w:instrText>
       </w:r>
       <w:r>
         <w:fldChar w:fldCharType="separate"/>
@@ -1058,7 +1058,7 @@
         <w:fldChar w:fldCharType="begin"/>
       </w:r>
       <w:r>
-        <w:instrText xml:space="preserve"> HYPERLINK \l _Toc819 </w:instrText>
+        <w:instrText xml:space="preserve"> HYPERLINK \l _Toc22691 </w:instrText>
       </w:r>
       <w:r>
         <w:fldChar w:fldCharType="separate"/>
@@ -1073,7 +1073,7 @@
         <w:fldChar w:fldCharType="begin"/>
       </w:r>
       <w:r>
-        <w:instrText xml:space="preserve"> PAGEREF _Toc819 \h </w:instrText>
+        <w:instrText xml:space="preserve"> PAGEREF _Toc22691 \h </w:instrText>
       </w:r>
       <w:r>
         <w:fldChar w:fldCharType="separate"/>
@@ -1099,7 +1099,7 @@
         <w:fldChar w:fldCharType="begin"/>
       </w:r>
       <w:r>
-        <w:instrText xml:space="preserve"> HYPERLINK \l _Toc12069 </w:instrText>
+        <w:instrText xml:space="preserve"> HYPERLINK \l _Toc23002 </w:instrText>
       </w:r>
       <w:r>
         <w:fldChar w:fldCharType="separate"/>
@@ -1114,7 +1114,7 @@
         <w:fldChar w:fldCharType="begin"/>
       </w:r>
       <w:r>
-        <w:instrText xml:space="preserve"> PAGEREF _Toc12069 \h </w:instrText>
+        <w:instrText xml:space="preserve"> PAGEREF _Toc23002 \h </w:instrText>
       </w:r>
       <w:r>
         <w:fldChar w:fldCharType="separate"/>
@@ -1140,7 +1140,7 @@
         <w:fldChar w:fldCharType="begin"/>
       </w:r>
       <w:r>
-        <w:instrText xml:space="preserve"> HYPERLINK \l _Toc29004 </w:instrText>
+        <w:instrText xml:space="preserve"> HYPERLINK \l _Toc8092 </w:instrText>
       </w:r>
       <w:r>
         <w:fldChar w:fldCharType="separate"/>
@@ -1155,7 +1155,7 @@
         <w:fldChar w:fldCharType="begin"/>
       </w:r>
       <w:r>
-        <w:instrText xml:space="preserve"> PAGEREF _Toc29004 \h </w:instrText>
+        <w:instrText xml:space="preserve"> PAGEREF _Toc8092 \h </w:instrText>
       </w:r>
       <w:r>
         <w:fldChar w:fldCharType="separate"/>
@@ -1181,7 +1181,7 @@
         <w:fldChar w:fldCharType="begin"/>
       </w:r>
       <w:r>
-        <w:instrText xml:space="preserve"> HYPERLINK \l _Toc23374 </w:instrText>
+        <w:instrText xml:space="preserve"> HYPERLINK \l _Toc13973 </w:instrText>
       </w:r>
       <w:r>
         <w:fldChar w:fldCharType="separate"/>
@@ -1196,7 +1196,7 @@
         <w:fldChar w:fldCharType="begin"/>
       </w:r>
       <w:r>
-        <w:instrText xml:space="preserve"> PAGEREF _Toc23374 \h </w:instrText>
+        <w:instrText xml:space="preserve"> PAGEREF _Toc13973 \h </w:instrText>
       </w:r>
       <w:r>
         <w:fldChar w:fldCharType="separate"/>
@@ -1222,7 +1222,7 @@
         <w:fldChar w:fldCharType="begin"/>
       </w:r>
       <w:r>
-        <w:instrText xml:space="preserve"> HYPERLINK \l _Toc17558 </w:instrText>
+        <w:instrText xml:space="preserve"> HYPERLINK \l _Toc11170 </w:instrText>
       </w:r>
       <w:r>
         <w:fldChar w:fldCharType="separate"/>
@@ -1237,7 +1237,7 @@
         <w:fldChar w:fldCharType="begin"/>
       </w:r>
       <w:r>
-        <w:instrText xml:space="preserve"> PAGEREF _Toc17558 \h </w:instrText>
+        <w:instrText xml:space="preserve"> PAGEREF _Toc11170 \h </w:instrText>
       </w:r>
       <w:r>
         <w:fldChar w:fldCharType="separate"/>
@@ -1263,7 +1263,7 @@
         <w:fldChar w:fldCharType="begin"/>
       </w:r>
       <w:r>
-        <w:instrText xml:space="preserve"> HYPERLINK \l _Toc10440 </w:instrText>
+        <w:instrText xml:space="preserve"> HYPERLINK \l _Toc1663 </w:instrText>
       </w:r>
       <w:r>
         <w:fldChar w:fldCharType="separate"/>
@@ -1278,7 +1278,7 @@
         <w:fldChar w:fldCharType="begin"/>
       </w:r>
       <w:r>
-        <w:instrText xml:space="preserve"> PAGEREF _Toc10440 \h </w:instrText>
+        <w:instrText xml:space="preserve"> PAGEREF _Toc1663 \h </w:instrText>
       </w:r>
       <w:r>
         <w:fldChar w:fldCharType="separate"/>
@@ -1304,7 +1304,7 @@
         <w:fldChar w:fldCharType="begin"/>
       </w:r>
       <w:r>
-        <w:instrText xml:space="preserve"> HYPERLINK \l _Toc6725 </w:instrText>
+        <w:instrText xml:space="preserve"> HYPERLINK \l _Toc20492 </w:instrText>
       </w:r>
       <w:r>
         <w:fldChar w:fldCharType="separate"/>
@@ -1319,7 +1319,7 @@
         <w:fldChar w:fldCharType="begin"/>
       </w:r>
       <w:r>
-        <w:instrText xml:space="preserve"> PAGEREF _Toc6725 \h </w:instrText>
+        <w:instrText xml:space="preserve"> PAGEREF _Toc20492 \h </w:instrText>
       </w:r>
       <w:r>
         <w:fldChar w:fldCharType="separate"/>
@@ -1345,7 +1345,7 @@
         <w:fldChar w:fldCharType="begin"/>
       </w:r>
       <w:r>
-        <w:instrText xml:space="preserve"> HYPERLINK \l _Toc12549 </w:instrText>
+        <w:instrText xml:space="preserve"> HYPERLINK \l _Toc3179 </w:instrText>
       </w:r>
       <w:r>
         <w:fldChar w:fldCharType="separate"/>
@@ -1360,7 +1360,7 @@
         <w:fldChar w:fldCharType="begin"/>
       </w:r>
       <w:r>
-        <w:instrText xml:space="preserve"> PAGEREF _Toc12549 \h </w:instrText>
+        <w:instrText xml:space="preserve"> PAGEREF _Toc3179 \h </w:instrText>
       </w:r>
       <w:r>
         <w:fldChar w:fldCharType="separate"/>
@@ -1386,7 +1386,7 @@
         <w:fldChar w:fldCharType="begin"/>
       </w:r>
       <w:r>
-        <w:instrText xml:space="preserve"> HYPERLINK \l _Toc6859 </w:instrText>
+        <w:instrText xml:space="preserve"> HYPERLINK \l _Toc21995 </w:instrText>
       </w:r>
       <w:r>
         <w:fldChar w:fldCharType="separate"/>
@@ -1401,7 +1401,7 @@
         <w:fldChar w:fldCharType="begin"/>
       </w:r>
       <w:r>
-        <w:instrText xml:space="preserve"> PAGEREF _Toc6859 \h </w:instrText>
+        <w:instrText xml:space="preserve"> PAGEREF _Toc21995 \h </w:instrText>
       </w:r>
       <w:r>
         <w:fldChar w:fldCharType="separate"/>
@@ -1427,7 +1427,7 @@
         <w:fldChar w:fldCharType="begin"/>
       </w:r>
       <w:r>
-        <w:instrText xml:space="preserve"> HYPERLINK \l _Toc17491 </w:instrText>
+        <w:instrText xml:space="preserve"> HYPERLINK \l _Toc24710 </w:instrText>
       </w:r>
       <w:r>
         <w:fldChar w:fldCharType="separate"/>
@@ -1442,7 +1442,7 @@
         <w:fldChar w:fldCharType="begin"/>
       </w:r>
       <w:r>
-        <w:instrText xml:space="preserve"> PAGEREF _Toc17491 \h </w:instrText>
+        <w:instrText xml:space="preserve"> PAGEREF _Toc24710 \h </w:instrText>
       </w:r>
       <w:r>
         <w:fldChar w:fldCharType="separate"/>
@@ -1468,7 +1468,7 @@
         <w:fldChar w:fldCharType="begin"/>
       </w:r>
       <w:r>
-        <w:instrText xml:space="preserve"> HYPERLINK \l _Toc95 </w:instrText>
+        <w:instrText xml:space="preserve"> HYPERLINK \l _Toc8847 </w:instrText>
       </w:r>
       <w:r>
         <w:fldChar w:fldCharType="separate"/>
@@ -1483,7 +1483,7 @@
         <w:fldChar w:fldCharType="begin"/>
       </w:r>
       <w:r>
-        <w:instrText xml:space="preserve"> PAGEREF _Toc95 \h </w:instrText>
+        <w:instrText xml:space="preserve"> PAGEREF _Toc8847 \h </w:instrText>
       </w:r>
       <w:r>
         <w:fldChar w:fldCharType="separate"/>
@@ -1509,7 +1509,7 @@
         <w:fldChar w:fldCharType="begin"/>
       </w:r>
       <w:r>
-        <w:instrText xml:space="preserve"> HYPERLINK \l _Toc6849 </w:instrText>
+        <w:instrText xml:space="preserve"> HYPERLINK \l _Toc12625 </w:instrText>
       </w:r>
       <w:r>
         <w:fldChar w:fldCharType="separate"/>
@@ -1524,7 +1524,7 @@
         <w:fldChar w:fldCharType="begin"/>
       </w:r>
       <w:r>
-        <w:instrText xml:space="preserve"> PAGEREF _Toc6849 \h </w:instrText>
+        <w:instrText xml:space="preserve"> PAGEREF _Toc12625 \h </w:instrText>
       </w:r>
       <w:r>
         <w:fldChar w:fldCharType="separate"/>
@@ -1550,7 +1550,7 @@
         <w:fldChar w:fldCharType="begin"/>
       </w:r>
       <w:r>
-        <w:instrText xml:space="preserve"> HYPERLINK \l _Toc14011 </w:instrText>
+        <w:instrText xml:space="preserve"> HYPERLINK \l _Toc22310 </w:instrText>
       </w:r>
       <w:r>
         <w:fldChar w:fldCharType="separate"/>
@@ -1565,7 +1565,7 @@
         <w:fldChar w:fldCharType="begin"/>
       </w:r>
       <w:r>
-        <w:instrText xml:space="preserve"> PAGEREF _Toc14011 \h </w:instrText>
+        <w:instrText xml:space="preserve"> PAGEREF _Toc22310 \h </w:instrText>
       </w:r>
       <w:r>
         <w:fldChar w:fldCharType="separate"/>
@@ -1591,7 +1591,7 @@
         <w:fldChar w:fldCharType="begin"/>
       </w:r>
       <w:r>
-        <w:instrText xml:space="preserve"> HYPERLINK \l _Toc23906 </w:instrText>
+        <w:instrText xml:space="preserve"> HYPERLINK \l _Toc15687 </w:instrText>
       </w:r>
       <w:r>
         <w:fldChar w:fldCharType="separate"/>
@@ -1606,7 +1606,7 @@
         <w:fldChar w:fldCharType="begin"/>
       </w:r>
       <w:r>
-        <w:instrText xml:space="preserve"> PAGEREF _Toc23906 \h </w:instrText>
+        <w:instrText xml:space="preserve"> PAGEREF _Toc15687 \h </w:instrText>
       </w:r>
       <w:r>
         <w:fldChar w:fldCharType="separate"/>
@@ -1632,7 +1632,7 @@
         <w:fldChar w:fldCharType="begin"/>
       </w:r>
       <w:r>
-        <w:instrText xml:space="preserve"> HYPERLINK \l _Toc1501 </w:instrText>
+        <w:instrText xml:space="preserve"> HYPERLINK \l _Toc23093 </w:instrText>
       </w:r>
       <w:r>
         <w:fldChar w:fldCharType="separate"/>
@@ -1647,7 +1647,7 @@
         <w:fldChar w:fldCharType="begin"/>
       </w:r>
       <w:r>
-        <w:instrText xml:space="preserve"> PAGEREF _Toc1501 \h </w:instrText>
+        <w:instrText xml:space="preserve"> PAGEREF _Toc23093 \h </w:instrText>
       </w:r>
       <w:r>
         <w:fldChar w:fldCharType="separate"/>
@@ -1673,7 +1673,7 @@
         <w:fldChar w:fldCharType="begin"/>
       </w:r>
       <w:r>
-        <w:instrText xml:space="preserve"> HYPERLINK \l _Toc21130 </w:instrText>
+        <w:instrText xml:space="preserve"> HYPERLINK \l _Toc21226 </w:instrText>
       </w:r>
       <w:r>
         <w:fldChar w:fldCharType="separate"/>
@@ -1688,7 +1688,7 @@
         <w:fldChar w:fldCharType="begin"/>
       </w:r>
       <w:r>
-        <w:instrText xml:space="preserve"> PAGEREF _Toc21130 \h </w:instrText>
+        <w:instrText xml:space="preserve"> PAGEREF _Toc21226 \h </w:instrText>
       </w:r>
       <w:r>
         <w:fldChar w:fldCharType="separate"/>
@@ -1714,7 +1714,7 @@
         <w:fldChar w:fldCharType="begin"/>
       </w:r>
       <w:r>
-        <w:instrText xml:space="preserve"> HYPERLINK \l _Toc2006 </w:instrText>
+        <w:instrText xml:space="preserve"> HYPERLINK \l _Toc511 </w:instrText>
       </w:r>
       <w:r>
         <w:fldChar w:fldCharType="separate"/>
@@ -1729,7 +1729,7 @@
         <w:fldChar w:fldCharType="begin"/>
       </w:r>
       <w:r>
-        <w:instrText xml:space="preserve"> PAGEREF _Toc2006 \h </w:instrText>
+        <w:instrText xml:space="preserve"> PAGEREF _Toc511 \h </w:instrText>
       </w:r>
       <w:r>
         <w:fldChar w:fldCharType="separate"/>
@@ -1755,7 +1755,7 @@
         <w:fldChar w:fldCharType="begin"/>
       </w:r>
       <w:r>
-        <w:instrText xml:space="preserve"> HYPERLINK \l _Toc3310 </w:instrText>
+        <w:instrText xml:space="preserve"> HYPERLINK \l _Toc21008 </w:instrText>
       </w:r>
       <w:r>
         <w:fldChar w:fldCharType="separate"/>
@@ -1770,7 +1770,7 @@
         <w:fldChar w:fldCharType="begin"/>
       </w:r>
       <w:r>
-        <w:instrText xml:space="preserve"> PAGEREF _Toc3310 \h </w:instrText>
+        <w:instrText xml:space="preserve"> PAGEREF _Toc21008 \h </w:instrText>
       </w:r>
       <w:r>
         <w:fldChar w:fldCharType="separate"/>
@@ -1796,7 +1796,7 @@
         <w:fldChar w:fldCharType="begin"/>
       </w:r>
       <w:r>
-        <w:instrText xml:space="preserve"> HYPERLINK \l _Toc27101 </w:instrText>
+        <w:instrText xml:space="preserve"> HYPERLINK \l _Toc3872 </w:instrText>
       </w:r>
       <w:r>
         <w:fldChar w:fldCharType="separate"/>
@@ -1811,7 +1811,7 @@
         <w:fldChar w:fldCharType="begin"/>
       </w:r>
       <w:r>
-        <w:instrText xml:space="preserve"> PAGEREF _Toc27101 \h </w:instrText>
+        <w:instrText xml:space="preserve"> PAGEREF _Toc3872 \h </w:instrText>
       </w:r>
       <w:r>
         <w:fldChar w:fldCharType="separate"/>
@@ -1837,7 +1837,7 @@
         <w:fldChar w:fldCharType="begin"/>
       </w:r>
       <w:r>
-        <w:instrText xml:space="preserve"> HYPERLINK \l _Toc15574 </w:instrText>
+        <w:instrText xml:space="preserve"> HYPERLINK \l _Toc16538 </w:instrText>
       </w:r>
       <w:r>
         <w:fldChar w:fldCharType="separate"/>
@@ -1852,7 +1852,7 @@
         <w:fldChar w:fldCharType="begin"/>
       </w:r>
       <w:r>
-        <w:instrText xml:space="preserve"> PAGEREF _Toc15574 \h </w:instrText>
+        <w:instrText xml:space="preserve"> PAGEREF _Toc16538 \h </w:instrText>
       </w:r>
       <w:r>
         <w:fldChar w:fldCharType="separate"/>
@@ -1878,7 +1878,7 @@
         <w:fldChar w:fldCharType="begin"/>
       </w:r>
       <w:r>
-        <w:instrText xml:space="preserve"> HYPERLINK \l _Toc15180 </w:instrText>
+        <w:instrText xml:space="preserve"> HYPERLINK \l _Toc24792 </w:instrText>
       </w:r>
       <w:r>
         <w:fldChar w:fldCharType="separate"/>
@@ -1893,7 +1893,7 @@
         <w:fldChar w:fldCharType="begin"/>
       </w:r>
       <w:r>
-        <w:instrText xml:space="preserve"> PAGEREF _Toc15180 \h </w:instrText>
+        <w:instrText xml:space="preserve"> PAGEREF _Toc24792 \h </w:instrText>
       </w:r>
       <w:r>
         <w:fldChar w:fldCharType="separate"/>
@@ -1919,7 +1919,7 @@
         <w:fldChar w:fldCharType="begin"/>
       </w:r>
       <w:r>
-        <w:instrText xml:space="preserve"> HYPERLINK \l _Toc31674 </w:instrText>
+        <w:instrText xml:space="preserve"> HYPERLINK \l _Toc22028 </w:instrText>
       </w:r>
       <w:r>
         <w:fldChar w:fldCharType="separate"/>
@@ -1934,7 +1934,7 @@
         <w:fldChar w:fldCharType="begin"/>
       </w:r>
       <w:r>
-        <w:instrText xml:space="preserve"> PAGEREF _Toc31674 \h </w:instrText>
+        <w:instrText xml:space="preserve"> PAGEREF _Toc22028 \h </w:instrText>
       </w:r>
       <w:r>
         <w:fldChar w:fldCharType="separate"/>
@@ -1960,7 +1960,7 @@
         <w:fldChar w:fldCharType="begin"/>
       </w:r>
       <w:r>
-        <w:instrText xml:space="preserve"> HYPERLINK \l _Toc24878 </w:instrText>
+        <w:instrText xml:space="preserve"> HYPERLINK \l _Toc22749 </w:instrText>
       </w:r>
       <w:r>
         <w:fldChar w:fldCharType="separate"/>
@@ -1975,7 +1975,7 @@
         <w:fldChar w:fldCharType="begin"/>
       </w:r>
       <w:r>
-        <w:instrText xml:space="preserve"> PAGEREF _Toc24878 \h </w:instrText>
+        <w:instrText xml:space="preserve"> PAGEREF _Toc22749 \h </w:instrText>
       </w:r>
       <w:r>
         <w:fldChar w:fldCharType="separate"/>
@@ -2001,7 +2001,7 @@
         <w:fldChar w:fldCharType="begin"/>
       </w:r>
       <w:r>
-        <w:instrText xml:space="preserve"> HYPERLINK \l _Toc28170 </w:instrText>
+        <w:instrText xml:space="preserve"> HYPERLINK \l _Toc15502 </w:instrText>
       </w:r>
       <w:r>
         <w:fldChar w:fldCharType="separate"/>
@@ -2016,7 +2016,7 @@
         <w:fldChar w:fldCharType="begin"/>
       </w:r>
       <w:r>
-        <w:instrText xml:space="preserve"> PAGEREF _Toc28170 \h </w:instrText>
+        <w:instrText xml:space="preserve"> PAGEREF _Toc15502 \h </w:instrText>
       </w:r>
       <w:r>
         <w:fldChar w:fldCharType="separate"/>
@@ -2042,7 +2042,7 @@
         <w:fldChar w:fldCharType="begin"/>
       </w:r>
       <w:r>
-        <w:instrText xml:space="preserve"> HYPERLINK \l _Toc15232 </w:instrText>
+        <w:instrText xml:space="preserve"> HYPERLINK \l _Toc21178 </w:instrText>
       </w:r>
       <w:r>
         <w:fldChar w:fldCharType="separate"/>
@@ -2057,7 +2057,7 @@
         <w:fldChar w:fldCharType="begin"/>
       </w:r>
       <w:r>
-        <w:instrText xml:space="preserve"> PAGEREF _Toc15232 \h </w:instrText>
+        <w:instrText xml:space="preserve"> PAGEREF _Toc21178 \h </w:instrText>
       </w:r>
       <w:r>
         <w:fldChar w:fldCharType="separate"/>
@@ -2083,7 +2083,7 @@
         <w:fldChar w:fldCharType="begin"/>
       </w:r>
       <w:r>
-        <w:instrText xml:space="preserve"> HYPERLINK \l _Toc13294 </w:instrText>
+        <w:instrText xml:space="preserve"> HYPERLINK \l _Toc31593 </w:instrText>
       </w:r>
       <w:r>
         <w:fldChar w:fldCharType="separate"/>
@@ -2098,7 +2098,7 @@
         <w:fldChar w:fldCharType="begin"/>
       </w:r>
       <w:r>
-        <w:instrText xml:space="preserve"> PAGEREF _Toc13294 \h </w:instrText>
+        <w:instrText xml:space="preserve"> PAGEREF _Toc31593 \h </w:instrText>
       </w:r>
       <w:r>
         <w:fldChar w:fldCharType="separate"/>
@@ -2124,7 +2124,7 @@
         <w:fldChar w:fldCharType="begin"/>
       </w:r>
       <w:r>
-        <w:instrText xml:space="preserve"> HYPERLINK \l _Toc12641 </w:instrText>
+        <w:instrText xml:space="preserve"> HYPERLINK \l _Toc29429 </w:instrText>
       </w:r>
       <w:r>
         <w:fldChar w:fldCharType="separate"/>
@@ -2139,7 +2139,7 @@
         <w:fldChar w:fldCharType="begin"/>
       </w:r>
       <w:r>
-        <w:instrText xml:space="preserve"> PAGEREF _Toc12641 \h </w:instrText>
+        <w:instrText xml:space="preserve"> PAGEREF _Toc29429 \h </w:instrText>
       </w:r>
       <w:r>
         <w:fldChar w:fldCharType="separate"/>
@@ -2165,7 +2165,7 @@
         <w:fldChar w:fldCharType="begin"/>
       </w:r>
       <w:r>
-        <w:instrText xml:space="preserve"> HYPERLINK \l _Toc10558 </w:instrText>
+        <w:instrText xml:space="preserve"> HYPERLINK \l _Toc24061 </w:instrText>
       </w:r>
       <w:r>
         <w:fldChar w:fldCharType="separate"/>
@@ -2180,7 +2180,7 @@
         <w:fldChar w:fldCharType="begin"/>
       </w:r>
       <w:r>
-        <w:instrText xml:space="preserve"> PAGEREF _Toc10558 \h </w:instrText>
+        <w:instrText xml:space="preserve"> PAGEREF _Toc24061 \h </w:instrText>
       </w:r>
       <w:r>
         <w:fldChar w:fldCharType="separate"/>
@@ -2206,7 +2206,7 @@
         <w:fldChar w:fldCharType="begin"/>
       </w:r>
       <w:r>
-        <w:instrText xml:space="preserve"> HYPERLINK \l _Toc17338 </w:instrText>
+        <w:instrText xml:space="preserve"> HYPERLINK \l _Toc29842 </w:instrText>
       </w:r>
       <w:r>
         <w:fldChar w:fldCharType="separate"/>
@@ -2221,7 +2221,7 @@
         <w:fldChar w:fldCharType="begin"/>
       </w:r>
       <w:r>
-        <w:instrText xml:space="preserve"> PAGEREF _Toc17338 \h </w:instrText>
+        <w:instrText xml:space="preserve"> PAGEREF _Toc29842 \h </w:instrText>
       </w:r>
       <w:r>
         <w:fldChar w:fldCharType="separate"/>
@@ -2247,7 +2247,7 @@
         <w:fldChar w:fldCharType="begin"/>
       </w:r>
       <w:r>
-        <w:instrText xml:space="preserve"> HYPERLINK \l _Toc13826 </w:instrText>
+        <w:instrText xml:space="preserve"> HYPERLINK \l _Toc953 </w:instrText>
       </w:r>
       <w:r>
         <w:fldChar w:fldCharType="separate"/>
@@ -2262,7 +2262,7 @@
         <w:fldChar w:fldCharType="begin"/>
       </w:r>
       <w:r>
-        <w:instrText xml:space="preserve"> PAGEREF _Toc13826 \h </w:instrText>
+        <w:instrText xml:space="preserve"> PAGEREF _Toc953 \h </w:instrText>
       </w:r>
       <w:r>
         <w:fldChar w:fldCharType="separate"/>
@@ -2288,7 +2288,7 @@
         <w:fldChar w:fldCharType="begin"/>
       </w:r>
       <w:r>
-        <w:instrText xml:space="preserve"> HYPERLINK \l _Toc547 </w:instrText>
+        <w:instrText xml:space="preserve"> HYPERLINK \l _Toc4030 </w:instrText>
       </w:r>
       <w:r>
         <w:fldChar w:fldCharType="separate"/>
@@ -2303,7 +2303,7 @@
         <w:fldChar w:fldCharType="begin"/>
       </w:r>
       <w:r>
-        <w:instrText xml:space="preserve"> PAGEREF _Toc547 \h </w:instrText>
+        <w:instrText xml:space="preserve"> PAGEREF _Toc4030 \h </w:instrText>
       </w:r>
       <w:r>
         <w:fldChar w:fldCharType="separate"/>
@@ -2329,7 +2329,7 @@
         <w:fldChar w:fldCharType="begin"/>
       </w:r>
       <w:r>
-        <w:instrText xml:space="preserve"> HYPERLINK \l _Toc15424 </w:instrText>
+        <w:instrText xml:space="preserve"> HYPERLINK \l _Toc26797 </w:instrText>
       </w:r>
       <w:r>
         <w:fldChar w:fldCharType="separate"/>
@@ -2344,7 +2344,7 @@
         <w:fldChar w:fldCharType="begin"/>
       </w:r>
       <w:r>
-        <w:instrText xml:space="preserve"> PAGEREF _Toc15424 \h </w:instrText>
+        <w:instrText xml:space="preserve"> PAGEREF _Toc26797 \h </w:instrText>
       </w:r>
       <w:r>
         <w:fldChar w:fldCharType="separate"/>
@@ -2370,7 +2370,7 @@
         <w:fldChar w:fldCharType="begin"/>
       </w:r>
       <w:r>
-        <w:instrText xml:space="preserve"> HYPERLINK \l _Toc23579 </w:instrText>
+        <w:instrText xml:space="preserve"> HYPERLINK \l _Toc10906 </w:instrText>
       </w:r>
       <w:r>
         <w:fldChar w:fldCharType="separate"/>
@@ -2385,7 +2385,7 @@
         <w:fldChar w:fldCharType="begin"/>
       </w:r>
       <w:r>
-        <w:instrText xml:space="preserve"> PAGEREF _Toc23579 \h </w:instrText>
+        <w:instrText xml:space="preserve"> PAGEREF _Toc10906 \h </w:instrText>
       </w:r>
       <w:r>
         <w:fldChar w:fldCharType="separate"/>
@@ -2411,7 +2411,7 @@
         <w:fldChar w:fldCharType="begin"/>
       </w:r>
       <w:r>
-        <w:instrText xml:space="preserve"> HYPERLINK \l _Toc21726 </w:instrText>
+        <w:instrText xml:space="preserve"> HYPERLINK \l _Toc29593 </w:instrText>
       </w:r>
       <w:r>
         <w:fldChar w:fldCharType="separate"/>
@@ -2426,7 +2426,7 @@
         <w:fldChar w:fldCharType="begin"/>
       </w:r>
       <w:r>
-        <w:instrText xml:space="preserve"> PAGEREF _Toc21726 \h </w:instrText>
+        <w:instrText xml:space="preserve"> PAGEREF _Toc29593 \h </w:instrText>
       </w:r>
       <w:r>
         <w:fldChar w:fldCharType="separate"/>
@@ -2452,7 +2452,7 @@
         <w:fldChar w:fldCharType="begin"/>
       </w:r>
       <w:r>
-        <w:instrText xml:space="preserve"> HYPERLINK \l _Toc22730 </w:instrText>
+        <w:instrText xml:space="preserve"> HYPERLINK \l _Toc19831 </w:instrText>
       </w:r>
       <w:r>
         <w:fldChar w:fldCharType="separate"/>
@@ -2467,7 +2467,7 @@
         <w:fldChar w:fldCharType="begin"/>
       </w:r>
       <w:r>
-        <w:instrText xml:space="preserve"> PAGEREF _Toc22730 \h </w:instrText>
+        <w:instrText xml:space="preserve"> PAGEREF _Toc19831 \h </w:instrText>
       </w:r>
       <w:r>
         <w:fldChar w:fldCharType="separate"/>
@@ -2493,7 +2493,7 @@
         <w:fldChar w:fldCharType="begin"/>
       </w:r>
       <w:r>
-        <w:instrText xml:space="preserve"> HYPERLINK \l _Toc23772 </w:instrText>
+        <w:instrText xml:space="preserve"> HYPERLINK \l _Toc15800 </w:instrText>
       </w:r>
       <w:r>
         <w:fldChar w:fldCharType="separate"/>
@@ -2508,7 +2508,7 @@
         <w:fldChar w:fldCharType="begin"/>
       </w:r>
       <w:r>
-        <w:instrText xml:space="preserve"> PAGEREF _Toc23772 \h </w:instrText>
+        <w:instrText xml:space="preserve"> PAGEREF _Toc15800 \h </w:instrText>
       </w:r>
       <w:r>
         <w:fldChar w:fldCharType="separate"/>
@@ -2534,7 +2534,7 @@
         <w:fldChar w:fldCharType="begin"/>
       </w:r>
       <w:r>
-        <w:instrText xml:space="preserve"> HYPERLINK \l _Toc20951 </w:instrText>
+        <w:instrText xml:space="preserve"> HYPERLINK \l _Toc24085 </w:instrText>
       </w:r>
       <w:r>
         <w:fldChar w:fldCharType="separate"/>
@@ -2549,7 +2549,7 @@
         <w:fldChar w:fldCharType="begin"/>
       </w:r>
       <w:r>
-        <w:instrText xml:space="preserve"> PAGEREF _Toc20951 \h </w:instrText>
+        <w:instrText xml:space="preserve"> PAGEREF _Toc24085 \h </w:instrText>
       </w:r>
       <w:r>
         <w:fldChar w:fldCharType="separate"/>
@@ -2575,7 +2575,7 @@
         <w:fldChar w:fldCharType="begin"/>
       </w:r>
       <w:r>
-        <w:instrText xml:space="preserve"> HYPERLINK \l _Toc7488 </w:instrText>
+        <w:instrText xml:space="preserve"> HYPERLINK \l _Toc10641 </w:instrText>
       </w:r>
       <w:r>
         <w:fldChar w:fldCharType="separate"/>
@@ -2590,7 +2590,7 @@
         <w:fldChar w:fldCharType="begin"/>
       </w:r>
       <w:r>
-        <w:instrText xml:space="preserve"> PAGEREF _Toc7488 \h </w:instrText>
+        <w:instrText xml:space="preserve"> PAGEREF _Toc10641 \h </w:instrText>
       </w:r>
       <w:r>
         <w:fldChar w:fldCharType="separate"/>
@@ -2616,7 +2616,7 @@
         <w:fldChar w:fldCharType="begin"/>
       </w:r>
       <w:r>
-        <w:instrText xml:space="preserve"> HYPERLINK \l _Toc29229 </w:instrText>
+        <w:instrText xml:space="preserve"> HYPERLINK \l _Toc404 </w:instrText>
       </w:r>
       <w:r>
         <w:fldChar w:fldCharType="separate"/>
@@ -2631,7 +2631,7 @@
         <w:fldChar w:fldCharType="begin"/>
       </w:r>
       <w:r>
-        <w:instrText xml:space="preserve"> PAGEREF _Toc29229 \h </w:instrText>
+        <w:instrText xml:space="preserve"> PAGEREF _Toc404 \h </w:instrText>
       </w:r>
       <w:r>
         <w:fldChar w:fldCharType="separate"/>
@@ -2657,7 +2657,7 @@
         <w:fldChar w:fldCharType="begin"/>
       </w:r>
       <w:r>
-        <w:instrText xml:space="preserve"> HYPERLINK \l _Toc27483 </w:instrText>
+        <w:instrText xml:space="preserve"> HYPERLINK \l _Toc18832 </w:instrText>
       </w:r>
       <w:r>
         <w:fldChar w:fldCharType="separate"/>
@@ -2672,13 +2672,54 @@
         <w:fldChar w:fldCharType="begin"/>
       </w:r>
       <w:r>
-        <w:instrText xml:space="preserve"> PAGEREF _Toc27483 \h </w:instrText>
+        <w:instrText xml:space="preserve"> PAGEREF _Toc18832 \h </w:instrText>
       </w:r>
       <w:r>
         <w:fldChar w:fldCharType="separate"/>
       </w:r>
       <w:r>
         <w:t>28</w:t>
+      </w:r>
+      <w:r>
+        <w:fldChar w:fldCharType="end"/>
+      </w:r>
+      <w:r>
+        <w:fldChar w:fldCharType="end"/>
+      </w:r>
+    </w:p>
+    <w:p>
+      <w:pPr>
+        <w:pStyle w:val="38"/>
+        <w:tabs>
+          <w:tab w:val="right" w:leader="dot" w:pos="9412"/>
+        </w:tabs>
+      </w:pPr>
+      <w:r>
+        <w:fldChar w:fldCharType="begin"/>
+      </w:r>
+      <w:r>
+        <w:instrText xml:space="preserve"> HYPERLINK \l _Toc17215 </w:instrText>
+      </w:r>
+      <w:r>
+        <w:fldChar w:fldCharType="separate"/>
+      </w:r>
+      <w:r>
+        <w:t>10.2 Checking the two questionnaires on a phone</w:t>
+      </w:r>
+      <w:r>
+        <w:tab/>
+      </w:r>
+      <w:r>
+        <w:fldChar w:fldCharType="begin"/>
+      </w:r>
+      <w:r>
+        <w:instrText xml:space="preserve"> PAGEREF _Toc17215 \h </w:instrText>
+      </w:r>
+      <w:r>
+        <w:fldChar w:fldCharType="separate"/>
+      </w:r>
+      <w:r>
+        <w:t>29</w:t>
       </w:r>
       <w:r>
         <w:fldChar w:fldCharType="end"/>
@@ -2698,7 +2739,7 @@
         <w:fldChar w:fldCharType="begin"/>
       </w:r>
       <w:r>
-        <w:instrText xml:space="preserve"> HYPERLINK \l _Toc32670 </w:instrText>
+        <w:instrText xml:space="preserve"> HYPERLINK \l _Toc23612 </w:instrText>
       </w:r>
       <w:r>
         <w:fldChar w:fldCharType="separate"/>
@@ -2713,13 +2754,13 @@
         <w:fldChar w:fldCharType="begin"/>
       </w:r>
       <w:r>
-        <w:instrText xml:space="preserve"> PAGEREF _Toc32670 \h </w:instrText>
+        <w:instrText xml:space="preserve"> PAGEREF _Toc23612 \h </w:instrText>
       </w:r>
       <w:r>
         <w:fldChar w:fldCharType="separate"/>
       </w:r>
       <w:r>
-        <w:t>29</w:t>
+        <w:t>30</w:t>
       </w:r>
       <w:r>
         <w:fldChar w:fldCharType="end"/>
@@ -2739,7 +2780,7 @@
         <w:fldChar w:fldCharType="begin"/>
       </w:r>
       <w:r>
-        <w:instrText xml:space="preserve"> HYPERLINK \l _Toc19549 </w:instrText>
+        <w:instrText xml:space="preserve"> HYPERLINK \l _Toc20055 </w:instrText>
       </w:r>
       <w:r>
         <w:fldChar w:fldCharType="separate"/>
@@ -2754,13 +2795,13 @@
         <w:fldChar w:fldCharType="begin"/>
       </w:r>
       <w:r>
-        <w:instrText xml:space="preserve"> PAGEREF _Toc19549 \h </w:instrText>
+        <w:instrText xml:space="preserve"> PAGEREF _Toc20055 \h </w:instrText>
       </w:r>
       <w:r>
         <w:fldChar w:fldCharType="separate"/>
       </w:r>
       <w:r>
-        <w:t>29</w:t>
+        <w:t>30</w:t>
       </w:r>
       <w:r>
         <w:fldChar w:fldCharType="end"/>
@@ -2780,7 +2821,7 @@
         <w:fldChar w:fldCharType="begin"/>
       </w:r>
       <w:r>
-        <w:instrText xml:space="preserve"> HYPERLINK \l _Toc28345 </w:instrText>
+        <w:instrText xml:space="preserve"> HYPERLINK \l _Toc4929 </w:instrText>
       </w:r>
       <w:r>
         <w:fldChar w:fldCharType="separate"/>
@@ -2795,7 +2836,7 @@
         <w:fldChar w:fldCharType="begin"/>
       </w:r>
       <w:r>
-        <w:instrText xml:space="preserve"> PAGEREF _Toc28345 \h </w:instrText>
+        <w:instrText xml:space="preserve"> PAGEREF _Toc4929 \h </w:instrText>
       </w:r>
       <w:r>
         <w:fldChar w:fldCharType="separate"/>
@@ -2821,7 +2862,7 @@
         <w:fldChar w:fldCharType="begin"/>
       </w:r>
       <w:r>
-        <w:instrText xml:space="preserve"> HYPERLINK \l _Toc15946 </w:instrText>
+        <w:instrText xml:space="preserve"> HYPERLINK \l _Toc15236 </w:instrText>
       </w:r>
       <w:r>
         <w:fldChar w:fldCharType="separate"/>
@@ -2836,7 +2877,7 @@
         <w:fldChar w:fldCharType="begin"/>
       </w:r>
       <w:r>
-        <w:instrText xml:space="preserve"> PAGEREF _Toc15946 \h </w:instrText>
+        <w:instrText xml:space="preserve"> PAGEREF _Toc15236 \h </w:instrText>
       </w:r>
       <w:r>
         <w:fldChar w:fldCharType="separate"/>
@@ -2862,7 +2903,7 @@
         <w:fldChar w:fldCharType="begin"/>
       </w:r>
       <w:r>
-        <w:instrText xml:space="preserve"> HYPERLINK \l _Toc31323 </w:instrText>
+        <w:instrText xml:space="preserve"> HYPERLINK \l _Toc17321 </w:instrText>
       </w:r>
       <w:r>
         <w:fldChar w:fldCharType="separate"/>
@@ -2877,13 +2918,13 @@
         <w:fldChar w:fldCharType="begin"/>
       </w:r>
       <w:r>
-        <w:instrText xml:space="preserve"> PAGEREF _Toc31323 \h </w:instrText>
+        <w:instrText xml:space="preserve"> PAGEREF _Toc17321 \h </w:instrText>
       </w:r>
       <w:r>
         <w:fldChar w:fldCharType="separate"/>
       </w:r>
       <w:r>
-        <w:t>30</w:t>
+        <w:t>31</w:t>
       </w:r>
       <w:r>
         <w:fldChar w:fldCharType="end"/>
@@ -2903,7 +2944,7 @@
         <w:fldChar w:fldCharType="begin"/>
       </w:r>
       <w:r>
-        <w:instrText xml:space="preserve"> HYPERLINK \l _Toc6603 </w:instrText>
+        <w:instrText xml:space="preserve"> HYPERLINK \l _Toc13984 </w:instrText>
       </w:r>
       <w:r>
         <w:fldChar w:fldCharType="separate"/>
@@ -2918,13 +2959,13 @@
         <w:fldChar w:fldCharType="begin"/>
       </w:r>
       <w:r>
-        <w:instrText xml:space="preserve"> PAGEREF _Toc6603 \h </w:instrText>
+        <w:instrText xml:space="preserve"> PAGEREF _Toc13984 \h </w:instrText>
       </w:r>
       <w:r>
         <w:fldChar w:fldCharType="separate"/>
       </w:r>
       <w:r>
-        <w:t>30</w:t>
+        <w:t>31</w:t>
       </w:r>
       <w:r>
         <w:fldChar w:fldCharType="end"/>
@@ -2944,7 +2985,7 @@
         <w:fldChar w:fldCharType="begin"/>
       </w:r>
       <w:r>
-        <w:instrText xml:space="preserve"> HYPERLINK \l _Toc1217 </w:instrText>
+        <w:instrText xml:space="preserve"> HYPERLINK \l _Toc20726 </w:instrText>
       </w:r>
       <w:r>
         <w:fldChar w:fldCharType="separate"/>
@@ -2959,7 +3000,7 @@
         <w:fldChar w:fldCharType="begin"/>
       </w:r>
       <w:r>
-        <w:instrText xml:space="preserve"> PAGEREF _Toc1217 \h </w:instrText>
+        <w:instrText xml:space="preserve"> PAGEREF _Toc20726 \h </w:instrText>
       </w:r>
       <w:r>
         <w:fldChar w:fldCharType="separate"/>
@@ -2985,7 +3026,7 @@
         <w:fldChar w:fldCharType="begin"/>
       </w:r>
       <w:r>
-        <w:instrText xml:space="preserve"> HYPERLINK \l _Toc23421 </w:instrText>
+        <w:instrText xml:space="preserve"> HYPERLINK \l _Toc10224 </w:instrText>
       </w:r>
       <w:r>
         <w:fldChar w:fldCharType="separate"/>
@@ -3000,7 +3041,7 @@
         <w:fldChar w:fldCharType="begin"/>
       </w:r>
       <w:r>
-        <w:instrText xml:space="preserve"> PAGEREF _Toc23421 \h </w:instrText>
+        <w:instrText xml:space="preserve"> PAGEREF _Toc10224 \h </w:instrText>
       </w:r>
       <w:r>
         <w:fldChar w:fldCharType="separate"/>
@@ -3026,7 +3067,7 @@
         <w:fldChar w:fldCharType="begin"/>
       </w:r>
       <w:r>
-        <w:instrText xml:space="preserve"> HYPERLINK \l _Toc30241 </w:instrText>
+        <w:instrText xml:space="preserve"> HYPERLINK \l _Toc29184 </w:instrText>
       </w:r>
       <w:r>
         <w:fldChar w:fldCharType="separate"/>
@@ -3041,7 +3082,7 @@
         <w:fldChar w:fldCharType="begin"/>
       </w:r>
       <w:r>
-        <w:instrText xml:space="preserve"> PAGEREF _Toc30241 \h </w:instrText>
+        <w:instrText xml:space="preserve"> PAGEREF _Toc29184 \h </w:instrText>
       </w:r>
       <w:r>
         <w:fldChar w:fldCharType="separate"/>
@@ -3067,7 +3108,7 @@
         <w:fldChar w:fldCharType="begin"/>
       </w:r>
       <w:r>
-        <w:instrText xml:space="preserve"> HYPERLINK \l _Toc22686 </w:instrText>
+        <w:instrText xml:space="preserve"> HYPERLINK \l _Toc9222 </w:instrText>
       </w:r>
       <w:r>
         <w:fldChar w:fldCharType="separate"/>
@@ -3082,7 +3123,7 @@
         <w:fldChar w:fldCharType="begin"/>
       </w:r>
       <w:r>
-        <w:instrText xml:space="preserve"> PAGEREF _Toc22686 \h </w:instrText>
+        <w:instrText xml:space="preserve"> PAGEREF _Toc9222 \h </w:instrText>
       </w:r>
       <w:r>
         <w:fldChar w:fldCharType="separate"/>
@@ -3108,7 +3149,7 @@
         <w:fldChar w:fldCharType="begin"/>
       </w:r>
       <w:r>
-        <w:instrText xml:space="preserve"> HYPERLINK \l _Toc11542 </w:instrText>
+        <w:instrText xml:space="preserve"> HYPERLINK \l _Toc9663 </w:instrText>
       </w:r>
       <w:r>
         <w:fldChar w:fldCharType="separate"/>
@@ -3123,7 +3164,7 @@
         <w:fldChar w:fldCharType="begin"/>
       </w:r>
       <w:r>
-        <w:instrText xml:space="preserve"> PAGEREF _Toc11542 \h </w:instrText>
+        <w:instrText xml:space="preserve"> PAGEREF _Toc9663 \h </w:instrText>
       </w:r>
       <w:r>
         <w:fldChar w:fldCharType="separate"/>
@@ -3149,7 +3190,7 @@
         <w:fldChar w:fldCharType="begin"/>
       </w:r>
       <w:r>
-        <w:instrText xml:space="preserve"> HYPERLINK \l _Toc16979 </w:instrText>
+        <w:instrText xml:space="preserve"> HYPERLINK \l _Toc16359 </w:instrText>
       </w:r>
       <w:r>
         <w:fldChar w:fldCharType="separate"/>
@@ -3164,7 +3205,7 @@
         <w:fldChar w:fldCharType="begin"/>
       </w:r>
       <w:r>
-        <w:instrText xml:space="preserve"> PAGEREF _Toc16979 \h </w:instrText>
+        <w:instrText xml:space="preserve"> PAGEREF _Toc16359 \h </w:instrText>
       </w:r>
       <w:r>
         <w:fldChar w:fldCharType="separate"/>
@@ -3189,7 +3230,7 @@
         <w:pStyle w:val="2"/>
         <w:pageBreakBefore/>
       </w:pPr>
-      <w:bookmarkStart w:id="0" w:name="_Toc10838"/>
+      <w:bookmarkStart w:id="0" w:name="_Toc9033"/>
       <w:r>
         <w:t>1. Executive summary</w:t>
       </w:r>
@@ -4174,7 +4215,7 @@
         <w:pStyle w:val="2"/>
         <w:pageBreakBefore w:val="0"/>
       </w:pPr>
-      <w:bookmarkStart w:id="1" w:name="_Toc29466"/>
+      <w:bookmarkStart w:id="1" w:name="_Toc30897"/>
       <w:r>
         <w:t>2. Project background and scope</w:t>
       </w:r>
@@ -4260,7 +4301,7 @@
         <w:pStyle w:val="2"/>
         <w:pageBreakBefore w:val="0"/>
       </w:pPr>
-      <w:bookmarkStart w:id="2" w:name="_Toc25681"/>
+      <w:bookmarkStart w:id="2" w:name="_Toc20933"/>
       <w:r>
         <w:t>3. System architecture</w:t>
       </w:r>
@@ -4270,7 +4311,7 @@
       <w:pPr>
         <w:pStyle w:val="3"/>
       </w:pPr>
-      <w:bookmarkStart w:id="3" w:name="_Toc1171"/>
+      <w:bookmarkStart w:id="3" w:name="_Toc21270"/>
       <w:r>
         <w:t>3.1 Overview</w:t>
       </w:r>
@@ -4818,7 +4859,7 @@
       <w:pPr>
         <w:pStyle w:val="3"/>
       </w:pPr>
-      <w:bookmarkStart w:id="4" w:name="_Toc1223"/>
+      <w:bookmarkStart w:id="4" w:name="_Toc8231"/>
       <w:r>
         <w:t>3.2 What happens when a user taps a button</w:t>
       </w:r>
@@ -4980,7 +5021,7 @@
       <w:pPr>
         <w:pStyle w:val="3"/>
       </w:pPr>
-      <w:bookmarkStart w:id="5" w:name="_Toc27439"/>
+      <w:bookmarkStart w:id="5" w:name="_Toc8657"/>
       <w:r>
         <w:t>3.3 API reference</w:t>
       </w:r>
@@ -8671,7 +8712,7 @@
       <w:pPr>
         <w:pStyle w:val="3"/>
       </w:pPr>
-      <w:bookmarkStart w:id="6" w:name="_Toc9501"/>
+      <w:bookmarkStart w:id="6" w:name="_Toc3692"/>
       <w:r>
         <w:t>3.4 Privacy, safety and security design</w:t>
       </w:r>
@@ -8736,7 +8777,7 @@
       <w:pPr>
         <w:pStyle w:val="3"/>
       </w:pPr>
-      <w:bookmarkStart w:id="7" w:name="_Toc2381"/>
+      <w:bookmarkStart w:id="7" w:name="_Toc12100"/>
       <w:r>
         <w:t>3.5 Repository layout</w:t>
       </w:r>
@@ -9280,7 +9321,7 @@
         <w:pStyle w:val="2"/>
         <w:pageBreakBefore w:val="0"/>
       </w:pPr>
-      <w:bookmarkStart w:id="8" w:name="_Toc23171"/>
+      <w:bookmarkStart w:id="8" w:name="_Toc9843"/>
       <w:r>
         <w:t>4. Mobile application in detail</w:t>
       </w:r>
@@ -9290,7 +9331,7 @@
       <w:pPr>
         <w:pStyle w:val="3"/>
       </w:pPr>
-      <w:bookmarkStart w:id="9" w:name="_Toc4738"/>
+      <w:bookmarkStart w:id="9" w:name="_Toc19116"/>
       <w:r>
         <w:t>4.1 Technology</w:t>
       </w:r>
@@ -9879,7 +9920,7 @@
       <w:pPr>
         <w:pStyle w:val="3"/>
       </w:pPr>
-      <w:bookmarkStart w:id="10" w:name="_Toc14542"/>
+      <w:bookmarkStart w:id="10" w:name="_Toc15330"/>
       <w:r>
         <w:t>4.2 Screens</w:t>
       </w:r>
@@ -9935,12 +9976,6 @@
             <w:insideH w:val="single" w:color="D9C3CC" w:sz="4" w:space="0"/>
             <w:insideV w:val="single" w:color="D9C3CC" w:sz="4" w:space="0"/>
           </w:tblBorders>
-          <w:tblCellMar>
-            <w:top w:w="50" w:type="dxa"/>
-            <w:left w:w="90" w:type="dxa"/>
-            <w:bottom w:w="50" w:type="dxa"/>
-            <w:right w:w="90" w:type="dxa"/>
-          </w:tblCellMar>
         </w:tblPrEx>
         <w:trPr>
           <w:tblHeader/>
@@ -10418,7 +10453,7 @@
       <w:pPr>
         <w:pStyle w:val="3"/>
       </w:pPr>
-      <w:bookmarkStart w:id="11" w:name="_Toc10113"/>
+      <w:bookmarkStart w:id="11" w:name="_Toc7437"/>
       <w:r>
         <w:t>4.3 State and data flow</w:t>
       </w:r>
@@ -10839,7 +10874,7 @@
       <w:pPr>
         <w:pStyle w:val="3"/>
       </w:pPr>
-      <w:bookmarkStart w:id="12" w:name="_Toc4434"/>
+      <w:bookmarkStart w:id="12" w:name="_Toc12244"/>
       <w:r>
         <w:t>4.4 PCOS assessment flow</w:t>
       </w:r>
@@ -10892,7 +10927,7 @@
       <w:pPr>
         <w:pStyle w:val="3"/>
       </w:pPr>
-      <w:bookmarkStart w:id="13" w:name="_Toc25103"/>
+      <w:bookmarkStart w:id="13" w:name="_Toc5785"/>
       <w:r>
         <w:t>4.5 Breast health flow</w:t>
       </w:r>
@@ -10997,7 +11032,7 @@
       <w:pPr>
         <w:pStyle w:val="3"/>
       </w:pPr>
-      <w:bookmarkStart w:id="14" w:name="_Toc30076"/>
+      <w:bookmarkStart w:id="14" w:name="_Toc32559"/>
       <w:r>
         <w:t>4.6 Breast self-exam and the monthly reminder</w:t>
       </w:r>
@@ -11071,7 +11106,7 @@
       <w:pPr>
         <w:pStyle w:val="3"/>
       </w:pPr>
-      <w:bookmarkStart w:id="15" w:name="_Toc22967"/>
+      <w:bookmarkStart w:id="15" w:name="_Toc16429"/>
       <w:r>
         <w:t>4.7 Server address setting</w:t>
       </w:r>
@@ -11090,7 +11125,7 @@
       <w:pPr>
         <w:pStyle w:val="3"/>
       </w:pPr>
-      <w:bookmarkStart w:id="16" w:name="_Toc819"/>
+      <w:bookmarkStart w:id="16" w:name="_Toc22691"/>
       <w:r>
         <w:t>4.8 Android configuration</w:t>
       </w:r>
@@ -11136,7 +11171,7 @@
       <w:pPr>
         <w:pStyle w:val="3"/>
       </w:pPr>
-      <w:bookmarkStart w:id="17" w:name="_Toc12069"/>
+      <w:bookmarkStart w:id="17" w:name="_Toc23002"/>
       <w:r>
         <w:t>4.9 Automated tests</w:t>
       </w:r>
@@ -12126,7 +12161,7 @@
         <w:pStyle w:val="2"/>
         <w:pageBreakBefore w:val="0"/>
       </w:pPr>
-      <w:bookmarkStart w:id="18" w:name="_Toc29004"/>
+      <w:bookmarkStart w:id="18" w:name="_Toc8092"/>
       <w:r>
         <w:t>5. PCOS risk model</w:t>
       </w:r>
@@ -12145,7 +12180,7 @@
       <w:pPr>
         <w:pStyle w:val="3"/>
       </w:pPr>
-      <w:bookmarkStart w:id="19" w:name="_Toc23374"/>
+      <w:bookmarkStart w:id="19" w:name="_Toc13973"/>
       <w:r>
         <w:t>5.1 Data and preparation</w:t>
       </w:r>
@@ -12212,7 +12247,7 @@
       <w:pPr>
         <w:pStyle w:val="3"/>
       </w:pPr>
-      <w:bookmarkStart w:id="20" w:name="_Toc17558"/>
+      <w:bookmarkStart w:id="20" w:name="_Toc11170"/>
       <w:r>
         <w:t>5.2 Features and constraints</w:t>
       </w:r>
@@ -13484,7 +13519,7 @@
       <w:pPr>
         <w:pStyle w:val="3"/>
       </w:pPr>
-      <w:bookmarkStart w:id="21" w:name="_Toc10440"/>
+      <w:bookmarkStart w:id="21" w:name="_Toc1663"/>
       <w:r>
         <w:t>5.3 Model and training</w:t>
       </w:r>
@@ -14027,7 +14062,7 @@
       <w:pPr>
         <w:pStyle w:val="3"/>
       </w:pPr>
-      <w:bookmarkStart w:id="22" w:name="_Toc6725"/>
+      <w:bookmarkStart w:id="22" w:name="_Toc20492"/>
       <w:r>
         <w:t>5.4 Results</w:t>
       </w:r>
@@ -15945,7 +15980,7 @@
       <w:pPr>
         <w:pStyle w:val="3"/>
       </w:pPr>
-      <w:bookmarkStart w:id="23" w:name="_Toc12549"/>
+      <w:bookmarkStart w:id="23" w:name="_Toc3179"/>
       <w:r>
         <w:t>5.5 How the app uses it</w:t>
       </w:r>
@@ -16005,7 +16040,7 @@
       <w:pPr>
         <w:pStyle w:val="3"/>
       </w:pPr>
-      <w:bookmarkStart w:id="24" w:name="_Toc6859"/>
+      <w:bookmarkStart w:id="24" w:name="_Toc21995"/>
       <w:r>
         <w:t>5.6 Limitations</w:t>
       </w:r>
@@ -16052,7 +16087,7 @@
         <w:pStyle w:val="2"/>
         <w:pageBreakBefore w:val="0"/>
       </w:pPr>
-      <w:bookmarkStart w:id="25" w:name="_Toc17491"/>
+      <w:bookmarkStart w:id="25" w:name="_Toc24710"/>
       <w:r>
         <w:t>6. Breast ultrasound classifier (component A)</w:t>
       </w:r>
@@ -16062,7 +16097,7 @@
       <w:pPr>
         <w:pStyle w:val="3"/>
       </w:pPr>
-      <w:bookmarkStart w:id="26" w:name="_Toc95"/>
+      <w:bookmarkStart w:id="26" w:name="_Toc8847"/>
       <w:r>
         <w:t>6.1 What it does</w:t>
       </w:r>
@@ -16081,7 +16116,7 @@
       <w:pPr>
         <w:pStyle w:val="3"/>
       </w:pPr>
-      <w:bookmarkStart w:id="27" w:name="_Toc6849"/>
+      <w:bookmarkStart w:id="27" w:name="_Toc12625"/>
       <w:r>
         <w:t>6.2 Datasets</w:t>
       </w:r>
@@ -18446,7 +18481,7 @@
       <w:pPr>
         <w:pStyle w:val="3"/>
       </w:pPr>
-      <w:bookmarkStart w:id="28" w:name="_Toc14011"/>
+      <w:bookmarkStart w:id="28" w:name="_Toc22310"/>
       <w:r>
         <w:t>6.3 Data-quality decisions</w:t>
       </w:r>
@@ -18570,7 +18605,7 @@
       <w:pPr>
         <w:pStyle w:val="3"/>
       </w:pPr>
-      <w:bookmarkStart w:id="29" w:name="_Toc23906"/>
+      <w:bookmarkStart w:id="29" w:name="_Toc15687"/>
       <w:r>
         <w:t>6.4 Method and settings</w:t>
       </w:r>
@@ -20212,7 +20247,7 @@
       <w:pPr>
         <w:pStyle w:val="3"/>
       </w:pPr>
-      <w:bookmarkStart w:id="30" w:name="_Toc1501"/>
+      <w:bookmarkStart w:id="30" w:name="_Toc23093"/>
       <w:r>
         <w:t>6.5 Selecting the recipe by cross-validation</w:t>
       </w:r>
@@ -22363,7 +22398,7 @@
       <w:pPr>
         <w:pStyle w:val="3"/>
       </w:pPr>
-      <w:bookmarkStart w:id="31" w:name="_Toc21130"/>
+      <w:bookmarkStart w:id="31" w:name="_Toc21226"/>
       <w:r>
         <w:t>6.6 Calibration, threshold and export</w:t>
       </w:r>
@@ -22449,7 +22484,7 @@
       <w:pPr>
         <w:pStyle w:val="3"/>
       </w:pPr>
-      <w:bookmarkStart w:id="32" w:name="_Toc2006"/>
+      <w:bookmarkStart w:id="32" w:name="_Toc511"/>
       <w:r>
         <w:t>6.7 Model versions</w:t>
       </w:r>
@@ -22909,7 +22944,7 @@
       <w:pPr>
         <w:pStyle w:val="3"/>
       </w:pPr>
-      <w:bookmarkStart w:id="33" w:name="_Toc3310"/>
+      <w:bookmarkStart w:id="33" w:name="_Toc21008"/>
       <w:r>
         <w:t>6.8 Results</w:t>
       </w:r>
@@ -28881,7 +28916,7 @@
       <w:pPr>
         <w:pStyle w:val="3"/>
       </w:pPr>
-      <w:bookmarkStart w:id="34" w:name="_Toc27101"/>
+      <w:bookmarkStart w:id="34" w:name="_Toc3872"/>
       <w:r>
         <w:t>6.9 Rejecting uploads that are not breast ultrasounds</w:t>
       </w:r>
@@ -29815,7 +29850,7 @@
       <w:pPr>
         <w:pStyle w:val="3"/>
       </w:pPr>
-      <w:bookmarkStart w:id="35" w:name="_Toc15574"/>
+      <w:bookmarkStart w:id="35" w:name="_Toc16538"/>
       <w:r>
         <w:t>6.10 The screening threshold decision</w:t>
       </w:r>
@@ -30447,7 +30482,7 @@
       <w:pPr>
         <w:pStyle w:val="3"/>
       </w:pPr>
-      <w:bookmarkStart w:id="36" w:name="_Toc15180"/>
+      <w:bookmarkStart w:id="36" w:name="_Toc24792"/>
       <w:r>
         <w:t>6.11 Explainability</w:t>
       </w:r>
@@ -30526,7 +30561,7 @@
       <w:pPr>
         <w:pStyle w:val="3"/>
       </w:pPr>
-      <w:bookmarkStart w:id="37" w:name="_Toc31674"/>
+      <w:bookmarkStart w:id="37" w:name="_Toc22028"/>
       <w:r>
         <w:t>6.12 Limitations</w:t>
       </w:r>
@@ -30627,7 +30662,7 @@
       <w:pPr>
         <w:pStyle w:val="3"/>
       </w:pPr>
-      <w:bookmarkStart w:id="38" w:name="_Toc24878"/>
+      <w:bookmarkStart w:id="38" w:name="_Toc22749"/>
       <w:r>
         <w:t>6.13 Informal check with images from the web</w:t>
       </w:r>
@@ -31629,7 +31664,7 @@
         <w:pStyle w:val="2"/>
         <w:pageBreakBefore w:val="0"/>
       </w:pPr>
-      <w:bookmarkStart w:id="39" w:name="_Toc28170"/>
+      <w:bookmarkStart w:id="39" w:name="_Toc15502"/>
       <w:r>
         <w:t>7. Breast cancer risk questionnaire (component B)</w:t>
       </w:r>
@@ -31639,7 +31674,7 @@
       <w:pPr>
         <w:pStyle w:val="3"/>
       </w:pPr>
-      <w:bookmarkStart w:id="40" w:name="_Toc15232"/>
+      <w:bookmarkStart w:id="40" w:name="_Toc21178"/>
       <w:r>
         <w:t>7.1 Data and design</w:t>
       </w:r>
@@ -31753,7 +31788,7 @@
       <w:pPr>
         <w:pStyle w:val="3"/>
       </w:pPr>
-      <w:bookmarkStart w:id="41" w:name="_Toc13294"/>
+      <w:bookmarkStart w:id="41" w:name="_Toc31593"/>
       <w:r>
         <w:t>7.2 How answers become model inputs</w:t>
       </w:r>
@@ -32400,7 +32435,7 @@
       <w:pPr>
         <w:pStyle w:val="3"/>
       </w:pPr>
-      <w:bookmarkStart w:id="42" w:name="_Toc12641"/>
+      <w:bookmarkStart w:id="42" w:name="_Toc29429"/>
       <w:r>
         <w:t>7.3 Model settings</w:t>
       </w:r>
@@ -32989,7 +33024,7 @@
       <w:pPr>
         <w:pStyle w:val="3"/>
       </w:pPr>
-      <w:bookmarkStart w:id="43" w:name="_Toc10558"/>
+      <w:bookmarkStart w:id="43" w:name="_Toc24061"/>
       <w:r>
         <w:t>7.4 Results</w:t>
       </w:r>
@@ -34779,7 +34814,7 @@
       <w:pPr>
         <w:pStyle w:val="3"/>
       </w:pPr>
-      <w:bookmarkStart w:id="44" w:name="_Toc17338"/>
+      <w:bookmarkStart w:id="44" w:name="_Toc29842"/>
       <w:r>
         <w:t>7.5 What the user sees and why</w:t>
       </w:r>
@@ -35555,7 +35590,7 @@
       <w:pPr>
         <w:pStyle w:val="3"/>
       </w:pPr>
-      <w:bookmarkStart w:id="45" w:name="_Toc13826"/>
+      <w:bookmarkStart w:id="45" w:name="_Toc953"/>
       <w:r>
         <w:t>7.6 Behaviour check through the API</w:t>
       </w:r>
@@ -36509,7 +36544,7 @@
       <w:pPr>
         <w:pStyle w:val="3"/>
       </w:pPr>
-      <w:bookmarkStart w:id="46" w:name="_Toc547"/>
+      <w:bookmarkStart w:id="46" w:name="_Toc4030"/>
       <w:r>
         <w:t>7.7 Deviation from the scope document</w:t>
       </w:r>
@@ -36528,7 +36563,7 @@
       <w:pPr>
         <w:pStyle w:val="3"/>
       </w:pPr>
-      <w:bookmarkStart w:id="47" w:name="_Toc15424"/>
+      <w:bookmarkStart w:id="47" w:name="_Toc26797"/>
       <w:r>
         <w:t>7.8 Limitations</w:t>
       </w:r>
@@ -36575,7 +36610,7 @@
         <w:pStyle w:val="2"/>
         <w:pageBreakBefore w:val="0"/>
       </w:pPr>
-      <w:bookmarkStart w:id="48" w:name="_Toc23579"/>
+      <w:bookmarkStart w:id="48" w:name="_Toc10906"/>
       <w:r>
         <w:t>8. Other parts of the breast module</w:t>
       </w:r>
@@ -36643,7 +36678,7 @@
         <w:pStyle w:val="2"/>
         <w:pageBreakBefore w:val="0"/>
       </w:pPr>
-      <w:bookmarkStart w:id="49" w:name="_Toc21726"/>
+      <w:bookmarkStart w:id="49" w:name="_Toc29593"/>
       <w:r>
         <w:t>9. Deployment and demo build</w:t>
       </w:r>
@@ -36653,7 +36688,7 @@
       <w:pPr>
         <w:pStyle w:val="3"/>
       </w:pPr>
-      <w:bookmarkStart w:id="50" w:name="_Toc22730"/>
+      <w:bookmarkStart w:id="50" w:name="_Toc19831"/>
       <w:r>
         <w:t>9.1 Hosting options considered</w:t>
       </w:r>
@@ -37014,7 +37049,7 @@
       <w:pPr>
         <w:pStyle w:val="3"/>
       </w:pPr>
-      <w:bookmarkStart w:id="51" w:name="_Toc23772"/>
+      <w:bookmarkStart w:id="51" w:name="_Toc15800"/>
       <w:r>
         <w:t>9.2 Demo procedure</w:t>
       </w:r>
@@ -37076,7 +37111,7 @@
       <w:pPr>
         <w:pStyle w:val="3"/>
       </w:pPr>
-      <w:bookmarkStart w:id="52" w:name="_Toc20951"/>
+      <w:bookmarkStart w:id="52" w:name="_Toc24085"/>
       <w:r>
         <w:t>9.3 Build environment and workarounds</w:t>
       </w:r>
@@ -37497,7 +37532,7 @@
       <w:pPr>
         <w:pStyle w:val="3"/>
       </w:pPr>
-      <w:bookmarkStart w:id="53" w:name="_Toc7488"/>
+      <w:bookmarkStart w:id="53" w:name="_Toc10641"/>
       <w:r>
         <w:t>9.4 APK builds</w:t>
       </w:r>
@@ -37806,7 +37841,7 @@
         <w:pStyle w:val="2"/>
         <w:pageBreakBefore w:val="0"/>
       </w:pPr>
-      <w:bookmarkStart w:id="54" w:name="_Toc29229"/>
+      <w:bookmarkStart w:id="54" w:name="_Toc404"/>
       <w:r>
         <w:t>10. Verification and testing</w:t>
       </w:r>
@@ -38735,7 +38770,7 @@
       <w:pPr>
         <w:pStyle w:val="3"/>
       </w:pPr>
-      <w:bookmarkStart w:id="55" w:name="_Toc27483"/>
+      <w:bookmarkStart w:id="55" w:name="_Toc18832"/>
       <w:r>
         <w:t>10.1 Checking the ultrasound module on a phone</w:t>
       </w:r>
@@ -39601,24 +39636,22 @@
     </w:p>
     <w:p>
       <w:pPr>
-        <w:pStyle w:val="2"/>
-        <w:pageBreakBefore w:val="0"/>
+        <w:pStyle w:val="3"/>
       </w:pPr>
-      <w:bookmarkStart w:id="56" w:name="_Toc32670"/>
-      <w:r>
-        <w:t>11. Limitations, ethics and risks</w:t>
+      <w:bookmarkStart w:id="56" w:name="_Toc17215"/>
+      <w:r>
+        <w:t>10.2 Checking the two questionnaires on a phone</w:t>
       </w:r>
       <w:bookmarkEnd w:id="56"/>
     </w:p>
     <w:p>
-      <w:pPr>
-        <w:pStyle w:val="3"/>
-      </w:pPr>
-      <w:bookmarkStart w:id="57" w:name="_Toc19549"/>
-      <w:r>
-        <w:t>11.1 Failure modes and mitigations</w:t>
-      </w:r>
-      <w:bookmarkEnd w:id="57"/>
+      <w:r>
+        <w:rPr>
+          <w:b w:val="0"/>
+          <w:i w:val="0"/>
+        </w:rPr>
+        <w:t>A checklist file (femora-questionnaire-tests.txt, on the developer's Desktop) lists the exact answers to enter and the results the server gives. The expected values were produced by the running backend.</w:t>
+      </w:r>
     </w:p>
     <w:p>
       <w:pPr>
@@ -39631,7 +39664,1250 @@
           <w:b w:val="0"/>
           <w:i w:val="0"/>
         </w:rPr>
-        <w:t>Table 51. Failure modes</w:t>
+        <w:t>Table 51. Phone test profiles for the questionnaires</w:t>
+      </w:r>
+    </w:p>
+    <w:tbl>
+      <w:tblPr>
+        <w:tblStyle w:val="12"/>
+        <w:tblW w:w="0" w:type="auto"/>
+        <w:jc w:val="center"/>
+        <w:tblBorders>
+          <w:top w:val="single" w:color="D9C3CC" w:sz="4" w:space="0"/>
+          <w:left w:val="single" w:color="D9C3CC" w:sz="4" w:space="0"/>
+          <w:bottom w:val="single" w:color="D9C3CC" w:sz="4" w:space="0"/>
+          <w:right w:val="single" w:color="D9C3CC" w:sz="4" w:space="0"/>
+          <w:insideH w:val="single" w:color="D9C3CC" w:sz="4" w:space="0"/>
+          <w:insideV w:val="single" w:color="D9C3CC" w:sz="4" w:space="0"/>
+        </w:tblBorders>
+        <w:tblLayout w:type="fixed"/>
+        <w:tblCellMar>
+          <w:top w:w="50" w:type="dxa"/>
+          <w:left w:w="90" w:type="dxa"/>
+          <w:bottom w:w="50" w:type="dxa"/>
+          <w:right w:w="90" w:type="dxa"/>
+        </w:tblCellMar>
+      </w:tblPr>
+      <w:tblGrid>
+        <w:gridCol w:w="1474"/>
+        <w:gridCol w:w="4535"/>
+        <w:gridCol w:w="3402"/>
+      </w:tblGrid>
+      <w:tr>
+        <w:tblPrEx>
+          <w:tblBorders>
+            <w:top w:val="single" w:color="D9C3CC" w:sz="4" w:space="0"/>
+            <w:left w:val="single" w:color="D9C3CC" w:sz="4" w:space="0"/>
+            <w:bottom w:val="single" w:color="D9C3CC" w:sz="4" w:space="0"/>
+            <w:right w:val="single" w:color="D9C3CC" w:sz="4" w:space="0"/>
+            <w:insideH w:val="single" w:color="D9C3CC" w:sz="4" w:space="0"/>
+            <w:insideV w:val="single" w:color="D9C3CC" w:sz="4" w:space="0"/>
+          </w:tblBorders>
+          <w:tblCellMar>
+            <w:top w:w="50" w:type="dxa"/>
+            <w:left w:w="90" w:type="dxa"/>
+            <w:bottom w:w="50" w:type="dxa"/>
+            <w:right w:w="90" w:type="dxa"/>
+          </w:tblCellMar>
+        </w:tblPrEx>
+        <w:trPr>
+          <w:tblHeader/>
+          <w:jc w:val="center"/>
+        </w:trPr>
+        <w:tc>
+          <w:tcPr>
+            <w:tcW w:w="1474" w:type="dxa"/>
+            <w:shd w:val="clear" w:color="auto" w:fill="9E1B46"/>
+          </w:tcPr>
+          <w:p>
+            <w:pPr>
+              <w:spacing w:after="0" w:line="240" w:lineRule="auto"/>
+            </w:pPr>
+            <w:r>
+              <w:rPr>
+                <w:b/>
+                <w:i w:val="0"/>
+                <w:color w:val="FFFFFF"/>
+                <w:sz w:val="17"/>
+              </w:rPr>
+              <w:t>Test</w:t>
+            </w:r>
+          </w:p>
+        </w:tc>
+        <w:tc>
+          <w:tcPr>
+            <w:tcW w:w="4535" w:type="dxa"/>
+            <w:shd w:val="clear" w:color="auto" w:fill="9E1B46"/>
+          </w:tcPr>
+          <w:p>
+            <w:pPr>
+              <w:spacing w:after="0" w:line="240" w:lineRule="auto"/>
+            </w:pPr>
+            <w:r>
+              <w:rPr>
+                <w:b/>
+                <w:i w:val="0"/>
+                <w:color w:val="FFFFFF"/>
+                <w:sz w:val="17"/>
+              </w:rPr>
+              <w:t>Answers to enter (in short)</w:t>
+            </w:r>
+          </w:p>
+        </w:tc>
+        <w:tc>
+          <w:tcPr>
+            <w:tcW w:w="3402" w:type="dxa"/>
+            <w:shd w:val="clear" w:color="auto" w:fill="9E1B46"/>
+          </w:tcPr>
+          <w:p>
+            <w:pPr>
+              <w:spacing w:after="0" w:line="240" w:lineRule="auto"/>
+            </w:pPr>
+            <w:r>
+              <w:rPr>
+                <w:b/>
+                <w:i w:val="0"/>
+                <w:color w:val="FFFFFF"/>
+                <w:sz w:val="17"/>
+              </w:rPr>
+              <w:t>Expected result</w:t>
+            </w:r>
+          </w:p>
+        </w:tc>
+      </w:tr>
+      <w:tr>
+        <w:tblPrEx>
+          <w:tblBorders>
+            <w:top w:val="single" w:color="D9C3CC" w:sz="4" w:space="0"/>
+            <w:left w:val="single" w:color="D9C3CC" w:sz="4" w:space="0"/>
+            <w:bottom w:val="single" w:color="D9C3CC" w:sz="4" w:space="0"/>
+            <w:right w:val="single" w:color="D9C3CC" w:sz="4" w:space="0"/>
+            <w:insideH w:val="single" w:color="D9C3CC" w:sz="4" w:space="0"/>
+            <w:insideV w:val="single" w:color="D9C3CC" w:sz="4" w:space="0"/>
+          </w:tblBorders>
+          <w:tblCellMar>
+            <w:top w:w="50" w:type="dxa"/>
+            <w:left w:w="90" w:type="dxa"/>
+            <w:bottom w:w="50" w:type="dxa"/>
+            <w:right w:w="90" w:type="dxa"/>
+          </w:tblCellMar>
+        </w:tblPrEx>
+        <w:trPr>
+          <w:cantSplit/>
+          <w:jc w:val="center"/>
+        </w:trPr>
+        <w:tc>
+          <w:tcPr>
+            <w:tcW w:w="1474" w:type="dxa"/>
+          </w:tcPr>
+          <w:p>
+            <w:pPr>
+              <w:spacing w:after="0" w:line="240" w:lineRule="auto"/>
+            </w:pPr>
+            <w:r>
+              <w:rPr>
+                <w:b/>
+                <w:i w:val="0"/>
+                <w:sz w:val="17"/>
+              </w:rPr>
+              <w:t>PCOS P1</w:t>
+            </w:r>
+          </w:p>
+        </w:tc>
+        <w:tc>
+          <w:tcPr>
+            <w:tcW w:w="4535" w:type="dxa"/>
+          </w:tcPr>
+          <w:p>
+            <w:pPr>
+              <w:spacing w:after="0" w:line="240" w:lineRule="auto"/>
+            </w:pPr>
+            <w:r>
+              <w:rPr>
+                <w:b w:val="0"/>
+                <w:i w:val="0"/>
+                <w:sz w:val="17"/>
+              </w:rPr>
+              <w:t>24 y, 165 cm, 58 kg, regular cycles, no symptoms, exercises</w:t>
+            </w:r>
+          </w:p>
+        </w:tc>
+        <w:tc>
+          <w:tcPr>
+            <w:tcW w:w="3402" w:type="dxa"/>
+          </w:tcPr>
+          <w:p>
+            <w:pPr>
+              <w:spacing w:after="0" w:line="240" w:lineRule="auto"/>
+            </w:pPr>
+            <w:r>
+              <w:rPr>
+                <w:b w:val="0"/>
+                <w:i w:val="0"/>
+                <w:sz w:val="17"/>
+              </w:rPr>
+              <w:t>about 1%, Low, Healthy Habits</w:t>
+            </w:r>
+          </w:p>
+        </w:tc>
+      </w:tr>
+      <w:tr>
+        <w:tblPrEx>
+          <w:tblBorders>
+            <w:top w:val="single" w:color="D9C3CC" w:sz="4" w:space="0"/>
+            <w:left w:val="single" w:color="D9C3CC" w:sz="4" w:space="0"/>
+            <w:bottom w:val="single" w:color="D9C3CC" w:sz="4" w:space="0"/>
+            <w:right w:val="single" w:color="D9C3CC" w:sz="4" w:space="0"/>
+            <w:insideH w:val="single" w:color="D9C3CC" w:sz="4" w:space="0"/>
+            <w:insideV w:val="single" w:color="D9C3CC" w:sz="4" w:space="0"/>
+          </w:tblBorders>
+          <w:tblCellMar>
+            <w:top w:w="50" w:type="dxa"/>
+            <w:left w:w="90" w:type="dxa"/>
+            <w:bottom w:w="50" w:type="dxa"/>
+            <w:right w:w="90" w:type="dxa"/>
+          </w:tblCellMar>
+        </w:tblPrEx>
+        <w:trPr>
+          <w:cantSplit/>
+          <w:jc w:val="center"/>
+        </w:trPr>
+        <w:tc>
+          <w:tcPr>
+            <w:tcW w:w="1474" w:type="dxa"/>
+            <w:shd w:val="clear" w:color="auto" w:fill="FBE9EF"/>
+          </w:tcPr>
+          <w:p>
+            <w:pPr>
+              <w:spacing w:after="0" w:line="240" w:lineRule="auto"/>
+            </w:pPr>
+            <w:r>
+              <w:rPr>
+                <w:b/>
+                <w:i w:val="0"/>
+                <w:sz w:val="17"/>
+              </w:rPr>
+              <w:t>PCOS P2</w:t>
+            </w:r>
+          </w:p>
+        </w:tc>
+        <w:tc>
+          <w:tcPr>
+            <w:tcW w:w="4535" w:type="dxa"/>
+            <w:shd w:val="clear" w:color="auto" w:fill="FBE9EF"/>
+          </w:tcPr>
+          <w:p>
+            <w:pPr>
+              <w:spacing w:after="0" w:line="240" w:lineRule="auto"/>
+            </w:pPr>
+            <w:r>
+              <w:rPr>
+                <w:b w:val="0"/>
+                <w:i w:val="0"/>
+                <w:sz w:val="17"/>
+              </w:rPr>
+              <w:t>P1 plus acne</w:t>
+            </w:r>
+          </w:p>
+        </w:tc>
+        <w:tc>
+          <w:tcPr>
+            <w:tcW w:w="3402" w:type="dxa"/>
+            <w:shd w:val="clear" w:color="auto" w:fill="FBE9EF"/>
+          </w:tcPr>
+          <w:p>
+            <w:pPr>
+              <w:spacing w:after="0" w:line="240" w:lineRule="auto"/>
+            </w:pPr>
+            <w:r>
+              <w:rPr>
+                <w:b w:val="0"/>
+                <w:i w:val="0"/>
+                <w:sz w:val="17"/>
+              </w:rPr>
+              <w:t>about 1%, Low, tag Acne</w:t>
+            </w:r>
+          </w:p>
+        </w:tc>
+      </w:tr>
+      <w:tr>
+        <w:tblPrEx>
+          <w:tblBorders>
+            <w:top w:val="single" w:color="D9C3CC" w:sz="4" w:space="0"/>
+            <w:left w:val="single" w:color="D9C3CC" w:sz="4" w:space="0"/>
+            <w:bottom w:val="single" w:color="D9C3CC" w:sz="4" w:space="0"/>
+            <w:right w:val="single" w:color="D9C3CC" w:sz="4" w:space="0"/>
+            <w:insideH w:val="single" w:color="D9C3CC" w:sz="4" w:space="0"/>
+            <w:insideV w:val="single" w:color="D9C3CC" w:sz="4" w:space="0"/>
+          </w:tblBorders>
+          <w:tblCellMar>
+            <w:top w:w="50" w:type="dxa"/>
+            <w:left w:w="90" w:type="dxa"/>
+            <w:bottom w:w="50" w:type="dxa"/>
+            <w:right w:w="90" w:type="dxa"/>
+          </w:tblCellMar>
+        </w:tblPrEx>
+        <w:trPr>
+          <w:cantSplit/>
+          <w:jc w:val="center"/>
+        </w:trPr>
+        <w:tc>
+          <w:tcPr>
+            <w:tcW w:w="1474" w:type="dxa"/>
+          </w:tcPr>
+          <w:p>
+            <w:pPr>
+              <w:spacing w:after="0" w:line="240" w:lineRule="auto"/>
+            </w:pPr>
+            <w:r>
+              <w:rPr>
+                <w:b/>
+                <w:i w:val="0"/>
+                <w:sz w:val="17"/>
+              </w:rPr>
+              <w:t>PCOS P3</w:t>
+            </w:r>
+          </w:p>
+        </w:tc>
+        <w:tc>
+          <w:tcPr>
+            <w:tcW w:w="4535" w:type="dxa"/>
+          </w:tcPr>
+          <w:p>
+            <w:pPr>
+              <w:spacing w:after="0" w:line="240" w:lineRule="auto"/>
+            </w:pPr>
+            <w:r>
+              <w:rPr>
+                <w:b w:val="0"/>
+                <w:i w:val="0"/>
+                <w:sz w:val="17"/>
+              </w:rPr>
+              <w:t>P1 but irregular cycles, weight gain, 70 kg</w:t>
+            </w:r>
+          </w:p>
+        </w:tc>
+        <w:tc>
+          <w:tcPr>
+            <w:tcW w:w="3402" w:type="dxa"/>
+          </w:tcPr>
+          <w:p>
+            <w:pPr>
+              <w:spacing w:after="0" w:line="240" w:lineRule="auto"/>
+            </w:pPr>
+            <w:r>
+              <w:rPr>
+                <w:b w:val="0"/>
+                <w:i w:val="0"/>
+                <w:sz w:val="17"/>
+              </w:rPr>
+              <w:t>about 7%, Low, BMI 25.7</w:t>
+            </w:r>
+          </w:p>
+        </w:tc>
+      </w:tr>
+      <w:tr>
+        <w:tblPrEx>
+          <w:tblBorders>
+            <w:top w:val="single" w:color="D9C3CC" w:sz="4" w:space="0"/>
+            <w:left w:val="single" w:color="D9C3CC" w:sz="4" w:space="0"/>
+            <w:bottom w:val="single" w:color="D9C3CC" w:sz="4" w:space="0"/>
+            <w:right w:val="single" w:color="D9C3CC" w:sz="4" w:space="0"/>
+            <w:insideH w:val="single" w:color="D9C3CC" w:sz="4" w:space="0"/>
+            <w:insideV w:val="single" w:color="D9C3CC" w:sz="4" w:space="0"/>
+          </w:tblBorders>
+          <w:tblCellMar>
+            <w:top w:w="50" w:type="dxa"/>
+            <w:left w:w="90" w:type="dxa"/>
+            <w:bottom w:w="50" w:type="dxa"/>
+            <w:right w:w="90" w:type="dxa"/>
+          </w:tblCellMar>
+        </w:tblPrEx>
+        <w:trPr>
+          <w:cantSplit/>
+          <w:jc w:val="center"/>
+        </w:trPr>
+        <w:tc>
+          <w:tcPr>
+            <w:tcW w:w="1474" w:type="dxa"/>
+            <w:shd w:val="clear" w:color="auto" w:fill="FBE9EF"/>
+          </w:tcPr>
+          <w:p>
+            <w:pPr>
+              <w:spacing w:after="0" w:line="240" w:lineRule="auto"/>
+            </w:pPr>
+            <w:r>
+              <w:rPr>
+                <w:b/>
+                <w:i w:val="0"/>
+                <w:sz w:val="17"/>
+              </w:rPr>
+              <w:t>PCOS P4</w:t>
+            </w:r>
+          </w:p>
+        </w:tc>
+        <w:tc>
+          <w:tcPr>
+            <w:tcW w:w="4535" w:type="dxa"/>
+            <w:shd w:val="clear" w:color="auto" w:fill="FBE9EF"/>
+          </w:tcPr>
+          <w:p>
+            <w:pPr>
+              <w:spacing w:after="0" w:line="240" w:lineRule="auto"/>
+            </w:pPr>
+            <w:r>
+              <w:rPr>
+                <w:b w:val="0"/>
+                <w:i w:val="0"/>
+                <w:sz w:val="17"/>
+              </w:rPr>
+              <w:t>irregular, weight gain, hair growth, skin darkening, acne, fast food, no exercise</w:t>
+            </w:r>
+          </w:p>
+        </w:tc>
+        <w:tc>
+          <w:tcPr>
+            <w:tcW w:w="3402" w:type="dxa"/>
+            <w:shd w:val="clear" w:color="auto" w:fill="FBE9EF"/>
+          </w:tcPr>
+          <w:p>
+            <w:pPr>
+              <w:spacing w:after="0" w:line="240" w:lineRule="auto"/>
+            </w:pPr>
+            <w:r>
+              <w:rPr>
+                <w:b w:val="0"/>
+                <w:i w:val="0"/>
+                <w:sz w:val="17"/>
+              </w:rPr>
+              <w:t>about 99%, High, See a Specialist</w:t>
+            </w:r>
+          </w:p>
+        </w:tc>
+      </w:tr>
+      <w:tr>
+        <w:tblPrEx>
+          <w:tblBorders>
+            <w:top w:val="single" w:color="D9C3CC" w:sz="4" w:space="0"/>
+            <w:left w:val="single" w:color="D9C3CC" w:sz="4" w:space="0"/>
+            <w:bottom w:val="single" w:color="D9C3CC" w:sz="4" w:space="0"/>
+            <w:right w:val="single" w:color="D9C3CC" w:sz="4" w:space="0"/>
+            <w:insideH w:val="single" w:color="D9C3CC" w:sz="4" w:space="0"/>
+            <w:insideV w:val="single" w:color="D9C3CC" w:sz="4" w:space="0"/>
+          </w:tblBorders>
+          <w:tblCellMar>
+            <w:top w:w="50" w:type="dxa"/>
+            <w:left w:w="90" w:type="dxa"/>
+            <w:bottom w:w="50" w:type="dxa"/>
+            <w:right w:w="90" w:type="dxa"/>
+          </w:tblCellMar>
+        </w:tblPrEx>
+        <w:trPr>
+          <w:cantSplit/>
+          <w:jc w:val="center"/>
+        </w:trPr>
+        <w:tc>
+          <w:tcPr>
+            <w:tcW w:w="1474" w:type="dxa"/>
+          </w:tcPr>
+          <w:p>
+            <w:pPr>
+              <w:spacing w:after="0" w:line="240" w:lineRule="auto"/>
+            </w:pPr>
+            <w:r>
+              <w:rPr>
+                <w:b/>
+                <w:i w:val="0"/>
+                <w:sz w:val="17"/>
+              </w:rPr>
+              <w:t>PCOS P5</w:t>
+            </w:r>
+          </w:p>
+        </w:tc>
+        <w:tc>
+          <w:tcPr>
+            <w:tcW w:w="4535" w:type="dxa"/>
+          </w:tcPr>
+          <w:p>
+            <w:pPr>
+              <w:spacing w:after="0" w:line="240" w:lineRule="auto"/>
+            </w:pPr>
+            <w:r>
+              <w:rPr>
+                <w:b w:val="0"/>
+                <w:i w:val="0"/>
+                <w:sz w:val="17"/>
+              </w:rPr>
+              <w:t>P4 without waist and hip</w:t>
+            </w:r>
+          </w:p>
+        </w:tc>
+        <w:tc>
+          <w:tcPr>
+            <w:tcW w:w="3402" w:type="dxa"/>
+          </w:tcPr>
+          <w:p>
+            <w:pPr>
+              <w:spacing w:after="0" w:line="240" w:lineRule="auto"/>
+            </w:pPr>
+            <w:r>
+              <w:rPr>
+                <w:b w:val="0"/>
+                <w:i w:val="0"/>
+                <w:sz w:val="17"/>
+              </w:rPr>
+              <w:t>still about 99%, High</w:t>
+            </w:r>
+          </w:p>
+        </w:tc>
+      </w:tr>
+      <w:tr>
+        <w:tblPrEx>
+          <w:tblBorders>
+            <w:top w:val="single" w:color="D9C3CC" w:sz="4" w:space="0"/>
+            <w:left w:val="single" w:color="D9C3CC" w:sz="4" w:space="0"/>
+            <w:bottom w:val="single" w:color="D9C3CC" w:sz="4" w:space="0"/>
+            <w:right w:val="single" w:color="D9C3CC" w:sz="4" w:space="0"/>
+            <w:insideH w:val="single" w:color="D9C3CC" w:sz="4" w:space="0"/>
+            <w:insideV w:val="single" w:color="D9C3CC" w:sz="4" w:space="0"/>
+          </w:tblBorders>
+          <w:tblCellMar>
+            <w:top w:w="50" w:type="dxa"/>
+            <w:left w:w="90" w:type="dxa"/>
+            <w:bottom w:w="50" w:type="dxa"/>
+            <w:right w:w="90" w:type="dxa"/>
+          </w:tblCellMar>
+        </w:tblPrEx>
+        <w:trPr>
+          <w:cantSplit/>
+          <w:jc w:val="center"/>
+        </w:trPr>
+        <w:tc>
+          <w:tcPr>
+            <w:tcW w:w="1474" w:type="dxa"/>
+            <w:shd w:val="clear" w:color="auto" w:fill="FBE9EF"/>
+          </w:tcPr>
+          <w:p>
+            <w:pPr>
+              <w:spacing w:after="0" w:line="240" w:lineRule="auto"/>
+            </w:pPr>
+            <w:r>
+              <w:rPr>
+                <w:b/>
+                <w:i w:val="0"/>
+                <w:sz w:val="17"/>
+              </w:rPr>
+              <w:t>Risk R1</w:t>
+            </w:r>
+          </w:p>
+        </w:tc>
+        <w:tc>
+          <w:tcPr>
+            <w:tcW w:w="4535" w:type="dxa"/>
+            <w:shd w:val="clear" w:color="auto" w:fill="FBE9EF"/>
+          </w:tcPr>
+          <w:p>
+            <w:pPr>
+              <w:spacing w:after="0" w:line="240" w:lineRule="auto"/>
+            </w:pPr>
+            <w:r>
+              <w:rPr>
+                <w:b w:val="0"/>
+                <w:i w:val="0"/>
+                <w:sz w:val="17"/>
+              </w:rPr>
+              <w:t>45 y, no risk factors</w:t>
+            </w:r>
+          </w:p>
+        </w:tc>
+        <w:tc>
+          <w:tcPr>
+            <w:tcW w:w="3402" w:type="dxa"/>
+            <w:shd w:val="clear" w:color="auto" w:fill="FBE9EF"/>
+          </w:tcPr>
+          <w:p>
+            <w:pPr>
+              <w:spacing w:after="0" w:line="240" w:lineRule="auto"/>
+            </w:pPr>
+            <w:r>
+              <w:rPr>
+                <w:b w:val="0"/>
+                <w:i w:val="0"/>
+                <w:sz w:val="17"/>
+              </w:rPr>
+              <w:t>0.33% a year, 0.99 x, Low</w:t>
+            </w:r>
+          </w:p>
+        </w:tc>
+      </w:tr>
+      <w:tr>
+        <w:tblPrEx>
+          <w:tblBorders>
+            <w:top w:val="single" w:color="D9C3CC" w:sz="4" w:space="0"/>
+            <w:left w:val="single" w:color="D9C3CC" w:sz="4" w:space="0"/>
+            <w:bottom w:val="single" w:color="D9C3CC" w:sz="4" w:space="0"/>
+            <w:right w:val="single" w:color="D9C3CC" w:sz="4" w:space="0"/>
+            <w:insideH w:val="single" w:color="D9C3CC" w:sz="4" w:space="0"/>
+            <w:insideV w:val="single" w:color="D9C3CC" w:sz="4" w:space="0"/>
+          </w:tblBorders>
+          <w:tblCellMar>
+            <w:top w:w="50" w:type="dxa"/>
+            <w:left w:w="90" w:type="dxa"/>
+            <w:bottom w:w="50" w:type="dxa"/>
+            <w:right w:w="90" w:type="dxa"/>
+          </w:tblCellMar>
+        </w:tblPrEx>
+        <w:trPr>
+          <w:cantSplit/>
+          <w:jc w:val="center"/>
+        </w:trPr>
+        <w:tc>
+          <w:tcPr>
+            <w:tcW w:w="1474" w:type="dxa"/>
+          </w:tcPr>
+          <w:p>
+            <w:pPr>
+              <w:spacing w:after="0" w:line="240" w:lineRule="auto"/>
+            </w:pPr>
+            <w:r>
+              <w:rPr>
+                <w:b/>
+                <w:i w:val="0"/>
+                <w:sz w:val="17"/>
+              </w:rPr>
+              <w:t>Risk R2</w:t>
+            </w:r>
+          </w:p>
+        </w:tc>
+        <w:tc>
+          <w:tcPr>
+            <w:tcW w:w="4535" w:type="dxa"/>
+          </w:tcPr>
+          <w:p>
+            <w:pPr>
+              <w:spacing w:after="0" w:line="240" w:lineRule="auto"/>
+            </w:pPr>
+            <w:r>
+              <w:rPr>
+                <w:b w:val="0"/>
+                <w:i w:val="0"/>
+                <w:sz w:val="17"/>
+              </w:rPr>
+              <w:t>one close relative</w:t>
+            </w:r>
+          </w:p>
+        </w:tc>
+        <w:tc>
+          <w:tcPr>
+            <w:tcW w:w="3402" w:type="dxa"/>
+          </w:tcPr>
+          <w:p>
+            <w:pPr>
+              <w:spacing w:after="0" w:line="240" w:lineRule="auto"/>
+            </w:pPr>
+            <w:r>
+              <w:rPr>
+                <w:b w:val="0"/>
+                <w:i w:val="0"/>
+                <w:sz w:val="17"/>
+              </w:rPr>
+              <w:t>0.42%, 1.26 x, Low, Family History</w:t>
+            </w:r>
+          </w:p>
+        </w:tc>
+      </w:tr>
+      <w:tr>
+        <w:tblPrEx>
+          <w:tblBorders>
+            <w:top w:val="single" w:color="D9C3CC" w:sz="4" w:space="0"/>
+            <w:left w:val="single" w:color="D9C3CC" w:sz="4" w:space="0"/>
+            <w:bottom w:val="single" w:color="D9C3CC" w:sz="4" w:space="0"/>
+            <w:right w:val="single" w:color="D9C3CC" w:sz="4" w:space="0"/>
+            <w:insideH w:val="single" w:color="D9C3CC" w:sz="4" w:space="0"/>
+            <w:insideV w:val="single" w:color="D9C3CC" w:sz="4" w:space="0"/>
+          </w:tblBorders>
+          <w:tblCellMar>
+            <w:top w:w="50" w:type="dxa"/>
+            <w:left w:w="90" w:type="dxa"/>
+            <w:bottom w:w="50" w:type="dxa"/>
+            <w:right w:w="90" w:type="dxa"/>
+          </w:tblCellMar>
+        </w:tblPrEx>
+        <w:trPr>
+          <w:cantSplit/>
+          <w:jc w:val="center"/>
+        </w:trPr>
+        <w:tc>
+          <w:tcPr>
+            <w:tcW w:w="1474" w:type="dxa"/>
+            <w:shd w:val="clear" w:color="auto" w:fill="FBE9EF"/>
+          </w:tcPr>
+          <w:p>
+            <w:pPr>
+              <w:spacing w:after="0" w:line="240" w:lineRule="auto"/>
+            </w:pPr>
+            <w:r>
+              <w:rPr>
+                <w:b/>
+                <w:i w:val="0"/>
+                <w:sz w:val="17"/>
+              </w:rPr>
+              <w:t>Risk R3</w:t>
+            </w:r>
+          </w:p>
+        </w:tc>
+        <w:tc>
+          <w:tcPr>
+            <w:tcW w:w="4535" w:type="dxa"/>
+            <w:shd w:val="clear" w:color="auto" w:fill="FBE9EF"/>
+          </w:tcPr>
+          <w:p>
+            <w:pPr>
+              <w:spacing w:after="0" w:line="240" w:lineRule="auto"/>
+            </w:pPr>
+            <w:r>
+              <w:rPr>
+                <w:b w:val="0"/>
+                <w:i w:val="0"/>
+                <w:sz w:val="17"/>
+              </w:rPr>
+              <w:t>two or more relatives</w:t>
+            </w:r>
+          </w:p>
+        </w:tc>
+        <w:tc>
+          <w:tcPr>
+            <w:tcW w:w="3402" w:type="dxa"/>
+            <w:shd w:val="clear" w:color="auto" w:fill="FBE9EF"/>
+          </w:tcPr>
+          <w:p>
+            <w:pPr>
+              <w:spacing w:after="0" w:line="240" w:lineRule="auto"/>
+            </w:pPr>
+            <w:r>
+              <w:rPr>
+                <w:b w:val="0"/>
+                <w:i w:val="0"/>
+                <w:sz w:val="17"/>
+              </w:rPr>
+              <w:t>0.49%, 1.47 x, Medium</w:t>
+            </w:r>
+          </w:p>
+        </w:tc>
+      </w:tr>
+      <w:tr>
+        <w:tblPrEx>
+          <w:tblBorders>
+            <w:top w:val="single" w:color="D9C3CC" w:sz="4" w:space="0"/>
+            <w:left w:val="single" w:color="D9C3CC" w:sz="4" w:space="0"/>
+            <w:bottom w:val="single" w:color="D9C3CC" w:sz="4" w:space="0"/>
+            <w:right w:val="single" w:color="D9C3CC" w:sz="4" w:space="0"/>
+            <w:insideH w:val="single" w:color="D9C3CC" w:sz="4" w:space="0"/>
+            <w:insideV w:val="single" w:color="D9C3CC" w:sz="4" w:space="0"/>
+          </w:tblBorders>
+          <w:tblCellMar>
+            <w:top w:w="50" w:type="dxa"/>
+            <w:left w:w="90" w:type="dxa"/>
+            <w:bottom w:w="50" w:type="dxa"/>
+            <w:right w:w="90" w:type="dxa"/>
+          </w:tblCellMar>
+        </w:tblPrEx>
+        <w:trPr>
+          <w:cantSplit/>
+          <w:jc w:val="center"/>
+        </w:trPr>
+        <w:tc>
+          <w:tcPr>
+            <w:tcW w:w="1474" w:type="dxa"/>
+          </w:tcPr>
+          <w:p>
+            <w:pPr>
+              <w:spacing w:after="0" w:line="240" w:lineRule="auto"/>
+            </w:pPr>
+            <w:r>
+              <w:rPr>
+                <w:b/>
+                <w:i w:val="0"/>
+                <w:sz w:val="17"/>
+              </w:rPr>
+              <w:t>Risk R4</w:t>
+            </w:r>
+          </w:p>
+        </w:tc>
+        <w:tc>
+          <w:tcPr>
+            <w:tcW w:w="4535" w:type="dxa"/>
+          </w:tcPr>
+          <w:p>
+            <w:pPr>
+              <w:spacing w:after="0" w:line="240" w:lineRule="auto"/>
+            </w:pPr>
+            <w:r>
+              <w:rPr>
+                <w:b w:val="0"/>
+                <w:i w:val="0"/>
+                <w:sz w:val="17"/>
+              </w:rPr>
+              <w:t>two or more relatives, biopsy, density d</w:t>
+            </w:r>
+          </w:p>
+        </w:tc>
+        <w:tc>
+          <w:tcPr>
+            <w:tcW w:w="3402" w:type="dxa"/>
+          </w:tcPr>
+          <w:p>
+            <w:pPr>
+              <w:spacing w:after="0" w:line="240" w:lineRule="auto"/>
+            </w:pPr>
+            <w:r>
+              <w:rPr>
+                <w:b w:val="0"/>
+                <w:i w:val="0"/>
+                <w:sz w:val="17"/>
+              </w:rPr>
+              <w:t>0.67%, 2.02 x, Medium, three factors</w:t>
+            </w:r>
+          </w:p>
+        </w:tc>
+      </w:tr>
+      <w:tr>
+        <w:tblPrEx>
+          <w:tblBorders>
+            <w:top w:val="single" w:color="D9C3CC" w:sz="4" w:space="0"/>
+            <w:left w:val="single" w:color="D9C3CC" w:sz="4" w:space="0"/>
+            <w:bottom w:val="single" w:color="D9C3CC" w:sz="4" w:space="0"/>
+            <w:right w:val="single" w:color="D9C3CC" w:sz="4" w:space="0"/>
+            <w:insideH w:val="single" w:color="D9C3CC" w:sz="4" w:space="0"/>
+            <w:insideV w:val="single" w:color="D9C3CC" w:sz="4" w:space="0"/>
+          </w:tblBorders>
+          <w:tblCellMar>
+            <w:top w:w="50" w:type="dxa"/>
+            <w:left w:w="90" w:type="dxa"/>
+            <w:bottom w:w="50" w:type="dxa"/>
+            <w:right w:w="90" w:type="dxa"/>
+          </w:tblCellMar>
+        </w:tblPrEx>
+        <w:trPr>
+          <w:cantSplit/>
+          <w:jc w:val="center"/>
+        </w:trPr>
+        <w:tc>
+          <w:tcPr>
+            <w:tcW w:w="1474" w:type="dxa"/>
+            <w:shd w:val="clear" w:color="auto" w:fill="FBE9EF"/>
+          </w:tcPr>
+          <w:p>
+            <w:pPr>
+              <w:spacing w:after="0" w:line="240" w:lineRule="auto"/>
+            </w:pPr>
+            <w:r>
+              <w:rPr>
+                <w:b/>
+                <w:i w:val="0"/>
+                <w:sz w:val="17"/>
+              </w:rPr>
+              <w:t>Risk R5</w:t>
+            </w:r>
+          </w:p>
+        </w:tc>
+        <w:tc>
+          <w:tcPr>
+            <w:tcW w:w="4535" w:type="dxa"/>
+            <w:shd w:val="clear" w:color="auto" w:fill="FBE9EF"/>
+          </w:tcPr>
+          <w:p>
+            <w:pPr>
+              <w:spacing w:after="0" w:line="240" w:lineRule="auto"/>
+            </w:pPr>
+            <w:r>
+              <w:rPr>
+                <w:b w:val="0"/>
+                <w:i w:val="0"/>
+                <w:sz w:val="17"/>
+              </w:rPr>
+              <w:t>60 y, post-menopausal</w:t>
+            </w:r>
+          </w:p>
+        </w:tc>
+        <w:tc>
+          <w:tcPr>
+            <w:tcW w:w="3402" w:type="dxa"/>
+            <w:shd w:val="clear" w:color="auto" w:fill="FBE9EF"/>
+          </w:tcPr>
+          <w:p>
+            <w:pPr>
+              <w:spacing w:after="0" w:line="240" w:lineRule="auto"/>
+            </w:pPr>
+            <w:r>
+              <w:rPr>
+                <w:b w:val="0"/>
+                <w:i w:val="0"/>
+                <w:sz w:val="17"/>
+              </w:rPr>
+              <w:t>0.62%, 1.04 x, Low</w:t>
+            </w:r>
+          </w:p>
+        </w:tc>
+      </w:tr>
+      <w:tr>
+        <w:tblPrEx>
+          <w:tblBorders>
+            <w:top w:val="single" w:color="D9C3CC" w:sz="4" w:space="0"/>
+            <w:left w:val="single" w:color="D9C3CC" w:sz="4" w:space="0"/>
+            <w:bottom w:val="single" w:color="D9C3CC" w:sz="4" w:space="0"/>
+            <w:right w:val="single" w:color="D9C3CC" w:sz="4" w:space="0"/>
+            <w:insideH w:val="single" w:color="D9C3CC" w:sz="4" w:space="0"/>
+            <w:insideV w:val="single" w:color="D9C3CC" w:sz="4" w:space="0"/>
+          </w:tblBorders>
+          <w:tblCellMar>
+            <w:top w:w="50" w:type="dxa"/>
+            <w:left w:w="90" w:type="dxa"/>
+            <w:bottom w:w="50" w:type="dxa"/>
+            <w:right w:w="90" w:type="dxa"/>
+          </w:tblCellMar>
+        </w:tblPrEx>
+        <w:trPr>
+          <w:cantSplit/>
+          <w:jc w:val="center"/>
+        </w:trPr>
+        <w:tc>
+          <w:tcPr>
+            <w:tcW w:w="1474" w:type="dxa"/>
+          </w:tcPr>
+          <w:p>
+            <w:pPr>
+              <w:spacing w:after="0" w:line="240" w:lineRule="auto"/>
+            </w:pPr>
+            <w:r>
+              <w:rPr>
+                <w:b/>
+                <w:i w:val="0"/>
+                <w:sz w:val="17"/>
+              </w:rPr>
+              <w:t>Risk R6</w:t>
+            </w:r>
+          </w:p>
+        </w:tc>
+        <w:tc>
+          <w:tcPr>
+            <w:tcW w:w="4535" w:type="dxa"/>
+          </w:tcPr>
+          <w:p>
+            <w:pPr>
+              <w:spacing w:after="0" w:line="240" w:lineRule="auto"/>
+            </w:pPr>
+            <w:r>
+              <w:rPr>
+                <w:b w:val="0"/>
+                <w:i w:val="0"/>
+                <w:sz w:val="17"/>
+              </w:rPr>
+              <w:t>25 y</w:t>
+            </w:r>
+          </w:p>
+        </w:tc>
+        <w:tc>
+          <w:tcPr>
+            <w:tcW w:w="3402" w:type="dxa"/>
+          </w:tcPr>
+          <w:p>
+            <w:pPr>
+              <w:spacing w:after="0" w:line="240" w:lineRule="auto"/>
+            </w:pPr>
+            <w:r>
+              <w:rPr>
+                <w:b w:val="0"/>
+                <w:i w:val="0"/>
+                <w:sz w:val="17"/>
+              </w:rPr>
+              <w:t>0.23%, 0.83 x, Low, note about the 35 to 84 range</w:t>
+            </w:r>
+          </w:p>
+        </w:tc>
+      </w:tr>
+      <w:tr>
+        <w:tblPrEx>
+          <w:tblBorders>
+            <w:top w:val="single" w:color="D9C3CC" w:sz="4" w:space="0"/>
+            <w:left w:val="single" w:color="D9C3CC" w:sz="4" w:space="0"/>
+            <w:bottom w:val="single" w:color="D9C3CC" w:sz="4" w:space="0"/>
+            <w:right w:val="single" w:color="D9C3CC" w:sz="4" w:space="0"/>
+            <w:insideH w:val="single" w:color="D9C3CC" w:sz="4" w:space="0"/>
+            <w:insideV w:val="single" w:color="D9C3CC" w:sz="4" w:space="0"/>
+          </w:tblBorders>
+          <w:tblCellMar>
+            <w:top w:w="50" w:type="dxa"/>
+            <w:left w:w="90" w:type="dxa"/>
+            <w:bottom w:w="50" w:type="dxa"/>
+            <w:right w:w="90" w:type="dxa"/>
+          </w:tblCellMar>
+        </w:tblPrEx>
+        <w:trPr>
+          <w:cantSplit/>
+          <w:jc w:val="center"/>
+        </w:trPr>
+        <w:tc>
+          <w:tcPr>
+            <w:tcW w:w="1474" w:type="dxa"/>
+            <w:shd w:val="clear" w:color="auto" w:fill="FBE9EF"/>
+          </w:tcPr>
+          <w:p>
+            <w:pPr>
+              <w:spacing w:after="0" w:line="240" w:lineRule="auto"/>
+            </w:pPr>
+            <w:r>
+              <w:rPr>
+                <w:b/>
+                <w:i w:val="0"/>
+                <w:sz w:val="17"/>
+              </w:rPr>
+              <w:t>Risk R7</w:t>
+            </w:r>
+          </w:p>
+        </w:tc>
+        <w:tc>
+          <w:tcPr>
+            <w:tcW w:w="4535" w:type="dxa"/>
+            <w:shd w:val="clear" w:color="auto" w:fill="FBE9EF"/>
+          </w:tcPr>
+          <w:p>
+            <w:pPr>
+              <w:spacing w:after="0" w:line="240" w:lineRule="auto"/>
+            </w:pPr>
+            <w:r>
+              <w:rPr>
+                <w:b w:val="0"/>
+                <w:i w:val="0"/>
+                <w:sz w:val="17"/>
+              </w:rPr>
+              <w:t>45 y plus breast lump</w:t>
+            </w:r>
+          </w:p>
+        </w:tc>
+        <w:tc>
+          <w:tcPr>
+            <w:tcW w:w="3402" w:type="dxa"/>
+            <w:shd w:val="clear" w:color="auto" w:fill="FBE9EF"/>
+          </w:tcPr>
+          <w:p>
+            <w:pPr>
+              <w:spacing w:after="0" w:line="240" w:lineRule="auto"/>
+            </w:pPr>
+            <w:r>
+              <w:rPr>
+                <w:b w:val="0"/>
+                <w:i w:val="0"/>
+                <w:sz w:val="17"/>
+              </w:rPr>
+              <w:t>risk unchanged; red flag Breast Lump, urgent, See a Doctor Within 2 Weeks</w:t>
+            </w:r>
+          </w:p>
+        </w:tc>
+      </w:tr>
+      <w:tr>
+        <w:tblPrEx>
+          <w:tblBorders>
+            <w:top w:val="single" w:color="D9C3CC" w:sz="4" w:space="0"/>
+            <w:left w:val="single" w:color="D9C3CC" w:sz="4" w:space="0"/>
+            <w:bottom w:val="single" w:color="D9C3CC" w:sz="4" w:space="0"/>
+            <w:right w:val="single" w:color="D9C3CC" w:sz="4" w:space="0"/>
+            <w:insideH w:val="single" w:color="D9C3CC" w:sz="4" w:space="0"/>
+            <w:insideV w:val="single" w:color="D9C3CC" w:sz="4" w:space="0"/>
+          </w:tblBorders>
+          <w:tblCellMar>
+            <w:top w:w="50" w:type="dxa"/>
+            <w:left w:w="90" w:type="dxa"/>
+            <w:bottom w:w="50" w:type="dxa"/>
+            <w:right w:w="90" w:type="dxa"/>
+          </w:tblCellMar>
+        </w:tblPrEx>
+        <w:trPr>
+          <w:cantSplit/>
+          <w:jc w:val="center"/>
+        </w:trPr>
+        <w:tc>
+          <w:tcPr>
+            <w:tcW w:w="1474" w:type="dxa"/>
+          </w:tcPr>
+          <w:p>
+            <w:pPr>
+              <w:spacing w:after="0" w:line="240" w:lineRule="auto"/>
+            </w:pPr>
+            <w:r>
+              <w:rPr>
+                <w:b/>
+                <w:i w:val="0"/>
+                <w:sz w:val="17"/>
+              </w:rPr>
+              <w:t>Risk R8</w:t>
+            </w:r>
+          </w:p>
+        </w:tc>
+        <w:tc>
+          <w:tcPr>
+            <w:tcW w:w="4535" w:type="dxa"/>
+          </w:tcPr>
+          <w:p>
+            <w:pPr>
+              <w:spacing w:after="0" w:line="240" w:lineRule="auto"/>
+            </w:pPr>
+            <w:r>
+              <w:rPr>
+                <w:b w:val="0"/>
+                <w:i w:val="0"/>
+                <w:sz w:val="17"/>
+              </w:rPr>
+              <w:t>38 y plus nipple discharge</w:t>
+            </w:r>
+          </w:p>
+        </w:tc>
+        <w:tc>
+          <w:tcPr>
+            <w:tcW w:w="3402" w:type="dxa"/>
+          </w:tcPr>
+          <w:p>
+            <w:pPr>
+              <w:spacing w:after="0" w:line="240" w:lineRule="auto"/>
+            </w:pPr>
+            <w:r>
+              <w:rPr>
+                <w:b w:val="0"/>
+                <w:i w:val="0"/>
+                <w:sz w:val="17"/>
+              </w:rPr>
+              <w:t>red flag, soon (urgent only from age 50)</w:t>
+            </w:r>
+          </w:p>
+        </w:tc>
+      </w:tr>
+      <w:tr>
+        <w:tblPrEx>
+          <w:tblBorders>
+            <w:top w:val="single" w:color="D9C3CC" w:sz="4" w:space="0"/>
+            <w:left w:val="single" w:color="D9C3CC" w:sz="4" w:space="0"/>
+            <w:bottom w:val="single" w:color="D9C3CC" w:sz="4" w:space="0"/>
+            <w:right w:val="single" w:color="D9C3CC" w:sz="4" w:space="0"/>
+            <w:insideH w:val="single" w:color="D9C3CC" w:sz="4" w:space="0"/>
+            <w:insideV w:val="single" w:color="D9C3CC" w:sz="4" w:space="0"/>
+          </w:tblBorders>
+          <w:tblCellMar>
+            <w:top w:w="50" w:type="dxa"/>
+            <w:left w:w="90" w:type="dxa"/>
+            <w:bottom w:w="50" w:type="dxa"/>
+            <w:right w:w="90" w:type="dxa"/>
+          </w:tblCellMar>
+        </w:tblPrEx>
+        <w:trPr>
+          <w:cantSplit/>
+          <w:jc w:val="center"/>
+        </w:trPr>
+        <w:tc>
+          <w:tcPr>
+            <w:tcW w:w="1474" w:type="dxa"/>
+            <w:shd w:val="clear" w:color="auto" w:fill="FBE9EF"/>
+          </w:tcPr>
+          <w:p>
+            <w:pPr>
+              <w:spacing w:after="0" w:line="240" w:lineRule="auto"/>
+            </w:pPr>
+            <w:r>
+              <w:rPr>
+                <w:b/>
+                <w:i w:val="0"/>
+                <w:sz w:val="17"/>
+              </w:rPr>
+              <w:t>Risk R9</w:t>
+            </w:r>
+          </w:p>
+        </w:tc>
+        <w:tc>
+          <w:tcPr>
+            <w:tcW w:w="4535" w:type="dxa"/>
+            <w:shd w:val="clear" w:color="auto" w:fill="FBE9EF"/>
+          </w:tcPr>
+          <w:p>
+            <w:pPr>
+              <w:spacing w:after="0" w:line="240" w:lineRule="auto"/>
+            </w:pPr>
+            <w:r>
+              <w:rPr>
+                <w:b w:val="0"/>
+                <w:i w:val="0"/>
+                <w:sz w:val="17"/>
+              </w:rPr>
+              <w:t>45 y plus breast pain only</w:t>
+            </w:r>
+          </w:p>
+        </w:tc>
+        <w:tc>
+          <w:tcPr>
+            <w:tcW w:w="3402" w:type="dxa"/>
+            <w:shd w:val="clear" w:color="auto" w:fill="FBE9EF"/>
+          </w:tcPr>
+          <w:p>
+            <w:pPr>
+              <w:spacing w:after="0" w:line="240" w:lineRule="auto"/>
+            </w:pPr>
+            <w:r>
+              <w:rPr>
+                <w:b w:val="0"/>
+                <w:i w:val="0"/>
+                <w:sz w:val="17"/>
+              </w:rPr>
+              <w:t>no red flag</w:t>
+            </w:r>
+          </w:p>
+        </w:tc>
+      </w:tr>
+    </w:tbl>
+    <w:p>
+      <w:pPr>
+        <w:spacing w:before="60" w:after="160"/>
+      </w:pPr>
+      <w:r>
+        <w:rPr>
+          <w:b w:val="0"/>
+          <w:i/>
+          <w:color w:val="555555"/>
+          <w:sz w:val="17"/>
+        </w:rPr>
+        <w:t>Form checks: unanswered required questions block submission; out-of-range numbers show their allowed range; with the server stopped the app shows "Could not reach the Femora server" and keeps the form open.</w:t>
+      </w:r>
+    </w:p>
+    <w:p>
+      <w:pPr>
+        <w:pStyle w:val="2"/>
+        <w:pageBreakBefore w:val="0"/>
+      </w:pPr>
+      <w:bookmarkStart w:id="57" w:name="_Toc23612"/>
+      <w:r>
+        <w:t>11. Limitations, ethics and risks</w:t>
+      </w:r>
+      <w:bookmarkEnd w:id="57"/>
+    </w:p>
+    <w:p>
+      <w:pPr>
+        <w:pStyle w:val="3"/>
+      </w:pPr>
+      <w:bookmarkStart w:id="58" w:name="_Toc20055"/>
+      <w:r>
+        <w:t>11.1 Failure modes and mitigations</w:t>
+      </w:r>
+      <w:bookmarkEnd w:id="58"/>
+    </w:p>
+    <w:p>
+      <w:pPr>
+        <w:pStyle w:val="16"/>
+        <w:keepNext/>
+        <w:spacing w:before="160" w:after="60"/>
+      </w:pPr>
+      <w:r>
+        <w:rPr>
+          <w:b w:val="0"/>
+          <w:i w:val="0"/>
+        </w:rPr>
+        <w:t>Table 52. Failure modes</w:t>
       </w:r>
     </w:p>
     <w:tbl>
@@ -40541,114 +41817,9 @@
       <w:pPr>
         <w:pStyle w:val="3"/>
       </w:pPr>
-      <w:bookmarkStart w:id="58" w:name="_Toc28345"/>
+      <w:bookmarkStart w:id="59" w:name="_Toc4929"/>
       <w:r>
         <w:t>11.2 Ethical and legal points</w:t>
-      </w:r>
-      <w:bookmarkEnd w:id="58"/>
-    </w:p>
-    <w:p>
-      <w:pPr>
-        <w:pStyle w:val="23"/>
-      </w:pPr>
-      <w:r>
-        <w:rPr>
-          <w:b/>
-          <w:i w:val="0"/>
-        </w:rPr>
-        <w:t>Not a medical device.</w:t>
-      </w:r>
-      <w:r>
-        <w:rPr>
-          <w:b w:val="0"/>
-          <w:i w:val="0"/>
-        </w:rPr>
-        <w:t xml:space="preserve"> Femora offers awareness and risk information. Using it as a diagnostic tool would require clinical validation and regulatory approval that this project does not claim.</w:t>
-      </w:r>
-    </w:p>
-    <w:p>
-      <w:pPr>
-        <w:pStyle w:val="23"/>
-      </w:pPr>
-      <w:r>
-        <w:rPr>
-          <w:b/>
-          <w:i w:val="0"/>
-        </w:rPr>
-        <w:t>Bias and representation.</w:t>
-      </w:r>
-      <w:r>
-        <w:rPr>
-          <w:b w:val="0"/>
-          <w:i w:val="0"/>
-        </w:rPr>
-        <w:t xml:space="preserve"> The ultrasound data comes from Egypt, Poland and Brazil and the risk data from the United States. None is from Pakistan, the intended users, so performance there is unknown. This is stated in the report and should be in the app's about screen.</w:t>
-      </w:r>
-    </w:p>
-    <w:p>
-      <w:pPr>
-        <w:pStyle w:val="23"/>
-      </w:pPr>
-      <w:r>
-        <w:rPr>
-          <w:b/>
-          <w:i w:val="0"/>
-        </w:rPr>
-        <w:t>Privacy.</w:t>
-      </w:r>
-      <w:r>
-        <w:rPr>
-          <w:b w:val="0"/>
-          <w:i w:val="0"/>
-        </w:rPr>
-        <w:t xml:space="preserve"> Scans and answers are processed in memory and not stored server-side. Images travel to a server, so real deployment needs HTTPS, a trusted host, a privacy notice and user consent. The demo tunnel passes traffic through Cloudflare.</w:t>
-      </w:r>
-    </w:p>
-    <w:p>
-      <w:pPr>
-        <w:pStyle w:val="23"/>
-      </w:pPr>
-      <w:r>
-        <w:rPr>
-          <w:b/>
-          <w:i w:val="0"/>
-        </w:rPr>
-        <w:t>Data terms.</w:t>
-      </w:r>
-      <w:r>
-        <w:rPr>
-          <w:b w:val="0"/>
-          <w:i w:val="0"/>
-        </w:rPr>
-        <w:t xml:space="preserve"> BUS-BRA requires citation; BCSC requires the funding citation and its redistribution terms are not spelled out, so the private Kaggle copy must not be made public without checking them.</w:t>
-      </w:r>
-    </w:p>
-    <w:p>
-      <w:pPr>
-        <w:pStyle w:val="23"/>
-      </w:pPr>
-      <w:r>
-        <w:rPr>
-          <w:b/>
-          <w:i w:val="0"/>
-        </w:rPr>
-        <w:t>Fairness of communication.</w:t>
-      </w:r>
-      <w:r>
-        <w:rPr>
-          <w:b w:val="0"/>
-          <w:i w:val="0"/>
-        </w:rPr>
-        <w:t xml:space="preserve"> Results avoid diagnostic words, always recommend a doctor and present uncertainty (calibrated probabilities, honest accuracy).</w:t>
-      </w:r>
-    </w:p>
-    <w:p>
-      <w:pPr>
-        <w:pStyle w:val="3"/>
-      </w:pPr>
-      <w:bookmarkStart w:id="59" w:name="_Toc15946"/>
-      <w:r>
-        <w:t>11.3 Other limitations</w:t>
       </w:r>
       <w:bookmarkEnd w:id="59"/>
     </w:p>
@@ -40661,6 +41832,111 @@
           <w:b/>
           <w:i w:val="0"/>
         </w:rPr>
+        <w:t>Not a medical device.</w:t>
+      </w:r>
+      <w:r>
+        <w:rPr>
+          <w:b w:val="0"/>
+          <w:i w:val="0"/>
+        </w:rPr>
+        <w:t xml:space="preserve"> Femora offers awareness and risk information. Using it as a diagnostic tool would require clinical validation and regulatory approval that this project does not claim.</w:t>
+      </w:r>
+    </w:p>
+    <w:p>
+      <w:pPr>
+        <w:pStyle w:val="23"/>
+      </w:pPr>
+      <w:r>
+        <w:rPr>
+          <w:b/>
+          <w:i w:val="0"/>
+        </w:rPr>
+        <w:t>Bias and representation.</w:t>
+      </w:r>
+      <w:r>
+        <w:rPr>
+          <w:b w:val="0"/>
+          <w:i w:val="0"/>
+        </w:rPr>
+        <w:t xml:space="preserve"> The ultrasound data comes from Egypt, Poland and Brazil and the risk data from the United States. None is from Pakistan, the intended users, so performance there is unknown. This is stated in the report and should be in the app's about screen.</w:t>
+      </w:r>
+    </w:p>
+    <w:p>
+      <w:pPr>
+        <w:pStyle w:val="23"/>
+      </w:pPr>
+      <w:r>
+        <w:rPr>
+          <w:b/>
+          <w:i w:val="0"/>
+        </w:rPr>
+        <w:t>Privacy.</w:t>
+      </w:r>
+      <w:r>
+        <w:rPr>
+          <w:b w:val="0"/>
+          <w:i w:val="0"/>
+        </w:rPr>
+        <w:t xml:space="preserve"> Scans and answers are processed in memory and not stored server-side. Images travel to a server, so real deployment needs HTTPS, a trusted host, a privacy notice and user consent. The demo tunnel passes traffic through Cloudflare.</w:t>
+      </w:r>
+    </w:p>
+    <w:p>
+      <w:pPr>
+        <w:pStyle w:val="23"/>
+      </w:pPr>
+      <w:r>
+        <w:rPr>
+          <w:b/>
+          <w:i w:val="0"/>
+        </w:rPr>
+        <w:t>Data terms.</w:t>
+      </w:r>
+      <w:r>
+        <w:rPr>
+          <w:b w:val="0"/>
+          <w:i w:val="0"/>
+        </w:rPr>
+        <w:t xml:space="preserve"> BUS-BRA requires citation; BCSC requires the funding citation and its redistribution terms are not spelled out, so the private Kaggle copy must not be made public without checking them.</w:t>
+      </w:r>
+    </w:p>
+    <w:p>
+      <w:pPr>
+        <w:pStyle w:val="23"/>
+      </w:pPr>
+      <w:r>
+        <w:rPr>
+          <w:b/>
+          <w:i w:val="0"/>
+        </w:rPr>
+        <w:t>Fairness of communication.</w:t>
+      </w:r>
+      <w:r>
+        <w:rPr>
+          <w:b w:val="0"/>
+          <w:i w:val="0"/>
+        </w:rPr>
+        <w:t xml:space="preserve"> Results avoid diagnostic words, always recommend a doctor and present uncertainty (calibrated probabilities, honest accuracy).</w:t>
+      </w:r>
+    </w:p>
+    <w:p>
+      <w:pPr>
+        <w:pStyle w:val="3"/>
+      </w:pPr>
+      <w:bookmarkStart w:id="60" w:name="_Toc15236"/>
+      <w:r>
+        <w:t>11.3 Other limitations</w:t>
+      </w:r>
+      <w:bookmarkEnd w:id="60"/>
+    </w:p>
+    <w:p>
+      <w:pPr>
+        <w:pStyle w:val="23"/>
+      </w:pPr>
+      <w:r>
+        <w:rPr>
+          <w:b/>
+          <w:i w:val="0"/>
+        </w:rPr>
         <w:t>Test-set tuning.</w:t>
       </w:r>
       <w:r>
@@ -40733,11 +42009,11 @@
         <w:pStyle w:val="2"/>
         <w:pageBreakBefore w:val="0"/>
       </w:pPr>
-      <w:bookmarkStart w:id="60" w:name="_Toc31323"/>
+      <w:bookmarkStart w:id="61" w:name="_Toc17321"/>
       <w:r>
         <w:t>12. Remaining work and recommended order</w:t>
       </w:r>
-      <w:bookmarkEnd w:id="60"/>
+      <w:bookmarkEnd w:id="61"/>
     </w:p>
     <w:p>
       <w:pPr>
@@ -40750,7 +42026,7 @@
           <w:b w:val="0"/>
           <w:i w:val="0"/>
         </w:rPr>
-        <w:t>Table 52. Suggested plan</w:t>
+        <w:t>Table 53. Suggested plan</w:t>
       </w:r>
     </w:p>
     <w:tbl>
@@ -41434,11 +42710,11 @@
         <w:pStyle w:val="2"/>
         <w:pageBreakBefore w:val="0"/>
       </w:pPr>
-      <w:bookmarkStart w:id="61" w:name="_Toc6603"/>
+      <w:bookmarkStart w:id="62" w:name="_Toc13984"/>
       <w:r>
         <w:t>13. Conclusion</w:t>
       </w:r>
-      <w:bookmarkEnd w:id="61"/>
+      <w:bookmarkEnd w:id="62"/>
     </w:p>
     <w:p>
       <w:r>
@@ -41454,11 +42730,11 @@
         <w:pStyle w:val="2"/>
         <w:pageBreakBefore/>
       </w:pPr>
-      <w:bookmarkStart w:id="62" w:name="_Toc1217"/>
+      <w:bookmarkStart w:id="63" w:name="_Toc20726"/>
       <w:r>
         <w:t>Appendix A. Metric glossary</w:t>
       </w:r>
-      <w:bookmarkEnd w:id="62"/>
+      <w:bookmarkEnd w:id="63"/>
     </w:p>
     <w:p>
       <w:pPr>
@@ -41471,7 +42747,7 @@
           <w:b w:val="0"/>
           <w:i w:val="0"/>
         </w:rPr>
-        <w:t>Table 53. Terms used in this report</w:t>
+        <w:t>Table 54. Terms used in this report</w:t>
       </w:r>
     </w:p>
     <w:tbl>
@@ -42634,11 +43910,11 @@
         <w:pStyle w:val="2"/>
         <w:pageBreakBefore w:val="0"/>
       </w:pPr>
-      <w:bookmarkStart w:id="63" w:name="_Toc23421"/>
+      <w:bookmarkStart w:id="64" w:name="_Toc10224"/>
       <w:r>
         <w:t>Appendix B. Reproducibility</w:t>
       </w:r>
-      <w:bookmarkEnd w:id="63"/>
+      <w:bookmarkEnd w:id="64"/>
     </w:p>
     <w:p>
       <w:pPr>
@@ -42651,7 +43927,7 @@
           <w:b w:val="0"/>
           <w:i w:val="0"/>
         </w:rPr>
-        <w:t>Table 54. Where things are</w:t>
+        <w:t>Table 55. Where things are</w:t>
       </w:r>
     </w:p>
     <w:tbl>
@@ -43233,11 +44509,11 @@
         <w:pStyle w:val="2"/>
         <w:pageBreakBefore w:val="0"/>
       </w:pPr>
-      <w:bookmarkStart w:id="64" w:name="_Toc30241"/>
+      <w:bookmarkStart w:id="65" w:name="_Toc29184"/>
       <w:r>
         <w:t>Appendix C. Data sources and citations</w:t>
       </w:r>
-      <w:bookmarkEnd w:id="64"/>
+      <w:bookmarkEnd w:id="65"/>
     </w:p>
     <w:p>
       <w:pPr>
@@ -43340,11 +44616,11 @@
         <w:pStyle w:val="2"/>
         <w:pageBreakBefore w:val="0"/>
       </w:pPr>
-      <w:bookmarkStart w:id="65" w:name="_Toc22686"/>
+      <w:bookmarkStart w:id="66" w:name="_Toc9222"/>
       <w:r>
         <w:t>Appendix D. Key decisions and why</w:t>
       </w:r>
-      <w:bookmarkEnd w:id="65"/>
+      <w:bookmarkEnd w:id="66"/>
     </w:p>
     <w:p>
       <w:pPr>
@@ -43357,7 +44633,7 @@
           <w:b w:val="0"/>
           <w:i w:val="0"/>
         </w:rPr>
-        <w:t>Table 55. Decision log</w:t>
+        <w:t>Table 56. Decision log</w:t>
       </w:r>
     </w:p>
     <w:tbl>
@@ -44048,11 +45324,11 @@
         <w:pStyle w:val="2"/>
         <w:pageBreakBefore w:val="0"/>
       </w:pPr>
-      <w:bookmarkStart w:id="66" w:name="_Toc11542"/>
+      <w:bookmarkStart w:id="67" w:name="_Toc9663"/>
       <w:r>
         <w:t>Appendix E. Commit history (main branch)</w:t>
       </w:r>
-      <w:bookmarkEnd w:id="66"/>
+      <w:bookmarkEnd w:id="67"/>
     </w:p>
     <w:p>
       <w:pPr>
@@ -44065,7 +45341,7 @@
           <w:b w:val="0"/>
           <w:i w:val="0"/>
         </w:rPr>
-        <w:t>Table 56. Commits made during this period</w:t>
+        <w:t>Table 57. Commits made during this period</w:t>
       </w:r>
     </w:p>
     <w:tbl>
@@ -44962,11 +46238,11 @@
         <w:pStyle w:val="2"/>
         <w:pageBreakBefore w:val="0"/>
       </w:pPr>
-      <w:bookmarkStart w:id="67" w:name="_Toc16979"/>
+      <w:bookmarkStart w:id="68" w:name="_Toc16359"/>
       <w:r>
         <w:t>Appendix F. Questions a panel may ask</w:t>
       </w:r>
-      <w:bookmarkEnd w:id="67"/>
+      <w:bookmarkEnd w:id="68"/>
     </w:p>
     <w:p>
       <w:pPr>
@@ -44979,7 +46255,7 @@
           <w:b w:val="0"/>
           <w:i w:val="0"/>
         </w:rPr>
-        <w:t>Table 57. Anticipated questions</w:t>
+        <w:t>Table 58. Anticipated questions</w:t>
       </w:r>
     </w:p>
     <w:tbl>
@@ -47114,7 +48390,7 @@
     <w:lsdException w:uiPriority="99" w:name="table of authorities"/>
     <w:lsdException w:uiPriority="99" w:semiHidden="0" w:name="macro"/>
     <w:lsdException w:uiPriority="99" w:name="toa heading"/>
-    <w:lsdException w:uiPriority="99" w:semiHidden="0" w:name="List"/>
+    <w:lsdException w:qFormat="1" w:uiPriority="99" w:semiHidden="0" w:name="List"/>
     <w:lsdException w:uiPriority="99" w:semiHidden="0" w:name="List Bullet"/>
     <w:lsdException w:uiPriority="99" w:semiHidden="0" w:name="List Number"/>
     <w:lsdException w:uiPriority="99" w:semiHidden="0" w:name="List 2"/>
@@ -47125,7 +48401,7 @@
     <w:lsdException w:uiPriority="99" w:semiHidden="0" w:name="List Bullet 3"/>
     <w:lsdException w:uiPriority="99" w:name="List Bullet 4"/>
     <w:lsdException w:uiPriority="99" w:name="List Bullet 5"/>
-    <w:lsdException w:uiPriority="99" w:semiHidden="0" w:name="List Number 2"/>
+    <w:lsdException w:qFormat="1" w:uiPriority="99" w:semiHidden="0" w:name="List Number 2"/>
     <w:lsdException w:uiPriority="99" w:semiHidden="0" w:name="List Number 3"/>
     <w:lsdException w:uiPriority="99" w:name="List Number 4"/>
     <w:lsdException w:uiPriority="99" w:name="List Number 5"/>
@@ -47221,7 +48497,7 @@
     <w:lsdException w:qFormat="1" w:unhideWhenUsed="0" w:uiPriority="60" w:semiHidden="0" w:name="Light Shading"/>
     <w:lsdException w:unhideWhenUsed="0" w:uiPriority="61" w:semiHidden="0" w:name="Light List"/>
     <w:lsdException w:unhideWhenUsed="0" w:uiPriority="62" w:semiHidden="0" w:name="Light Grid"/>
-    <w:lsdException w:qFormat="1" w:unhideWhenUsed="0" w:uiPriority="63" w:semiHidden="0" w:name="Medium Shading 1"/>
+    <w:lsdException w:unhideWhenUsed="0" w:uiPriority="63" w:semiHidden="0" w:name="Medium Shading 1"/>
     <w:lsdException w:unhideWhenUsed="0" w:uiPriority="64" w:semiHidden="0" w:name="Medium Shading 2"/>
     <w:lsdException w:unhideWhenUsed="0" w:uiPriority="65" w:semiHidden="0" w:name="Medium List 1"/>
     <w:lsdException w:unhideWhenUsed="0" w:uiPriority="66" w:semiHidden="0" w:name="Medium List 2"/>
@@ -47232,7 +48508,7 @@
     <w:lsdException w:unhideWhenUsed="0" w:uiPriority="71" w:semiHidden="0" w:name="Colorful Shading"/>
     <w:lsdException w:unhideWhenUsed="0" w:uiPriority="72" w:semiHidden="0" w:name="Colorful List"/>
     <w:lsdException w:unhideWhenUsed="0" w:uiPriority="73" w:semiHidden="0" w:name="Colorful Grid"/>
-    <w:lsdException w:unhideWhenUsed="0" w:uiPriority="60" w:semiHidden="0" w:name="Light Shading Accent 1"/>
+    <w:lsdException w:qFormat="1" w:unhideWhenUsed="0" w:uiPriority="60" w:semiHidden="0" w:name="Light Shading Accent 1"/>
     <w:lsdException w:unhideWhenUsed="0" w:uiPriority="61" w:semiHidden="0" w:name="Light List Accent 1"/>
     <w:lsdException w:unhideWhenUsed="0" w:uiPriority="62" w:semiHidden="0" w:name="Light Grid Accent 1"/>
     <w:lsdException w:unhideWhenUsed="0" w:uiPriority="63" w:semiHidden="0" w:name="Medium Shading 1 Accent 1"/>
@@ -47241,7 +48517,7 @@
     <w:lsdException w:qFormat="1" w:unhideWhenUsed="0" w:uiPriority="34" w:semiHidden="0" w:name="List Paragraph"/>
     <w:lsdException w:qFormat="1" w:unhideWhenUsed="0" w:uiPriority="29" w:semiHidden="0" w:name="Quote"/>
     <w:lsdException w:qFormat="1" w:unhideWhenUsed="0" w:uiPriority="30" w:semiHidden="0" w:name="Intense Quote"/>
-    <w:lsdException w:unhideWhenUsed="0" w:uiPriority="66" w:semiHidden="0" w:name="Medium List 2 Accent 1"/>
+    <w:lsdException w:qFormat="1" w:unhideWhenUsed="0" w:uiPriority="66" w:semiHidden="0" w:name="Medium List 2 Accent 1"/>
     <w:lsdException w:unhideWhenUsed="0" w:uiPriority="67" w:semiHidden="0" w:name="Medium Grid 1 Accent 1"/>
     <w:lsdException w:unhideWhenUsed="0" w:uiPriority="68" w:semiHidden="0" w:name="Medium Grid 2 Accent 1"/>
     <w:lsdException w:unhideWhenUsed="0" w:uiPriority="69" w:semiHidden="0" w:name="Medium Grid 3 Accent 1"/>
@@ -47252,9 +48528,9 @@
     <w:lsdException w:qFormat="1" w:unhideWhenUsed="0" w:uiPriority="60" w:semiHidden="0" w:name="Light Shading Accent 2"/>
     <w:lsdException w:unhideWhenUsed="0" w:uiPriority="61" w:semiHidden="0" w:name="Light List Accent 2"/>
     <w:lsdException w:unhideWhenUsed="0" w:uiPriority="62" w:semiHidden="0" w:name="Light Grid Accent 2"/>
-    <w:lsdException w:qFormat="1" w:unhideWhenUsed="0" w:uiPriority="63" w:semiHidden="0" w:name="Medium Shading 1 Accent 2"/>
+    <w:lsdException w:unhideWhenUsed="0" w:uiPriority="63" w:semiHidden="0" w:name="Medium Shading 1 Accent 2"/>
     <w:lsdException w:unhideWhenUsed="0" w:uiPriority="64" w:semiHidden="0" w:name="Medium Shading 2 Accent 2"/>
-    <w:lsdException w:qFormat="1" w:unhideWhenUsed="0" w:uiPriority="65" w:semiHidden="0" w:name="Medium List 1 Accent 2"/>
+    <w:lsdException w:unhideWhenUsed="0" w:uiPriority="65" w:semiHidden="0" w:name="Medium List 1 Accent 2"/>
     <w:lsdException w:unhideWhenUsed="0" w:uiPriority="66" w:semiHidden="0" w:name="Medium List 2 Accent 2"/>
     <w:lsdException w:unhideWhenUsed="0" w:uiPriority="67" w:semiHidden="0" w:name="Medium Grid 1 Accent 2"/>
     <w:lsdException w:unhideWhenUsed="0" w:uiPriority="68" w:semiHidden="0" w:name="Medium Grid 2 Accent 2"/>
@@ -47264,9 +48540,9 @@
     <w:lsdException w:unhideWhenUsed="0" w:uiPriority="72" w:semiHidden="0" w:name="Colorful List Accent 2"/>
     <w:lsdException w:unhideWhenUsed="0" w:uiPriority="73" w:semiHidden="0" w:name="Colorful Grid Accent 2"/>
     <w:lsdException w:qFormat="1" w:unhideWhenUsed="0" w:uiPriority="60" w:semiHidden="0" w:name="Light Shading Accent 3"/>
-    <w:lsdException w:qFormat="1" w:unhideWhenUsed="0" w:uiPriority="61" w:semiHidden="0" w:name="Light List Accent 3"/>
-    <w:lsdException w:qFormat="1" w:unhideWhenUsed="0" w:uiPriority="62" w:semiHidden="0" w:name="Light Grid Accent 3"/>
-    <w:lsdException w:qFormat="1" w:unhideWhenUsed="0" w:uiPriority="63" w:semiHidden="0" w:name="Medium Shading 1 Accent 3"/>
+    <w:lsdException w:unhideWhenUsed="0" w:uiPriority="61" w:semiHidden="0" w:name="Light List Accent 3"/>
+    <w:lsdException w:unhideWhenUsed="0" w:uiPriority="62" w:semiHidden="0" w:name="Light Grid Accent 3"/>
+    <w:lsdException w:unhideWhenUsed="0" w:uiPriority="63" w:semiHidden="0" w:name="Medium Shading 1 Accent 3"/>
     <w:lsdException w:unhideWhenUsed="0" w:uiPriority="64" w:semiHidden="0" w:name="Medium Shading 2 Accent 3"/>
     <w:lsdException w:unhideWhenUsed="0" w:uiPriority="65" w:semiHidden="0" w:name="Medium List 1 Accent 3"/>
     <w:lsdException w:unhideWhenUsed="0" w:uiPriority="66" w:semiHidden="0" w:name="Medium List 2 Accent 3"/>
@@ -47275,14 +48551,14 @@
     <w:lsdException w:unhideWhenUsed="0" w:uiPriority="69" w:semiHidden="0" w:name="Medium Grid 3 Accent 3"/>
     <w:lsdException w:unhideWhenUsed="0" w:uiPriority="70" w:semiHidden="0" w:name="Dark List Accent 3"/>
     <w:lsdException w:unhideWhenUsed="0" w:uiPriority="71" w:semiHidden="0" w:name="Colorful Shading Accent 3"/>
-    <w:lsdException w:unhideWhenUsed="0" w:uiPriority="72" w:semiHidden="0" w:name="Colorful List Accent 3"/>
+    <w:lsdException w:qFormat="1" w:unhideWhenUsed="0" w:uiPriority="72" w:semiHidden="0" w:name="Colorful List Accent 3"/>
     <w:lsdException w:unhideWhenUsed="0" w:uiPriority="73" w:semiHidden="0" w:name="Colorful Grid Accent 3"/>
     <w:lsdException w:unhideWhenUsed="0" w:uiPriority="60" w:semiHidden="0" w:name="Light Shading Accent 4"/>
-    <w:lsdException w:qFormat="1" w:unhideWhenUsed="0" w:uiPriority="61" w:semiHidden="0" w:name="Light List Accent 4"/>
+    <w:lsdException w:unhideWhenUsed="0" w:uiPriority="61" w:semiHidden="0" w:name="Light List Accent 4"/>
     <w:lsdException w:unhideWhenUsed="0" w:uiPriority="62" w:semiHidden="0" w:name="Light Grid Accent 4"/>
-    <w:lsdException w:qFormat="1" w:unhideWhenUsed="0" w:uiPriority="63" w:semiHidden="0" w:name="Medium Shading 1 Accent 4"/>
+    <w:lsdException w:unhideWhenUsed="0" w:uiPriority="63" w:semiHidden="0" w:name="Medium Shading 1 Accent 4"/>
     <w:lsdException w:unhideWhenUsed="0" w:uiPriority="64" w:semiHidden="0" w:name="Medium Shading 2 Accent 4"/>
-    <w:lsdException w:unhideWhenUsed="0" w:uiPriority="65" w:semiHidden="0" w:name="Medium List 1 Accent 4"/>
+    <w:lsdException w:qFormat="1" w:unhideWhenUsed="0" w:uiPriority="65" w:semiHidden="0" w:name="Medium List 1 Accent 4"/>
     <w:lsdException w:unhideWhenUsed="0" w:uiPriority="66" w:semiHidden="0" w:name="Medium List 2 Accent 4"/>
     <w:lsdException w:unhideWhenUsed="0" w:uiPriority="67" w:semiHidden="0" w:name="Medium Grid 1 Accent 4"/>
     <w:lsdException w:unhideWhenUsed="0" w:uiPriority="68" w:semiHidden="0" w:name="Medium Grid 2 Accent 4"/>
@@ -47291,11 +48567,11 @@
     <w:lsdException w:unhideWhenUsed="0" w:uiPriority="71" w:semiHidden="0" w:name="Colorful Shading Accent 4"/>
     <w:lsdException w:unhideWhenUsed="0" w:uiPriority="72" w:semiHidden="0" w:name="Colorful List Accent 4"/>
     <w:lsdException w:unhideWhenUsed="0" w:uiPriority="73" w:semiHidden="0" w:name="Colorful Grid Accent 4"/>
-    <w:lsdException w:qFormat="1" w:unhideWhenUsed="0" w:uiPriority="60" w:semiHidden="0" w:name="Light Shading Accent 5"/>
+    <w:lsdException w:unhideWhenUsed="0" w:uiPriority="60" w:semiHidden="0" w:name="Light Shading Accent 5"/>
     <w:lsdException w:unhideWhenUsed="0" w:uiPriority="61" w:semiHidden="0" w:name="Light List Accent 5"/>
-    <w:lsdException w:qFormat="1" w:unhideWhenUsed="0" w:uiPriority="62" w:semiHidden="0" w:name="Light Grid Accent 5"/>
-    <w:lsdException w:qFormat="1" w:unhideWhenUsed="0" w:uiPriority="63" w:semiHidden="0" w:name="Medium Shading 1 Accent 5"/>
-    <w:lsdException w:qFormat="1" w:unhideWhenUsed="0" w:uiPriority="64" w:semiHidden="0" w:name="Medium Shading 2 Accent 5"/>
+    <w:lsdException w:unhideWhenUsed="0" w:uiPriority="62" w:semiHidden="0" w:name="Light Grid Accent 5"/>
+    <w:lsdException w:unhideWhenUsed="0" w:uiPriority="63" w:semiHidden="0" w:name="Medium Shading 1 Accent 5"/>
+    <w:lsdException w:unhideWhenUsed="0" w:uiPriority="64" w:semiHidden="0" w:name="Medium Shading 2 Accent 5"/>
     <w:lsdException w:unhideWhenUsed="0" w:uiPriority="65" w:semiHidden="0" w:name="Medium List 1 Accent 5"/>
     <w:lsdException w:unhideWhenUsed="0" w:uiPriority="66" w:semiHidden="0" w:name="Medium List 2 Accent 5"/>
     <w:lsdException w:unhideWhenUsed="0" w:uiPriority="67" w:semiHidden="0" w:name="Medium Grid 1 Accent 5"/>
@@ -47306,9 +48582,9 @@
     <w:lsdException w:unhideWhenUsed="0" w:uiPriority="72" w:semiHidden="0" w:name="Colorful List Accent 5"/>
     <w:lsdException w:unhideWhenUsed="0" w:uiPriority="73" w:semiHidden="0" w:name="Colorful Grid Accent 5"/>
     <w:lsdException w:unhideWhenUsed="0" w:uiPriority="60" w:semiHidden="0" w:name="Light Shading Accent 6"/>
-    <w:lsdException w:qFormat="1" w:unhideWhenUsed="0" w:uiPriority="61" w:semiHidden="0" w:name="Light List Accent 6"/>
+    <w:lsdException w:unhideWhenUsed="0" w:uiPriority="61" w:semiHidden="0" w:name="Light List Accent 6"/>
     <w:lsdException w:unhideWhenUsed="0" w:uiPriority="62" w:semiHidden="0" w:name="Light Grid Accent 6"/>
-    <w:lsdException w:qFormat="1" w:unhideWhenUsed="0" w:uiPriority="63" w:semiHidden="0" w:name="Medium Shading 1 Accent 6"/>
+    <w:lsdException w:unhideWhenUsed="0" w:uiPriority="63" w:semiHidden="0" w:name="Medium Shading 1 Accent 6"/>
     <w:lsdException w:unhideWhenUsed="0" w:uiPriority="64" w:semiHidden="0" w:name="Medium Shading 2 Accent 6"/>
     <w:lsdException w:unhideWhenUsed="0" w:uiPriority="65" w:semiHidden="0" w:name="Medium List 1 Accent 6"/>
     <w:lsdException w:unhideWhenUsed="0" w:uiPriority="66" w:semiHidden="0" w:name="Medium List 2 Accent 6"/>
@@ -47681,6 +48957,7 @@
     <w:name w:val="List"/>
     <w:basedOn w:val="1"/>
     <w:unhideWhenUsed/>
+    <w:qFormat/>
     <w:uiPriority w:val="99"/>
     <w:pPr>
       <w:ind w:left="360" w:hanging="360"/>
@@ -47801,6 +49078,7 @@
     <w:name w:val="List Number 2"/>
     <w:basedOn w:val="1"/>
     <w:unhideWhenUsed/>
+    <w:qFormat/>
     <w:uiPriority w:val="99"/>
     <w:pPr>
       <w:numPr>
@@ -48060,6 +49338,7 @@
   <w:style w:type="table" w:styleId="40">
     <w:name w:val="Light Shading Accent 1"/>
     <w:basedOn w:val="12"/>
+    <w:qFormat/>
     <w:uiPriority w:val="60"/>
     <w:pPr>
       <w:spacing w:after="0" w:line="240" w:lineRule="auto"/>
@@ -48458,7 +49737,6 @@
   <w:style w:type="table" w:styleId="44">
     <w:name w:val="Light Shading Accent 5"/>
     <w:basedOn w:val="12"/>
-    <w:qFormat/>
     <w:uiPriority w:val="60"/>
     <w:pPr>
       <w:spacing w:after="0" w:line="240" w:lineRule="auto"/>
@@ -48936,7 +50214,6 @@
   <w:style w:type="table" w:styleId="49">
     <w:name w:val="Light List Accent 3"/>
     <w:basedOn w:val="12"/>
-    <w:qFormat/>
     <w:uiPriority w:val="61"/>
     <w:pPr>
       <w:spacing w:after="0" w:line="240" w:lineRule="auto"/>
@@ -49030,7 +50307,6 @@
   <w:style w:type="table" w:styleId="50">
     <w:name w:val="Light List Accent 4"/>
     <w:basedOn w:val="12"/>
-    <w:qFormat/>
     <w:uiPriority w:val="61"/>
     <w:pPr>
       <w:spacing w:after="0" w:line="240" w:lineRule="auto"/>
@@ -49217,7 +50493,6 @@
   <w:style w:type="table" w:styleId="52">
     <w:name w:val="Light List Accent 6"/>
     <w:basedOn w:val="12"/>
-    <w:qFormat/>
     <w:uiPriority w:val="61"/>
     <w:pPr>
       <w:spacing w:after="0" w:line="240" w:lineRule="auto"/>
@@ -49689,7 +50964,6 @@
   <w:style w:type="table" w:styleId="56">
     <w:name w:val="Light Grid Accent 3"/>
     <w:basedOn w:val="12"/>
-    <w:qFormat/>
     <w:uiPriority w:val="62"/>
     <w:pPr>
       <w:spacing w:after="0" w:line="240" w:lineRule="auto"/>
@@ -49942,7 +51216,6 @@
   <w:style w:type="table" w:styleId="58">
     <w:name w:val="Light Grid Accent 5"/>
     <w:basedOn w:val="12"/>
-    <w:qFormat/>
     <w:uiPriority w:val="62"/>
     <w:pPr>
       <w:spacing w:after="0" w:line="240" w:lineRule="auto"/>
@@ -50195,7 +51468,6 @@
   <w:style w:type="table" w:styleId="60">
     <w:name w:val="Medium Shading 1"/>
     <w:basedOn w:val="12"/>
-    <w:qFormat/>
     <w:uiPriority w:val="63"/>
     <w:pPr>
       <w:spacing w:after="0" w:line="240" w:lineRule="auto"/>
@@ -50410,7 +51682,6 @@
   <w:style w:type="table" w:styleId="62">
     <w:name w:val="Medium Shading 1 Accent 2"/>
     <w:basedOn w:val="12"/>
-    <w:qFormat/>
     <w:uiPriority w:val="63"/>
     <w:pPr>
       <w:spacing w:after="0" w:line="240" w:lineRule="auto"/>
@@ -50518,7 +51789,6 @@
   <w:style w:type="table" w:styleId="63">
     <w:name w:val="Medium Shading 1 Accent 3"/>
     <w:basedOn w:val="12"/>
-    <w:qFormat/>
     <w:uiPriority w:val="63"/>
     <w:pPr>
       <w:spacing w:after="0" w:line="240" w:lineRule="auto"/>
@@ -50626,7 +51896,6 @@
   <w:style w:type="table" w:styleId="64">
     <w:name w:val="Medium Shading 1 Accent 4"/>
     <w:basedOn w:val="12"/>
-    <w:qFormat/>
     <w:uiPriority w:val="63"/>
     <w:pPr>
       <w:spacing w:after="0" w:line="240" w:lineRule="auto"/>
@@ -50734,7 +52003,6 @@
   <w:style w:type="table" w:styleId="65">
     <w:name w:val="Medium Shading 1 Accent 5"/>
     <w:basedOn w:val="12"/>
-    <w:qFormat/>
     <w:uiPriority w:val="63"/>
     <w:pPr>
       <w:spacing w:after="0" w:line="240" w:lineRule="auto"/>
@@ -50842,7 +52110,6 @@
   <w:style w:type="table" w:styleId="66">
     <w:name w:val="Medium Shading 1 Accent 6"/>
     <w:basedOn w:val="12"/>
-    <w:qFormat/>
     <w:uiPriority w:val="63"/>
     <w:pPr>
       <w:spacing w:after="0" w:line="240" w:lineRule="auto"/>
@@ -51775,7 +53042,6 @@
   <w:style w:type="table" w:styleId="72">
     <w:name w:val="Medium Shading 2 Accent 5"/>
     <w:basedOn w:val="12"/>
-    <w:qFormat/>
     <w:uiPriority w:val="64"/>
     <w:pPr>
       <w:spacing w:after="0" w:line="240" w:lineRule="auto"/>
@@ -52286,7 +53552,6 @@
   <w:style w:type="table" w:styleId="76">
     <w:name w:val="Medium List 1 Accent 2"/>
     <w:basedOn w:val="12"/>
-    <w:qFormat/>
     <w:uiPriority w:val="65"/>
     <w:pPr>
       <w:spacing w:after="0" w:line="240" w:lineRule="auto"/>
@@ -52467,6 +53732,7 @@
   <w:style w:type="table" w:styleId="78">
     <w:name w:val="Medium List 1 Accent 4"/>
     <w:basedOn w:val="12"/>
+    <w:qFormat/>
     <w:uiPriority w:val="65"/>
     <w:pPr>
       <w:spacing w:after="0" w:line="240" w:lineRule="auto"/>
@@ -52866,6 +54132,7 @@
   <w:style w:type="table" w:styleId="82">
     <w:name w:val="Medium List 2 Accent 1"/>
     <w:basedOn w:val="12"/>
+    <w:qFormat/>
     <w:uiPriority w:val="66"/>
     <w:pPr>
       <w:spacing w:after="0" w:line="240" w:lineRule="auto"/>
@@ -58341,6 +59608,7 @@
   <w:style w:type="table" w:styleId="126">
     <w:name w:val="Colorful List Accent 3"/>
     <w:basedOn w:val="12"/>
+    <w:qFormat/>
     <w:uiPriority w:val="72"/>
     <w:pPr>
       <w:spacing w:after="0" w:line="240" w:lineRule="auto"/>
@@ -59445,6 +60713,7 @@
     <w:name w:val="Heading 3 Char"/>
     <w:basedOn w:val="11"/>
     <w:link w:val="4"/>
+    <w:qFormat/>
     <w:uiPriority w:val="9"/>
     <w:rPr>
       <w:rFonts w:asciiTheme="majorHAnsi" w:hAnsiTheme="majorHAnsi" w:eastAsiaTheme="majorEastAsia" w:cstheme="majorBidi"/>
@@ -59508,6 +60777,7 @@
     <w:name w:val="Body Text Char"/>
     <w:basedOn w:val="11"/>
     <w:link w:val="13"/>
+    <w:qFormat/>
     <w:uiPriority w:val="99"/>
   </w:style>
   <w:style w:type="character" w:customStyle="1" w:styleId="147">
@@ -59530,7 +60800,6 @@
     <w:name w:val="Macro Text Char"/>
     <w:basedOn w:val="11"/>
     <w:link w:val="32"/>
-    <w:qFormat/>
     <w:uiPriority w:val="99"/>
     <w:rPr>
       <w:rFonts w:ascii="Courier" w:hAnsi="Courier"/>

</xml_diff>